<commit_message>
refactoring image reading/writing in operations; no longer restricts input/output format unless in operation; tests run
</commit_message>
<xml_diff>
--- a/doc/cv-workbench manual.docx
+++ b/doc/cv-workbench manual.docx
@@ -17344,14 +17344,6 @@
             </w:pPr>
             <w:r>
               <w:t xml:space="preserve">output </w:t>
-            </w:r>
-            <w:proofErr w:type="spellStart"/>
-            <w:r>
-              <w:t>CV_32S</w:t>
-            </w:r>
-            <w:proofErr w:type="spellEnd"/>
-            <w:r>
-              <w:t xml:space="preserve">, or </w:t>
             </w:r>
             <w:proofErr w:type="spellStart"/>
             <w:r>
@@ -25202,6 +25194,9 @@
       <w:r>
         <w:t xml:space="preserve">The operator takes the following data descriptors. </w:t>
       </w:r>
+      <w:r>
+        <w:t>Input images must be the same (rows, cols) size.</w:t>
+      </w:r>
     </w:p>
     <w:tbl>
       <w:tblPr>
@@ -25588,7 +25583,7 @@
       </w:tblPr>
       <w:tblGrid>
         <w:gridCol w:w="1280"/>
-        <w:gridCol w:w="3714"/>
+        <w:gridCol w:w="5218"/>
       </w:tblGrid>
       <w:tr>
         <w:trPr>
@@ -25662,6 +25657,9 @@
             <w:r>
               <w:t>Scale factor for first image value</w:t>
             </w:r>
+            <w:r>
+              <w:t>, defaults to 1.0</w:t>
+            </w:r>
           </w:p>
         </w:tc>
       </w:tr>
@@ -25698,6 +25696,9 @@
             </w:pPr>
             <w:r>
               <w:t>Scale factor for second image value</w:t>
+            </w:r>
+            <w:r>
+              <w:t>, defaults to 1.0</w:t>
             </w:r>
           </w:p>
         </w:tc>
@@ -25738,6 +25739,9 @@
             </w:pPr>
             <w:r>
               <w:t>Offset for output image value</w:t>
+            </w:r>
+            <w:r>
+              <w:t>, defaults to 0.0</w:t>
             </w:r>
           </w:p>
         </w:tc>
@@ -29103,6 +29107,17 @@
       <w:r>
         <w:t xml:space="preserve"> is the output pixel value for input pixel values &gt;= threshold. </w:t>
       </w:r>
+      <w:r>
+        <w:t xml:space="preserve">Values for JPEG output images will be </w:t>
+      </w:r>
+      <w:proofErr w:type="spellStart"/>
+      <w:r>
+        <w:t>CV_8U</w:t>
+      </w:r>
+      <w:proofErr w:type="spellEnd"/>
+      <w:r>
+        <w:t xml:space="preserve"> and truncated to 0..255.</w:t>
+      </w:r>
     </w:p>
     <w:p>
       <w:r>
@@ -29410,7 +29425,7 @@
       </w:tblPr>
       <w:tblGrid>
         <w:gridCol w:w="1280"/>
-        <w:gridCol w:w="5121"/>
+        <w:gridCol w:w="8070"/>
       </w:tblGrid>
       <w:tr>
         <w:trPr>
@@ -29468,44 +29483,68 @@
                 <w:b w:val="0"/>
                 <w:bCs w:val="0"/>
               </w:rPr>
+              <w:t>depth</w:t>
+            </w:r>
+          </w:p>
+        </w:tc>
+        <w:tc>
+          <w:tcPr>
+            <w:tcW w:w="0" w:type="auto"/>
+          </w:tcPr>
+          <w:p>
+            <w:pPr>
+              <w:pStyle w:val="NoSpacing"/>
+              <w:cnfStyle w:val="000000100000" w:firstRow="0" w:lastRow="0" w:firstColumn="0" w:lastColumn="0" w:oddVBand="0" w:evenVBand="0" w:oddHBand="1" w:evenHBand="0" w:firstRowFirstColumn="0" w:firstRowLastColumn="0" w:lastRowFirstColumn="0" w:lastRowLastColumn="0"/>
+            </w:pPr>
+            <w:r>
+              <w:t xml:space="preserve">The output image depth: </w:t>
+            </w:r>
+            <w:proofErr w:type="spellStart"/>
+            <w:r>
+              <w:t>CV_8U</w:t>
+            </w:r>
+            <w:proofErr w:type="spellEnd"/>
+            <w:r>
+              <w:t xml:space="preserve">, </w:t>
+            </w:r>
+            <w:proofErr w:type="spellStart"/>
+            <w:r>
+              <w:t>CV_32S</w:t>
+            </w:r>
+            <w:proofErr w:type="spellEnd"/>
+            <w:r>
+              <w:t xml:space="preserve">, or </w:t>
+            </w:r>
+            <w:proofErr w:type="spellStart"/>
+            <w:r>
+              <w:t>CV_32F</w:t>
+            </w:r>
+            <w:proofErr w:type="spellEnd"/>
+            <w:r>
+              <w:t>. Defaults to the input image depth, ignored for JPEG output images.</w:t>
+            </w:r>
+          </w:p>
+        </w:tc>
+      </w:tr>
+      <w:tr>
+        <w:tc>
+          <w:tcPr>
+            <w:cnfStyle w:val="001000000000" w:firstRow="0" w:lastRow="0" w:firstColumn="1" w:lastColumn="0" w:oddVBand="0" w:evenVBand="0" w:oddHBand="0" w:evenHBand="0" w:firstRowFirstColumn="0" w:firstRowLastColumn="0" w:lastRowFirstColumn="0" w:lastRowLastColumn="0"/>
+            <w:tcW w:w="0" w:type="auto"/>
+          </w:tcPr>
+          <w:p>
+            <w:pPr>
+              <w:rPr>
+                <w:b w:val="0"/>
+                <w:bCs w:val="0"/>
+              </w:rPr>
+            </w:pPr>
+            <w:r>
+              <w:rPr>
+                <w:b w:val="0"/>
+                <w:bCs w:val="0"/>
+              </w:rPr>
               <w:t>lower-in</w:t>
-            </w:r>
-          </w:p>
-        </w:tc>
-        <w:tc>
-          <w:tcPr>
-            <w:tcW w:w="0" w:type="auto"/>
-          </w:tcPr>
-          <w:p>
-            <w:pPr>
-              <w:pStyle w:val="NoSpacing"/>
-              <w:cnfStyle w:val="000000100000" w:firstRow="0" w:lastRow="0" w:firstColumn="0" w:lastColumn="0" w:oddVBand="0" w:evenVBand="0" w:oddHBand="1" w:evenHBand="0" w:firstRowFirstColumn="0" w:firstRowLastColumn="0" w:lastRowFirstColumn="0" w:lastRowLastColumn="0"/>
-            </w:pPr>
-            <w:r>
-              <w:t>The lower mapped pixel value of the input image</w:t>
-            </w:r>
-          </w:p>
-        </w:tc>
-      </w:tr>
-      <w:tr>
-        <w:tc>
-          <w:tcPr>
-            <w:cnfStyle w:val="001000000000" w:firstRow="0" w:lastRow="0" w:firstColumn="1" w:lastColumn="0" w:oddVBand="0" w:evenVBand="0" w:oddHBand="0" w:evenHBand="0" w:firstRowFirstColumn="0" w:firstRowLastColumn="0" w:lastRowFirstColumn="0" w:lastRowLastColumn="0"/>
-            <w:tcW w:w="0" w:type="auto"/>
-          </w:tcPr>
-          <w:p>
-            <w:pPr>
-              <w:rPr>
-                <w:b w:val="0"/>
-                <w:bCs w:val="0"/>
-              </w:rPr>
-            </w:pPr>
-            <w:r>
-              <w:rPr>
-                <w:b w:val="0"/>
-                <w:bCs w:val="0"/>
-              </w:rPr>
-              <w:t>upper-in</w:t>
             </w:r>
           </w:p>
         </w:tc>
@@ -29545,6 +29584,43 @@
                 <w:b w:val="0"/>
                 <w:bCs w:val="0"/>
               </w:rPr>
+              <w:t>upper-in</w:t>
+            </w:r>
+          </w:p>
+        </w:tc>
+        <w:tc>
+          <w:tcPr>
+            <w:tcW w:w="0" w:type="auto"/>
+          </w:tcPr>
+          <w:p>
+            <w:pPr>
+              <w:pStyle w:val="NoSpacing"/>
+              <w:cnfStyle w:val="000000100000" w:firstRow="0" w:lastRow="0" w:firstColumn="0" w:lastColumn="0" w:oddVBand="0" w:evenVBand="0" w:oddHBand="1" w:evenHBand="0" w:firstRowFirstColumn="0" w:firstRowLastColumn="0" w:lastRowFirstColumn="0" w:lastRowLastColumn="0"/>
+            </w:pPr>
+            <w:r>
+              <w:t>The lower mapped pixel value of the input image</w:t>
+            </w:r>
+          </w:p>
+        </w:tc>
+      </w:tr>
+      <w:tr>
+        <w:tc>
+          <w:tcPr>
+            <w:cnfStyle w:val="001000000000" w:firstRow="0" w:lastRow="0" w:firstColumn="1" w:lastColumn="0" w:oddVBand="0" w:evenVBand="0" w:oddHBand="0" w:evenHBand="0" w:firstRowFirstColumn="0" w:firstRowLastColumn="0" w:lastRowFirstColumn="0" w:lastRowLastColumn="0"/>
+            <w:tcW w:w="0" w:type="auto"/>
+          </w:tcPr>
+          <w:p>
+            <w:pPr>
+              <w:rPr>
+                <w:b w:val="0"/>
+                <w:bCs w:val="0"/>
+              </w:rPr>
+            </w:pPr>
+            <w:r>
+              <w:rPr>
+                <w:b w:val="0"/>
+                <w:bCs w:val="0"/>
+              </w:rPr>
               <w:t>lower-out</w:t>
             </w:r>
           </w:p>
@@ -29556,44 +29632,47 @@
           <w:p>
             <w:pPr>
               <w:pStyle w:val="NoSpacing"/>
+              <w:cnfStyle w:val="000000000000" w:firstRow="0" w:lastRow="0" w:firstColumn="0" w:lastColumn="0" w:oddVBand="0" w:evenVBand="0" w:oddHBand="0" w:evenHBand="0" w:firstRowFirstColumn="0" w:firstRowLastColumn="0" w:lastRowFirstColumn="0" w:lastRowLastColumn="0"/>
+            </w:pPr>
+            <w:r>
+              <w:t>The lower mapped pixel value of the output image</w:t>
+            </w:r>
+          </w:p>
+        </w:tc>
+      </w:tr>
+      <w:tr>
+        <w:trPr>
+          <w:cnfStyle w:val="000000100000" w:firstRow="0" w:lastRow="0" w:firstColumn="0" w:lastColumn="0" w:oddVBand="0" w:evenVBand="0" w:oddHBand="1" w:evenHBand="0" w:firstRowFirstColumn="0" w:firstRowLastColumn="0" w:lastRowFirstColumn="0" w:lastRowLastColumn="0"/>
+        </w:trPr>
+        <w:tc>
+          <w:tcPr>
+            <w:cnfStyle w:val="001000000000" w:firstRow="0" w:lastRow="0" w:firstColumn="1" w:lastColumn="0" w:oddVBand="0" w:evenVBand="0" w:oddHBand="0" w:evenHBand="0" w:firstRowFirstColumn="0" w:firstRowLastColumn="0" w:lastRowFirstColumn="0" w:lastRowLastColumn="0"/>
+            <w:tcW w:w="0" w:type="auto"/>
+          </w:tcPr>
+          <w:p>
+            <w:pPr>
+              <w:rPr>
+                <w:b w:val="0"/>
+                <w:bCs w:val="0"/>
+              </w:rPr>
+            </w:pPr>
+            <w:r>
+              <w:rPr>
+                <w:b w:val="0"/>
+                <w:bCs w:val="0"/>
+              </w:rPr>
+              <w:t>upper-out</w:t>
+            </w:r>
+          </w:p>
+        </w:tc>
+        <w:tc>
+          <w:tcPr>
+            <w:tcW w:w="0" w:type="auto"/>
+          </w:tcPr>
+          <w:p>
+            <w:pPr>
+              <w:pStyle w:val="NoSpacing"/>
               <w:cnfStyle w:val="000000100000" w:firstRow="0" w:lastRow="0" w:firstColumn="0" w:lastColumn="0" w:oddVBand="0" w:evenVBand="0" w:oddHBand="1" w:evenHBand="0" w:firstRowFirstColumn="0" w:firstRowLastColumn="0" w:lastRowFirstColumn="0" w:lastRowLastColumn="0"/>
-            </w:pPr>
-            <w:r>
-              <w:t>The lower mapped pixel value of the output image</w:t>
-            </w:r>
-          </w:p>
-        </w:tc>
-      </w:tr>
-      <w:tr>
-        <w:tc>
-          <w:tcPr>
-            <w:cnfStyle w:val="001000000000" w:firstRow="0" w:lastRow="0" w:firstColumn="1" w:lastColumn="0" w:oddVBand="0" w:evenVBand="0" w:oddHBand="0" w:evenHBand="0" w:firstRowFirstColumn="0" w:firstRowLastColumn="0" w:lastRowFirstColumn="0" w:lastRowLastColumn="0"/>
-            <w:tcW w:w="0" w:type="auto"/>
-          </w:tcPr>
-          <w:p>
-            <w:pPr>
-              <w:rPr>
-                <w:b w:val="0"/>
-                <w:bCs w:val="0"/>
-              </w:rPr>
-            </w:pPr>
-            <w:r>
-              <w:rPr>
-                <w:b w:val="0"/>
-                <w:bCs w:val="0"/>
-              </w:rPr>
-              <w:t>upper-out</w:t>
-            </w:r>
-          </w:p>
-        </w:tc>
-        <w:tc>
-          <w:tcPr>
-            <w:tcW w:w="0" w:type="auto"/>
-          </w:tcPr>
-          <w:p>
-            <w:pPr>
-              <w:pStyle w:val="NoSpacing"/>
-              <w:cnfStyle w:val="000000000000" w:firstRow="0" w:lastRow="0" w:firstColumn="0" w:lastColumn="0" w:oddVBand="0" w:evenVBand="0" w:oddHBand="0" w:evenHBand="0" w:firstRowFirstColumn="0" w:firstRowLastColumn="0" w:lastRowFirstColumn="0" w:lastRowLastColumn="0"/>
             </w:pPr>
             <w:r>
               <w:t>The upper mapped pixel value of the output image</w:t>
@@ -30167,7 +30246,7 @@
       <w:rPr>
         <w:noProof/>
       </w:rPr>
-      <w:t>8/19/2022 1:44 PM</w:t>
+      <w:t>8/19/2022 5:53 PM</w:t>
     </w:r>
     <w:r>
       <w:fldChar w:fldCharType="end"/>
@@ -30225,7 +30304,7 @@
       <w:rPr>
         <w:noProof/>
       </w:rPr>
-      <w:t>8/19/2022 1:44 PM</w:t>
+      <w:t>8/19/2022 5:53 PM</w:t>
     </w:r>
     <w:r>
       <w:fldChar w:fldCharType="end"/>
@@ -30233,11 +30312,21 @@
     <w:r>
       <w:tab/>
     </w:r>
-    <w:fldSimple w:instr="DOCPROPERTY  Version  \* MERGEFORMAT">
-      <w:r>
-        <w:t>v0.2</w:t>
-      </w:r>
-    </w:fldSimple>
+    <w:r>
+      <w:fldChar w:fldCharType="begin"/>
+    </w:r>
+    <w:r>
+      <w:instrText>DOCPROPERTY  Version  \* MERGEFORMAT</w:instrText>
+    </w:r>
+    <w:r>
+      <w:fldChar w:fldCharType="separate"/>
+    </w:r>
+    <w:r>
+      <w:t>v0.2</w:t>
+    </w:r>
+    <w:r>
+      <w:fldChar w:fldCharType="end"/>
+    </w:r>
     <w:r>
       <w:tab/>
       <w:t xml:space="preserve">Page </w:t>

</xml_diff>

<commit_message>
new laptop cv-workbench manual
</commit_message>
<xml_diff>
--- a/doc/cv-workbench manual.docx
+++ b/doc/cv-workbench manual.docx
@@ -29,7 +29,7 @@
     </w:p>
     <w:p>
       <w:r>
-        <w:t xml:space="preserve">The CV-Workbench is a framework to perform image processing experiments using scripts. Users define scripts that are experiments with multiple image processing operator steps that process input data and store outputs. Scripts allow easily reproducing experiments with different data. The advantages of the system are: </w:t>
+        <w:t>The CV-Workbench is a framework to perform image processing experiments using scripts. Users define scripts that are experiments with multiple image processing operator steps that process input data and store outputs. Scripts allow easily reproducing experiments with different data. The advantages of the system are: new laptop</w:t>
       </w:r>
     </w:p>
     <w:p>
@@ -27224,7 +27224,7 @@
       <w:rPr>
         <w:noProof/>
       </w:rPr>
-      <w:t>8/20/2022 11:17 AM</w:t>
+      <w:t>8/20/2022 11:31 AM</w:t>
     </w:r>
     <w:r>
       <w:fldChar w:fldCharType="end"/>
@@ -27282,7 +27282,7 @@
       <w:rPr>
         <w:noProof/>
       </w:rPr>
-      <w:t>8/20/2022 11:17 AM</w:t>
+      <w:t>8/20/2022 11:31 AM</w:t>
     </w:r>
     <w:r>
       <w:fldChar w:fldCharType="end"/>

</xml_diff>

<commit_message>
old laptop cv workbench manual
</commit_message>
<xml_diff>
--- a/doc/cv-workbench manual.docx
+++ b/doc/cv-workbench manual.docx
@@ -29,7 +29,13 @@
     </w:p>
     <w:p>
       <w:r>
-        <w:t>The CV-Workbench is a framework to perform image processing experiments using scripts. Users define scripts that are experiments with multiple image processing operator steps that process input data and store outputs. Scripts allow easily reproducing experiments with different data. The advantages of the system are: new2 laptop</w:t>
+        <w:t xml:space="preserve">The CV-Workbench is a framework to perform image processing experiments using scripts. Users define scripts that are experiments with multiple image processing operator steps that process input data and store outputs. Scripts allow easily reproducing experiments with different data. The advantages of the system are: </w:t>
+      </w:r>
+      <w:r>
+        <w:t>old3</w:t>
+      </w:r>
+      <w:r>
+        <w:t xml:space="preserve"> laptop</w:t>
       </w:r>
     </w:p>
     <w:p>
@@ -176,6 +182,7 @@
         <w:pStyle w:val="Heading1"/>
       </w:pPr>
       <w:r>
+        <w:lastRenderedPageBreak/>
         <w:t>Operators</w:t>
       </w:r>
     </w:p>
@@ -1054,6 +1061,7 @@
         </w:numPr>
       </w:pPr>
       <w:r>
+        <w:lastRenderedPageBreak/>
         <w:t xml:space="preserve">One or more output image or other types of data </w:t>
       </w:r>
     </w:p>
@@ -1816,6 +1824,7 @@
                 <w:sz w:val="20"/>
                 <w:szCs w:val="20"/>
               </w:rPr>
+              <w:lastRenderedPageBreak/>
               <w:t>CV_8U has value 0</w:t>
             </w:r>
           </w:p>
@@ -1873,6 +1882,7 @@
                 <w:b w:val="0"/>
                 <w:bCs w:val="0"/>
               </w:rPr>
+              <w:lastRenderedPageBreak/>
               <w:t>image data</w:t>
             </w:r>
           </w:p>
@@ -2384,6 +2394,7 @@
         </w:rPr>
       </w:pPr>
       <w:r>
+        <w:lastRenderedPageBreak/>
         <w:t xml:space="preserve">  </w:t>
       </w:r>
       <w:r>
@@ -3009,6 +3020,7 @@
         <w:pStyle w:val="Heading3"/>
       </w:pPr>
       <w:r>
+        <w:lastRenderedPageBreak/>
         <w:t>Hough accumulator data text file format</w:t>
       </w:r>
     </w:p>
@@ -3723,6 +3735,7 @@
           <w:i/>
           <w:iCs/>
         </w:rPr>
+        <w:lastRenderedPageBreak/>
         <w:tab/>
         <w:t xml:space="preserve">    input-data-descriptors</w:t>
       </w:r>
@@ -4553,6 +4566,7 @@
         <w:pStyle w:val="Heading2"/>
       </w:pPr>
       <w:r>
+        <w:lastRenderedPageBreak/>
         <w:t>Filesystem data repository</w:t>
       </w:r>
     </w:p>
@@ -5429,6 +5443,7 @@
           <w:i/>
           <w:iCs/>
         </w:rPr>
+        <w:lastRenderedPageBreak/>
         <w:tab/>
         <w:t xml:space="preserve">    input-data-descriptors</w:t>
       </w:r>
@@ -6183,6 +6198,7 @@
           <w:sz w:val="16"/>
           <w:szCs w:val="16"/>
         </w:rPr>
+        <w:lastRenderedPageBreak/>
         <w:tab/>
         <w:t xml:space="preserve">      "type": "image",</w:t>
       </w:r>
@@ -7284,6 +7300,7 @@
           <w:sz w:val="16"/>
           <w:szCs w:val="16"/>
         </w:rPr>
+        <w:lastRenderedPageBreak/>
         <w:tab/>
         <w:t xml:space="preserve">      "ext": "jpg"</w:t>
       </w:r>
@@ -8852,6 +8869,7 @@
                 <w:b w:val="0"/>
                 <w:bCs w:val="0"/>
               </w:rPr>
+              <w:lastRenderedPageBreak/>
               <w:t>Histogram</w:t>
             </w:r>
           </w:p>
@@ -10286,6 +10304,7 @@
           </w:tcPr>
           <w:p>
             <w:r>
+              <w:lastRenderedPageBreak/>
               <w:t>Descriptor type</w:t>
             </w:r>
           </w:p>
@@ -11534,6 +11553,7 @@
         <w:pStyle w:val="Normalafterlist"/>
       </w:pPr>
       <w:r>
+        <w:lastRenderedPageBreak/>
         <w:t>The experiment log output includes the output image pixel statistics:</w:t>
       </w:r>
     </w:p>
@@ -12818,6 +12838,7 @@
                 <w:b w:val="0"/>
                 <w:bCs w:val="0"/>
               </w:rPr>
+              <w:lastRenderedPageBreak/>
               <w:t>pixel standard deviation</w:t>
             </w:r>
           </w:p>
@@ -13867,7 +13888,11 @@
         <w:t xml:space="preserve">structuring element </w:t>
       </w:r>
       <w:r>
-        <w:t xml:space="preserve">at each pixel position and decides as to what output value to produce. Erosion selects the minimum value under the mask and dilation selects the maximum value. This will give the appropriate result for both binary and grayscale images. The operator produce output images of the same depth as the input images. </w:t>
+        <w:t xml:space="preserve">at each pixel position and decides as to what output value to produce. Erosion selects the minimum value under the mask and dilation selects the maximum value. This will give the </w:t>
+      </w:r>
+      <w:r>
+        <w:lastRenderedPageBreak/>
+        <w:t xml:space="preserve">appropriate result for both binary and grayscale images. The operator produce output images of the same depth as the input images. </w:t>
       </w:r>
     </w:p>
     <w:tbl>
@@ -15229,6 +15254,7 @@
         <w:pStyle w:val="Heading2"/>
       </w:pPr>
       <w:r>
+        <w:lastRenderedPageBreak/>
         <w:t>filter-smooth-average Operator</w:t>
       </w:r>
     </w:p>
@@ -16374,6 +16400,7 @@
             <w:rPr>
               <w:rFonts w:ascii="Cambria Math" w:hAnsi="Cambria Math"/>
             </w:rPr>
+            <w:lastRenderedPageBreak/>
             <m:t>G</m:t>
           </m:r>
           <m:d>
@@ -17702,6 +17729,7 @@
                 <w:b w:val="0"/>
                 <w:bCs w:val="0"/>
               </w:rPr>
+              <w:lastRenderedPageBreak/>
               <w:t>output</w:t>
             </w:r>
           </w:p>
@@ -18744,6 +18772,7 @@
                 <w:b w:val="0"/>
                 <w:bCs w:val="0"/>
               </w:rPr>
+              <w:lastRenderedPageBreak/>
               <w:t>lower-value</w:t>
             </w:r>
           </w:p>
@@ -20131,6 +20160,7 @@
                 <w:b w:val="0"/>
                 <w:bCs w:val="0"/>
               </w:rPr>
+              <w:lastRenderedPageBreak/>
               <w:t>output</w:t>
             </w:r>
           </w:p>
@@ -21115,6 +21145,7 @@
                 <w:b w:val="0"/>
                 <w:bCs w:val="0"/>
               </w:rPr>
+              <w:lastRenderedPageBreak/>
               <w:t>start-col</w:t>
             </w:r>
           </w:p>
@@ -22177,6 +22208,7 @@
     </w:p>
     <w:p>
       <w:r>
+        <w:lastRenderedPageBreak/>
         <w:t>The operator takes the following data descriptors:</w:t>
       </w:r>
     </w:p>
@@ -23459,6 +23491,7 @@
                 <w:b w:val="0"/>
                 <w:bCs w:val="0"/>
               </w:rPr>
+              <w:lastRenderedPageBreak/>
               <w:t>depth</w:t>
             </w:r>
           </w:p>
@@ -24544,6 +24577,7 @@
                 <w:sz w:val="20"/>
                 <w:szCs w:val="20"/>
               </w:rPr>
+              <w:lastRenderedPageBreak/>
               <w:t>CV_32F</w:t>
             </w:r>
           </w:p>
@@ -24571,6 +24605,7 @@
                 <w:b w:val="0"/>
                 <w:bCs w:val="0"/>
               </w:rPr>
+              <w:lastRenderedPageBreak/>
               <w:t>pixel count</w:t>
             </w:r>
           </w:p>
@@ -25421,6 +25456,7 @@
           <w:sz w:val="18"/>
           <w:szCs w:val="18"/>
         </w:rPr>
+        <w:lastRenderedPageBreak/>
         <w:t>“point”: “(</w:t>
       </w:r>
       <w:r>
@@ -26699,6 +26735,7 @@
         <w:pStyle w:val="Normalafterlist"/>
       </w:pPr>
       <w:r>
+        <w:lastRenderedPageBreak/>
         <w:t>If lower_in or lower_out are omitted, they default to the lowest input image pixel value or highest input image pixel value.</w:t>
       </w:r>
     </w:p>
@@ -27224,7 +27261,7 @@
       <w:rPr>
         <w:noProof/>
       </w:rPr>
-      <w:t>8/20/2022 11:50 AM</w:t>
+      <w:t>8/20/2022 11:51 AM</w:t>
     </w:r>
     <w:r>
       <w:fldChar w:fldCharType="end"/>
@@ -27282,7 +27319,7 @@
       <w:rPr>
         <w:noProof/>
       </w:rPr>
-      <w:t>8/20/2022 11:50 AM</w:t>
+      <w:t>8/20/2022 11:51 AM</w:t>
     </w:r>
     <w:r>
       <w:fldChar w:fldCharType="end"/>

</xml_diff>

<commit_message>
new 1laptop cv-workbench manual
</commit_message>
<xml_diff>
--- a/doc/cv-workbench manual.docx
+++ b/doc/cv-workbench manual.docx
@@ -29,13 +29,7 @@
     </w:p>
     <w:p>
       <w:r>
-        <w:t xml:space="preserve">The CV-Workbench is a framework to perform image processing experiments using scripts. Users define scripts that are experiments with multiple image processing operator steps that process input data and store outputs. Scripts allow easily reproducing experiments with different data. The advantages of the system are: </w:t>
-      </w:r>
-      <w:r>
-        <w:t>old3</w:t>
-      </w:r>
-      <w:r>
-        <w:t xml:space="preserve"> laptop</w:t>
+        <w:t>The CV-Workbench is a framework to perform image processing experiments using scripts. Users define scripts that are experiments with multiple image processing operator steps that process input data and store outputs. Scripts allow easily reproducing experiments with different data. The advantages of the system are:</w:t>
       </w:r>
     </w:p>
     <w:p>
@@ -182,7 +176,6 @@
         <w:pStyle w:val="Heading1"/>
       </w:pPr>
       <w:r>
-        <w:lastRenderedPageBreak/>
         <w:t>Operators</w:t>
       </w:r>
     </w:p>
@@ -1061,7 +1054,6 @@
         </w:numPr>
       </w:pPr>
       <w:r>
-        <w:lastRenderedPageBreak/>
         <w:t xml:space="preserve">One or more output image or other types of data </w:t>
       </w:r>
     </w:p>
@@ -1824,7 +1816,6 @@
                 <w:sz w:val="20"/>
                 <w:szCs w:val="20"/>
               </w:rPr>
-              <w:lastRenderedPageBreak/>
               <w:t>CV_8U has value 0</w:t>
             </w:r>
           </w:p>
@@ -1882,7 +1873,6 @@
                 <w:b w:val="0"/>
                 <w:bCs w:val="0"/>
               </w:rPr>
-              <w:lastRenderedPageBreak/>
               <w:t>image data</w:t>
             </w:r>
           </w:p>
@@ -2394,7 +2384,6 @@
         </w:rPr>
       </w:pPr>
       <w:r>
-        <w:lastRenderedPageBreak/>
         <w:t xml:space="preserve">  </w:t>
       </w:r>
       <w:r>
@@ -3020,7 +3009,6 @@
         <w:pStyle w:val="Heading3"/>
       </w:pPr>
       <w:r>
-        <w:lastRenderedPageBreak/>
         <w:t>Hough accumulator data text file format</w:t>
       </w:r>
     </w:p>
@@ -3735,7 +3723,6 @@
           <w:i/>
           <w:iCs/>
         </w:rPr>
-        <w:lastRenderedPageBreak/>
         <w:tab/>
         <w:t xml:space="preserve">    input-data-descriptors</w:t>
       </w:r>
@@ -4566,7 +4553,6 @@
         <w:pStyle w:val="Heading2"/>
       </w:pPr>
       <w:r>
-        <w:lastRenderedPageBreak/>
         <w:t>Filesystem data repository</w:t>
       </w:r>
     </w:p>
@@ -5443,7 +5429,6 @@
           <w:i/>
           <w:iCs/>
         </w:rPr>
-        <w:lastRenderedPageBreak/>
         <w:tab/>
         <w:t xml:space="preserve">    input-data-descriptors</w:t>
       </w:r>
@@ -6198,7 +6183,6 @@
           <w:sz w:val="16"/>
           <w:szCs w:val="16"/>
         </w:rPr>
-        <w:lastRenderedPageBreak/>
         <w:tab/>
         <w:t xml:space="preserve">      "type": "image",</w:t>
       </w:r>
@@ -7300,7 +7284,6 @@
           <w:sz w:val="16"/>
           <w:szCs w:val="16"/>
         </w:rPr>
-        <w:lastRenderedPageBreak/>
         <w:tab/>
         <w:t xml:space="preserve">      "ext": "jpg"</w:t>
       </w:r>
@@ -8869,7 +8852,6 @@
                 <w:b w:val="0"/>
                 <w:bCs w:val="0"/>
               </w:rPr>
-              <w:lastRenderedPageBreak/>
               <w:t>Histogram</w:t>
             </w:r>
           </w:p>
@@ -10304,7 +10286,6 @@
           </w:tcPr>
           <w:p>
             <w:r>
-              <w:lastRenderedPageBreak/>
               <w:t>Descriptor type</w:t>
             </w:r>
           </w:p>
@@ -11553,7 +11534,6 @@
         <w:pStyle w:val="Normalafterlist"/>
       </w:pPr>
       <w:r>
-        <w:lastRenderedPageBreak/>
         <w:t>The experiment log output includes the output image pixel statistics:</w:t>
       </w:r>
     </w:p>
@@ -12838,7 +12818,6 @@
                 <w:b w:val="0"/>
                 <w:bCs w:val="0"/>
               </w:rPr>
-              <w:lastRenderedPageBreak/>
               <w:t>pixel standard deviation</w:t>
             </w:r>
           </w:p>
@@ -13888,11 +13867,7 @@
         <w:t xml:space="preserve">structuring element </w:t>
       </w:r>
       <w:r>
-        <w:t xml:space="preserve">at each pixel position and decides as to what output value to produce. Erosion selects the minimum value under the mask and dilation selects the maximum value. This will give the </w:t>
-      </w:r>
-      <w:r>
-        <w:lastRenderedPageBreak/>
-        <w:t xml:space="preserve">appropriate result for both binary and grayscale images. The operator produce output images of the same depth as the input images. </w:t>
+        <w:t xml:space="preserve">at each pixel position and decides as to what output value to produce. Erosion selects the minimum value under the mask and dilation selects the maximum value. This will give the appropriate result for both binary and grayscale images. The operator produce output images of the same depth as the input images. </w:t>
       </w:r>
     </w:p>
     <w:tbl>
@@ -15254,7 +15229,6 @@
         <w:pStyle w:val="Heading2"/>
       </w:pPr>
       <w:r>
-        <w:lastRenderedPageBreak/>
         <w:t>filter-smooth-average Operator</w:t>
       </w:r>
     </w:p>
@@ -16400,7 +16374,6 @@
             <w:rPr>
               <w:rFonts w:ascii="Cambria Math" w:hAnsi="Cambria Math"/>
             </w:rPr>
-            <w:lastRenderedPageBreak/>
             <m:t>G</m:t>
           </m:r>
           <m:d>
@@ -17729,7 +17702,6 @@
                 <w:b w:val="0"/>
                 <w:bCs w:val="0"/>
               </w:rPr>
-              <w:lastRenderedPageBreak/>
               <w:t>output</w:t>
             </w:r>
           </w:p>
@@ -18772,7 +18744,6 @@
                 <w:b w:val="0"/>
                 <w:bCs w:val="0"/>
               </w:rPr>
-              <w:lastRenderedPageBreak/>
               <w:t>lower-value</w:t>
             </w:r>
           </w:p>
@@ -20160,7 +20131,6 @@
                 <w:b w:val="0"/>
                 <w:bCs w:val="0"/>
               </w:rPr>
-              <w:lastRenderedPageBreak/>
               <w:t>output</w:t>
             </w:r>
           </w:p>
@@ -21145,7 +21115,6 @@
                 <w:b w:val="0"/>
                 <w:bCs w:val="0"/>
               </w:rPr>
-              <w:lastRenderedPageBreak/>
               <w:t>start-col</w:t>
             </w:r>
           </w:p>
@@ -22208,7 +22177,6 @@
     </w:p>
     <w:p>
       <w:r>
-        <w:lastRenderedPageBreak/>
         <w:t>The operator takes the following data descriptors:</w:t>
       </w:r>
     </w:p>
@@ -23491,7 +23459,6 @@
                 <w:b w:val="0"/>
                 <w:bCs w:val="0"/>
               </w:rPr>
-              <w:lastRenderedPageBreak/>
               <w:t>depth</w:t>
             </w:r>
           </w:p>
@@ -24577,7 +24544,6 @@
                 <w:sz w:val="20"/>
                 <w:szCs w:val="20"/>
               </w:rPr>
-              <w:lastRenderedPageBreak/>
               <w:t>CV_32F</w:t>
             </w:r>
           </w:p>
@@ -24605,7 +24571,6 @@
                 <w:b w:val="0"/>
                 <w:bCs w:val="0"/>
               </w:rPr>
-              <w:lastRenderedPageBreak/>
               <w:t>pixel count</w:t>
             </w:r>
           </w:p>
@@ -25456,7 +25421,6 @@
           <w:sz w:val="18"/>
           <w:szCs w:val="18"/>
         </w:rPr>
-        <w:lastRenderedPageBreak/>
         <w:t>“point”: “(</w:t>
       </w:r>
       <w:r>
@@ -26735,7 +26699,6 @@
         <w:pStyle w:val="Normalafterlist"/>
       </w:pPr>
       <w:r>
-        <w:lastRenderedPageBreak/>
         <w:t>If lower_in or lower_out are omitted, they default to the lowest input image pixel value or highest input image pixel value.</w:t>
       </w:r>
     </w:p>
@@ -27261,7 +27224,7 @@
       <w:rPr>
         <w:noProof/>
       </w:rPr>
-      <w:t>8/20/2022 11:51 AM</w:t>
+      <w:t>8/20/2022 11:52 AM</w:t>
     </w:r>
     <w:r>
       <w:fldChar w:fldCharType="end"/>
@@ -27319,7 +27282,7 @@
       <w:rPr>
         <w:noProof/>
       </w:rPr>
-      <w:t>8/20/2022 11:51 AM</w:t>
+      <w:t>8/20/2022 11:52 AM</w:t>
     </w:r>
     <w:r>
       <w:fldChar w:fldCharType="end"/>

</xml_diff>

<commit_message>
refactored subimage not tested
</commit_message>
<xml_diff>
--- a/doc/cv-workbench manual.docx
+++ b/doc/cv-workbench manual.docx
@@ -92,10 +92,7 @@
         <w:t xml:space="preserve"> </w:t>
       </w:r>
       <w:r>
-        <w:t>easily</w:t>
-      </w:r>
-      <w:r>
-        <w:t xml:space="preserve"> reused </w:t>
+        <w:t xml:space="preserve">easily reused </w:t>
       </w:r>
       <w:r>
         <w:t>for different applications</w:t>
@@ -3640,16 +3637,7 @@
     </w:p>
     <w:p>
       <w:r>
-        <w:t xml:space="preserve">Scripts are a series of image processing operations </w:t>
-      </w:r>
-      <w:r>
-        <w:t xml:space="preserve">Scripts are written in JSON format to define the </w:t>
-      </w:r>
-      <w:r>
-        <w:t>operations performed</w:t>
-      </w:r>
-      <w:r>
-        <w:t xml:space="preserve"> in an experiment. </w:t>
+        <w:t xml:space="preserve">Scripts are a series of image processing operations Scripts are written in JSON format to define the operations performed in an experiment. </w:t>
       </w:r>
     </w:p>
     <w:p>
@@ -4563,10 +4551,7 @@
               <w:cnfStyle w:val="000000000000" w:firstRow="0" w:lastRow="0" w:firstColumn="0" w:lastColumn="0" w:oddVBand="0" w:evenVBand="0" w:oddHBand="0" w:evenHBand="0" w:firstRowFirstColumn="0" w:firstRowLastColumn="0" w:lastRowFirstColumn="0" w:lastRowLastColumn="0"/>
             </w:pPr>
             <w:r>
-              <w:t>“</w:t>
-            </w:r>
-            <w:r>
-              <w:t>binary” for binary Hough peak line data</w:t>
+              <w:t>“binary” for binary Hough peak line data</w:t>
             </w:r>
           </w:p>
           <w:p>
@@ -12181,6 +12166,7 @@
       </w:tblPr>
       <w:tblGrid>
         <w:gridCol w:w="1280"/>
+        <w:gridCol w:w="1659"/>
         <w:gridCol w:w="6328"/>
       </w:tblGrid>
       <w:tr>
@@ -12209,6 +12195,19 @@
               <w:cnfStyle w:val="100000000000" w:firstRow="1" w:lastRow="0" w:firstColumn="0" w:lastColumn="0" w:oddVBand="0" w:evenVBand="0" w:oddHBand="0" w:evenHBand="0" w:firstRowFirstColumn="0" w:firstRowLastColumn="0" w:lastRowFirstColumn="0" w:lastRowLastColumn="0"/>
             </w:pPr>
             <w:r>
+              <w:t>default</w:t>
+            </w:r>
+          </w:p>
+        </w:tc>
+        <w:tc>
+          <w:tcPr>
+            <w:tcW w:w="0" w:type="auto"/>
+          </w:tcPr>
+          <w:p>
+            <w:pPr>
+              <w:cnfStyle w:val="100000000000" w:firstRow="1" w:lastRow="0" w:firstColumn="0" w:lastColumn="0" w:oddVBand="0" w:evenVBand="0" w:oddHBand="0" w:evenHBand="0" w:firstRowFirstColumn="0" w:firstRowLastColumn="0" w:lastRowFirstColumn="0" w:lastRowLastColumn="0"/>
+            </w:pPr>
+            <w:r>
               <w:t>description</w:t>
             </w:r>
           </w:p>
@@ -12248,7 +12247,265 @@
               <w:cnfStyle w:val="000000100000" w:firstRow="0" w:lastRow="0" w:firstColumn="0" w:lastColumn="0" w:oddVBand="0" w:evenVBand="0" w:oddHBand="1" w:evenHBand="0" w:firstRowFirstColumn="0" w:firstRowLastColumn="0" w:lastRowFirstColumn="0" w:lastRowLastColumn="0"/>
             </w:pPr>
             <w:r>
+              <w:t>required</w:t>
+            </w:r>
+          </w:p>
+        </w:tc>
+        <w:tc>
+          <w:tcPr>
+            <w:tcW w:w="0" w:type="auto"/>
+          </w:tcPr>
+          <w:p>
+            <w:pPr>
+              <w:cnfStyle w:val="000000100000" w:firstRow="0" w:lastRow="0" w:firstColumn="0" w:lastColumn="0" w:oddVBand="0" w:evenVBand="0" w:oddHBand="1" w:evenHBand="0" w:firstRowFirstColumn="0" w:firstRowLastColumn="0" w:lastRowFirstColumn="0" w:lastRowLastColumn="0"/>
+            </w:pPr>
+            <w:r>
               <w:t>“N”, “NW”, “W”, “SW”, “S”, “SE”, “E”, or “NE” direction as above</w:t>
+            </w:r>
+          </w:p>
+        </w:tc>
+      </w:tr>
+      <w:tr>
+        <w:tc>
+          <w:tcPr>
+            <w:cnfStyle w:val="001000000000" w:firstRow="0" w:lastRow="0" w:firstColumn="1" w:lastColumn="0" w:oddVBand="0" w:evenVBand="0" w:oddHBand="0" w:evenHBand="0" w:firstRowFirstColumn="0" w:firstRowLastColumn="0" w:lastRowFirstColumn="0" w:lastRowLastColumn="0"/>
+            <w:tcW w:w="0" w:type="auto"/>
+          </w:tcPr>
+          <w:p>
+            <w:pPr>
+              <w:rPr>
+                <w:b w:val="0"/>
+                <w:bCs w:val="0"/>
+              </w:rPr>
+            </w:pPr>
+            <w:r>
+              <w:rPr>
+                <w:b w:val="0"/>
+                <w:bCs w:val="0"/>
+              </w:rPr>
+              <w:t>min-row</w:t>
+            </w:r>
+          </w:p>
+        </w:tc>
+        <w:tc>
+          <w:tcPr>
+            <w:tcW w:w="0" w:type="auto"/>
+          </w:tcPr>
+          <w:p>
+            <w:pPr>
+              <w:cnfStyle w:val="000000000000" w:firstRow="0" w:lastRow="0" w:firstColumn="0" w:lastColumn="0" w:oddVBand="0" w:evenVBand="0" w:oddHBand="0" w:evenHBand="0" w:firstRowFirstColumn="0" w:firstRowLastColumn="0" w:lastRowFirstColumn="0" w:lastRowLastColumn="0"/>
+            </w:pPr>
+            <w:r>
+              <w:t>0</w:t>
+            </w:r>
+          </w:p>
+        </w:tc>
+        <w:tc>
+          <w:tcPr>
+            <w:tcW w:w="0" w:type="auto"/>
+          </w:tcPr>
+          <w:p>
+            <w:pPr>
+              <w:cnfStyle w:val="000000000000" w:firstRow="0" w:lastRow="0" w:firstColumn="0" w:lastColumn="0" w:oddVBand="0" w:evenVBand="0" w:oddHBand="0" w:evenHBand="0" w:firstRowFirstColumn="0" w:firstRowLastColumn="0" w:lastRowFirstColumn="0" w:lastRowLastColumn="0"/>
+            </w:pPr>
+            <w:r>
+              <w:t>minimum sub-image row</w:t>
+            </w:r>
+          </w:p>
+        </w:tc>
+      </w:tr>
+      <w:tr>
+        <w:trPr>
+          <w:cnfStyle w:val="000000100000" w:firstRow="0" w:lastRow="0" w:firstColumn="0" w:lastColumn="0" w:oddVBand="0" w:evenVBand="0" w:oddHBand="1" w:evenHBand="0" w:firstRowFirstColumn="0" w:firstRowLastColumn="0" w:lastRowFirstColumn="0" w:lastRowLastColumn="0"/>
+        </w:trPr>
+        <w:tc>
+          <w:tcPr>
+            <w:cnfStyle w:val="001000000000" w:firstRow="0" w:lastRow="0" w:firstColumn="1" w:lastColumn="0" w:oddVBand="0" w:evenVBand="0" w:oddHBand="0" w:evenHBand="0" w:firstRowFirstColumn="0" w:firstRowLastColumn="0" w:lastRowFirstColumn="0" w:lastRowLastColumn="0"/>
+            <w:tcW w:w="0" w:type="auto"/>
+          </w:tcPr>
+          <w:p>
+            <w:pPr>
+              <w:rPr>
+                <w:b w:val="0"/>
+                <w:bCs w:val="0"/>
+              </w:rPr>
+            </w:pPr>
+            <w:r>
+              <w:rPr>
+                <w:b w:val="0"/>
+                <w:bCs w:val="0"/>
+              </w:rPr>
+              <w:t>m</w:t>
+            </w:r>
+            <w:r>
+              <w:rPr>
+                <w:b w:val="0"/>
+                <w:bCs w:val="0"/>
+              </w:rPr>
+              <w:t>ax</w:t>
+            </w:r>
+            <w:r>
+              <w:rPr>
+                <w:b w:val="0"/>
+                <w:bCs w:val="0"/>
+              </w:rPr>
+              <w:t>-row</w:t>
+            </w:r>
+          </w:p>
+        </w:tc>
+        <w:tc>
+          <w:tcPr>
+            <w:tcW w:w="0" w:type="auto"/>
+          </w:tcPr>
+          <w:p>
+            <w:pPr>
+              <w:cnfStyle w:val="000000100000" w:firstRow="0" w:lastRow="0" w:firstColumn="0" w:lastColumn="0" w:oddVBand="0" w:evenVBand="0" w:oddHBand="1" w:evenHBand="0" w:firstRowFirstColumn="0" w:firstRowLastColumn="0" w:lastRowFirstColumn="0" w:lastRowLastColumn="0"/>
+            </w:pPr>
+            <w:r>
+              <w:t>image rows - 1</w:t>
+            </w:r>
+          </w:p>
+        </w:tc>
+        <w:tc>
+          <w:tcPr>
+            <w:tcW w:w="0" w:type="auto"/>
+          </w:tcPr>
+          <w:p>
+            <w:pPr>
+              <w:cnfStyle w:val="000000100000" w:firstRow="0" w:lastRow="0" w:firstColumn="0" w:lastColumn="0" w:oddVBand="0" w:evenVBand="0" w:oddHBand="1" w:evenHBand="0" w:firstRowFirstColumn="0" w:firstRowLastColumn="0" w:lastRowFirstColumn="0" w:lastRowLastColumn="0"/>
+            </w:pPr>
+            <w:r>
+              <w:t>maximum</w:t>
+            </w:r>
+            <w:r>
+              <w:t xml:space="preserve"> sub-image row</w:t>
+            </w:r>
+          </w:p>
+        </w:tc>
+      </w:tr>
+      <w:tr>
+        <w:tc>
+          <w:tcPr>
+            <w:cnfStyle w:val="001000000000" w:firstRow="0" w:lastRow="0" w:firstColumn="1" w:lastColumn="0" w:oddVBand="0" w:evenVBand="0" w:oddHBand="0" w:evenHBand="0" w:firstRowFirstColumn="0" w:firstRowLastColumn="0" w:lastRowFirstColumn="0" w:lastRowLastColumn="0"/>
+            <w:tcW w:w="0" w:type="auto"/>
+          </w:tcPr>
+          <w:p>
+            <w:pPr>
+              <w:rPr>
+                <w:b w:val="0"/>
+                <w:bCs w:val="0"/>
+              </w:rPr>
+            </w:pPr>
+            <w:r>
+              <w:rPr>
+                <w:b w:val="0"/>
+                <w:bCs w:val="0"/>
+              </w:rPr>
+              <w:t>min-</w:t>
+            </w:r>
+            <w:r>
+              <w:rPr>
+                <w:b w:val="0"/>
+                <w:bCs w:val="0"/>
+              </w:rPr>
+              <w:t>col</w:t>
+            </w:r>
+          </w:p>
+        </w:tc>
+        <w:tc>
+          <w:tcPr>
+            <w:tcW w:w="0" w:type="auto"/>
+          </w:tcPr>
+          <w:p>
+            <w:pPr>
+              <w:cnfStyle w:val="000000000000" w:firstRow="0" w:lastRow="0" w:firstColumn="0" w:lastColumn="0" w:oddVBand="0" w:evenVBand="0" w:oddHBand="0" w:evenHBand="0" w:firstRowFirstColumn="0" w:firstRowLastColumn="0" w:lastRowFirstColumn="0" w:lastRowLastColumn="0"/>
+            </w:pPr>
+            <w:r>
+              <w:t>0</w:t>
+            </w:r>
+          </w:p>
+        </w:tc>
+        <w:tc>
+          <w:tcPr>
+            <w:tcW w:w="0" w:type="auto"/>
+          </w:tcPr>
+          <w:p>
+            <w:pPr>
+              <w:cnfStyle w:val="000000000000" w:firstRow="0" w:lastRow="0" w:firstColumn="0" w:lastColumn="0" w:oddVBand="0" w:evenVBand="0" w:oddHBand="0" w:evenHBand="0" w:firstRowFirstColumn="0" w:firstRowLastColumn="0" w:lastRowFirstColumn="0" w:lastRowLastColumn="0"/>
+            </w:pPr>
+            <w:r>
+              <w:t xml:space="preserve">minimum sub-image </w:t>
+            </w:r>
+            <w:r>
+              <w:t>column</w:t>
+            </w:r>
+          </w:p>
+        </w:tc>
+      </w:tr>
+      <w:tr>
+        <w:trPr>
+          <w:cnfStyle w:val="000000100000" w:firstRow="0" w:lastRow="0" w:firstColumn="0" w:lastColumn="0" w:oddVBand="0" w:evenVBand="0" w:oddHBand="1" w:evenHBand="0" w:firstRowFirstColumn="0" w:firstRowLastColumn="0" w:lastRowFirstColumn="0" w:lastRowLastColumn="0"/>
+        </w:trPr>
+        <w:tc>
+          <w:tcPr>
+            <w:cnfStyle w:val="001000000000" w:firstRow="0" w:lastRow="0" w:firstColumn="1" w:lastColumn="0" w:oddVBand="0" w:evenVBand="0" w:oddHBand="0" w:evenHBand="0" w:firstRowFirstColumn="0" w:firstRowLastColumn="0" w:lastRowFirstColumn="0" w:lastRowLastColumn="0"/>
+            <w:tcW w:w="0" w:type="auto"/>
+          </w:tcPr>
+          <w:p>
+            <w:pPr>
+              <w:rPr>
+                <w:b w:val="0"/>
+                <w:bCs w:val="0"/>
+              </w:rPr>
+            </w:pPr>
+            <w:r>
+              <w:rPr>
+                <w:b w:val="0"/>
+                <w:bCs w:val="0"/>
+              </w:rPr>
+              <w:t>max-</w:t>
+            </w:r>
+            <w:r>
+              <w:rPr>
+                <w:b w:val="0"/>
+                <w:bCs w:val="0"/>
+              </w:rPr>
+              <w:t>col</w:t>
+            </w:r>
+          </w:p>
+        </w:tc>
+        <w:tc>
+          <w:tcPr>
+            <w:tcW w:w="0" w:type="auto"/>
+          </w:tcPr>
+          <w:p>
+            <w:pPr>
+              <w:cnfStyle w:val="000000100000" w:firstRow="0" w:lastRow="0" w:firstColumn="0" w:lastColumn="0" w:oddVBand="0" w:evenVBand="0" w:oddHBand="1" w:evenHBand="0" w:firstRowFirstColumn="0" w:firstRowLastColumn="0" w:lastRowFirstColumn="0" w:lastRowLastColumn="0"/>
+            </w:pPr>
+            <w:r>
+              <w:t xml:space="preserve">image </w:t>
+            </w:r>
+            <w:r>
+              <w:t>col</w:t>
+            </w:r>
+            <w:r>
+              <w:t>s - 1</w:t>
+            </w:r>
+          </w:p>
+        </w:tc>
+        <w:tc>
+          <w:tcPr>
+            <w:tcW w:w="0" w:type="auto"/>
+          </w:tcPr>
+          <w:p>
+            <w:pPr>
+              <w:cnfStyle w:val="000000100000" w:firstRow="0" w:lastRow="0" w:firstColumn="0" w:lastColumn="0" w:oddVBand="0" w:evenVBand="0" w:oddHBand="1" w:evenHBand="0" w:firstRowFirstColumn="0" w:firstRowLastColumn="0" w:lastRowFirstColumn="0" w:lastRowLastColumn="0"/>
+            </w:pPr>
+            <w:r>
+              <w:t xml:space="preserve">maximum sub-image </w:t>
+            </w:r>
+            <w:r>
+              <w:t>column</w:t>
             </w:r>
           </w:p>
         </w:tc>
@@ -13407,6 +13664,7 @@
         <w:pStyle w:val="Normalafterlist"/>
       </w:pPr>
       <w:r>
+        <w:lastRenderedPageBreak/>
         <w:t>The parameter to the Prewitt operator is:</w:t>
       </w:r>
     </w:p>
@@ -13418,7 +13676,8 @@
       </w:tblPr>
       <w:tblGrid>
         <w:gridCol w:w="1280"/>
-        <w:gridCol w:w="3005"/>
+        <w:gridCol w:w="1659"/>
+        <w:gridCol w:w="3028"/>
       </w:tblGrid>
       <w:tr>
         <w:trPr>
@@ -13446,6 +13705,19 @@
               <w:cnfStyle w:val="100000000000" w:firstRow="1" w:lastRow="0" w:firstColumn="0" w:lastColumn="0" w:oddVBand="0" w:evenVBand="0" w:oddHBand="0" w:evenHBand="0" w:firstRowFirstColumn="0" w:firstRowLastColumn="0" w:lastRowFirstColumn="0" w:lastRowLastColumn="0"/>
             </w:pPr>
             <w:r>
+              <w:t>default</w:t>
+            </w:r>
+          </w:p>
+        </w:tc>
+        <w:tc>
+          <w:tcPr>
+            <w:tcW w:w="0" w:type="auto"/>
+          </w:tcPr>
+          <w:p>
+            <w:pPr>
+              <w:cnfStyle w:val="100000000000" w:firstRow="1" w:lastRow="0" w:firstColumn="0" w:lastColumn="0" w:oddVBand="0" w:evenVBand="0" w:oddHBand="0" w:evenHBand="0" w:firstRowFirstColumn="0" w:firstRowLastColumn="0" w:lastRowFirstColumn="0" w:lastRowLastColumn="0"/>
+            </w:pPr>
+            <w:r>
               <w:t>description</w:t>
             </w:r>
           </w:p>
@@ -13485,18 +13757,226 @@
               <w:cnfStyle w:val="000000100000" w:firstRow="0" w:lastRow="0" w:firstColumn="0" w:lastColumn="0" w:oddVBand="0" w:evenVBand="0" w:oddHBand="1" w:evenHBand="0" w:firstRowFirstColumn="0" w:firstRowLastColumn="0" w:lastRowFirstColumn="0" w:lastRowLastColumn="0"/>
             </w:pPr>
             <w:r>
+              <w:t>required</w:t>
+            </w:r>
+          </w:p>
+        </w:tc>
+        <w:tc>
+          <w:tcPr>
+            <w:tcW w:w="0" w:type="auto"/>
+          </w:tcPr>
+          <w:p>
+            <w:pPr>
+              <w:cnfStyle w:val="000000100000" w:firstRow="0" w:lastRow="0" w:firstColumn="0" w:lastColumn="0" w:oddVBand="0" w:evenVBand="0" w:oddHBand="1" w:evenHBand="0" w:firstRowFirstColumn="0" w:firstRowLastColumn="0" w:lastRowFirstColumn="0" w:lastRowLastColumn="0"/>
+            </w:pPr>
+            <w:r>
               <w:t>“0” or “90” degrees as above</w:t>
             </w:r>
           </w:p>
         </w:tc>
       </w:tr>
+      <w:tr>
+        <w:tc>
+          <w:tcPr>
+            <w:cnfStyle w:val="001000000000" w:firstRow="0" w:lastRow="0" w:firstColumn="1" w:lastColumn="0" w:oddVBand="0" w:evenVBand="0" w:oddHBand="0" w:evenHBand="0" w:firstRowFirstColumn="0" w:firstRowLastColumn="0" w:lastRowFirstColumn="0" w:lastRowLastColumn="0"/>
+            <w:tcW w:w="0" w:type="auto"/>
+          </w:tcPr>
+          <w:p>
+            <w:r>
+              <w:rPr>
+                <w:b w:val="0"/>
+                <w:bCs w:val="0"/>
+              </w:rPr>
+              <w:t>min-row</w:t>
+            </w:r>
+          </w:p>
+        </w:tc>
+        <w:tc>
+          <w:tcPr>
+            <w:tcW w:w="0" w:type="auto"/>
+          </w:tcPr>
+          <w:p>
+            <w:pPr>
+              <w:cnfStyle w:val="000000000000" w:firstRow="0" w:lastRow="0" w:firstColumn="0" w:lastColumn="0" w:oddVBand="0" w:evenVBand="0" w:oddHBand="0" w:evenHBand="0" w:firstRowFirstColumn="0" w:firstRowLastColumn="0" w:lastRowFirstColumn="0" w:lastRowLastColumn="0"/>
+            </w:pPr>
+            <w:r>
+              <w:t>0</w:t>
+            </w:r>
+          </w:p>
+        </w:tc>
+        <w:tc>
+          <w:tcPr>
+            <w:tcW w:w="0" w:type="auto"/>
+          </w:tcPr>
+          <w:p>
+            <w:pPr>
+              <w:cnfStyle w:val="000000000000" w:firstRow="0" w:lastRow="0" w:firstColumn="0" w:lastColumn="0" w:oddVBand="0" w:evenVBand="0" w:oddHBand="0" w:evenHBand="0" w:firstRowFirstColumn="0" w:firstRowLastColumn="0" w:lastRowFirstColumn="0" w:lastRowLastColumn="0"/>
+            </w:pPr>
+            <w:r>
+              <w:t>minimum sub-image row</w:t>
+            </w:r>
+          </w:p>
+        </w:tc>
+      </w:tr>
+      <w:tr>
+        <w:trPr>
+          <w:cnfStyle w:val="000000100000" w:firstRow="0" w:lastRow="0" w:firstColumn="0" w:lastColumn="0" w:oddVBand="0" w:evenVBand="0" w:oddHBand="1" w:evenHBand="0" w:firstRowFirstColumn="0" w:firstRowLastColumn="0" w:lastRowFirstColumn="0" w:lastRowLastColumn="0"/>
+        </w:trPr>
+        <w:tc>
+          <w:tcPr>
+            <w:cnfStyle w:val="001000000000" w:firstRow="0" w:lastRow="0" w:firstColumn="1" w:lastColumn="0" w:oddVBand="0" w:evenVBand="0" w:oddHBand="0" w:evenHBand="0" w:firstRowFirstColumn="0" w:firstRowLastColumn="0" w:lastRowFirstColumn="0" w:lastRowLastColumn="0"/>
+            <w:tcW w:w="0" w:type="auto"/>
+          </w:tcPr>
+          <w:p>
+            <w:pPr>
+              <w:rPr>
+                <w:b w:val="0"/>
+                <w:bCs w:val="0"/>
+              </w:rPr>
+            </w:pPr>
+            <w:r>
+              <w:rPr>
+                <w:b w:val="0"/>
+                <w:bCs w:val="0"/>
+              </w:rPr>
+              <w:t>max-row</w:t>
+            </w:r>
+          </w:p>
+        </w:tc>
+        <w:tc>
+          <w:tcPr>
+            <w:tcW w:w="0" w:type="auto"/>
+          </w:tcPr>
+          <w:p>
+            <w:pPr>
+              <w:cnfStyle w:val="000000100000" w:firstRow="0" w:lastRow="0" w:firstColumn="0" w:lastColumn="0" w:oddVBand="0" w:evenVBand="0" w:oddHBand="1" w:evenHBand="0" w:firstRowFirstColumn="0" w:firstRowLastColumn="0" w:lastRowFirstColumn="0" w:lastRowLastColumn="0"/>
+            </w:pPr>
+            <w:r>
+              <w:t>image rows - 1</w:t>
+            </w:r>
+          </w:p>
+        </w:tc>
+        <w:tc>
+          <w:tcPr>
+            <w:tcW w:w="0" w:type="auto"/>
+          </w:tcPr>
+          <w:p>
+            <w:pPr>
+              <w:cnfStyle w:val="000000100000" w:firstRow="0" w:lastRow="0" w:firstColumn="0" w:lastColumn="0" w:oddVBand="0" w:evenVBand="0" w:oddHBand="1" w:evenHBand="0" w:firstRowFirstColumn="0" w:firstRowLastColumn="0" w:lastRowFirstColumn="0" w:lastRowLastColumn="0"/>
+            </w:pPr>
+            <w:r>
+              <w:t>maximum sub-image row</w:t>
+            </w:r>
+          </w:p>
+        </w:tc>
+      </w:tr>
+      <w:tr>
+        <w:tc>
+          <w:tcPr>
+            <w:cnfStyle w:val="001000000000" w:firstRow="0" w:lastRow="0" w:firstColumn="1" w:lastColumn="0" w:oddVBand="0" w:evenVBand="0" w:oddHBand="0" w:evenHBand="0" w:firstRowFirstColumn="0" w:firstRowLastColumn="0" w:lastRowFirstColumn="0" w:lastRowLastColumn="0"/>
+            <w:tcW w:w="0" w:type="auto"/>
+          </w:tcPr>
+          <w:p>
+            <w:pPr>
+              <w:rPr>
+                <w:b w:val="0"/>
+                <w:bCs w:val="0"/>
+              </w:rPr>
+            </w:pPr>
+            <w:r>
+              <w:rPr>
+                <w:b w:val="0"/>
+                <w:bCs w:val="0"/>
+              </w:rPr>
+              <w:t>min-col</w:t>
+            </w:r>
+          </w:p>
+        </w:tc>
+        <w:tc>
+          <w:tcPr>
+            <w:tcW w:w="0" w:type="auto"/>
+          </w:tcPr>
+          <w:p>
+            <w:pPr>
+              <w:cnfStyle w:val="000000000000" w:firstRow="0" w:lastRow="0" w:firstColumn="0" w:lastColumn="0" w:oddVBand="0" w:evenVBand="0" w:oddHBand="0" w:evenHBand="0" w:firstRowFirstColumn="0" w:firstRowLastColumn="0" w:lastRowFirstColumn="0" w:lastRowLastColumn="0"/>
+            </w:pPr>
+            <w:r>
+              <w:t>0</w:t>
+            </w:r>
+          </w:p>
+        </w:tc>
+        <w:tc>
+          <w:tcPr>
+            <w:tcW w:w="0" w:type="auto"/>
+          </w:tcPr>
+          <w:p>
+            <w:pPr>
+              <w:cnfStyle w:val="000000000000" w:firstRow="0" w:lastRow="0" w:firstColumn="0" w:lastColumn="0" w:oddVBand="0" w:evenVBand="0" w:oddHBand="0" w:evenHBand="0" w:firstRowFirstColumn="0" w:firstRowLastColumn="0" w:lastRowFirstColumn="0" w:lastRowLastColumn="0"/>
+            </w:pPr>
+            <w:r>
+              <w:t>minimum sub-image column</w:t>
+            </w:r>
+          </w:p>
+        </w:tc>
+      </w:tr>
+      <w:tr>
+        <w:trPr>
+          <w:cnfStyle w:val="000000100000" w:firstRow="0" w:lastRow="0" w:firstColumn="0" w:lastColumn="0" w:oddVBand="0" w:evenVBand="0" w:oddHBand="1" w:evenHBand="0" w:firstRowFirstColumn="0" w:firstRowLastColumn="0" w:lastRowFirstColumn="0" w:lastRowLastColumn="0"/>
+        </w:trPr>
+        <w:tc>
+          <w:tcPr>
+            <w:cnfStyle w:val="001000000000" w:firstRow="0" w:lastRow="0" w:firstColumn="1" w:lastColumn="0" w:oddVBand="0" w:evenVBand="0" w:oddHBand="0" w:evenHBand="0" w:firstRowFirstColumn="0" w:firstRowLastColumn="0" w:lastRowFirstColumn="0" w:lastRowLastColumn="0"/>
+            <w:tcW w:w="0" w:type="auto"/>
+          </w:tcPr>
+          <w:p>
+            <w:pPr>
+              <w:rPr>
+                <w:b w:val="0"/>
+                <w:bCs w:val="0"/>
+              </w:rPr>
+            </w:pPr>
+            <w:r>
+              <w:rPr>
+                <w:b w:val="0"/>
+                <w:bCs w:val="0"/>
+              </w:rPr>
+              <w:t>max-col</w:t>
+            </w:r>
+          </w:p>
+        </w:tc>
+        <w:tc>
+          <w:tcPr>
+            <w:tcW w:w="0" w:type="auto"/>
+          </w:tcPr>
+          <w:p>
+            <w:pPr>
+              <w:cnfStyle w:val="000000100000" w:firstRow="0" w:lastRow="0" w:firstColumn="0" w:lastColumn="0" w:oddVBand="0" w:evenVBand="0" w:oddHBand="1" w:evenHBand="0" w:firstRowFirstColumn="0" w:firstRowLastColumn="0" w:lastRowFirstColumn="0" w:lastRowLastColumn="0"/>
+            </w:pPr>
+            <w:r>
+              <w:t>image cols - 1</w:t>
+            </w:r>
+          </w:p>
+        </w:tc>
+        <w:tc>
+          <w:tcPr>
+            <w:tcW w:w="0" w:type="auto"/>
+          </w:tcPr>
+          <w:p>
+            <w:pPr>
+              <w:cnfStyle w:val="000000100000" w:firstRow="0" w:lastRow="0" w:firstColumn="0" w:lastColumn="0" w:oddVBand="0" w:evenVBand="0" w:oddHBand="1" w:evenHBand="0" w:firstRowFirstColumn="0" w:firstRowLastColumn="0" w:lastRowFirstColumn="0" w:lastRowLastColumn="0"/>
+            </w:pPr>
+            <w:r>
+              <w:t>maximum sub-image column</w:t>
+            </w:r>
+          </w:p>
+        </w:tc>
+      </w:tr>
     </w:tbl>
     <w:p>
       <w:pPr>
         <w:pStyle w:val="Normalafterlist"/>
       </w:pPr>
       <w:r>
-        <w:lastRenderedPageBreak/>
         <w:t>The experiment log output includes the output image pixel statistics:</w:t>
       </w:r>
     </w:p>
@@ -14542,7 +15022,8 @@
       </w:tblPr>
       <w:tblGrid>
         <w:gridCol w:w="1280"/>
-        <w:gridCol w:w="2895"/>
+        <w:gridCol w:w="1659"/>
+        <w:gridCol w:w="3028"/>
       </w:tblGrid>
       <w:tr>
         <w:trPr>
@@ -14557,7 +15038,21 @@
           </w:tcPr>
           <w:p>
             <w:r>
+              <w:lastRenderedPageBreak/>
               <w:t>parameter</w:t>
+            </w:r>
+          </w:p>
+        </w:tc>
+        <w:tc>
+          <w:tcPr>
+            <w:tcW w:w="0" w:type="auto"/>
+          </w:tcPr>
+          <w:p>
+            <w:pPr>
+              <w:cnfStyle w:val="100000000000" w:firstRow="1" w:lastRow="0" w:firstColumn="0" w:lastColumn="0" w:oddVBand="0" w:evenVBand="0" w:oddHBand="0" w:evenHBand="0" w:firstRowFirstColumn="0" w:firstRowLastColumn="0" w:lastRowFirstColumn="0" w:lastRowLastColumn="0"/>
+            </w:pPr>
+            <w:r>
+              <w:t>default</w:t>
             </w:r>
           </w:p>
         </w:tc>
@@ -14609,7 +15104,216 @@
               <w:cnfStyle w:val="000000100000" w:firstRow="0" w:lastRow="0" w:firstColumn="0" w:lastColumn="0" w:oddVBand="0" w:evenVBand="0" w:oddHBand="1" w:evenHBand="0" w:firstRowFirstColumn="0" w:firstRowLastColumn="0" w:lastRowFirstColumn="0" w:lastRowLastColumn="0"/>
             </w:pPr>
             <w:r>
+              <w:t>required</w:t>
+            </w:r>
+          </w:p>
+        </w:tc>
+        <w:tc>
+          <w:tcPr>
+            <w:tcW w:w="0" w:type="auto"/>
+          </w:tcPr>
+          <w:p>
+            <w:pPr>
+              <w:cnfStyle w:val="000000100000" w:firstRow="0" w:lastRow="0" w:firstColumn="0" w:lastColumn="0" w:oddVBand="0" w:evenVBand="0" w:oddHBand="1" w:evenHBand="0" w:firstRowFirstColumn="0" w:firstRowLastColumn="0" w:lastRowFirstColumn="0" w:lastRowLastColumn="0"/>
+            </w:pPr>
+            <w:r>
               <w:t>“0” or “90” degree as above</w:t>
+            </w:r>
+          </w:p>
+        </w:tc>
+      </w:tr>
+      <w:tr>
+        <w:tc>
+          <w:tcPr>
+            <w:cnfStyle w:val="001000000000" w:firstRow="0" w:lastRow="0" w:firstColumn="1" w:lastColumn="0" w:oddVBand="0" w:evenVBand="0" w:oddHBand="0" w:evenHBand="0" w:firstRowFirstColumn="0" w:firstRowLastColumn="0" w:lastRowFirstColumn="0" w:lastRowLastColumn="0"/>
+            <w:tcW w:w="0" w:type="auto"/>
+          </w:tcPr>
+          <w:p>
+            <w:r>
+              <w:rPr>
+                <w:b w:val="0"/>
+                <w:bCs w:val="0"/>
+              </w:rPr>
+              <w:t>min-row</w:t>
+            </w:r>
+          </w:p>
+        </w:tc>
+        <w:tc>
+          <w:tcPr>
+            <w:tcW w:w="0" w:type="auto"/>
+          </w:tcPr>
+          <w:p>
+            <w:pPr>
+              <w:cnfStyle w:val="000000000000" w:firstRow="0" w:lastRow="0" w:firstColumn="0" w:lastColumn="0" w:oddVBand="0" w:evenVBand="0" w:oddHBand="0" w:evenHBand="0" w:firstRowFirstColumn="0" w:firstRowLastColumn="0" w:lastRowFirstColumn="0" w:lastRowLastColumn="0"/>
+            </w:pPr>
+            <w:r>
+              <w:t>0</w:t>
+            </w:r>
+          </w:p>
+        </w:tc>
+        <w:tc>
+          <w:tcPr>
+            <w:tcW w:w="0" w:type="auto"/>
+          </w:tcPr>
+          <w:p>
+            <w:pPr>
+              <w:cnfStyle w:val="000000000000" w:firstRow="0" w:lastRow="0" w:firstColumn="0" w:lastColumn="0" w:oddVBand="0" w:evenVBand="0" w:oddHBand="0" w:evenHBand="0" w:firstRowFirstColumn="0" w:firstRowLastColumn="0" w:lastRowFirstColumn="0" w:lastRowLastColumn="0"/>
+            </w:pPr>
+            <w:r>
+              <w:t>minimum sub-image row</w:t>
+            </w:r>
+          </w:p>
+        </w:tc>
+      </w:tr>
+      <w:tr>
+        <w:trPr>
+          <w:cnfStyle w:val="000000100000" w:firstRow="0" w:lastRow="0" w:firstColumn="0" w:lastColumn="0" w:oddVBand="0" w:evenVBand="0" w:oddHBand="1" w:evenHBand="0" w:firstRowFirstColumn="0" w:firstRowLastColumn="0" w:lastRowFirstColumn="0" w:lastRowLastColumn="0"/>
+        </w:trPr>
+        <w:tc>
+          <w:tcPr>
+            <w:cnfStyle w:val="001000000000" w:firstRow="0" w:lastRow="0" w:firstColumn="1" w:lastColumn="0" w:oddVBand="0" w:evenVBand="0" w:oddHBand="0" w:evenHBand="0" w:firstRowFirstColumn="0" w:firstRowLastColumn="0" w:lastRowFirstColumn="0" w:lastRowLastColumn="0"/>
+            <w:tcW w:w="0" w:type="auto"/>
+          </w:tcPr>
+          <w:p>
+            <w:pPr>
+              <w:rPr>
+                <w:b w:val="0"/>
+                <w:bCs w:val="0"/>
+              </w:rPr>
+            </w:pPr>
+            <w:r>
+              <w:rPr>
+                <w:b w:val="0"/>
+                <w:bCs w:val="0"/>
+              </w:rPr>
+              <w:t>max-row</w:t>
+            </w:r>
+          </w:p>
+        </w:tc>
+        <w:tc>
+          <w:tcPr>
+            <w:tcW w:w="0" w:type="auto"/>
+          </w:tcPr>
+          <w:p>
+            <w:pPr>
+              <w:cnfStyle w:val="000000100000" w:firstRow="0" w:lastRow="0" w:firstColumn="0" w:lastColumn="0" w:oddVBand="0" w:evenVBand="0" w:oddHBand="1" w:evenHBand="0" w:firstRowFirstColumn="0" w:firstRowLastColumn="0" w:lastRowFirstColumn="0" w:lastRowLastColumn="0"/>
+            </w:pPr>
+            <w:r>
+              <w:t>image rows - 1</w:t>
+            </w:r>
+          </w:p>
+        </w:tc>
+        <w:tc>
+          <w:tcPr>
+            <w:tcW w:w="0" w:type="auto"/>
+          </w:tcPr>
+          <w:p>
+            <w:pPr>
+              <w:cnfStyle w:val="000000100000" w:firstRow="0" w:lastRow="0" w:firstColumn="0" w:lastColumn="0" w:oddVBand="0" w:evenVBand="0" w:oddHBand="1" w:evenHBand="0" w:firstRowFirstColumn="0" w:firstRowLastColumn="0" w:lastRowFirstColumn="0" w:lastRowLastColumn="0"/>
+            </w:pPr>
+            <w:r>
+              <w:t>maximum sub-image row</w:t>
+            </w:r>
+          </w:p>
+        </w:tc>
+      </w:tr>
+      <w:tr>
+        <w:tc>
+          <w:tcPr>
+            <w:cnfStyle w:val="001000000000" w:firstRow="0" w:lastRow="0" w:firstColumn="1" w:lastColumn="0" w:oddVBand="0" w:evenVBand="0" w:oddHBand="0" w:evenHBand="0" w:firstRowFirstColumn="0" w:firstRowLastColumn="0" w:lastRowFirstColumn="0" w:lastRowLastColumn="0"/>
+            <w:tcW w:w="0" w:type="auto"/>
+          </w:tcPr>
+          <w:p>
+            <w:pPr>
+              <w:rPr>
+                <w:b w:val="0"/>
+                <w:bCs w:val="0"/>
+              </w:rPr>
+            </w:pPr>
+            <w:r>
+              <w:rPr>
+                <w:b w:val="0"/>
+                <w:bCs w:val="0"/>
+              </w:rPr>
+              <w:t>min-col</w:t>
+            </w:r>
+          </w:p>
+        </w:tc>
+        <w:tc>
+          <w:tcPr>
+            <w:tcW w:w="0" w:type="auto"/>
+          </w:tcPr>
+          <w:p>
+            <w:pPr>
+              <w:cnfStyle w:val="000000000000" w:firstRow="0" w:lastRow="0" w:firstColumn="0" w:lastColumn="0" w:oddVBand="0" w:evenVBand="0" w:oddHBand="0" w:evenHBand="0" w:firstRowFirstColumn="0" w:firstRowLastColumn="0" w:lastRowFirstColumn="0" w:lastRowLastColumn="0"/>
+            </w:pPr>
+            <w:r>
+              <w:t>0</w:t>
+            </w:r>
+          </w:p>
+        </w:tc>
+        <w:tc>
+          <w:tcPr>
+            <w:tcW w:w="0" w:type="auto"/>
+          </w:tcPr>
+          <w:p>
+            <w:pPr>
+              <w:cnfStyle w:val="000000000000" w:firstRow="0" w:lastRow="0" w:firstColumn="0" w:lastColumn="0" w:oddVBand="0" w:evenVBand="0" w:oddHBand="0" w:evenHBand="0" w:firstRowFirstColumn="0" w:firstRowLastColumn="0" w:lastRowFirstColumn="0" w:lastRowLastColumn="0"/>
+            </w:pPr>
+            <w:r>
+              <w:t>minimum sub-image column</w:t>
+            </w:r>
+          </w:p>
+        </w:tc>
+      </w:tr>
+      <w:tr>
+        <w:trPr>
+          <w:cnfStyle w:val="000000100000" w:firstRow="0" w:lastRow="0" w:firstColumn="0" w:lastColumn="0" w:oddVBand="0" w:evenVBand="0" w:oddHBand="1" w:evenHBand="0" w:firstRowFirstColumn="0" w:firstRowLastColumn="0" w:lastRowFirstColumn="0" w:lastRowLastColumn="0"/>
+        </w:trPr>
+        <w:tc>
+          <w:tcPr>
+            <w:cnfStyle w:val="001000000000" w:firstRow="0" w:lastRow="0" w:firstColumn="1" w:lastColumn="0" w:oddVBand="0" w:evenVBand="0" w:oddHBand="0" w:evenHBand="0" w:firstRowFirstColumn="0" w:firstRowLastColumn="0" w:lastRowFirstColumn="0" w:lastRowLastColumn="0"/>
+            <w:tcW w:w="0" w:type="auto"/>
+          </w:tcPr>
+          <w:p>
+            <w:pPr>
+              <w:rPr>
+                <w:b w:val="0"/>
+                <w:bCs w:val="0"/>
+              </w:rPr>
+            </w:pPr>
+            <w:r>
+              <w:rPr>
+                <w:b w:val="0"/>
+                <w:bCs w:val="0"/>
+              </w:rPr>
+              <w:t>max-col</w:t>
+            </w:r>
+          </w:p>
+        </w:tc>
+        <w:tc>
+          <w:tcPr>
+            <w:tcW w:w="0" w:type="auto"/>
+          </w:tcPr>
+          <w:p>
+            <w:pPr>
+              <w:cnfStyle w:val="000000100000" w:firstRow="0" w:lastRow="0" w:firstColumn="0" w:lastColumn="0" w:oddVBand="0" w:evenVBand="0" w:oddHBand="1" w:evenHBand="0" w:firstRowFirstColumn="0" w:firstRowLastColumn="0" w:lastRowFirstColumn="0" w:lastRowLastColumn="0"/>
+            </w:pPr>
+            <w:r>
+              <w:t>image cols - 1</w:t>
+            </w:r>
+          </w:p>
+        </w:tc>
+        <w:tc>
+          <w:tcPr>
+            <w:tcW w:w="0" w:type="auto"/>
+          </w:tcPr>
+          <w:p>
+            <w:pPr>
+              <w:cnfStyle w:val="000000100000" w:firstRow="0" w:lastRow="0" w:firstColumn="0" w:lastColumn="0" w:oddVBand="0" w:evenVBand="0" w:oddHBand="1" w:evenHBand="0" w:firstRowFirstColumn="0" w:firstRowLastColumn="0" w:lastRowFirstColumn="0" w:lastRowLastColumn="0"/>
+            </w:pPr>
+            <w:r>
+              <w:t>maximum sub-image column</w:t>
             </w:r>
           </w:p>
         </w:tc>
@@ -14807,7 +15511,6 @@
                 <w:b w:val="0"/>
                 <w:bCs w:val="0"/>
               </w:rPr>
-              <w:lastRenderedPageBreak/>
               <w:t>depth</w:t>
             </w:r>
           </w:p>
@@ -15769,7 +16472,8 @@
       </w:tblPr>
       <w:tblGrid>
         <w:gridCol w:w="1280"/>
-        <w:gridCol w:w="6623"/>
+        <w:gridCol w:w="1659"/>
+        <w:gridCol w:w="3028"/>
       </w:tblGrid>
       <w:tr>
         <w:trPr>
@@ -15797,6 +16501,19 @@
               <w:cnfStyle w:val="100000000000" w:firstRow="1" w:lastRow="0" w:firstColumn="0" w:lastColumn="0" w:oddVBand="0" w:evenVBand="0" w:oddHBand="0" w:evenHBand="0" w:firstRowFirstColumn="0" w:firstRowLastColumn="0" w:lastRowFirstColumn="0" w:lastRowLastColumn="0"/>
             </w:pPr>
             <w:r>
+              <w:t>default</w:t>
+            </w:r>
+          </w:p>
+        </w:tc>
+        <w:tc>
+          <w:tcPr>
+            <w:tcW w:w="0" w:type="auto"/>
+          </w:tcPr>
+          <w:p>
+            <w:pPr>
+              <w:cnfStyle w:val="100000000000" w:firstRow="1" w:lastRow="0" w:firstColumn="0" w:lastColumn="0" w:oddVBand="0" w:evenVBand="0" w:oddHBand="0" w:evenHBand="0" w:firstRowFirstColumn="0" w:firstRowLastColumn="0" w:lastRowFirstColumn="0" w:lastRowLastColumn="0"/>
+            </w:pPr>
+            <w:r>
               <w:t>description</w:t>
             </w:r>
           </w:p>
@@ -15836,6 +16553,19 @@
               <w:cnfStyle w:val="000000100000" w:firstRow="0" w:lastRow="0" w:firstColumn="0" w:lastColumn="0" w:oddVBand="0" w:evenVBand="0" w:oddHBand="1" w:evenHBand="0" w:firstRowFirstColumn="0" w:firstRowLastColumn="0" w:lastRowFirstColumn="0" w:lastRowLastColumn="0"/>
             </w:pPr>
             <w:r>
+              <w:t>required</w:t>
+            </w:r>
+          </w:p>
+        </w:tc>
+        <w:tc>
+          <w:tcPr>
+            <w:tcW w:w="0" w:type="auto"/>
+          </w:tcPr>
+          <w:p>
+            <w:pPr>
+              <w:cnfStyle w:val="000000100000" w:firstRow="0" w:lastRow="0" w:firstColumn="0" w:lastColumn="0" w:oddVBand="0" w:evenVBand="0" w:oddHBand="1" w:evenHBand="0" w:firstRowFirstColumn="0" w:firstRowLastColumn="0" w:lastRowFirstColumn="0" w:lastRowLastColumn="0"/>
+            </w:pPr>
+            <w:r>
               <w:t>“0” or “90” degrees as above</w:t>
             </w:r>
           </w:p>
@@ -15872,7 +16602,20 @@
               <w:cnfStyle w:val="000000000000" w:firstRow="0" w:lastRow="0" w:firstColumn="0" w:lastColumn="0" w:oddVBand="0" w:evenVBand="0" w:oddHBand="0" w:evenHBand="0" w:firstRowFirstColumn="0" w:firstRowLastColumn="0" w:lastRowFirstColumn="0" w:lastRowLastColumn="0"/>
             </w:pPr>
             <w:r>
-              <w:t>sub-image minimum row, default 0</w:t>
+              <w:t>0</w:t>
+            </w:r>
+          </w:p>
+        </w:tc>
+        <w:tc>
+          <w:tcPr>
+            <w:tcW w:w="0" w:type="auto"/>
+          </w:tcPr>
+          <w:p>
+            <w:pPr>
+              <w:cnfStyle w:val="000000000000" w:firstRow="0" w:lastRow="0" w:firstColumn="0" w:lastColumn="0" w:oddVBand="0" w:evenVBand="0" w:oddHBand="0" w:evenHBand="0" w:firstRowFirstColumn="0" w:firstRowLastColumn="0" w:lastRowFirstColumn="0" w:lastRowLastColumn="0"/>
+            </w:pPr>
+            <w:r>
+              <w:t>minimum sub-image row</w:t>
             </w:r>
           </w:p>
         </w:tc>
@@ -15898,6 +16641,56 @@
                 <w:b w:val="0"/>
                 <w:bCs w:val="0"/>
               </w:rPr>
+              <w:lastRenderedPageBreak/>
+              <w:t>max-row</w:t>
+            </w:r>
+          </w:p>
+        </w:tc>
+        <w:tc>
+          <w:tcPr>
+            <w:tcW w:w="0" w:type="auto"/>
+          </w:tcPr>
+          <w:p>
+            <w:pPr>
+              <w:cnfStyle w:val="000000100000" w:firstRow="0" w:lastRow="0" w:firstColumn="0" w:lastColumn="0" w:oddVBand="0" w:evenVBand="0" w:oddHBand="1" w:evenHBand="0" w:firstRowFirstColumn="0" w:firstRowLastColumn="0" w:lastRowFirstColumn="0" w:lastRowLastColumn="0"/>
+            </w:pPr>
+            <w:r>
+              <w:t>image rows - 1</w:t>
+            </w:r>
+          </w:p>
+        </w:tc>
+        <w:tc>
+          <w:tcPr>
+            <w:tcW w:w="0" w:type="auto"/>
+          </w:tcPr>
+          <w:p>
+            <w:pPr>
+              <w:cnfStyle w:val="000000100000" w:firstRow="0" w:lastRow="0" w:firstColumn="0" w:lastColumn="0" w:oddVBand="0" w:evenVBand="0" w:oddHBand="1" w:evenHBand="0" w:firstRowFirstColumn="0" w:firstRowLastColumn="0" w:lastRowFirstColumn="0" w:lastRowLastColumn="0"/>
+            </w:pPr>
+            <w:r>
+              <w:t>maximum sub-image row</w:t>
+            </w:r>
+          </w:p>
+        </w:tc>
+      </w:tr>
+      <w:tr>
+        <w:tc>
+          <w:tcPr>
+            <w:cnfStyle w:val="001000000000" w:firstRow="0" w:lastRow="0" w:firstColumn="1" w:lastColumn="0" w:oddVBand="0" w:evenVBand="0" w:oddHBand="0" w:evenHBand="0" w:firstRowFirstColumn="0" w:firstRowLastColumn="0" w:lastRowFirstColumn="0" w:lastRowLastColumn="0"/>
+            <w:tcW w:w="0" w:type="auto"/>
+          </w:tcPr>
+          <w:p>
+            <w:pPr>
+              <w:rPr>
+                <w:b w:val="0"/>
+                <w:bCs w:val="0"/>
+              </w:rPr>
+            </w:pPr>
+            <w:r>
+              <w:rPr>
+                <w:b w:val="0"/>
+                <w:bCs w:val="0"/>
+              </w:rPr>
               <w:t>min-col</w:t>
             </w:r>
           </w:p>
@@ -15908,46 +16701,23 @@
           </w:tcPr>
           <w:p>
             <w:pPr>
-              <w:cnfStyle w:val="000000100000" w:firstRow="0" w:lastRow="0" w:firstColumn="0" w:lastColumn="0" w:oddVBand="0" w:evenVBand="0" w:oddHBand="1" w:evenHBand="0" w:firstRowFirstColumn="0" w:firstRowLastColumn="0" w:lastRowFirstColumn="0" w:lastRowLastColumn="0"/>
-            </w:pPr>
-            <w:r>
-              <w:t>sub-image minimum column, default 0</w:t>
-            </w:r>
-          </w:p>
-        </w:tc>
-      </w:tr>
-      <w:tr>
-        <w:tc>
-          <w:tcPr>
-            <w:cnfStyle w:val="001000000000" w:firstRow="0" w:lastRow="0" w:firstColumn="1" w:lastColumn="0" w:oddVBand="0" w:evenVBand="0" w:oddHBand="0" w:evenHBand="0" w:firstRowFirstColumn="0" w:firstRowLastColumn="0" w:lastRowFirstColumn="0" w:lastRowLastColumn="0"/>
-            <w:tcW w:w="0" w:type="auto"/>
-          </w:tcPr>
-          <w:p>
-            <w:pPr>
-              <w:rPr>
-                <w:b w:val="0"/>
-                <w:bCs w:val="0"/>
-              </w:rPr>
-            </w:pPr>
-            <w:r>
-              <w:rPr>
-                <w:b w:val="0"/>
-                <w:bCs w:val="0"/>
-              </w:rPr>
-              <w:t>max-row</w:t>
-            </w:r>
-          </w:p>
-        </w:tc>
-        <w:tc>
-          <w:tcPr>
-            <w:tcW w:w="0" w:type="auto"/>
-          </w:tcPr>
-          <w:p>
-            <w:pPr>
               <w:cnfStyle w:val="000000000000" w:firstRow="0" w:lastRow="0" w:firstColumn="0" w:lastColumn="0" w:oddVBand="0" w:evenVBand="0" w:oddHBand="0" w:evenHBand="0" w:firstRowFirstColumn="0" w:firstRowLastColumn="0" w:lastRowFirstColumn="0" w:lastRowLastColumn="0"/>
             </w:pPr>
             <w:r>
-              <w:t>sub-image maximum row, default the image maximum row</w:t>
+              <w:t>0</w:t>
+            </w:r>
+          </w:p>
+        </w:tc>
+        <w:tc>
+          <w:tcPr>
+            <w:tcW w:w="0" w:type="auto"/>
+          </w:tcPr>
+          <w:p>
+            <w:pPr>
+              <w:cnfStyle w:val="000000000000" w:firstRow="0" w:lastRow="0" w:firstColumn="0" w:lastColumn="0" w:oddVBand="0" w:evenVBand="0" w:oddHBand="0" w:evenHBand="0" w:firstRowFirstColumn="0" w:firstRowLastColumn="0" w:lastRowFirstColumn="0" w:lastRowLastColumn="0"/>
+            </w:pPr>
+            <w:r>
+              <w:t>minimum sub-image column</w:t>
             </w:r>
           </w:p>
         </w:tc>
@@ -15986,7 +16756,20 @@
               <w:cnfStyle w:val="000000100000" w:firstRow="0" w:lastRow="0" w:firstColumn="0" w:lastColumn="0" w:oddVBand="0" w:evenVBand="0" w:oddHBand="1" w:evenHBand="0" w:firstRowFirstColumn="0" w:firstRowLastColumn="0" w:lastRowFirstColumn="0" w:lastRowLastColumn="0"/>
             </w:pPr>
             <w:r>
-              <w:t>sub-image maximum column, default the image maximum column</w:t>
+              <w:t>image cols - 1</w:t>
+            </w:r>
+          </w:p>
+        </w:tc>
+        <w:tc>
+          <w:tcPr>
+            <w:tcW w:w="0" w:type="auto"/>
+          </w:tcPr>
+          <w:p>
+            <w:pPr>
+              <w:cnfStyle w:val="000000100000" w:firstRow="0" w:lastRow="0" w:firstColumn="0" w:lastColumn="0" w:oddVBand="0" w:evenVBand="0" w:oddHBand="1" w:evenHBand="0" w:firstRowFirstColumn="0" w:firstRowLastColumn="0" w:lastRowFirstColumn="0" w:lastRowLastColumn="0"/>
+            </w:pPr>
+            <w:r>
+              <w:t>maximum sub-image column</w:t>
             </w:r>
           </w:p>
         </w:tc>
@@ -16232,7 +17015,6 @@
                 <w:sz w:val="20"/>
                 <w:szCs w:val="20"/>
               </w:rPr>
-              <w:lastRenderedPageBreak/>
               <w:t>CV_32S</w:t>
             </w:r>
           </w:p>
@@ -16273,7 +17055,6 @@
                 <w:b w:val="0"/>
                 <w:bCs w:val="0"/>
               </w:rPr>
-              <w:lastRenderedPageBreak/>
               <w:t>pixel count</w:t>
             </w:r>
           </w:p>
@@ -17145,8 +17926,9 @@
         <w:tblLook w:val="04A0" w:firstRow="1" w:lastRow="0" w:firstColumn="1" w:lastColumn="0" w:noHBand="0" w:noVBand="1"/>
       </w:tblPr>
       <w:tblGrid>
-        <w:gridCol w:w="2099"/>
-        <w:gridCol w:w="6697"/>
+        <w:gridCol w:w="1932"/>
+        <w:gridCol w:w="1851"/>
+        <w:gridCol w:w="5567"/>
       </w:tblGrid>
       <w:tr>
         <w:trPr>
@@ -17161,7 +17943,21 @@
           </w:tcPr>
           <w:p>
             <w:r>
+              <w:lastRenderedPageBreak/>
               <w:t>parameter</w:t>
+            </w:r>
+          </w:p>
+        </w:tc>
+        <w:tc>
+          <w:tcPr>
+            <w:tcW w:w="0" w:type="auto"/>
+          </w:tcPr>
+          <w:p>
+            <w:pPr>
+              <w:cnfStyle w:val="100000000000" w:firstRow="1" w:lastRow="0" w:firstColumn="0" w:lastColumn="0" w:oddVBand="0" w:evenVBand="0" w:oddHBand="0" w:evenHBand="0" w:firstRowFirstColumn="0" w:firstRowLastColumn="0" w:lastRowFirstColumn="0" w:lastRowLastColumn="0"/>
+            </w:pPr>
+            <w:r>
+              <w:t>default</w:t>
             </w:r>
           </w:p>
         </w:tc>
@@ -17214,6 +18010,19 @@
               <w:cnfStyle w:val="000000100000" w:firstRow="0" w:lastRow="0" w:firstColumn="0" w:lastColumn="0" w:oddVBand="0" w:evenVBand="0" w:oddHBand="1" w:evenHBand="0" w:firstRowFirstColumn="0" w:firstRowLastColumn="0" w:lastRowFirstColumn="0" w:lastRowLastColumn="0"/>
             </w:pPr>
             <w:r>
+              <w:t>required</w:t>
+            </w:r>
+          </w:p>
+        </w:tc>
+        <w:tc>
+          <w:tcPr>
+            <w:tcW w:w="0" w:type="auto"/>
+          </w:tcPr>
+          <w:p>
+            <w:pPr>
+              <w:cnfStyle w:val="000000100000" w:firstRow="0" w:lastRow="0" w:firstColumn="0" w:lastColumn="0" w:oddVBand="0" w:evenVBand="0" w:oddHBand="1" w:evenHBand="0" w:firstRowFirstColumn="0" w:firstRowLastColumn="0" w:lastRowFirstColumn="0" w:lastRowLastColumn="0"/>
+            </w:pPr>
+            <w:r>
               <w:t>Shape of the structuring element: “rectangle”, “cross”, “ellipse”</w:t>
             </w:r>
           </w:p>
@@ -17238,6 +18047,19 @@
                 <w:bCs w:val="0"/>
               </w:rPr>
               <w:t>height</w:t>
+            </w:r>
+          </w:p>
+        </w:tc>
+        <w:tc>
+          <w:tcPr>
+            <w:tcW w:w="0" w:type="auto"/>
+          </w:tcPr>
+          <w:p>
+            <w:pPr>
+              <w:cnfStyle w:val="000000000000" w:firstRow="0" w:lastRow="0" w:firstColumn="0" w:lastColumn="0" w:oddVBand="0" w:evenVBand="0" w:oddHBand="0" w:evenHBand="0" w:firstRowFirstColumn="0" w:firstRowLastColumn="0" w:lastRowFirstColumn="0" w:lastRowLastColumn="0"/>
+            </w:pPr>
+            <w:r>
+              <w:t>required</w:t>
             </w:r>
           </w:p>
         </w:tc>
@@ -17289,6 +18111,19 @@
               <w:cnfStyle w:val="000000100000" w:firstRow="0" w:lastRow="0" w:firstColumn="0" w:lastColumn="0" w:oddVBand="0" w:evenVBand="0" w:oddHBand="1" w:evenHBand="0" w:firstRowFirstColumn="0" w:firstRowLastColumn="0" w:lastRowFirstColumn="0" w:lastRowLastColumn="0"/>
             </w:pPr>
             <w:r>
+              <w:t>required</w:t>
+            </w:r>
+          </w:p>
+        </w:tc>
+        <w:tc>
+          <w:tcPr>
+            <w:tcW w:w="0" w:type="auto"/>
+          </w:tcPr>
+          <w:p>
+            <w:pPr>
+              <w:cnfStyle w:val="000000100000" w:firstRow="0" w:lastRow="0" w:firstColumn="0" w:lastColumn="0" w:oddVBand="0" w:evenVBand="0" w:oddHBand="1" w:evenHBand="0" w:firstRowFirstColumn="0" w:firstRowLastColumn="0" w:lastRowFirstColumn="0" w:lastRowLastColumn="0"/>
+            </w:pPr>
+            <w:r>
               <w:t>Rectangle, ellipse, or cross pixel width</w:t>
             </w:r>
           </w:p>
@@ -17313,6 +18148,22 @@
                 <w:bCs w:val="0"/>
               </w:rPr>
               <w:t>thickness</w:t>
+            </w:r>
+          </w:p>
+        </w:tc>
+        <w:tc>
+          <w:tcPr>
+            <w:tcW w:w="0" w:type="auto"/>
+          </w:tcPr>
+          <w:p>
+            <w:pPr>
+              <w:cnfStyle w:val="000000000000" w:firstRow="0" w:lastRow="0" w:firstColumn="0" w:lastColumn="0" w:oddVBand="0" w:evenVBand="0" w:oddHBand="0" w:evenHBand="0" w:firstRowFirstColumn="0" w:firstRowLastColumn="0" w:lastRowFirstColumn="0" w:lastRowLastColumn="0"/>
+            </w:pPr>
+            <w:r>
+              <w:t>required</w:t>
+            </w:r>
+            <w:r>
+              <w:t xml:space="preserve"> for “cross”</w:t>
             </w:r>
           </w:p>
         </w:tc>
@@ -17364,7 +18215,216 @@
               <w:cnfStyle w:val="000000100000" w:firstRow="0" w:lastRow="0" w:firstColumn="0" w:lastColumn="0" w:oddVBand="0" w:evenVBand="0" w:oddHBand="1" w:evenHBand="0" w:firstRowFirstColumn="0" w:firstRowLastColumn="0" w:lastRowFirstColumn="0" w:lastRowLastColumn="0"/>
             </w:pPr>
             <w:r>
+              <w:t>required</w:t>
+            </w:r>
+          </w:p>
+        </w:tc>
+        <w:tc>
+          <w:tcPr>
+            <w:tcW w:w="0" w:type="auto"/>
+          </w:tcPr>
+          <w:p>
+            <w:pPr>
+              <w:cnfStyle w:val="000000100000" w:firstRow="0" w:lastRow="0" w:firstColumn="0" w:lastColumn="0" w:oddVBand="0" w:evenVBand="0" w:oddHBand="1" w:evenHBand="0" w:firstRowFirstColumn="0" w:firstRowLastColumn="0" w:lastRowFirstColumn="0" w:lastRowLastColumn="0"/>
+            </w:pPr>
+            <w:r>
               <w:t>“erode”, “dilate”, “open”, “close”, “gradient”, “top-hat”, or “black-hat”</w:t>
+            </w:r>
+          </w:p>
+        </w:tc>
+      </w:tr>
+      <w:tr>
+        <w:tc>
+          <w:tcPr>
+            <w:cnfStyle w:val="001000000000" w:firstRow="0" w:lastRow="0" w:firstColumn="1" w:lastColumn="0" w:oddVBand="0" w:evenVBand="0" w:oddHBand="0" w:evenHBand="0" w:firstRowFirstColumn="0" w:firstRowLastColumn="0" w:lastRowFirstColumn="0" w:lastRowLastColumn="0"/>
+            <w:tcW w:w="0" w:type="auto"/>
+          </w:tcPr>
+          <w:p>
+            <w:r>
+              <w:rPr>
+                <w:b w:val="0"/>
+                <w:bCs w:val="0"/>
+              </w:rPr>
+              <w:t>min-row</w:t>
+            </w:r>
+          </w:p>
+        </w:tc>
+        <w:tc>
+          <w:tcPr>
+            <w:tcW w:w="0" w:type="auto"/>
+          </w:tcPr>
+          <w:p>
+            <w:pPr>
+              <w:cnfStyle w:val="000000000000" w:firstRow="0" w:lastRow="0" w:firstColumn="0" w:lastColumn="0" w:oddVBand="0" w:evenVBand="0" w:oddHBand="0" w:evenHBand="0" w:firstRowFirstColumn="0" w:firstRowLastColumn="0" w:lastRowFirstColumn="0" w:lastRowLastColumn="0"/>
+            </w:pPr>
+            <w:r>
+              <w:t>0</w:t>
+            </w:r>
+          </w:p>
+        </w:tc>
+        <w:tc>
+          <w:tcPr>
+            <w:tcW w:w="0" w:type="auto"/>
+          </w:tcPr>
+          <w:p>
+            <w:pPr>
+              <w:cnfStyle w:val="000000000000" w:firstRow="0" w:lastRow="0" w:firstColumn="0" w:lastColumn="0" w:oddVBand="0" w:evenVBand="0" w:oddHBand="0" w:evenHBand="0" w:firstRowFirstColumn="0" w:firstRowLastColumn="0" w:lastRowFirstColumn="0" w:lastRowLastColumn="0"/>
+            </w:pPr>
+            <w:r>
+              <w:t>minimum sub-image row</w:t>
+            </w:r>
+          </w:p>
+        </w:tc>
+      </w:tr>
+      <w:tr>
+        <w:trPr>
+          <w:cnfStyle w:val="000000100000" w:firstRow="0" w:lastRow="0" w:firstColumn="0" w:lastColumn="0" w:oddVBand="0" w:evenVBand="0" w:oddHBand="1" w:evenHBand="0" w:firstRowFirstColumn="0" w:firstRowLastColumn="0" w:lastRowFirstColumn="0" w:lastRowLastColumn="0"/>
+        </w:trPr>
+        <w:tc>
+          <w:tcPr>
+            <w:cnfStyle w:val="001000000000" w:firstRow="0" w:lastRow="0" w:firstColumn="1" w:lastColumn="0" w:oddVBand="0" w:evenVBand="0" w:oddHBand="0" w:evenHBand="0" w:firstRowFirstColumn="0" w:firstRowLastColumn="0" w:lastRowFirstColumn="0" w:lastRowLastColumn="0"/>
+            <w:tcW w:w="0" w:type="auto"/>
+          </w:tcPr>
+          <w:p>
+            <w:pPr>
+              <w:rPr>
+                <w:b w:val="0"/>
+                <w:bCs w:val="0"/>
+              </w:rPr>
+            </w:pPr>
+            <w:r>
+              <w:rPr>
+                <w:b w:val="0"/>
+                <w:bCs w:val="0"/>
+              </w:rPr>
+              <w:t>max-row</w:t>
+            </w:r>
+          </w:p>
+        </w:tc>
+        <w:tc>
+          <w:tcPr>
+            <w:tcW w:w="0" w:type="auto"/>
+          </w:tcPr>
+          <w:p>
+            <w:pPr>
+              <w:cnfStyle w:val="000000100000" w:firstRow="0" w:lastRow="0" w:firstColumn="0" w:lastColumn="0" w:oddVBand="0" w:evenVBand="0" w:oddHBand="1" w:evenHBand="0" w:firstRowFirstColumn="0" w:firstRowLastColumn="0" w:lastRowFirstColumn="0" w:lastRowLastColumn="0"/>
+            </w:pPr>
+            <w:r>
+              <w:t>image rows - 1</w:t>
+            </w:r>
+          </w:p>
+        </w:tc>
+        <w:tc>
+          <w:tcPr>
+            <w:tcW w:w="0" w:type="auto"/>
+          </w:tcPr>
+          <w:p>
+            <w:pPr>
+              <w:cnfStyle w:val="000000100000" w:firstRow="0" w:lastRow="0" w:firstColumn="0" w:lastColumn="0" w:oddVBand="0" w:evenVBand="0" w:oddHBand="1" w:evenHBand="0" w:firstRowFirstColumn="0" w:firstRowLastColumn="0" w:lastRowFirstColumn="0" w:lastRowLastColumn="0"/>
+            </w:pPr>
+            <w:r>
+              <w:t>maximum sub-image row</w:t>
+            </w:r>
+          </w:p>
+        </w:tc>
+      </w:tr>
+      <w:tr>
+        <w:tc>
+          <w:tcPr>
+            <w:cnfStyle w:val="001000000000" w:firstRow="0" w:lastRow="0" w:firstColumn="1" w:lastColumn="0" w:oddVBand="0" w:evenVBand="0" w:oddHBand="0" w:evenHBand="0" w:firstRowFirstColumn="0" w:firstRowLastColumn="0" w:lastRowFirstColumn="0" w:lastRowLastColumn="0"/>
+            <w:tcW w:w="0" w:type="auto"/>
+          </w:tcPr>
+          <w:p>
+            <w:pPr>
+              <w:rPr>
+                <w:b w:val="0"/>
+                <w:bCs w:val="0"/>
+              </w:rPr>
+            </w:pPr>
+            <w:r>
+              <w:rPr>
+                <w:b w:val="0"/>
+                <w:bCs w:val="0"/>
+              </w:rPr>
+              <w:t>min-col</w:t>
+            </w:r>
+          </w:p>
+        </w:tc>
+        <w:tc>
+          <w:tcPr>
+            <w:tcW w:w="0" w:type="auto"/>
+          </w:tcPr>
+          <w:p>
+            <w:pPr>
+              <w:cnfStyle w:val="000000000000" w:firstRow="0" w:lastRow="0" w:firstColumn="0" w:lastColumn="0" w:oddVBand="0" w:evenVBand="0" w:oddHBand="0" w:evenHBand="0" w:firstRowFirstColumn="0" w:firstRowLastColumn="0" w:lastRowFirstColumn="0" w:lastRowLastColumn="0"/>
+            </w:pPr>
+            <w:r>
+              <w:t>0</w:t>
+            </w:r>
+          </w:p>
+        </w:tc>
+        <w:tc>
+          <w:tcPr>
+            <w:tcW w:w="0" w:type="auto"/>
+          </w:tcPr>
+          <w:p>
+            <w:pPr>
+              <w:cnfStyle w:val="000000000000" w:firstRow="0" w:lastRow="0" w:firstColumn="0" w:lastColumn="0" w:oddVBand="0" w:evenVBand="0" w:oddHBand="0" w:evenHBand="0" w:firstRowFirstColumn="0" w:firstRowLastColumn="0" w:lastRowFirstColumn="0" w:lastRowLastColumn="0"/>
+            </w:pPr>
+            <w:r>
+              <w:t>minimum sub-image column</w:t>
+            </w:r>
+          </w:p>
+        </w:tc>
+      </w:tr>
+      <w:tr>
+        <w:trPr>
+          <w:cnfStyle w:val="000000100000" w:firstRow="0" w:lastRow="0" w:firstColumn="0" w:lastColumn="0" w:oddVBand="0" w:evenVBand="0" w:oddHBand="1" w:evenHBand="0" w:firstRowFirstColumn="0" w:firstRowLastColumn="0" w:lastRowFirstColumn="0" w:lastRowLastColumn="0"/>
+        </w:trPr>
+        <w:tc>
+          <w:tcPr>
+            <w:cnfStyle w:val="001000000000" w:firstRow="0" w:lastRow="0" w:firstColumn="1" w:lastColumn="0" w:oddVBand="0" w:evenVBand="0" w:oddHBand="0" w:evenHBand="0" w:firstRowFirstColumn="0" w:firstRowLastColumn="0" w:lastRowFirstColumn="0" w:lastRowLastColumn="0"/>
+            <w:tcW w:w="0" w:type="auto"/>
+          </w:tcPr>
+          <w:p>
+            <w:pPr>
+              <w:rPr>
+                <w:b w:val="0"/>
+                <w:bCs w:val="0"/>
+              </w:rPr>
+            </w:pPr>
+            <w:r>
+              <w:rPr>
+                <w:b w:val="0"/>
+                <w:bCs w:val="0"/>
+              </w:rPr>
+              <w:t>max-col</w:t>
+            </w:r>
+          </w:p>
+        </w:tc>
+        <w:tc>
+          <w:tcPr>
+            <w:tcW w:w="0" w:type="auto"/>
+          </w:tcPr>
+          <w:p>
+            <w:pPr>
+              <w:cnfStyle w:val="000000100000" w:firstRow="0" w:lastRow="0" w:firstColumn="0" w:lastColumn="0" w:oddVBand="0" w:evenVBand="0" w:oddHBand="1" w:evenHBand="0" w:firstRowFirstColumn="0" w:firstRowLastColumn="0" w:lastRowFirstColumn="0" w:lastRowLastColumn="0"/>
+            </w:pPr>
+            <w:r>
+              <w:t>image cols - 1</w:t>
+            </w:r>
+          </w:p>
+        </w:tc>
+        <w:tc>
+          <w:tcPr>
+            <w:tcW w:w="0" w:type="auto"/>
+          </w:tcPr>
+          <w:p>
+            <w:pPr>
+              <w:cnfStyle w:val="000000100000" w:firstRow="0" w:lastRow="0" w:firstColumn="0" w:lastColumn="0" w:oddVBand="0" w:evenVBand="0" w:oddHBand="1" w:evenHBand="0" w:firstRowFirstColumn="0" w:firstRowLastColumn="0" w:lastRowFirstColumn="0" w:lastRowLastColumn="0"/>
+            </w:pPr>
+            <w:r>
+              <w:t>maximum sub-image column</w:t>
             </w:r>
           </w:p>
         </w:tc>
@@ -17562,7 +18622,6 @@
                 <w:b w:val="0"/>
                 <w:bCs w:val="0"/>
               </w:rPr>
-              <w:lastRenderedPageBreak/>
               <w:t>depth</w:t>
             </w:r>
           </w:p>
@@ -18104,7 +19163,8 @@
       </w:tblPr>
       <w:tblGrid>
         <w:gridCol w:w="1280"/>
-        <w:gridCol w:w="1476"/>
+        <w:gridCol w:w="1659"/>
+        <w:gridCol w:w="3028"/>
       </w:tblGrid>
       <w:tr>
         <w:trPr>
@@ -18132,6 +19192,19 @@
               <w:cnfStyle w:val="100000000000" w:firstRow="1" w:lastRow="0" w:firstColumn="0" w:lastColumn="0" w:oddVBand="0" w:evenVBand="0" w:oddHBand="0" w:evenHBand="0" w:firstRowFirstColumn="0" w:firstRowLastColumn="0" w:lastRowFirstColumn="0" w:lastRowLastColumn="0"/>
             </w:pPr>
             <w:r>
+              <w:t>default</w:t>
+            </w:r>
+          </w:p>
+        </w:tc>
+        <w:tc>
+          <w:tcPr>
+            <w:tcW w:w="0" w:type="auto"/>
+          </w:tcPr>
+          <w:p>
+            <w:pPr>
+              <w:cnfStyle w:val="100000000000" w:firstRow="1" w:lastRow="0" w:firstColumn="0" w:lastColumn="0" w:oddVBand="0" w:evenVBand="0" w:oddHBand="0" w:evenHBand="0" w:firstRowFirstColumn="0" w:firstRowLastColumn="0" w:lastRowFirstColumn="0" w:lastRowLastColumn="0"/>
+            </w:pPr>
+            <w:r>
               <w:t>description</w:t>
             </w:r>
           </w:p>
@@ -18171,6 +19244,19 @@
               <w:cnfStyle w:val="000000100000" w:firstRow="0" w:lastRow="0" w:firstColumn="0" w:lastColumn="0" w:oddVBand="0" w:evenVBand="0" w:oddHBand="1" w:evenHBand="0" w:firstRowFirstColumn="0" w:firstRowLastColumn="0" w:lastRowFirstColumn="0" w:lastRowLastColumn="0"/>
             </w:pPr>
             <w:r>
+              <w:t>required</w:t>
+            </w:r>
+          </w:p>
+        </w:tc>
+        <w:tc>
+          <w:tcPr>
+            <w:tcW w:w="0" w:type="auto"/>
+          </w:tcPr>
+          <w:p>
+            <w:pPr>
+              <w:cnfStyle w:val="000000100000" w:firstRow="0" w:lastRow="0" w:firstColumn="0" w:lastColumn="0" w:oddVBand="0" w:evenVBand="0" w:oddHBand="1" w:evenHBand="0" w:firstRowFirstColumn="0" w:firstRowLastColumn="0" w:lastRowFirstColumn="0" w:lastRowLastColumn="0"/>
+            </w:pPr>
+            <w:r>
               <w:t>kernel height</w:t>
             </w:r>
           </w:p>
@@ -18207,7 +19293,217 @@
               <w:cnfStyle w:val="000000000000" w:firstRow="0" w:lastRow="0" w:firstColumn="0" w:lastColumn="0" w:oddVBand="0" w:evenVBand="0" w:oddHBand="0" w:evenHBand="0" w:firstRowFirstColumn="0" w:firstRowLastColumn="0" w:lastRowFirstColumn="0" w:lastRowLastColumn="0"/>
             </w:pPr>
             <w:r>
+              <w:t>required</w:t>
+            </w:r>
+          </w:p>
+        </w:tc>
+        <w:tc>
+          <w:tcPr>
+            <w:tcW w:w="0" w:type="auto"/>
+          </w:tcPr>
+          <w:p>
+            <w:pPr>
+              <w:cnfStyle w:val="000000000000" w:firstRow="0" w:lastRow="0" w:firstColumn="0" w:lastColumn="0" w:oddVBand="0" w:evenVBand="0" w:oddHBand="0" w:evenHBand="0" w:firstRowFirstColumn="0" w:firstRowLastColumn="0" w:lastRowFirstColumn="0" w:lastRowLastColumn="0"/>
+            </w:pPr>
+            <w:r>
               <w:t>kernel width</w:t>
+            </w:r>
+          </w:p>
+        </w:tc>
+      </w:tr>
+      <w:tr>
+        <w:trPr>
+          <w:cnfStyle w:val="000000100000" w:firstRow="0" w:lastRow="0" w:firstColumn="0" w:lastColumn="0" w:oddVBand="0" w:evenVBand="0" w:oddHBand="1" w:evenHBand="0" w:firstRowFirstColumn="0" w:firstRowLastColumn="0" w:lastRowFirstColumn="0" w:lastRowLastColumn="0"/>
+        </w:trPr>
+        <w:tc>
+          <w:tcPr>
+            <w:cnfStyle w:val="001000000000" w:firstRow="0" w:lastRow="0" w:firstColumn="1" w:lastColumn="0" w:oddVBand="0" w:evenVBand="0" w:oddHBand="0" w:evenHBand="0" w:firstRowFirstColumn="0" w:firstRowLastColumn="0" w:lastRowFirstColumn="0" w:lastRowLastColumn="0"/>
+            <w:tcW w:w="0" w:type="auto"/>
+          </w:tcPr>
+          <w:p>
+            <w:r>
+              <w:rPr>
+                <w:b w:val="0"/>
+                <w:bCs w:val="0"/>
+              </w:rPr>
+              <w:lastRenderedPageBreak/>
+              <w:t>min-row</w:t>
+            </w:r>
+          </w:p>
+        </w:tc>
+        <w:tc>
+          <w:tcPr>
+            <w:tcW w:w="0" w:type="auto"/>
+          </w:tcPr>
+          <w:p>
+            <w:pPr>
+              <w:cnfStyle w:val="000000100000" w:firstRow="0" w:lastRow="0" w:firstColumn="0" w:lastColumn="0" w:oddVBand="0" w:evenVBand="0" w:oddHBand="1" w:evenHBand="0" w:firstRowFirstColumn="0" w:firstRowLastColumn="0" w:lastRowFirstColumn="0" w:lastRowLastColumn="0"/>
+            </w:pPr>
+            <w:r>
+              <w:t>0</w:t>
+            </w:r>
+          </w:p>
+        </w:tc>
+        <w:tc>
+          <w:tcPr>
+            <w:tcW w:w="0" w:type="auto"/>
+          </w:tcPr>
+          <w:p>
+            <w:pPr>
+              <w:cnfStyle w:val="000000100000" w:firstRow="0" w:lastRow="0" w:firstColumn="0" w:lastColumn="0" w:oddVBand="0" w:evenVBand="0" w:oddHBand="1" w:evenHBand="0" w:firstRowFirstColumn="0" w:firstRowLastColumn="0" w:lastRowFirstColumn="0" w:lastRowLastColumn="0"/>
+            </w:pPr>
+            <w:r>
+              <w:t>minimum sub-image row</w:t>
+            </w:r>
+          </w:p>
+        </w:tc>
+      </w:tr>
+      <w:tr>
+        <w:tc>
+          <w:tcPr>
+            <w:cnfStyle w:val="001000000000" w:firstRow="0" w:lastRow="0" w:firstColumn="1" w:lastColumn="0" w:oddVBand="0" w:evenVBand="0" w:oddHBand="0" w:evenHBand="0" w:firstRowFirstColumn="0" w:firstRowLastColumn="0" w:lastRowFirstColumn="0" w:lastRowLastColumn="0"/>
+            <w:tcW w:w="0" w:type="auto"/>
+          </w:tcPr>
+          <w:p>
+            <w:pPr>
+              <w:rPr>
+                <w:b w:val="0"/>
+                <w:bCs w:val="0"/>
+              </w:rPr>
+            </w:pPr>
+            <w:r>
+              <w:rPr>
+                <w:b w:val="0"/>
+                <w:bCs w:val="0"/>
+              </w:rPr>
+              <w:t>max-row</w:t>
+            </w:r>
+          </w:p>
+        </w:tc>
+        <w:tc>
+          <w:tcPr>
+            <w:tcW w:w="0" w:type="auto"/>
+          </w:tcPr>
+          <w:p>
+            <w:pPr>
+              <w:cnfStyle w:val="000000000000" w:firstRow="0" w:lastRow="0" w:firstColumn="0" w:lastColumn="0" w:oddVBand="0" w:evenVBand="0" w:oddHBand="0" w:evenHBand="0" w:firstRowFirstColumn="0" w:firstRowLastColumn="0" w:lastRowFirstColumn="0" w:lastRowLastColumn="0"/>
+            </w:pPr>
+            <w:r>
+              <w:t>image rows - 1</w:t>
+            </w:r>
+          </w:p>
+        </w:tc>
+        <w:tc>
+          <w:tcPr>
+            <w:tcW w:w="0" w:type="auto"/>
+          </w:tcPr>
+          <w:p>
+            <w:pPr>
+              <w:cnfStyle w:val="000000000000" w:firstRow="0" w:lastRow="0" w:firstColumn="0" w:lastColumn="0" w:oddVBand="0" w:evenVBand="0" w:oddHBand="0" w:evenHBand="0" w:firstRowFirstColumn="0" w:firstRowLastColumn="0" w:lastRowFirstColumn="0" w:lastRowLastColumn="0"/>
+            </w:pPr>
+            <w:r>
+              <w:t>maximum sub-image row</w:t>
+            </w:r>
+          </w:p>
+        </w:tc>
+      </w:tr>
+      <w:tr>
+        <w:trPr>
+          <w:cnfStyle w:val="000000100000" w:firstRow="0" w:lastRow="0" w:firstColumn="0" w:lastColumn="0" w:oddVBand="0" w:evenVBand="0" w:oddHBand="1" w:evenHBand="0" w:firstRowFirstColumn="0" w:firstRowLastColumn="0" w:lastRowFirstColumn="0" w:lastRowLastColumn="0"/>
+        </w:trPr>
+        <w:tc>
+          <w:tcPr>
+            <w:cnfStyle w:val="001000000000" w:firstRow="0" w:lastRow="0" w:firstColumn="1" w:lastColumn="0" w:oddVBand="0" w:evenVBand="0" w:oddHBand="0" w:evenHBand="0" w:firstRowFirstColumn="0" w:firstRowLastColumn="0" w:lastRowFirstColumn="0" w:lastRowLastColumn="0"/>
+            <w:tcW w:w="0" w:type="auto"/>
+          </w:tcPr>
+          <w:p>
+            <w:pPr>
+              <w:rPr>
+                <w:b w:val="0"/>
+                <w:bCs w:val="0"/>
+              </w:rPr>
+            </w:pPr>
+            <w:r>
+              <w:rPr>
+                <w:b w:val="0"/>
+                <w:bCs w:val="0"/>
+              </w:rPr>
+              <w:t>min-col</w:t>
+            </w:r>
+          </w:p>
+        </w:tc>
+        <w:tc>
+          <w:tcPr>
+            <w:tcW w:w="0" w:type="auto"/>
+          </w:tcPr>
+          <w:p>
+            <w:pPr>
+              <w:cnfStyle w:val="000000100000" w:firstRow="0" w:lastRow="0" w:firstColumn="0" w:lastColumn="0" w:oddVBand="0" w:evenVBand="0" w:oddHBand="1" w:evenHBand="0" w:firstRowFirstColumn="0" w:firstRowLastColumn="0" w:lastRowFirstColumn="0" w:lastRowLastColumn="0"/>
+            </w:pPr>
+            <w:r>
+              <w:t>0</w:t>
+            </w:r>
+          </w:p>
+        </w:tc>
+        <w:tc>
+          <w:tcPr>
+            <w:tcW w:w="0" w:type="auto"/>
+          </w:tcPr>
+          <w:p>
+            <w:pPr>
+              <w:cnfStyle w:val="000000100000" w:firstRow="0" w:lastRow="0" w:firstColumn="0" w:lastColumn="0" w:oddVBand="0" w:evenVBand="0" w:oddHBand="1" w:evenHBand="0" w:firstRowFirstColumn="0" w:firstRowLastColumn="0" w:lastRowFirstColumn="0" w:lastRowLastColumn="0"/>
+            </w:pPr>
+            <w:r>
+              <w:t>minimum sub-image column</w:t>
+            </w:r>
+          </w:p>
+        </w:tc>
+      </w:tr>
+      <w:tr>
+        <w:tc>
+          <w:tcPr>
+            <w:cnfStyle w:val="001000000000" w:firstRow="0" w:lastRow="0" w:firstColumn="1" w:lastColumn="0" w:oddVBand="0" w:evenVBand="0" w:oddHBand="0" w:evenHBand="0" w:firstRowFirstColumn="0" w:firstRowLastColumn="0" w:lastRowFirstColumn="0" w:lastRowLastColumn="0"/>
+            <w:tcW w:w="0" w:type="auto"/>
+          </w:tcPr>
+          <w:p>
+            <w:pPr>
+              <w:rPr>
+                <w:b w:val="0"/>
+                <w:bCs w:val="0"/>
+              </w:rPr>
+            </w:pPr>
+            <w:r>
+              <w:rPr>
+                <w:b w:val="0"/>
+                <w:bCs w:val="0"/>
+              </w:rPr>
+              <w:t>max-col</w:t>
+            </w:r>
+          </w:p>
+        </w:tc>
+        <w:tc>
+          <w:tcPr>
+            <w:tcW w:w="0" w:type="auto"/>
+          </w:tcPr>
+          <w:p>
+            <w:pPr>
+              <w:cnfStyle w:val="000000000000" w:firstRow="0" w:lastRow="0" w:firstColumn="0" w:lastColumn="0" w:oddVBand="0" w:evenVBand="0" w:oddHBand="0" w:evenHBand="0" w:firstRowFirstColumn="0" w:firstRowLastColumn="0" w:lastRowFirstColumn="0" w:lastRowLastColumn="0"/>
+            </w:pPr>
+            <w:r>
+              <w:t>image cols - 1</w:t>
+            </w:r>
+          </w:p>
+        </w:tc>
+        <w:tc>
+          <w:tcPr>
+            <w:tcW w:w="0" w:type="auto"/>
+          </w:tcPr>
+          <w:p>
+            <w:pPr>
+              <w:cnfStyle w:val="000000000000" w:firstRow="0" w:lastRow="0" w:firstColumn="0" w:lastColumn="0" w:oddVBand="0" w:evenVBand="0" w:oddHBand="0" w:evenHBand="0" w:firstRowFirstColumn="0" w:firstRowLastColumn="0" w:lastRowFirstColumn="0" w:lastRowLastColumn="0"/>
+            </w:pPr>
+            <w:r>
+              <w:t>maximum sub-image column</w:t>
             </w:r>
           </w:p>
         </w:tc>
@@ -18677,7 +19973,6 @@
         <w:pStyle w:val="Heading2"/>
       </w:pPr>
       <w:r>
-        <w:lastRenderedPageBreak/>
         <w:t>filter-smooth-gaussian Operator</w:t>
       </w:r>
     </w:p>
@@ -19456,7 +20751,8 @@
       </w:tblPr>
       <w:tblGrid>
         <w:gridCol w:w="1280"/>
-        <w:gridCol w:w="1818"/>
+        <w:gridCol w:w="1659"/>
+        <w:gridCol w:w="3028"/>
       </w:tblGrid>
       <w:tr>
         <w:trPr>
@@ -19471,7 +20767,21 @@
           </w:tcPr>
           <w:p>
             <w:r>
+              <w:lastRenderedPageBreak/>
               <w:t>parameter</w:t>
+            </w:r>
+          </w:p>
+        </w:tc>
+        <w:tc>
+          <w:tcPr>
+            <w:tcW w:w="0" w:type="auto"/>
+          </w:tcPr>
+          <w:p>
+            <w:pPr>
+              <w:cnfStyle w:val="100000000000" w:firstRow="1" w:lastRow="0" w:firstColumn="0" w:lastColumn="0" w:oddVBand="0" w:evenVBand="0" w:oddHBand="0" w:evenHBand="0" w:firstRowFirstColumn="0" w:firstRowLastColumn="0" w:lastRowFirstColumn="0" w:lastRowLastColumn="0"/>
+            </w:pPr>
+            <w:r>
+              <w:t>default</w:t>
             </w:r>
           </w:p>
         </w:tc>
@@ -19523,6 +20833,19 @@
               <w:cnfStyle w:val="000000100000" w:firstRow="0" w:lastRow="0" w:firstColumn="0" w:lastColumn="0" w:oddVBand="0" w:evenVBand="0" w:oddHBand="1" w:evenHBand="0" w:firstRowFirstColumn="0" w:firstRowLastColumn="0" w:lastRowFirstColumn="0" w:lastRowLastColumn="0"/>
             </w:pPr>
             <w:r>
+              <w:t>required</w:t>
+            </w:r>
+          </w:p>
+        </w:tc>
+        <w:tc>
+          <w:tcPr>
+            <w:tcW w:w="0" w:type="auto"/>
+          </w:tcPr>
+          <w:p>
+            <w:pPr>
+              <w:cnfStyle w:val="000000100000" w:firstRow="0" w:lastRow="0" w:firstColumn="0" w:lastColumn="0" w:oddVBand="0" w:evenVBand="0" w:oddHBand="1" w:evenHBand="0" w:firstRowFirstColumn="0" w:firstRowLastColumn="0" w:lastRowFirstColumn="0" w:lastRowLastColumn="0"/>
+            </w:pPr>
+            <w:r>
               <w:t>kernel height</w:t>
             </w:r>
           </w:p>
@@ -19547,6 +20870,19 @@
                 <w:bCs w:val="0"/>
               </w:rPr>
               <w:t>cols</w:t>
+            </w:r>
+          </w:p>
+        </w:tc>
+        <w:tc>
+          <w:tcPr>
+            <w:tcW w:w="0" w:type="auto"/>
+          </w:tcPr>
+          <w:p>
+            <w:pPr>
+              <w:cnfStyle w:val="000000000000" w:firstRow="0" w:lastRow="0" w:firstColumn="0" w:lastColumn="0" w:oddVBand="0" w:evenVBand="0" w:oddHBand="0" w:evenHBand="0" w:firstRowFirstColumn="0" w:firstRowLastColumn="0" w:lastRowFirstColumn="0" w:lastRowLastColumn="0"/>
+            </w:pPr>
+            <w:r>
+              <w:t>required</w:t>
             </w:r>
           </w:p>
         </w:tc>
@@ -19598,6 +20934,19 @@
               <w:cnfStyle w:val="000000100000" w:firstRow="0" w:lastRow="0" w:firstColumn="0" w:lastColumn="0" w:oddVBand="0" w:evenVBand="0" w:oddHBand="1" w:evenHBand="0" w:firstRowFirstColumn="0" w:firstRowLastColumn="0" w:lastRowFirstColumn="0" w:lastRowLastColumn="0"/>
             </w:pPr>
             <w:r>
+              <w:t>required</w:t>
+            </w:r>
+          </w:p>
+        </w:tc>
+        <w:tc>
+          <w:tcPr>
+            <w:tcW w:w="0" w:type="auto"/>
+          </w:tcPr>
+          <w:p>
+            <w:pPr>
+              <w:cnfStyle w:val="000000100000" w:firstRow="0" w:lastRow="0" w:firstColumn="0" w:lastColumn="0" w:oddVBand="0" w:evenVBand="0" w:oddHBand="1" w:evenHBand="0" w:firstRowFirstColumn="0" w:firstRowLastColumn="0" w:lastRowFirstColumn="0" w:lastRowLastColumn="0"/>
+            </w:pPr>
+            <w:r>
               <w:t>column variance</w:t>
             </w:r>
           </w:p>
@@ -19634,7 +20983,216 @@
               <w:cnfStyle w:val="000000000000" w:firstRow="0" w:lastRow="0" w:firstColumn="0" w:lastColumn="0" w:oddVBand="0" w:evenVBand="0" w:oddHBand="0" w:evenHBand="0" w:firstRowFirstColumn="0" w:firstRowLastColumn="0" w:lastRowFirstColumn="0" w:lastRowLastColumn="0"/>
             </w:pPr>
             <w:r>
+              <w:t>required</w:t>
+            </w:r>
+          </w:p>
+        </w:tc>
+        <w:tc>
+          <w:tcPr>
+            <w:tcW w:w="0" w:type="auto"/>
+          </w:tcPr>
+          <w:p>
+            <w:pPr>
+              <w:cnfStyle w:val="000000000000" w:firstRow="0" w:lastRow="0" w:firstColumn="0" w:lastColumn="0" w:oddVBand="0" w:evenVBand="0" w:oddHBand="0" w:evenHBand="0" w:firstRowFirstColumn="0" w:firstRowLastColumn="0" w:lastRowFirstColumn="0" w:lastRowLastColumn="0"/>
+            </w:pPr>
+            <w:r>
               <w:t>row variance</w:t>
+            </w:r>
+          </w:p>
+        </w:tc>
+      </w:tr>
+      <w:tr>
+        <w:trPr>
+          <w:cnfStyle w:val="000000100000" w:firstRow="0" w:lastRow="0" w:firstColumn="0" w:lastColumn="0" w:oddVBand="0" w:evenVBand="0" w:oddHBand="1" w:evenHBand="0" w:firstRowFirstColumn="0" w:firstRowLastColumn="0" w:lastRowFirstColumn="0" w:lastRowLastColumn="0"/>
+        </w:trPr>
+        <w:tc>
+          <w:tcPr>
+            <w:cnfStyle w:val="001000000000" w:firstRow="0" w:lastRow="0" w:firstColumn="1" w:lastColumn="0" w:oddVBand="0" w:evenVBand="0" w:oddHBand="0" w:evenHBand="0" w:firstRowFirstColumn="0" w:firstRowLastColumn="0" w:lastRowFirstColumn="0" w:lastRowLastColumn="0"/>
+            <w:tcW w:w="0" w:type="auto"/>
+          </w:tcPr>
+          <w:p>
+            <w:r>
+              <w:rPr>
+                <w:b w:val="0"/>
+                <w:bCs w:val="0"/>
+              </w:rPr>
+              <w:t>min-row</w:t>
+            </w:r>
+          </w:p>
+        </w:tc>
+        <w:tc>
+          <w:tcPr>
+            <w:tcW w:w="0" w:type="auto"/>
+          </w:tcPr>
+          <w:p>
+            <w:pPr>
+              <w:cnfStyle w:val="000000100000" w:firstRow="0" w:lastRow="0" w:firstColumn="0" w:lastColumn="0" w:oddVBand="0" w:evenVBand="0" w:oddHBand="1" w:evenHBand="0" w:firstRowFirstColumn="0" w:firstRowLastColumn="0" w:lastRowFirstColumn="0" w:lastRowLastColumn="0"/>
+            </w:pPr>
+            <w:r>
+              <w:t>0</w:t>
+            </w:r>
+          </w:p>
+        </w:tc>
+        <w:tc>
+          <w:tcPr>
+            <w:tcW w:w="0" w:type="auto"/>
+          </w:tcPr>
+          <w:p>
+            <w:pPr>
+              <w:cnfStyle w:val="000000100000" w:firstRow="0" w:lastRow="0" w:firstColumn="0" w:lastColumn="0" w:oddVBand="0" w:evenVBand="0" w:oddHBand="1" w:evenHBand="0" w:firstRowFirstColumn="0" w:firstRowLastColumn="0" w:lastRowFirstColumn="0" w:lastRowLastColumn="0"/>
+            </w:pPr>
+            <w:r>
+              <w:t>minimum sub-image row</w:t>
+            </w:r>
+          </w:p>
+        </w:tc>
+      </w:tr>
+      <w:tr>
+        <w:tc>
+          <w:tcPr>
+            <w:cnfStyle w:val="001000000000" w:firstRow="0" w:lastRow="0" w:firstColumn="1" w:lastColumn="0" w:oddVBand="0" w:evenVBand="0" w:oddHBand="0" w:evenHBand="0" w:firstRowFirstColumn="0" w:firstRowLastColumn="0" w:lastRowFirstColumn="0" w:lastRowLastColumn="0"/>
+            <w:tcW w:w="0" w:type="auto"/>
+          </w:tcPr>
+          <w:p>
+            <w:pPr>
+              <w:rPr>
+                <w:b w:val="0"/>
+                <w:bCs w:val="0"/>
+              </w:rPr>
+            </w:pPr>
+            <w:r>
+              <w:rPr>
+                <w:b w:val="0"/>
+                <w:bCs w:val="0"/>
+              </w:rPr>
+              <w:t>max-row</w:t>
+            </w:r>
+          </w:p>
+        </w:tc>
+        <w:tc>
+          <w:tcPr>
+            <w:tcW w:w="0" w:type="auto"/>
+          </w:tcPr>
+          <w:p>
+            <w:pPr>
+              <w:cnfStyle w:val="000000000000" w:firstRow="0" w:lastRow="0" w:firstColumn="0" w:lastColumn="0" w:oddVBand="0" w:evenVBand="0" w:oddHBand="0" w:evenHBand="0" w:firstRowFirstColumn="0" w:firstRowLastColumn="0" w:lastRowFirstColumn="0" w:lastRowLastColumn="0"/>
+            </w:pPr>
+            <w:r>
+              <w:t>image rows - 1</w:t>
+            </w:r>
+          </w:p>
+        </w:tc>
+        <w:tc>
+          <w:tcPr>
+            <w:tcW w:w="0" w:type="auto"/>
+          </w:tcPr>
+          <w:p>
+            <w:pPr>
+              <w:cnfStyle w:val="000000000000" w:firstRow="0" w:lastRow="0" w:firstColumn="0" w:lastColumn="0" w:oddVBand="0" w:evenVBand="0" w:oddHBand="0" w:evenHBand="0" w:firstRowFirstColumn="0" w:firstRowLastColumn="0" w:lastRowFirstColumn="0" w:lastRowLastColumn="0"/>
+            </w:pPr>
+            <w:r>
+              <w:t>maximum sub-image row</w:t>
+            </w:r>
+          </w:p>
+        </w:tc>
+      </w:tr>
+      <w:tr>
+        <w:trPr>
+          <w:cnfStyle w:val="000000100000" w:firstRow="0" w:lastRow="0" w:firstColumn="0" w:lastColumn="0" w:oddVBand="0" w:evenVBand="0" w:oddHBand="1" w:evenHBand="0" w:firstRowFirstColumn="0" w:firstRowLastColumn="0" w:lastRowFirstColumn="0" w:lastRowLastColumn="0"/>
+        </w:trPr>
+        <w:tc>
+          <w:tcPr>
+            <w:cnfStyle w:val="001000000000" w:firstRow="0" w:lastRow="0" w:firstColumn="1" w:lastColumn="0" w:oddVBand="0" w:evenVBand="0" w:oddHBand="0" w:evenHBand="0" w:firstRowFirstColumn="0" w:firstRowLastColumn="0" w:lastRowFirstColumn="0" w:lastRowLastColumn="0"/>
+            <w:tcW w:w="0" w:type="auto"/>
+          </w:tcPr>
+          <w:p>
+            <w:pPr>
+              <w:rPr>
+                <w:b w:val="0"/>
+                <w:bCs w:val="0"/>
+              </w:rPr>
+            </w:pPr>
+            <w:r>
+              <w:rPr>
+                <w:b w:val="0"/>
+                <w:bCs w:val="0"/>
+              </w:rPr>
+              <w:t>min-col</w:t>
+            </w:r>
+          </w:p>
+        </w:tc>
+        <w:tc>
+          <w:tcPr>
+            <w:tcW w:w="0" w:type="auto"/>
+          </w:tcPr>
+          <w:p>
+            <w:pPr>
+              <w:cnfStyle w:val="000000100000" w:firstRow="0" w:lastRow="0" w:firstColumn="0" w:lastColumn="0" w:oddVBand="0" w:evenVBand="0" w:oddHBand="1" w:evenHBand="0" w:firstRowFirstColumn="0" w:firstRowLastColumn="0" w:lastRowFirstColumn="0" w:lastRowLastColumn="0"/>
+            </w:pPr>
+            <w:r>
+              <w:t>0</w:t>
+            </w:r>
+          </w:p>
+        </w:tc>
+        <w:tc>
+          <w:tcPr>
+            <w:tcW w:w="0" w:type="auto"/>
+          </w:tcPr>
+          <w:p>
+            <w:pPr>
+              <w:cnfStyle w:val="000000100000" w:firstRow="0" w:lastRow="0" w:firstColumn="0" w:lastColumn="0" w:oddVBand="0" w:evenVBand="0" w:oddHBand="1" w:evenHBand="0" w:firstRowFirstColumn="0" w:firstRowLastColumn="0" w:lastRowFirstColumn="0" w:lastRowLastColumn="0"/>
+            </w:pPr>
+            <w:r>
+              <w:t>minimum sub-image column</w:t>
+            </w:r>
+          </w:p>
+        </w:tc>
+      </w:tr>
+      <w:tr>
+        <w:tc>
+          <w:tcPr>
+            <w:cnfStyle w:val="001000000000" w:firstRow="0" w:lastRow="0" w:firstColumn="1" w:lastColumn="0" w:oddVBand="0" w:evenVBand="0" w:oddHBand="0" w:evenHBand="0" w:firstRowFirstColumn="0" w:firstRowLastColumn="0" w:lastRowFirstColumn="0" w:lastRowLastColumn="0"/>
+            <w:tcW w:w="0" w:type="auto"/>
+          </w:tcPr>
+          <w:p>
+            <w:pPr>
+              <w:rPr>
+                <w:b w:val="0"/>
+                <w:bCs w:val="0"/>
+              </w:rPr>
+            </w:pPr>
+            <w:r>
+              <w:rPr>
+                <w:b w:val="0"/>
+                <w:bCs w:val="0"/>
+              </w:rPr>
+              <w:t>max-col</w:t>
+            </w:r>
+          </w:p>
+        </w:tc>
+        <w:tc>
+          <w:tcPr>
+            <w:tcW w:w="0" w:type="auto"/>
+          </w:tcPr>
+          <w:p>
+            <w:pPr>
+              <w:cnfStyle w:val="000000000000" w:firstRow="0" w:lastRow="0" w:firstColumn="0" w:lastColumn="0" w:oddVBand="0" w:evenVBand="0" w:oddHBand="0" w:evenHBand="0" w:firstRowFirstColumn="0" w:firstRowLastColumn="0" w:lastRowFirstColumn="0" w:lastRowLastColumn="0"/>
+            </w:pPr>
+            <w:r>
+              <w:t>image cols - 1</w:t>
+            </w:r>
+          </w:p>
+        </w:tc>
+        <w:tc>
+          <w:tcPr>
+            <w:tcW w:w="0" w:type="auto"/>
+          </w:tcPr>
+          <w:p>
+            <w:pPr>
+              <w:cnfStyle w:val="000000000000" w:firstRow="0" w:lastRow="0" w:firstColumn="0" w:lastColumn="0" w:oddVBand="0" w:evenVBand="0" w:oddHBand="0" w:evenHBand="0" w:firstRowFirstColumn="0" w:firstRowLastColumn="0" w:lastRowFirstColumn="0" w:lastRowLastColumn="0"/>
+            </w:pPr>
+            <w:r>
+              <w:t>maximum sub-image column</w:t>
             </w:r>
           </w:p>
         </w:tc>
@@ -20104,7 +21662,6 @@
         <w:pStyle w:val="Heading2"/>
       </w:pPr>
       <w:r>
-        <w:lastRenderedPageBreak/>
         <w:t>filter-smooth-median Operator</w:t>
       </w:r>
     </w:p>
@@ -20496,6 +22053,7 @@
                 <w:b w:val="0"/>
                 <w:bCs w:val="0"/>
               </w:rPr>
+              <w:lastRenderedPageBreak/>
               <w:t>lower-value</w:t>
             </w:r>
           </w:p>
@@ -21229,7 +22787,6 @@
         <w:pStyle w:val="Normalafterlist"/>
       </w:pPr>
       <w:r>
-        <w:lastRenderedPageBreak/>
         <w:t xml:space="preserve">For text output format, the output data descriptor extension is ignored. The output text file has the extension “.txt” and the output gnuplot script has the extension “.gp” as described in section </w:t>
       </w:r>
       <w:r>
@@ -21726,6 +23283,7 @@
                 <w:b w:val="0"/>
                 <w:bCs w:val="0"/>
               </w:rPr>
+              <w:lastRenderedPageBreak/>
               <w:t>max pixel value</w:t>
             </w:r>
           </w:p>
@@ -22548,7 +24106,6 @@
         <w:pStyle w:val="Heading2"/>
       </w:pPr>
       <w:r>
-        <w:lastRenderedPageBreak/>
         <w:t>hough-peak-detect Operator</w:t>
       </w:r>
     </w:p>
@@ -22966,6 +24523,7 @@
               <w:pStyle w:val="NoSpacing"/>
             </w:pPr>
             <w:r>
+              <w:lastRenderedPageBreak/>
               <w:t>Field</w:t>
             </w:r>
           </w:p>
@@ -23592,7 +25150,6 @@
                 <w:b w:val="0"/>
                 <w:bCs w:val="0"/>
               </w:rPr>
-              <w:lastRenderedPageBreak/>
               <w:t>out-component</w:t>
             </w:r>
           </w:p>
@@ -23900,6 +25457,7 @@
           </w:tcPr>
           <w:p>
             <w:r>
+              <w:lastRenderedPageBreak/>
               <w:t>Descriptor type</w:t>
             </w:r>
           </w:p>
@@ -24666,7 +26224,6 @@
                 <w:b w:val="0"/>
                 <w:bCs w:val="0"/>
               </w:rPr>
-              <w:lastRenderedPageBreak/>
               <w:t>theta_inc</w:t>
             </w:r>
           </w:p>
@@ -25184,6 +26741,7 @@
         <w:pStyle w:val="Normalafterlist"/>
       </w:pPr>
       <w:r>
+        <w:lastRenderedPageBreak/>
         <w:t>The parameters to the draw Hough peak detect operator are as follows. Only one of either the threshold or max_peaks parameter should be supplied.</w:t>
       </w:r>
     </w:p>
@@ -25863,7 +27421,6 @@
         </w:rPr>
       </w:pPr>
       <w:r>
-        <w:lastRenderedPageBreak/>
         <w:t xml:space="preserve">These are the parameters to the draw transform image create operator.  </w:t>
       </w:r>
     </w:p>
@@ -26335,6 +27892,7 @@
         <w:pStyle w:val="Heading2"/>
       </w:pPr>
       <w:r>
+        <w:lastRenderedPageBreak/>
         <w:t>transform-image-copy Operator</w:t>
       </w:r>
     </w:p>
@@ -26957,7 +28515,6 @@
               <w:pStyle w:val="NoSpacing"/>
             </w:pPr>
             <w:r>
-              <w:lastRenderedPageBreak/>
               <w:t>parameter</w:t>
             </w:r>
           </w:p>
@@ -27493,6 +29050,7 @@
                 <w:b w:val="0"/>
                 <w:bCs w:val="0"/>
               </w:rPr>
+              <w:lastRenderedPageBreak/>
               <w:t>max value</w:t>
             </w:r>
           </w:p>
@@ -27942,7 +29500,6 @@
                 <w:b w:val="0"/>
                 <w:bCs w:val="0"/>
               </w:rPr>
-              <w:lastRenderedPageBreak/>
               <w:t>background</w:t>
             </w:r>
           </w:p>
@@ -28577,6 +30134,7 @@
               <w:pStyle w:val="NoSpacing"/>
             </w:pPr>
             <w:r>
+              <w:lastRenderedPageBreak/>
               <w:t>Field</w:t>
             </w:r>
           </w:p>
@@ -29000,7 +30558,6 @@
           </w:tcPr>
           <w:p>
             <w:r>
-              <w:lastRenderedPageBreak/>
               <w:t>Descriptor type</w:t>
             </w:r>
           </w:p>
@@ -29502,6 +31059,7 @@
               <w:pStyle w:val="NoSpacing"/>
             </w:pPr>
             <w:r>
+              <w:lastRenderedPageBreak/>
               <w:t>Field</w:t>
             </w:r>
           </w:p>
@@ -29990,7 +31548,7 @@
       <w:rPr>
         <w:noProof/>
       </w:rPr>
-      <w:t>8/28/2022 1:59 PM</w:t>
+      <w:t>8/28/2022 9:18 PM</w:t>
     </w:r>
     <w:r>
       <w:fldChar w:fldCharType="end"/>
@@ -30048,7 +31606,7 @@
       <w:rPr>
         <w:noProof/>
       </w:rPr>
-      <w:t>8/28/2022 1:59 PM</w:t>
+      <w:t>8/28/2022 9:18 PM</w:t>
     </w:r>
     <w:r>
       <w:fldChar w:fldCharType="end"/>
@@ -34610,6 +36168,7 @@
   <w:style w:type="character" w:default="1" w:styleId="DefaultParagraphFont">
     <w:name w:val="Default Paragraph Font"/>
     <w:uiPriority w:val="1"/>
+    <w:semiHidden/>
     <w:unhideWhenUsed/>
   </w:style>
   <w:style w:type="table" w:default="1" w:styleId="TableNormal">

</xml_diff>

<commit_message>
fixed hough draw lines
</commit_message>
<xml_diff>
--- a/doc/cv-workbench manual.docx
+++ b/doc/cv-workbench manual.docx
@@ -851,7 +851,7 @@
           <w:noProof/>
         </w:rPr>
         <w:drawing>
-          <wp:inline distT="0" distB="0" distL="0" distR="0">
+          <wp:inline distT="0" distB="0" distL="0" distR="0" wp14:anchorId="1F29273C" wp14:editId="08D2F66D">
             <wp:extent cx="5497384" cy="2235200"/>
             <wp:effectExtent l="0" t="0" r="8255" b="0"/>
             <wp:docPr id="1" name="Picture 1"/>
@@ -1042,7 +1042,7 @@
         </w:rPr>
         <w:lastRenderedPageBreak/>
         <w:drawing>
-          <wp:inline distT="0" distB="0" distL="0" distR="0">
+          <wp:inline distT="0" distB="0" distL="0" distR="0" wp14:anchorId="20446DF8" wp14:editId="7C3B89AC">
             <wp:extent cx="4210050" cy="3520070"/>
             <wp:effectExtent l="0" t="0" r="0" b="4445"/>
             <wp:docPr id="5" name="Picture 5"/>
@@ -1534,7 +1534,7 @@
         </w:rPr>
         <w:lastRenderedPageBreak/>
         <w:drawing>
-          <wp:inline distT="0" distB="0" distL="0" distR="0">
+          <wp:inline distT="0" distB="0" distL="0" distR="0" wp14:anchorId="131D8FBC" wp14:editId="701FE9B3">
             <wp:extent cx="4570275" cy="3106420"/>
             <wp:effectExtent l="0" t="0" r="1905" b="0"/>
             <wp:docPr id="6" name="Picture 6"/>
@@ -24304,6 +24304,27 @@
             <w:r>
               <w:t>Color output image component in which to draw line</w:t>
             </w:r>
+            <w:r>
+              <w:t xml:space="preserve">. </w:t>
+            </w:r>
+          </w:p>
+          <w:p>
+            <w:pPr>
+              <w:pStyle w:val="tablebullet"/>
+              <w:cnfStyle w:val="000000100000" w:firstRow="0" w:lastRow="0" w:firstColumn="0" w:lastColumn="0" w:oddVBand="0" w:evenVBand="0" w:oddHBand="1" w:evenHBand="0" w:firstRowFirstColumn="0" w:firstRowLastColumn="0" w:lastRowFirstColumn="0" w:lastRowLastColumn="0"/>
+            </w:pPr>
+            <w:r>
+              <w:t>for grayscale images = 1</w:t>
+            </w:r>
+          </w:p>
+          <w:p>
+            <w:pPr>
+              <w:pStyle w:val="tablebullet"/>
+              <w:cnfStyle w:val="000000100000" w:firstRow="0" w:lastRow="0" w:firstColumn="0" w:lastColumn="0" w:oddVBand="0" w:evenVBand="0" w:oddHBand="1" w:evenHBand="0" w:firstRowFirstColumn="0" w:firstRowLastColumn="0" w:lastRowFirstColumn="0" w:lastRowLastColumn="0"/>
+            </w:pPr>
+            <w:r>
+              <w:t>for color images = 1/red, 2/green, 3/blue</w:t>
+            </w:r>
           </w:p>
         </w:tc>
       </w:tr>
@@ -32583,7 +32604,7 @@
       <w:rPr>
         <w:noProof/>
       </w:rPr>
-      <w:t>9/1/2022 3:53 PM</w:t>
+      <w:t>9/7/2022 11:41 AM</w:t>
     </w:r>
     <w:r>
       <w:fldChar w:fldCharType="end"/>
@@ -32643,7 +32664,7 @@
       <w:rPr>
         <w:noProof/>
       </w:rPr>
-      <w:t>9/1/2022 3:53 PM</w:t>
+      <w:t>9/7/2022 11:41 AM</w:t>
     </w:r>
     <w:r>
       <w:fldChar w:fldCharType="end"/>

</xml_diff>

<commit_message>
added hough-peak-lines code and compiles
</commit_message>
<xml_diff>
--- a/doc/cv-workbench manual.docx
+++ b/doc/cv-workbench manual.docx
@@ -4899,13 +4899,6 @@
       <w:bookmarkEnd w:id="4"/>
     </w:p>
     <w:p>
-      <w:pPr>
-        <w:rPr>
-          <w:sz w:val="20"/>
-          <w:szCs w:val="20"/>
-          <w:vertAlign w:val="superscript"/>
-        </w:rPr>
-      </w:pPr>
       <w:r>
         <w:t xml:space="preserve">Histogram peaks are polar line (r, </w:t>
       </w:r>
@@ -4918,7 +4911,90 @@
         </m:r>
       </m:oMath>
       <w:r>
-        <w:t xml:space="preserve"> parameters selected from the Hough accumulator for a given image. Each peak includes the accumulator count for that line.</w:t>
+        <w:t xml:space="preserve"> parameters selected from the Hough accumulator for a given image. Each peak </w:t>
+      </w:r>
+      <w:r>
+        <w:t>is a local maximum, where</w:t>
+      </w:r>
+      <w:r>
+        <w:t xml:space="preserve"> the accumulator count for that line</w:t>
+      </w:r>
+      <w:r>
+        <w:t xml:space="preserve"> is greater than each (r </w:t>
+      </w:r>
+      <w:r>
+        <w:sym w:font="Symbol" w:char="F0B1"/>
+      </w:r>
+      <w:r>
+        <w:t xml:space="preserve"> 1, </w:t>
+      </w:r>
+      <w:r>
+        <w:sym w:font="Symbol" w:char="F071"/>
+      </w:r>
+      <w:r>
+        <w:t xml:space="preserve"> </w:t>
+      </w:r>
+      <w:r>
+        <w:sym w:font="Symbol" w:char="F0B1"/>
+      </w:r>
+      <w:r>
+        <w:t xml:space="preserve"> 1) neighbor. Included are:</w:t>
+      </w:r>
+    </w:p>
+    <w:p>
+      <w:pPr>
+        <w:pStyle w:val="ListParagraph"/>
+        <w:numPr>
+          <w:ilvl w:val="0"/>
+          <w:numId w:val="32"/>
+        </w:numPr>
+        <w:rPr>
+          <w:sz w:val="20"/>
+          <w:szCs w:val="20"/>
+          <w:vertAlign w:val="superscript"/>
+        </w:rPr>
+      </w:pPr>
+      <w:r>
+        <w:t xml:space="preserve">the accumulator </w:t>
+      </w:r>
+      <w:proofErr w:type="gramStart"/>
+      <w:r>
+        <w:t>count</w:t>
+      </w:r>
+      <w:proofErr w:type="gramEnd"/>
+    </w:p>
+    <w:p>
+      <w:pPr>
+        <w:pStyle w:val="ListParagraph"/>
+        <w:numPr>
+          <w:ilvl w:val="0"/>
+          <w:numId w:val="32"/>
+        </w:numPr>
+        <w:rPr>
+          <w:sz w:val="20"/>
+          <w:szCs w:val="20"/>
+          <w:vertAlign w:val="superscript"/>
+        </w:rPr>
+      </w:pPr>
+      <w:r>
+        <w:t>the difference between the count and the next highest value</w:t>
+      </w:r>
+    </w:p>
+    <w:p>
+      <w:pPr>
+        <w:pStyle w:val="ListParagraph"/>
+        <w:numPr>
+          <w:ilvl w:val="0"/>
+          <w:numId w:val="32"/>
+        </w:numPr>
+        <w:rPr>
+          <w:sz w:val="20"/>
+          <w:szCs w:val="20"/>
+          <w:vertAlign w:val="superscript"/>
+        </w:rPr>
+      </w:pPr>
+      <w:r>
+        <w:t xml:space="preserve">the percentage of that difference and the accumulator count </w:t>
       </w:r>
     </w:p>
     <w:p>
@@ -4973,7 +5049,13 @@
       </w:r>
       <w:proofErr w:type="spellStart"/>
       <w:r>
-        <w:t>max_rho</w:t>
+        <w:t>n</w:t>
+      </w:r>
+      <w:r>
+        <w:t>rho</w:t>
+      </w:r>
+      <w:r>
+        <w:t>s</w:t>
       </w:r>
       <w:proofErr w:type="spellEnd"/>
       <w:r>
@@ -5013,9 +5095,9 @@
         <w:tblLook w:val="04A0" w:firstRow="1" w:lastRow="0" w:firstColumn="1" w:lastColumn="0" w:noHBand="0" w:noVBand="1"/>
       </w:tblPr>
       <w:tblGrid>
-        <w:gridCol w:w="2075"/>
-        <w:gridCol w:w="2284"/>
-        <w:gridCol w:w="4991"/>
+        <w:gridCol w:w="2046"/>
+        <w:gridCol w:w="2423"/>
+        <w:gridCol w:w="4881"/>
       </w:tblGrid>
       <w:tr>
         <w:trPr>
@@ -5089,7 +5171,7 @@
                 <w:b w:val="0"/>
                 <w:bCs w:val="0"/>
               </w:rPr>
-              <w:t>nlines</w:t>
+              <w:t>npeaks</w:t>
             </w:r>
             <w:proofErr w:type="spellEnd"/>
           </w:p>
@@ -5283,15 +5365,21 @@
               <w:cnfStyle w:val="000000000000" w:firstRow="0" w:lastRow="0" w:firstColumn="0" w:lastColumn="0" w:oddVBand="0" w:evenVBand="0" w:oddHBand="0" w:evenHBand="0" w:firstRowFirstColumn="0" w:firstRowLastColumn="0" w:lastRowFirstColumn="0" w:lastRowLastColumn="0"/>
             </w:pPr>
             <w:r>
-              <w:t xml:space="preserve">3 * </w:t>
+              <w:t>5</w:t>
+            </w:r>
+            <w:r>
+              <w:t xml:space="preserve"> * </w:t>
             </w:r>
             <w:proofErr w:type="spellStart"/>
             <w:r>
-              <w:t>nlines</w:t>
+              <w:t>npeaks</w:t>
             </w:r>
             <w:proofErr w:type="spellEnd"/>
             <w:r>
-              <w:t xml:space="preserve"> 32-bit integers</w:t>
+              <w:t xml:space="preserve"> 32-bit </w:t>
+            </w:r>
+            <w:r>
+              <w:t>numbers</w:t>
             </w:r>
           </w:p>
         </w:tc>
@@ -5305,23 +5393,86 @@
               <w:cnfStyle w:val="000000000000" w:firstRow="0" w:lastRow="0" w:firstColumn="0" w:lastColumn="0" w:oddVBand="0" w:evenVBand="0" w:oddHBand="0" w:evenHBand="0" w:firstRowFirstColumn="0" w:firstRowLastColumn="0" w:lastRowFirstColumn="0" w:lastRowLastColumn="0"/>
             </w:pPr>
             <w:r>
-              <w:t>The polar line (</w:t>
-            </w:r>
+              <w:t>The polar line data</w:t>
+            </w:r>
+            <w:r>
+              <w:t>:</w:t>
+            </w:r>
+          </w:p>
+          <w:p>
+            <w:pPr>
+              <w:pStyle w:val="tablebullet"/>
+              <w:cnfStyle w:val="000000000000" w:firstRow="0" w:lastRow="0" w:firstColumn="0" w:lastColumn="0" w:oddVBand="0" w:evenVBand="0" w:oddHBand="0" w:evenHBand="0" w:firstRowFirstColumn="0" w:firstRowLastColumn="0" w:lastRowFirstColumn="0" w:lastRowLastColumn="0"/>
+            </w:pPr>
             <w:proofErr w:type="spellStart"/>
             <w:r>
               <w:t>rho_index</w:t>
             </w:r>
             <w:proofErr w:type="spellEnd"/>
             <w:r>
-              <w:t xml:space="preserve">, </w:t>
-            </w:r>
+              <w:t xml:space="preserve"> (integer)</w:t>
+            </w:r>
+          </w:p>
+          <w:p>
+            <w:pPr>
+              <w:pStyle w:val="tablebullet"/>
+              <w:cnfStyle w:val="000000000000" w:firstRow="0" w:lastRow="0" w:firstColumn="0" w:lastColumn="0" w:oddVBand="0" w:evenVBand="0" w:oddHBand="0" w:evenHBand="0" w:firstRowFirstColumn="0" w:firstRowLastColumn="0" w:lastRowFirstColumn="0" w:lastRowLastColumn="0"/>
+            </w:pPr>
             <w:proofErr w:type="spellStart"/>
             <w:r>
               <w:t>theta_index</w:t>
             </w:r>
             <w:proofErr w:type="spellEnd"/>
             <w:r>
-              <w:t>, count) data</w:t>
+              <w:t xml:space="preserve"> (integer)</w:t>
+            </w:r>
+          </w:p>
+          <w:p>
+            <w:pPr>
+              <w:pStyle w:val="tablebullet"/>
+              <w:cnfStyle w:val="000000000000" w:firstRow="0" w:lastRow="0" w:firstColumn="0" w:lastColumn="0" w:oddVBand="0" w:evenVBand="0" w:oddHBand="0" w:evenHBand="0" w:firstRowFirstColumn="0" w:firstRowLastColumn="0" w:lastRowFirstColumn="0" w:lastRowLastColumn="0"/>
+            </w:pPr>
+            <w:r>
+              <w:t>count (integer)</w:t>
+            </w:r>
+          </w:p>
+          <w:p>
+            <w:pPr>
+              <w:pStyle w:val="tablebullet"/>
+              <w:cnfStyle w:val="000000000000" w:firstRow="0" w:lastRow="0" w:firstColumn="0" w:lastColumn="0" w:oddVBand="0" w:evenVBand="0" w:oddHBand="0" w:evenHBand="0" w:firstRowFirstColumn="0" w:firstRowLastColumn="0" w:lastRowFirstColumn="0" w:lastRowLastColumn="0"/>
+            </w:pPr>
+            <w:r>
+              <w:t>total difference</w:t>
+            </w:r>
+            <w:r>
+              <w:t xml:space="preserve"> (integer)</w:t>
+            </w:r>
+          </w:p>
+          <w:p>
+            <w:pPr>
+              <w:pStyle w:val="tablebullet"/>
+              <w:cnfStyle w:val="000000000000" w:firstRow="0" w:lastRow="0" w:firstColumn="0" w:lastColumn="0" w:oddVBand="0" w:evenVBand="0" w:oddHBand="0" w:evenHBand="0" w:firstRowFirstColumn="0" w:firstRowLastColumn="0" w:lastRowFirstColumn="0" w:lastRowLastColumn="0"/>
+            </w:pPr>
+            <w:r>
+              <w:t>percent difference (0</w:t>
+            </w:r>
+            <w:r>
+              <w:t>.0</w:t>
+            </w:r>
+            <w:r>
+              <w:t>-1</w:t>
+            </w:r>
+            <w:r>
+              <w:t>.</w:t>
+            </w:r>
+            <w:r>
+              <w:t xml:space="preserve">0 as </w:t>
+            </w:r>
+            <w:r>
+              <w:t>float</w:t>
+            </w:r>
+            <w:r>
+              <w:t>)</w:t>
             </w:r>
           </w:p>
         </w:tc>
@@ -5337,21 +5488,82 @@
     </w:p>
     <w:p>
       <w:r>
-        <w:t xml:space="preserve">Hough peak line text data is stored as tab-delimited text files with </w:t>
+        <w:t>Hough peak line text data is stored as tab-delimited text files</w:t>
+      </w:r>
+      <w:r>
+        <w:t xml:space="preserve"> where the first line is:</w:t>
+      </w:r>
+    </w:p>
+    <w:p>
+      <w:pPr>
+        <w:pStyle w:val="Code"/>
+      </w:pPr>
+      <w:r>
+        <w:t xml:space="preserve">  </w:t>
+      </w:r>
+      <w:proofErr w:type="spellStart"/>
+      <w:r>
+        <w:t>npeaks</w:t>
+      </w:r>
+      <w:proofErr w:type="spellEnd"/>
+      <w:r>
+        <w:t xml:space="preserve"> </w:t>
+      </w:r>
+      <w:proofErr w:type="spellStart"/>
+      <w:r>
+        <w:t>theta_inc</w:t>
+      </w:r>
+      <w:proofErr w:type="spellEnd"/>
+      <w:r>
+        <w:t xml:space="preserve"> </w:t>
+      </w:r>
+      <w:proofErr w:type="spellStart"/>
+      <w:r>
+        <w:t>nrhos</w:t>
+      </w:r>
+      <w:proofErr w:type="spellEnd"/>
+    </w:p>
+    <w:p>
+      <w:pPr>
+        <w:pStyle w:val="Normalafterlist"/>
+      </w:pPr>
+      <w:r>
+        <w:t>followed by</w:t>
+      </w:r>
+      <w:r>
+        <w:t xml:space="preserve"> </w:t>
       </w:r>
       <w:proofErr w:type="spellStart"/>
       <w:r>
         <w:rPr>
           <w:rStyle w:val="CodeChar"/>
         </w:rPr>
-        <w:t>nlines</w:t>
+        <w:t>n</w:t>
+      </w:r>
+      <w:r>
+        <w:rPr>
+          <w:rStyle w:val="CodeChar"/>
+        </w:rPr>
+        <w:t>peak</w:t>
+      </w:r>
+      <w:r>
+        <w:rPr>
+          <w:rStyle w:val="CodeChar"/>
+        </w:rPr>
+        <w:t>s</w:t>
       </w:r>
       <w:proofErr w:type="spellEnd"/>
       <w:r>
-        <w:t xml:space="preserve"> lines as a record in the following format. These files can be imported into Microsoft Excel for review.</w:t>
-      </w:r>
-    </w:p>
-    <w:p>
+        <w:t xml:space="preserve"> lines as a record in the following format. </w:t>
+      </w:r>
+    </w:p>
+    <w:p>
+      <w:pPr>
+        <w:pStyle w:val="Code"/>
+      </w:pPr>
+      <w:r>
+        <w:t xml:space="preserve">  </w:t>
+      </w:r>
       <w:r>
         <w:t xml:space="preserve">rho-index </w:t>
       </w:r>
@@ -5362,6 +5574,17 @@
       <w:proofErr w:type="spellEnd"/>
       <w:r>
         <w:t xml:space="preserve"> count</w:t>
+      </w:r>
+      <w:r>
+        <w:t xml:space="preserve"> difference percent-difference</w:t>
+      </w:r>
+    </w:p>
+    <w:p>
+      <w:pPr>
+        <w:pStyle w:val="Normalafterlist"/>
+      </w:pPr>
+      <w:r>
+        <w:t>These files can be imported into Microsoft Excel for review.</w:t>
       </w:r>
     </w:p>
     <w:p>
@@ -5499,6 +5722,7 @@
           <w:i/>
           <w:iCs/>
         </w:rPr>
+        <w:lastRenderedPageBreak/>
         <w:tab/>
       </w:r>
       <w:r>
@@ -5714,7 +5938,6 @@
         <w:pStyle w:val="Code"/>
       </w:pPr>
       <w:r>
-        <w:lastRenderedPageBreak/>
         <w:tab/>
         <w:t xml:space="preserve">  “parameters”: [</w:t>
       </w:r>
@@ -6102,7 +6325,11 @@
               <w:cnfStyle w:val="000000100000" w:firstRow="0" w:lastRow="0" w:firstColumn="0" w:lastColumn="0" w:oddVBand="0" w:evenVBand="0" w:oddHBand="1" w:evenHBand="0" w:firstRowFirstColumn="0" w:firstRowLastColumn="0" w:lastRowFirstColumn="0" w:lastRowLastColumn="0"/>
             </w:pPr>
             <w:r>
-              <w:t xml:space="preserve">An array of pixels that are stored as integer or real numbers. Programs on most computers can view integer images with unsigned byte pixels having values from 0 to 255 stored on the filesystem in JPEG format. </w:t>
+              <w:t xml:space="preserve">An array of pixels that are stored as integer or real numbers. Programs on most computers can view integer images with </w:t>
+            </w:r>
+            <w:r>
+              <w:lastRenderedPageBreak/>
+              <w:t xml:space="preserve">unsigned byte pixels having values from 0 to 255 stored on the filesystem in JPEG format. </w:t>
             </w:r>
           </w:p>
           <w:p>
@@ -6152,6 +6379,7 @@
                 <w:b w:val="0"/>
                 <w:bCs w:val="0"/>
               </w:rPr>
+              <w:lastRenderedPageBreak/>
               <w:t>Histogram</w:t>
             </w:r>
           </w:p>
@@ -6306,7 +6534,6 @@
         <w:pStyle w:val="Heading3"/>
       </w:pPr>
       <w:r>
-        <w:lastRenderedPageBreak/>
         <w:t>Data Format</w:t>
       </w:r>
     </w:p>
@@ -7046,6 +7273,7 @@
         <w:pStyle w:val="Normalafterlist"/>
       </w:pPr>
       <w:r>
+        <w:lastRenderedPageBreak/>
         <w:t>The filesystem data repository supports all data types and data formats listed above. The file path associated with the data descriptor is “</w:t>
       </w:r>
       <w:r>
@@ -7148,7 +7376,6 @@
         <w:pStyle w:val="Code"/>
       </w:pPr>
       <w:r>
-        <w:lastRenderedPageBreak/>
         <w:tab/>
         <w:t xml:space="preserve">    “run</w:t>
       </w:r>
@@ -7890,6 +8117,7 @@
         <w:pStyle w:val="Code"/>
       </w:pPr>
       <w:r>
+        <w:lastRenderedPageBreak/>
         <w:tab/>
         <w:t>}</w:t>
       </w:r>
@@ -8002,7 +8230,6 @@
         <w:pStyle w:val="Code"/>
       </w:pPr>
       <w:r>
-        <w:lastRenderedPageBreak/>
         <w:t>bin/cv-workbench</w:t>
       </w:r>
     </w:p>
@@ -8433,6 +8660,7 @@
         <w:pStyle w:val="Code"/>
       </w:pPr>
       <w:r>
+        <w:lastRenderedPageBreak/>
         <w:tab/>
         <w:t xml:space="preserve">    }</w:t>
       </w:r>
@@ -8644,7 +8872,6 @@
                 <w:b w:val="0"/>
                 <w:bCs w:val="0"/>
               </w:rPr>
-              <w:lastRenderedPageBreak/>
               <w:t xml:space="preserve">  "</w:t>
             </w:r>
             <w:proofErr w:type="gramStart"/>
@@ -9442,6 +9669,7 @@
         <w:pStyle w:val="Code"/>
       </w:pPr>
       <w:r>
+        <w:lastRenderedPageBreak/>
         <w:tab/>
         <w:t xml:space="preserve">      "filename": "square45-90_sobel_gray",</w:t>
       </w:r>
@@ -9607,7 +9835,6 @@
         <w:pStyle w:val="Normalafterlist"/>
       </w:pPr>
       <w:r>
-        <w:lastRenderedPageBreak/>
         <w:t>The significant elements of the script are:</w:t>
       </w:r>
     </w:p>
@@ -11283,6 +11510,7 @@
                 <w:b w:val="0"/>
                 <w:bCs w:val="0"/>
               </w:rPr>
+              <w:lastRenderedPageBreak/>
               <w:t>Filter</w:t>
             </w:r>
           </w:p>
@@ -11683,7 +11911,6 @@
                 <w:b w:val="0"/>
                 <w:bCs w:val="0"/>
               </w:rPr>
-              <w:lastRenderedPageBreak/>
               <w:t>Hough</w:t>
             </w:r>
           </w:p>
@@ -13286,6 +13513,7 @@
                 <w:b w:val="0"/>
                 <w:bCs w:val="0"/>
               </w:rPr>
+              <w:lastRenderedPageBreak/>
               <w:t>S</w:t>
             </w:r>
           </w:p>
@@ -13811,7 +14039,6 @@
                 <w:b w:val="0"/>
                 <w:bCs w:val="0"/>
               </w:rPr>
-              <w:lastRenderedPageBreak/>
               <w:t>NE</w:t>
             </w:r>
           </w:p>
@@ -15005,6 +15232,7 @@
         <w:pStyle w:val="Heading2"/>
       </w:pPr>
       <w:r>
+        <w:lastRenderedPageBreak/>
         <w:t>filter-edge-</w:t>
       </w:r>
       <w:proofErr w:type="spellStart"/>
@@ -15277,7 +15505,6 @@
                 <w:b w:val="0"/>
                 <w:bCs w:val="0"/>
               </w:rPr>
-              <w:lastRenderedPageBreak/>
               <w:t>90</w:t>
             </w:r>
           </w:p>
@@ -16506,6 +16733,7 @@
               <w:pStyle w:val="NoSpacing"/>
             </w:pPr>
             <w:r>
+              <w:lastRenderedPageBreak/>
               <w:t>orientation</w:t>
             </w:r>
           </w:p>
@@ -16812,7 +17040,6 @@
           </w:tcPr>
           <w:p>
             <w:r>
-              <w:lastRenderedPageBreak/>
               <w:t>Descriptor type</w:t>
             </w:r>
           </w:p>
@@ -18233,6 +18460,7 @@
         <w:pStyle w:val="Normalafterlist"/>
       </w:pPr>
       <w:r>
+        <w:lastRenderedPageBreak/>
         <w:t>The operator takes the following data descriptors:</w:t>
       </w:r>
     </w:p>
@@ -18415,7 +18643,6 @@
                 <w:b w:val="0"/>
                 <w:bCs w:val="0"/>
               </w:rPr>
-              <w:lastRenderedPageBreak/>
               <w:t>output</w:t>
             </w:r>
           </w:p>
@@ -19693,6 +19920,7 @@
         <w:pStyle w:val="Normalafterlist"/>
       </w:pPr>
       <w:r>
+        <w:lastRenderedPageBreak/>
         <w:t>The operator takes the following data descriptors. The output data format is ignored.</w:t>
       </w:r>
     </w:p>
@@ -19722,7 +19950,6 @@
           </w:tcPr>
           <w:p>
             <w:r>
-              <w:lastRenderedPageBreak/>
               <w:t>Descriptor type</w:t>
             </w:r>
           </w:p>
@@ -28507,15 +28734,7 @@
         <w:pStyle w:val="Normalafterlist"/>
       </w:pPr>
       <w:r>
-        <w:t xml:space="preserve">The parameters to the draw Hough peak detect operator are as follows. Only one of either the threshold or </w:t>
-      </w:r>
-      <w:proofErr w:type="spellStart"/>
-      <w:r>
-        <w:t>max_peaks</w:t>
-      </w:r>
-      <w:proofErr w:type="spellEnd"/>
-      <w:r>
-        <w:t xml:space="preserve"> parameter should be supplied.</w:t>
+        <w:t xml:space="preserve">The parameters to the draw Hough peak detect operator are as follows. </w:t>
       </w:r>
     </w:p>
     <w:tbl>
@@ -28525,8 +28744,9 @@
         <w:tblLook w:val="04A0" w:firstRow="1" w:lastRow="0" w:firstColumn="1" w:lastColumn="0" w:noHBand="0" w:noVBand="1"/>
       </w:tblPr>
       <w:tblGrid>
-        <w:gridCol w:w="1733"/>
-        <w:gridCol w:w="7617"/>
+        <w:gridCol w:w="2296"/>
+        <w:gridCol w:w="938"/>
+        <w:gridCol w:w="4741"/>
       </w:tblGrid>
       <w:tr>
         <w:trPr>
@@ -28537,7 +28757,7 @@
         <w:tc>
           <w:tcPr>
             <w:cnfStyle w:val="001000000000" w:firstRow="0" w:lastRow="0" w:firstColumn="1" w:lastColumn="0" w:oddVBand="0" w:evenVBand="0" w:oddHBand="0" w:evenHBand="0" w:firstRowFirstColumn="0" w:firstRowLastColumn="0" w:lastRowFirstColumn="0" w:lastRowLastColumn="0"/>
-            <w:tcW w:w="1733" w:type="dxa"/>
+            <w:tcW w:w="0" w:type="auto"/>
           </w:tcPr>
           <w:p>
             <w:pPr>
@@ -28550,7 +28770,21 @@
         </w:tc>
         <w:tc>
           <w:tcPr>
-            <w:tcW w:w="7617" w:type="dxa"/>
+            <w:tcW w:w="0" w:type="auto"/>
+          </w:tcPr>
+          <w:p>
+            <w:pPr>
+              <w:pStyle w:val="NoSpacing"/>
+              <w:cnfStyle w:val="100000000000" w:firstRow="1" w:lastRow="0" w:firstColumn="0" w:lastColumn="0" w:oddVBand="0" w:evenVBand="0" w:oddHBand="0" w:evenHBand="0" w:firstRowFirstColumn="0" w:firstRowLastColumn="0" w:lastRowFirstColumn="0" w:lastRowLastColumn="0"/>
+            </w:pPr>
+            <w:r>
+              <w:t>default</w:t>
+            </w:r>
+          </w:p>
+        </w:tc>
+        <w:tc>
+          <w:tcPr>
+            <w:tcW w:w="0" w:type="auto"/>
           </w:tcPr>
           <w:p>
             <w:pPr>
@@ -28570,30 +28804,30 @@
         <w:tc>
           <w:tcPr>
             <w:cnfStyle w:val="001000000000" w:firstRow="0" w:lastRow="0" w:firstColumn="1" w:lastColumn="0" w:oddVBand="0" w:evenVBand="0" w:oddHBand="0" w:evenHBand="0" w:firstRowFirstColumn="0" w:firstRowLastColumn="0" w:lastRowFirstColumn="0" w:lastRowLastColumn="0"/>
-            <w:tcW w:w="1733" w:type="dxa"/>
-          </w:tcPr>
-          <w:p>
-            <w:pPr>
-              <w:pStyle w:val="NoSpacing"/>
-              <w:rPr>
-                <w:b w:val="0"/>
-                <w:bCs w:val="0"/>
-              </w:rPr>
-            </w:pPr>
-            <w:proofErr w:type="gramStart"/>
-            <w:r>
-              <w:rPr>
-                <w:b w:val="0"/>
-                <w:bCs w:val="0"/>
-              </w:rPr>
-              <w:t>max-peaks</w:t>
-            </w:r>
-            <w:proofErr w:type="gramEnd"/>
-          </w:p>
-        </w:tc>
-        <w:tc>
-          <w:tcPr>
-            <w:tcW w:w="7617" w:type="dxa"/>
+            <w:tcW w:w="0" w:type="auto"/>
+          </w:tcPr>
+          <w:p>
+            <w:pPr>
+              <w:pStyle w:val="NoSpacing"/>
+              <w:rPr>
+                <w:b w:val="0"/>
+                <w:bCs w:val="0"/>
+              </w:rPr>
+            </w:pPr>
+            <w:proofErr w:type="spellStart"/>
+            <w:r>
+              <w:rPr>
+                <w:b w:val="0"/>
+                <w:bCs w:val="0"/>
+              </w:rPr>
+              <w:t>rho_size</w:t>
+            </w:r>
+            <w:proofErr w:type="spellEnd"/>
+          </w:p>
+        </w:tc>
+        <w:tc>
+          <w:tcPr>
+            <w:tcW w:w="0" w:type="auto"/>
           </w:tcPr>
           <w:p>
             <w:pPr>
@@ -28601,7 +28835,237 @@
               <w:cnfStyle w:val="000000100000" w:firstRow="0" w:lastRow="0" w:firstColumn="0" w:lastColumn="0" w:oddVBand="0" w:evenVBand="0" w:oddHBand="1" w:evenHBand="0" w:firstRowFirstColumn="0" w:firstRowLastColumn="0" w:lastRowFirstColumn="0" w:lastRowLastColumn="0"/>
             </w:pPr>
             <w:r>
-              <w:t>The maximum number of peaks to return</w:t>
+              <w:t>1</w:t>
+            </w:r>
+          </w:p>
+        </w:tc>
+        <w:tc>
+          <w:tcPr>
+            <w:tcW w:w="0" w:type="auto"/>
+          </w:tcPr>
+          <w:p>
+            <w:pPr>
+              <w:pStyle w:val="NoSpacing"/>
+              <w:cnfStyle w:val="000000100000" w:firstRow="0" w:lastRow="0" w:firstColumn="0" w:lastColumn="0" w:oddVBand="0" w:evenVBand="0" w:oddHBand="1" w:evenHBand="0" w:firstRowFirstColumn="0" w:firstRowLastColumn="0" w:lastRowFirstColumn="0" w:lastRowLastColumn="0"/>
+            </w:pPr>
+            <w:r>
+              <w:t>neighborhood size in rho axis</w:t>
+            </w:r>
+          </w:p>
+        </w:tc>
+      </w:tr>
+      <w:tr>
+        <w:tc>
+          <w:tcPr>
+            <w:cnfStyle w:val="001000000000" w:firstRow="0" w:lastRow="0" w:firstColumn="1" w:lastColumn="0" w:oddVBand="0" w:evenVBand="0" w:oddHBand="0" w:evenHBand="0" w:firstRowFirstColumn="0" w:firstRowLastColumn="0" w:lastRowFirstColumn="0" w:lastRowLastColumn="0"/>
+            <w:tcW w:w="0" w:type="auto"/>
+          </w:tcPr>
+          <w:p>
+            <w:pPr>
+              <w:pStyle w:val="NoSpacing"/>
+              <w:rPr>
+                <w:b w:val="0"/>
+                <w:bCs w:val="0"/>
+              </w:rPr>
+            </w:pPr>
+            <w:proofErr w:type="spellStart"/>
+            <w:r>
+              <w:rPr>
+                <w:b w:val="0"/>
+                <w:bCs w:val="0"/>
+              </w:rPr>
+              <w:t>theta_size</w:t>
+            </w:r>
+            <w:proofErr w:type="spellEnd"/>
+          </w:p>
+        </w:tc>
+        <w:tc>
+          <w:tcPr>
+            <w:tcW w:w="0" w:type="auto"/>
+          </w:tcPr>
+          <w:p>
+            <w:pPr>
+              <w:pStyle w:val="NoSpacing"/>
+              <w:cnfStyle w:val="000000000000" w:firstRow="0" w:lastRow="0" w:firstColumn="0" w:lastColumn="0" w:oddVBand="0" w:evenVBand="0" w:oddHBand="0" w:evenHBand="0" w:firstRowFirstColumn="0" w:firstRowLastColumn="0" w:lastRowFirstColumn="0" w:lastRowLastColumn="0"/>
+            </w:pPr>
+            <w:r>
+              <w:t>1</w:t>
+            </w:r>
+          </w:p>
+        </w:tc>
+        <w:tc>
+          <w:tcPr>
+            <w:tcW w:w="0" w:type="auto"/>
+          </w:tcPr>
+          <w:p>
+            <w:pPr>
+              <w:pStyle w:val="NoSpacing"/>
+              <w:cnfStyle w:val="000000000000" w:firstRow="0" w:lastRow="0" w:firstColumn="0" w:lastColumn="0" w:oddVBand="0" w:evenVBand="0" w:oddHBand="0" w:evenHBand="0" w:firstRowFirstColumn="0" w:firstRowLastColumn="0" w:lastRowFirstColumn="0" w:lastRowLastColumn="0"/>
+            </w:pPr>
+            <w:r>
+              <w:t>neighborhood size in theta axis</w:t>
+            </w:r>
+          </w:p>
+        </w:tc>
+      </w:tr>
+      <w:tr>
+        <w:trPr>
+          <w:cnfStyle w:val="000000100000" w:firstRow="0" w:lastRow="0" w:firstColumn="0" w:lastColumn="0" w:oddVBand="0" w:evenVBand="0" w:oddHBand="1" w:evenHBand="0" w:firstRowFirstColumn="0" w:firstRowLastColumn="0" w:lastRowFirstColumn="0" w:lastRowLastColumn="0"/>
+        </w:trPr>
+        <w:tc>
+          <w:tcPr>
+            <w:cnfStyle w:val="001000000000" w:firstRow="0" w:lastRow="0" w:firstColumn="1" w:lastColumn="0" w:oddVBand="0" w:evenVBand="0" w:oddHBand="0" w:evenHBand="0" w:firstRowFirstColumn="0" w:firstRowLastColumn="0" w:lastRowFirstColumn="0" w:lastRowLastColumn="0"/>
+            <w:tcW w:w="0" w:type="auto"/>
+          </w:tcPr>
+          <w:p>
+            <w:pPr>
+              <w:pStyle w:val="NoSpacing"/>
+              <w:rPr>
+                <w:b w:val="0"/>
+                <w:bCs w:val="0"/>
+              </w:rPr>
+            </w:pPr>
+            <w:r>
+              <w:rPr>
+                <w:b w:val="0"/>
+                <w:bCs w:val="0"/>
+              </w:rPr>
+              <w:t>threshold-count</w:t>
+            </w:r>
+          </w:p>
+        </w:tc>
+        <w:tc>
+          <w:tcPr>
+            <w:tcW w:w="0" w:type="auto"/>
+          </w:tcPr>
+          <w:p>
+            <w:pPr>
+              <w:pStyle w:val="NoSpacing"/>
+              <w:cnfStyle w:val="000000100000" w:firstRow="0" w:lastRow="0" w:firstColumn="0" w:lastColumn="0" w:oddVBand="0" w:evenVBand="0" w:oddHBand="1" w:evenHBand="0" w:firstRowFirstColumn="0" w:firstRowLastColumn="0" w:lastRowFirstColumn="0" w:lastRowLastColumn="0"/>
+            </w:pPr>
+            <w:r>
+              <w:t>*</w:t>
+            </w:r>
+          </w:p>
+        </w:tc>
+        <w:tc>
+          <w:tcPr>
+            <w:tcW w:w="0" w:type="auto"/>
+          </w:tcPr>
+          <w:p>
+            <w:pPr>
+              <w:pStyle w:val="NoSpacing"/>
+              <w:cnfStyle w:val="000000100000" w:firstRow="0" w:lastRow="0" w:firstColumn="0" w:lastColumn="0" w:oddVBand="0" w:evenVBand="0" w:oddHBand="1" w:evenHBand="0" w:firstRowFirstColumn="0" w:firstRowLastColumn="0" w:lastRowFirstColumn="0" w:lastRowLastColumn="0"/>
+            </w:pPr>
+            <w:r>
+              <w:t>The minimum count for peaks to include</w:t>
+            </w:r>
+          </w:p>
+        </w:tc>
+      </w:tr>
+      <w:tr>
+        <w:tc>
+          <w:tcPr>
+            <w:cnfStyle w:val="001000000000" w:firstRow="0" w:lastRow="0" w:firstColumn="1" w:lastColumn="0" w:oddVBand="0" w:evenVBand="0" w:oddHBand="0" w:evenHBand="0" w:firstRowFirstColumn="0" w:firstRowLastColumn="0" w:lastRowFirstColumn="0" w:lastRowLastColumn="0"/>
+            <w:tcW w:w="0" w:type="auto"/>
+          </w:tcPr>
+          <w:p>
+            <w:pPr>
+              <w:pStyle w:val="NoSpacing"/>
+              <w:rPr>
+                <w:b w:val="0"/>
+                <w:bCs w:val="0"/>
+              </w:rPr>
+            </w:pPr>
+            <w:r>
+              <w:rPr>
+                <w:b w:val="0"/>
+                <w:bCs w:val="0"/>
+              </w:rPr>
+              <w:t>threshold-difference</w:t>
+            </w:r>
+          </w:p>
+        </w:tc>
+        <w:tc>
+          <w:tcPr>
+            <w:tcW w:w="0" w:type="auto"/>
+          </w:tcPr>
+          <w:p>
+            <w:pPr>
+              <w:pStyle w:val="NoSpacing"/>
+              <w:cnfStyle w:val="000000000000" w:firstRow="0" w:lastRow="0" w:firstColumn="0" w:lastColumn="0" w:oddVBand="0" w:evenVBand="0" w:oddHBand="0" w:evenHBand="0" w:firstRowFirstColumn="0" w:firstRowLastColumn="0" w:lastRowFirstColumn="0" w:lastRowLastColumn="0"/>
+            </w:pPr>
+            <w:r>
+              <w:t>*</w:t>
+            </w:r>
+          </w:p>
+        </w:tc>
+        <w:tc>
+          <w:tcPr>
+            <w:tcW w:w="0" w:type="auto"/>
+          </w:tcPr>
+          <w:p>
+            <w:pPr>
+              <w:pStyle w:val="NoSpacing"/>
+              <w:cnfStyle w:val="000000000000" w:firstRow="0" w:lastRow="0" w:firstColumn="0" w:lastColumn="0" w:oddVBand="0" w:evenVBand="0" w:oddHBand="0" w:evenHBand="0" w:firstRowFirstColumn="0" w:firstRowLastColumn="0" w:lastRowFirstColumn="0" w:lastRowLastColumn="0"/>
+            </w:pPr>
+            <w:r>
+              <w:t>The minimum difference for peaks to include</w:t>
+            </w:r>
+          </w:p>
+        </w:tc>
+      </w:tr>
+      <w:tr>
+        <w:trPr>
+          <w:cnfStyle w:val="000000100000" w:firstRow="0" w:lastRow="0" w:firstColumn="0" w:lastColumn="0" w:oddVBand="0" w:evenVBand="0" w:oddHBand="1" w:evenHBand="0" w:firstRowFirstColumn="0" w:firstRowLastColumn="0" w:lastRowFirstColumn="0" w:lastRowLastColumn="0"/>
+        </w:trPr>
+        <w:tc>
+          <w:tcPr>
+            <w:cnfStyle w:val="001000000000" w:firstRow="0" w:lastRow="0" w:firstColumn="1" w:lastColumn="0" w:oddVBand="0" w:evenVBand="0" w:oddHBand="0" w:evenHBand="0" w:firstRowFirstColumn="0" w:firstRowLastColumn="0" w:lastRowFirstColumn="0" w:lastRowLastColumn="0"/>
+            <w:tcW w:w="0" w:type="auto"/>
+          </w:tcPr>
+          <w:p>
+            <w:pPr>
+              <w:pStyle w:val="NoSpacing"/>
+              <w:rPr>
+                <w:b w:val="0"/>
+                <w:bCs w:val="0"/>
+              </w:rPr>
+            </w:pPr>
+            <w:r>
+              <w:rPr>
+                <w:b w:val="0"/>
+                <w:bCs w:val="0"/>
+              </w:rPr>
+              <w:t>threshold-percentage</w:t>
+            </w:r>
+          </w:p>
+        </w:tc>
+        <w:tc>
+          <w:tcPr>
+            <w:tcW w:w="0" w:type="auto"/>
+          </w:tcPr>
+          <w:p>
+            <w:pPr>
+              <w:pStyle w:val="NoSpacing"/>
+              <w:cnfStyle w:val="000000100000" w:firstRow="0" w:lastRow="0" w:firstColumn="0" w:lastColumn="0" w:oddVBand="0" w:evenVBand="0" w:oddHBand="1" w:evenHBand="0" w:firstRowFirstColumn="0" w:firstRowLastColumn="0" w:lastRowFirstColumn="0" w:lastRowLastColumn="0"/>
+            </w:pPr>
+            <w:r>
+              <w:t>*</w:t>
+            </w:r>
+          </w:p>
+        </w:tc>
+        <w:tc>
+          <w:tcPr>
+            <w:tcW w:w="0" w:type="auto"/>
+          </w:tcPr>
+          <w:p>
+            <w:pPr>
+              <w:pStyle w:val="NoSpacing"/>
+              <w:cnfStyle w:val="000000100000" w:firstRow="0" w:lastRow="0" w:firstColumn="0" w:lastColumn="0" w:oddVBand="0" w:evenVBand="0" w:oddHBand="1" w:evenHBand="0" w:firstRowFirstColumn="0" w:firstRowLastColumn="0" w:lastRowFirstColumn="0" w:lastRowLastColumn="0"/>
+            </w:pPr>
+            <w:r>
+              <w:t>The minimum percentage difference to include</w:t>
             </w:r>
           </w:p>
         </w:tc>
@@ -28612,7 +29076,24 @@
         <w:pStyle w:val="Normalafterlist"/>
       </w:pPr>
       <w:r>
-        <w:t>The experiment log output is the peak polar line (rho, theta) data:</w:t>
+        <w:t>*</w:t>
+      </w:r>
+      <w:r>
+        <w:t>Only one of these parameters should be supplied.</w:t>
+      </w:r>
+    </w:p>
+    <w:p>
+      <w:pPr>
+        <w:pStyle w:val="Normalafterlist"/>
+      </w:pPr>
+      <w:r>
+        <w:t xml:space="preserve">The experiment log output is the peak polar line (rho, </w:t>
+      </w:r>
+      <w:r>
+        <w:sym w:font="Symbol" w:char="F071"/>
+      </w:r>
+      <w:r>
+        <w:t>) data:</w:t>
       </w:r>
     </w:p>
     <w:tbl>
@@ -28622,8 +29103,8 @@
         <w:tblLook w:val="04A0" w:firstRow="1" w:lastRow="0" w:firstColumn="1" w:lastColumn="0" w:noHBand="0" w:noVBand="1"/>
       </w:tblPr>
       <w:tblGrid>
-        <w:gridCol w:w="938"/>
-        <w:gridCol w:w="4943"/>
+        <w:gridCol w:w="2876"/>
+        <w:gridCol w:w="6474"/>
       </w:tblGrid>
       <w:tr>
         <w:trPr>
@@ -28738,13 +29219,36 @@
               <w:cnfStyle w:val="000000000000" w:firstRow="0" w:lastRow="0" w:firstColumn="0" w:lastColumn="0" w:oddVBand="0" w:evenVBand="0" w:oddHBand="0" w:evenHBand="0" w:firstRowFirstColumn="0" w:firstRowLastColumn="0" w:lastRowFirstColumn="0" w:lastRowLastColumn="0"/>
             </w:pPr>
             <w:r>
-              <w:t xml:space="preserve">The number of angles sampled = 180 / </w:t>
-            </w:r>
-            <w:proofErr w:type="spellStart"/>
-            <w:r>
-              <w:t>theta_inc</w:t>
-            </w:r>
-            <w:proofErr w:type="spellEnd"/>
+              <w:t xml:space="preserve">The number of angles sampled = </w:t>
+            </w:r>
+            <m:oMath>
+              <m:f>
+                <m:fPr>
+                  <m:ctrlPr>
+                    <w:rPr>
+                      <w:rFonts w:ascii="Cambria Math" w:hAnsi="Cambria Math"/>
+                      <w:i/>
+                    </w:rPr>
+                  </m:ctrlPr>
+                </m:fPr>
+                <m:num>
+                  <m:r>
+                    <w:rPr>
+                      <w:rFonts w:ascii="Cambria Math" w:hAnsi="Cambria Math"/>
+                    </w:rPr>
+                    <m:t>180</m:t>
+                  </m:r>
+                </m:num>
+                <m:den>
+                  <m:r>
+                    <w:rPr>
+                      <w:rFonts w:ascii="Cambria Math" w:hAnsi="Cambria Math"/>
+                    </w:rPr>
+                    <m:t>theta_inc</m:t>
+                  </m:r>
+                </m:den>
+              </m:f>
+            </m:oMath>
           </w:p>
         </w:tc>
       </w:tr>
@@ -28787,6 +29291,717 @@
             </w:pPr>
             <w:r>
               <w:t>The number of rho values sampled</w:t>
+            </w:r>
+          </w:p>
+        </w:tc>
+      </w:tr>
+      <w:tr>
+        <w:tc>
+          <w:tcPr>
+            <w:cnfStyle w:val="001000000000" w:firstRow="0" w:lastRow="0" w:firstColumn="1" w:lastColumn="0" w:oddVBand="0" w:evenVBand="0" w:oddHBand="0" w:evenHBand="0" w:firstRowFirstColumn="0" w:firstRowLastColumn="0" w:lastRowFirstColumn="0" w:lastRowLastColumn="0"/>
+            <w:tcW w:w="0" w:type="auto"/>
+          </w:tcPr>
+          <w:p>
+            <w:pPr>
+              <w:pStyle w:val="NoSpacing"/>
+            </w:pPr>
+            <w:r>
+              <w:rPr>
+                <w:b w:val="0"/>
+                <w:bCs w:val="0"/>
+              </w:rPr>
+              <w:t xml:space="preserve">count </w:t>
+            </w:r>
+            <w:r>
+              <w:rPr>
+                <w:b w:val="0"/>
+                <w:bCs w:val="0"/>
+              </w:rPr>
+              <w:t>min</w:t>
+            </w:r>
+          </w:p>
+        </w:tc>
+        <w:tc>
+          <w:tcPr>
+            <w:tcW w:w="0" w:type="auto"/>
+          </w:tcPr>
+          <w:p>
+            <w:pPr>
+              <w:pStyle w:val="NoSpacing"/>
+              <w:cnfStyle w:val="000000000000" w:firstRow="0" w:lastRow="0" w:firstColumn="0" w:lastColumn="0" w:oddVBand="0" w:evenVBand="0" w:oddHBand="0" w:evenHBand="0" w:firstRowFirstColumn="0" w:firstRowLastColumn="0" w:lastRowFirstColumn="0" w:lastRowLastColumn="0"/>
+            </w:pPr>
+            <w:r>
+              <w:t xml:space="preserve">The lowest count for any </w:t>
+            </w:r>
+            <w:proofErr w:type="spellStart"/>
+            <w:r>
+              <w:t>hough</w:t>
+            </w:r>
+            <w:proofErr w:type="spellEnd"/>
+            <w:r>
+              <w:t xml:space="preserve"> accumulator counts</w:t>
+            </w:r>
+          </w:p>
+        </w:tc>
+      </w:tr>
+      <w:tr>
+        <w:trPr>
+          <w:cnfStyle w:val="000000100000" w:firstRow="0" w:lastRow="0" w:firstColumn="0" w:lastColumn="0" w:oddVBand="0" w:evenVBand="0" w:oddHBand="1" w:evenHBand="0" w:firstRowFirstColumn="0" w:firstRowLastColumn="0" w:lastRowFirstColumn="0" w:lastRowLastColumn="0"/>
+        </w:trPr>
+        <w:tc>
+          <w:tcPr>
+            <w:cnfStyle w:val="001000000000" w:firstRow="0" w:lastRow="0" w:firstColumn="1" w:lastColumn="0" w:oddVBand="0" w:evenVBand="0" w:oddHBand="0" w:evenHBand="0" w:firstRowFirstColumn="0" w:firstRowLastColumn="0" w:lastRowFirstColumn="0" w:lastRowLastColumn="0"/>
+            <w:tcW w:w="0" w:type="auto"/>
+          </w:tcPr>
+          <w:p>
+            <w:pPr>
+              <w:pStyle w:val="NoSpacing"/>
+            </w:pPr>
+            <w:r>
+              <w:rPr>
+                <w:b w:val="0"/>
+                <w:bCs w:val="0"/>
+              </w:rPr>
+              <w:t xml:space="preserve">count </w:t>
+            </w:r>
+            <w:r>
+              <w:rPr>
+                <w:b w:val="0"/>
+                <w:bCs w:val="0"/>
+              </w:rPr>
+              <w:t>max</w:t>
+            </w:r>
+          </w:p>
+        </w:tc>
+        <w:tc>
+          <w:tcPr>
+            <w:tcW w:w="0" w:type="auto"/>
+          </w:tcPr>
+          <w:p>
+            <w:pPr>
+              <w:pStyle w:val="NoSpacing"/>
+              <w:cnfStyle w:val="000000100000" w:firstRow="0" w:lastRow="0" w:firstColumn="0" w:lastColumn="0" w:oddVBand="0" w:evenVBand="0" w:oddHBand="1" w:evenHBand="0" w:firstRowFirstColumn="0" w:firstRowLastColumn="0" w:lastRowFirstColumn="0" w:lastRowLastColumn="0"/>
+            </w:pPr>
+            <w:r>
+              <w:t xml:space="preserve">The largest count for any </w:t>
+            </w:r>
+            <w:proofErr w:type="spellStart"/>
+            <w:r>
+              <w:t>hough</w:t>
+            </w:r>
+            <w:proofErr w:type="spellEnd"/>
+            <w:r>
+              <w:t xml:space="preserve"> accumulator counts</w:t>
+            </w:r>
+          </w:p>
+        </w:tc>
+      </w:tr>
+      <w:tr>
+        <w:tc>
+          <w:tcPr>
+            <w:cnfStyle w:val="001000000000" w:firstRow="0" w:lastRow="0" w:firstColumn="1" w:lastColumn="0" w:oddVBand="0" w:evenVBand="0" w:oddHBand="0" w:evenHBand="0" w:firstRowFirstColumn="0" w:firstRowLastColumn="0" w:lastRowFirstColumn="0" w:lastRowLastColumn="0"/>
+            <w:tcW w:w="0" w:type="auto"/>
+          </w:tcPr>
+          <w:p>
+            <w:pPr>
+              <w:pStyle w:val="NoSpacing"/>
+            </w:pPr>
+            <w:r>
+              <w:rPr>
+                <w:b w:val="0"/>
+                <w:bCs w:val="0"/>
+              </w:rPr>
+              <w:t xml:space="preserve">count </w:t>
+            </w:r>
+            <w:r>
+              <w:rPr>
+                <w:b w:val="0"/>
+                <w:bCs w:val="0"/>
+              </w:rPr>
+              <w:t>mean</w:t>
+            </w:r>
+          </w:p>
+        </w:tc>
+        <w:tc>
+          <w:tcPr>
+            <w:tcW w:w="0" w:type="auto"/>
+          </w:tcPr>
+          <w:p>
+            <w:pPr>
+              <w:pStyle w:val="NoSpacing"/>
+              <w:cnfStyle w:val="000000000000" w:firstRow="0" w:lastRow="0" w:firstColumn="0" w:lastColumn="0" w:oddVBand="0" w:evenVBand="0" w:oddHBand="0" w:evenHBand="0" w:firstRowFirstColumn="0" w:firstRowLastColumn="0" w:lastRowFirstColumn="0" w:lastRowLastColumn="0"/>
+            </w:pPr>
+            <w:r>
+              <w:t xml:space="preserve">The mean for the </w:t>
+            </w:r>
+            <w:proofErr w:type="spellStart"/>
+            <w:r>
+              <w:t>hough</w:t>
+            </w:r>
+            <w:proofErr w:type="spellEnd"/>
+            <w:r>
+              <w:t xml:space="preserve"> accumulator counts</w:t>
+            </w:r>
+          </w:p>
+        </w:tc>
+      </w:tr>
+      <w:tr>
+        <w:trPr>
+          <w:cnfStyle w:val="000000100000" w:firstRow="0" w:lastRow="0" w:firstColumn="0" w:lastColumn="0" w:oddVBand="0" w:evenVBand="0" w:oddHBand="1" w:evenHBand="0" w:firstRowFirstColumn="0" w:firstRowLastColumn="0" w:lastRowFirstColumn="0" w:lastRowLastColumn="0"/>
+        </w:trPr>
+        <w:tc>
+          <w:tcPr>
+            <w:cnfStyle w:val="001000000000" w:firstRow="0" w:lastRow="0" w:firstColumn="1" w:lastColumn="0" w:oddVBand="0" w:evenVBand="0" w:oddHBand="0" w:evenHBand="0" w:firstRowFirstColumn="0" w:firstRowLastColumn="0" w:lastRowFirstColumn="0" w:lastRowLastColumn="0"/>
+            <w:tcW w:w="0" w:type="auto"/>
+          </w:tcPr>
+          <w:p>
+            <w:pPr>
+              <w:pStyle w:val="NoSpacing"/>
+            </w:pPr>
+            <w:r>
+              <w:rPr>
+                <w:b w:val="0"/>
+                <w:bCs w:val="0"/>
+              </w:rPr>
+              <w:t xml:space="preserve">count </w:t>
+            </w:r>
+            <w:r>
+              <w:rPr>
+                <w:b w:val="0"/>
+                <w:bCs w:val="0"/>
+              </w:rPr>
+              <w:t>standard deviation</w:t>
+            </w:r>
+          </w:p>
+        </w:tc>
+        <w:tc>
+          <w:tcPr>
+            <w:tcW w:w="0" w:type="auto"/>
+          </w:tcPr>
+          <w:p>
+            <w:pPr>
+              <w:pStyle w:val="NoSpacing"/>
+              <w:cnfStyle w:val="000000100000" w:firstRow="0" w:lastRow="0" w:firstColumn="0" w:lastColumn="0" w:oddVBand="0" w:evenVBand="0" w:oddHBand="1" w:evenHBand="0" w:firstRowFirstColumn="0" w:firstRowLastColumn="0" w:lastRowFirstColumn="0" w:lastRowLastColumn="0"/>
+            </w:pPr>
+            <w:r>
+              <w:t xml:space="preserve">The standard deviation for the </w:t>
+            </w:r>
+            <w:proofErr w:type="spellStart"/>
+            <w:r>
+              <w:t>hough</w:t>
+            </w:r>
+            <w:proofErr w:type="spellEnd"/>
+            <w:r>
+              <w:t xml:space="preserve"> accumulator counts</w:t>
+            </w:r>
+          </w:p>
+        </w:tc>
+      </w:tr>
+      <w:tr>
+        <w:tc>
+          <w:tcPr>
+            <w:cnfStyle w:val="001000000000" w:firstRow="0" w:lastRow="0" w:firstColumn="1" w:lastColumn="0" w:oddVBand="0" w:evenVBand="0" w:oddHBand="0" w:evenHBand="0" w:firstRowFirstColumn="0" w:firstRowLastColumn="0" w:lastRowFirstColumn="0" w:lastRowLastColumn="0"/>
+            <w:tcW w:w="0" w:type="auto"/>
+          </w:tcPr>
+          <w:p>
+            <w:pPr>
+              <w:pStyle w:val="NoSpacing"/>
+              <w:rPr>
+                <w:b w:val="0"/>
+                <w:bCs w:val="0"/>
+              </w:rPr>
+            </w:pPr>
+            <w:r>
+              <w:rPr>
+                <w:b w:val="0"/>
+                <w:bCs w:val="0"/>
+              </w:rPr>
+              <w:t>difference</w:t>
+            </w:r>
+            <w:r>
+              <w:rPr>
+                <w:b w:val="0"/>
+                <w:bCs w:val="0"/>
+              </w:rPr>
+              <w:t xml:space="preserve"> min</w:t>
+            </w:r>
+          </w:p>
+        </w:tc>
+        <w:tc>
+          <w:tcPr>
+            <w:tcW w:w="0" w:type="auto"/>
+          </w:tcPr>
+          <w:p>
+            <w:pPr>
+              <w:pStyle w:val="NoSpacing"/>
+              <w:cnfStyle w:val="000000000000" w:firstRow="0" w:lastRow="0" w:firstColumn="0" w:lastColumn="0" w:oddVBand="0" w:evenVBand="0" w:oddHBand="0" w:evenHBand="0" w:firstRowFirstColumn="0" w:firstRowLastColumn="0" w:lastRowFirstColumn="0" w:lastRowLastColumn="0"/>
+            </w:pPr>
+            <w:r>
+              <w:t xml:space="preserve">The lowest </w:t>
+            </w:r>
+            <w:r>
+              <w:t>difference</w:t>
+            </w:r>
+            <w:r>
+              <w:t xml:space="preserve"> for any </w:t>
+            </w:r>
+            <w:proofErr w:type="spellStart"/>
+            <w:r>
+              <w:t>hough</w:t>
+            </w:r>
+            <w:proofErr w:type="spellEnd"/>
+            <w:r>
+              <w:t xml:space="preserve"> accumulator </w:t>
+            </w:r>
+            <w:r>
+              <w:t>difference</w:t>
+            </w:r>
+            <w:r>
+              <w:t>s</w:t>
+            </w:r>
+          </w:p>
+        </w:tc>
+      </w:tr>
+      <w:tr>
+        <w:trPr>
+          <w:cnfStyle w:val="000000100000" w:firstRow="0" w:lastRow="0" w:firstColumn="0" w:lastColumn="0" w:oddVBand="0" w:evenVBand="0" w:oddHBand="1" w:evenHBand="0" w:firstRowFirstColumn="0" w:firstRowLastColumn="0" w:lastRowFirstColumn="0" w:lastRowLastColumn="0"/>
+        </w:trPr>
+        <w:tc>
+          <w:tcPr>
+            <w:cnfStyle w:val="001000000000" w:firstRow="0" w:lastRow="0" w:firstColumn="1" w:lastColumn="0" w:oddVBand="0" w:evenVBand="0" w:oddHBand="0" w:evenHBand="0" w:firstRowFirstColumn="0" w:firstRowLastColumn="0" w:lastRowFirstColumn="0" w:lastRowLastColumn="0"/>
+            <w:tcW w:w="0" w:type="auto"/>
+          </w:tcPr>
+          <w:p>
+            <w:pPr>
+              <w:pStyle w:val="NoSpacing"/>
+              <w:rPr>
+                <w:b w:val="0"/>
+                <w:bCs w:val="0"/>
+              </w:rPr>
+            </w:pPr>
+            <w:r>
+              <w:rPr>
+                <w:b w:val="0"/>
+                <w:bCs w:val="0"/>
+              </w:rPr>
+              <w:t>difference</w:t>
+            </w:r>
+            <w:r>
+              <w:rPr>
+                <w:b w:val="0"/>
+                <w:bCs w:val="0"/>
+              </w:rPr>
+              <w:t xml:space="preserve"> max</w:t>
+            </w:r>
+          </w:p>
+        </w:tc>
+        <w:tc>
+          <w:tcPr>
+            <w:tcW w:w="0" w:type="auto"/>
+          </w:tcPr>
+          <w:p>
+            <w:pPr>
+              <w:pStyle w:val="NoSpacing"/>
+              <w:cnfStyle w:val="000000100000" w:firstRow="0" w:lastRow="0" w:firstColumn="0" w:lastColumn="0" w:oddVBand="0" w:evenVBand="0" w:oddHBand="1" w:evenHBand="0" w:firstRowFirstColumn="0" w:firstRowLastColumn="0" w:lastRowFirstColumn="0" w:lastRowLastColumn="0"/>
+            </w:pPr>
+            <w:r>
+              <w:t xml:space="preserve">The largest </w:t>
+            </w:r>
+            <w:r>
+              <w:t>difference</w:t>
+            </w:r>
+            <w:r>
+              <w:t xml:space="preserve"> for any </w:t>
+            </w:r>
+            <w:proofErr w:type="spellStart"/>
+            <w:r>
+              <w:t>hough</w:t>
+            </w:r>
+            <w:proofErr w:type="spellEnd"/>
+            <w:r>
+              <w:t xml:space="preserve"> accumulator </w:t>
+            </w:r>
+            <w:r>
+              <w:t>difference</w:t>
+            </w:r>
+            <w:r>
+              <w:t>s</w:t>
+            </w:r>
+          </w:p>
+        </w:tc>
+      </w:tr>
+      <w:tr>
+        <w:tc>
+          <w:tcPr>
+            <w:cnfStyle w:val="001000000000" w:firstRow="0" w:lastRow="0" w:firstColumn="1" w:lastColumn="0" w:oddVBand="0" w:evenVBand="0" w:oddHBand="0" w:evenHBand="0" w:firstRowFirstColumn="0" w:firstRowLastColumn="0" w:lastRowFirstColumn="0" w:lastRowLastColumn="0"/>
+            <w:tcW w:w="0" w:type="auto"/>
+          </w:tcPr>
+          <w:p>
+            <w:pPr>
+              <w:pStyle w:val="NoSpacing"/>
+              <w:rPr>
+                <w:b w:val="0"/>
+                <w:bCs w:val="0"/>
+              </w:rPr>
+            </w:pPr>
+            <w:r>
+              <w:rPr>
+                <w:b w:val="0"/>
+                <w:bCs w:val="0"/>
+              </w:rPr>
+              <w:t>difference</w:t>
+            </w:r>
+            <w:r>
+              <w:rPr>
+                <w:b w:val="0"/>
+                <w:bCs w:val="0"/>
+              </w:rPr>
+              <w:t xml:space="preserve"> mean</w:t>
+            </w:r>
+          </w:p>
+        </w:tc>
+        <w:tc>
+          <w:tcPr>
+            <w:tcW w:w="0" w:type="auto"/>
+          </w:tcPr>
+          <w:p>
+            <w:pPr>
+              <w:pStyle w:val="NoSpacing"/>
+              <w:cnfStyle w:val="000000000000" w:firstRow="0" w:lastRow="0" w:firstColumn="0" w:lastColumn="0" w:oddVBand="0" w:evenVBand="0" w:oddHBand="0" w:evenHBand="0" w:firstRowFirstColumn="0" w:firstRowLastColumn="0" w:lastRowFirstColumn="0" w:lastRowLastColumn="0"/>
+            </w:pPr>
+            <w:r>
+              <w:t xml:space="preserve">The mean for the </w:t>
+            </w:r>
+            <w:proofErr w:type="spellStart"/>
+            <w:r>
+              <w:t>hough</w:t>
+            </w:r>
+            <w:proofErr w:type="spellEnd"/>
+            <w:r>
+              <w:t xml:space="preserve"> accumulator </w:t>
+            </w:r>
+            <w:r>
+              <w:t>difference</w:t>
+            </w:r>
+            <w:r>
+              <w:t>s</w:t>
+            </w:r>
+          </w:p>
+        </w:tc>
+      </w:tr>
+      <w:tr>
+        <w:trPr>
+          <w:cnfStyle w:val="000000100000" w:firstRow="0" w:lastRow="0" w:firstColumn="0" w:lastColumn="0" w:oddVBand="0" w:evenVBand="0" w:oddHBand="1" w:evenHBand="0" w:firstRowFirstColumn="0" w:firstRowLastColumn="0" w:lastRowFirstColumn="0" w:lastRowLastColumn="0"/>
+        </w:trPr>
+        <w:tc>
+          <w:tcPr>
+            <w:cnfStyle w:val="001000000000" w:firstRow="0" w:lastRow="0" w:firstColumn="1" w:lastColumn="0" w:oddVBand="0" w:evenVBand="0" w:oddHBand="0" w:evenHBand="0" w:firstRowFirstColumn="0" w:firstRowLastColumn="0" w:lastRowFirstColumn="0" w:lastRowLastColumn="0"/>
+            <w:tcW w:w="0" w:type="auto"/>
+          </w:tcPr>
+          <w:p>
+            <w:pPr>
+              <w:pStyle w:val="NoSpacing"/>
+              <w:rPr>
+                <w:b w:val="0"/>
+                <w:bCs w:val="0"/>
+              </w:rPr>
+            </w:pPr>
+            <w:r>
+              <w:rPr>
+                <w:b w:val="0"/>
+                <w:bCs w:val="0"/>
+              </w:rPr>
+              <w:t>difference</w:t>
+            </w:r>
+            <w:r>
+              <w:rPr>
+                <w:b w:val="0"/>
+                <w:bCs w:val="0"/>
+              </w:rPr>
+              <w:t xml:space="preserve"> standard deviation</w:t>
+            </w:r>
+          </w:p>
+        </w:tc>
+        <w:tc>
+          <w:tcPr>
+            <w:tcW w:w="0" w:type="auto"/>
+          </w:tcPr>
+          <w:p>
+            <w:pPr>
+              <w:pStyle w:val="NoSpacing"/>
+              <w:cnfStyle w:val="000000100000" w:firstRow="0" w:lastRow="0" w:firstColumn="0" w:lastColumn="0" w:oddVBand="0" w:evenVBand="0" w:oddHBand="1" w:evenHBand="0" w:firstRowFirstColumn="0" w:firstRowLastColumn="0" w:lastRowFirstColumn="0" w:lastRowLastColumn="0"/>
+            </w:pPr>
+            <w:r>
+              <w:t xml:space="preserve">The standard deviation for the </w:t>
+            </w:r>
+            <w:proofErr w:type="spellStart"/>
+            <w:r>
+              <w:t>hough</w:t>
+            </w:r>
+            <w:proofErr w:type="spellEnd"/>
+            <w:r>
+              <w:t xml:space="preserve"> accumulator </w:t>
+            </w:r>
+            <w:r>
+              <w:t>difference</w:t>
+            </w:r>
+            <w:r>
+              <w:t>s</w:t>
+            </w:r>
+          </w:p>
+        </w:tc>
+      </w:tr>
+      <w:tr>
+        <w:tc>
+          <w:tcPr>
+            <w:cnfStyle w:val="001000000000" w:firstRow="0" w:lastRow="0" w:firstColumn="1" w:lastColumn="0" w:oddVBand="0" w:evenVBand="0" w:oddHBand="0" w:evenHBand="0" w:firstRowFirstColumn="0" w:firstRowLastColumn="0" w:lastRowFirstColumn="0" w:lastRowLastColumn="0"/>
+            <w:tcW w:w="0" w:type="auto"/>
+          </w:tcPr>
+          <w:p>
+            <w:pPr>
+              <w:pStyle w:val="NoSpacing"/>
+              <w:rPr>
+                <w:b w:val="0"/>
+                <w:bCs w:val="0"/>
+              </w:rPr>
+            </w:pPr>
+            <w:r>
+              <w:rPr>
+                <w:b w:val="0"/>
+                <w:bCs w:val="0"/>
+              </w:rPr>
+              <w:t>percentage</w:t>
+            </w:r>
+            <w:r>
+              <w:rPr>
+                <w:b w:val="0"/>
+                <w:bCs w:val="0"/>
+              </w:rPr>
+              <w:t xml:space="preserve"> min</w:t>
+            </w:r>
+          </w:p>
+        </w:tc>
+        <w:tc>
+          <w:tcPr>
+            <w:tcW w:w="0" w:type="auto"/>
+          </w:tcPr>
+          <w:p>
+            <w:pPr>
+              <w:pStyle w:val="NoSpacing"/>
+              <w:cnfStyle w:val="000000000000" w:firstRow="0" w:lastRow="0" w:firstColumn="0" w:lastColumn="0" w:oddVBand="0" w:evenVBand="0" w:oddHBand="0" w:evenHBand="0" w:firstRowFirstColumn="0" w:firstRowLastColumn="0" w:lastRowFirstColumn="0" w:lastRowLastColumn="0"/>
+            </w:pPr>
+            <w:r>
+              <w:t xml:space="preserve">The lowest </w:t>
+            </w:r>
+            <w:r>
+              <w:t>percentage</w:t>
+            </w:r>
+            <w:r>
+              <w:t xml:space="preserve"> for any </w:t>
+            </w:r>
+            <w:proofErr w:type="spellStart"/>
+            <w:r>
+              <w:t>hough</w:t>
+            </w:r>
+            <w:proofErr w:type="spellEnd"/>
+            <w:r>
+              <w:t xml:space="preserve"> accumulator difference </w:t>
+            </w:r>
+            <w:r>
+              <w:t>percentage</w:t>
+            </w:r>
+            <w:r>
+              <w:t>s</w:t>
+            </w:r>
+          </w:p>
+        </w:tc>
+      </w:tr>
+      <w:tr>
+        <w:trPr>
+          <w:cnfStyle w:val="000000100000" w:firstRow="0" w:lastRow="0" w:firstColumn="0" w:lastColumn="0" w:oddVBand="0" w:evenVBand="0" w:oddHBand="1" w:evenHBand="0" w:firstRowFirstColumn="0" w:firstRowLastColumn="0" w:lastRowFirstColumn="0" w:lastRowLastColumn="0"/>
+        </w:trPr>
+        <w:tc>
+          <w:tcPr>
+            <w:cnfStyle w:val="001000000000" w:firstRow="0" w:lastRow="0" w:firstColumn="1" w:lastColumn="0" w:oddVBand="0" w:evenVBand="0" w:oddHBand="0" w:evenHBand="0" w:firstRowFirstColumn="0" w:firstRowLastColumn="0" w:lastRowFirstColumn="0" w:lastRowLastColumn="0"/>
+            <w:tcW w:w="0" w:type="auto"/>
+          </w:tcPr>
+          <w:p>
+            <w:pPr>
+              <w:pStyle w:val="NoSpacing"/>
+              <w:rPr>
+                <w:b w:val="0"/>
+                <w:bCs w:val="0"/>
+              </w:rPr>
+            </w:pPr>
+            <w:r>
+              <w:rPr>
+                <w:b w:val="0"/>
+                <w:bCs w:val="0"/>
+              </w:rPr>
+              <w:t>percentage</w:t>
+            </w:r>
+            <w:r>
+              <w:rPr>
+                <w:b w:val="0"/>
+                <w:bCs w:val="0"/>
+              </w:rPr>
+              <w:t xml:space="preserve"> max</w:t>
+            </w:r>
+          </w:p>
+        </w:tc>
+        <w:tc>
+          <w:tcPr>
+            <w:tcW w:w="0" w:type="auto"/>
+          </w:tcPr>
+          <w:p>
+            <w:pPr>
+              <w:pStyle w:val="NoSpacing"/>
+              <w:cnfStyle w:val="000000100000" w:firstRow="0" w:lastRow="0" w:firstColumn="0" w:lastColumn="0" w:oddVBand="0" w:evenVBand="0" w:oddHBand="1" w:evenHBand="0" w:firstRowFirstColumn="0" w:firstRowLastColumn="0" w:lastRowFirstColumn="0" w:lastRowLastColumn="0"/>
+            </w:pPr>
+            <w:r>
+              <w:t xml:space="preserve">The largest </w:t>
+            </w:r>
+            <w:r>
+              <w:t>percentage</w:t>
+            </w:r>
+            <w:r>
+              <w:t xml:space="preserve"> for any </w:t>
+            </w:r>
+            <w:proofErr w:type="spellStart"/>
+            <w:r>
+              <w:t>hough</w:t>
+            </w:r>
+            <w:proofErr w:type="spellEnd"/>
+            <w:r>
+              <w:t xml:space="preserve"> accumulator difference </w:t>
+            </w:r>
+            <w:r>
+              <w:t>percentage</w:t>
+            </w:r>
+            <w:r>
+              <w:t>s</w:t>
+            </w:r>
+          </w:p>
+        </w:tc>
+      </w:tr>
+      <w:tr>
+        <w:tc>
+          <w:tcPr>
+            <w:cnfStyle w:val="001000000000" w:firstRow="0" w:lastRow="0" w:firstColumn="1" w:lastColumn="0" w:oddVBand="0" w:evenVBand="0" w:oddHBand="0" w:evenHBand="0" w:firstRowFirstColumn="0" w:firstRowLastColumn="0" w:lastRowFirstColumn="0" w:lastRowLastColumn="0"/>
+            <w:tcW w:w="0" w:type="auto"/>
+          </w:tcPr>
+          <w:p>
+            <w:pPr>
+              <w:pStyle w:val="NoSpacing"/>
+              <w:rPr>
+                <w:b w:val="0"/>
+                <w:bCs w:val="0"/>
+              </w:rPr>
+            </w:pPr>
+            <w:r>
+              <w:rPr>
+                <w:b w:val="0"/>
+                <w:bCs w:val="0"/>
+              </w:rPr>
+              <w:lastRenderedPageBreak/>
+              <w:t>percentage</w:t>
+            </w:r>
+            <w:r>
+              <w:rPr>
+                <w:b w:val="0"/>
+                <w:bCs w:val="0"/>
+              </w:rPr>
+              <w:t xml:space="preserve"> mean</w:t>
+            </w:r>
+          </w:p>
+        </w:tc>
+        <w:tc>
+          <w:tcPr>
+            <w:tcW w:w="0" w:type="auto"/>
+          </w:tcPr>
+          <w:p>
+            <w:pPr>
+              <w:pStyle w:val="NoSpacing"/>
+              <w:cnfStyle w:val="000000000000" w:firstRow="0" w:lastRow="0" w:firstColumn="0" w:lastColumn="0" w:oddVBand="0" w:evenVBand="0" w:oddHBand="0" w:evenHBand="0" w:firstRowFirstColumn="0" w:firstRowLastColumn="0" w:lastRowFirstColumn="0" w:lastRowLastColumn="0"/>
+            </w:pPr>
+            <w:r>
+              <w:t xml:space="preserve">The mean for the </w:t>
+            </w:r>
+            <w:proofErr w:type="spellStart"/>
+            <w:r>
+              <w:t>hough</w:t>
+            </w:r>
+            <w:proofErr w:type="spellEnd"/>
+            <w:r>
+              <w:t xml:space="preserve"> accumulator difference </w:t>
+            </w:r>
+            <w:r>
+              <w:t>percentage</w:t>
+            </w:r>
+            <w:r>
+              <w:t>s</w:t>
+            </w:r>
+          </w:p>
+        </w:tc>
+      </w:tr>
+      <w:tr>
+        <w:trPr>
+          <w:cnfStyle w:val="000000100000" w:firstRow="0" w:lastRow="0" w:firstColumn="0" w:lastColumn="0" w:oddVBand="0" w:evenVBand="0" w:oddHBand="1" w:evenHBand="0" w:firstRowFirstColumn="0" w:firstRowLastColumn="0" w:lastRowFirstColumn="0" w:lastRowLastColumn="0"/>
+        </w:trPr>
+        <w:tc>
+          <w:tcPr>
+            <w:cnfStyle w:val="001000000000" w:firstRow="0" w:lastRow="0" w:firstColumn="1" w:lastColumn="0" w:oddVBand="0" w:evenVBand="0" w:oddHBand="0" w:evenHBand="0" w:firstRowFirstColumn="0" w:firstRowLastColumn="0" w:lastRowFirstColumn="0" w:lastRowLastColumn="0"/>
+            <w:tcW w:w="0" w:type="auto"/>
+          </w:tcPr>
+          <w:p>
+            <w:pPr>
+              <w:pStyle w:val="NoSpacing"/>
+              <w:rPr>
+                <w:b w:val="0"/>
+                <w:bCs w:val="0"/>
+              </w:rPr>
+            </w:pPr>
+            <w:r>
+              <w:rPr>
+                <w:b w:val="0"/>
+                <w:bCs w:val="0"/>
+              </w:rPr>
+              <w:t>percentage</w:t>
+            </w:r>
+            <w:r>
+              <w:rPr>
+                <w:b w:val="0"/>
+                <w:bCs w:val="0"/>
+              </w:rPr>
+              <w:t xml:space="preserve"> standard deviation</w:t>
+            </w:r>
+          </w:p>
+        </w:tc>
+        <w:tc>
+          <w:tcPr>
+            <w:tcW w:w="0" w:type="auto"/>
+          </w:tcPr>
+          <w:p>
+            <w:pPr>
+              <w:pStyle w:val="NoSpacing"/>
+              <w:cnfStyle w:val="000000100000" w:firstRow="0" w:lastRow="0" w:firstColumn="0" w:lastColumn="0" w:oddVBand="0" w:evenVBand="0" w:oddHBand="1" w:evenHBand="0" w:firstRowFirstColumn="0" w:firstRowLastColumn="0" w:lastRowFirstColumn="0" w:lastRowLastColumn="0"/>
+            </w:pPr>
+            <w:r>
+              <w:t xml:space="preserve">The standard deviation for the </w:t>
+            </w:r>
+            <w:proofErr w:type="spellStart"/>
+            <w:r>
+              <w:t>hough</w:t>
+            </w:r>
+            <w:proofErr w:type="spellEnd"/>
+            <w:r>
+              <w:t xml:space="preserve"> accumulator difference </w:t>
+            </w:r>
+            <w:r>
+              <w:t>percentage</w:t>
+            </w:r>
+            <w:r>
+              <w:t>s</w:t>
             </w:r>
           </w:p>
         </w:tc>
@@ -29218,7 +30433,6 @@
               <w:pStyle w:val="NoSpacing"/>
             </w:pPr>
             <w:r>
-              <w:lastRenderedPageBreak/>
               <w:t>parameter</w:t>
             </w:r>
           </w:p>
@@ -29939,6 +31153,7 @@
           </w:tcPr>
           <w:p>
             <w:r>
+              <w:lastRenderedPageBreak/>
               <w:t>Input Image</w:t>
             </w:r>
           </w:p>
@@ -30601,7 +31816,6 @@
               <w:pStyle w:val="NoSpacing"/>
             </w:pPr>
             <w:r>
-              <w:lastRenderedPageBreak/>
               <w:t>parameter</w:t>
             </w:r>
           </w:p>
@@ -31159,6 +32373,7 @@
         </w:numPr>
       </w:pPr>
       <w:r>
+        <w:lastRenderedPageBreak/>
         <w:t>If the input descriptor is omitted, an image is created from scratch and the ‘rows’ and ‘cols’ parameters are required. The output image is CV_32S data format.</w:t>
       </w:r>
     </w:p>
@@ -31617,7 +32832,6 @@
                 <w:b w:val="0"/>
                 <w:bCs w:val="0"/>
               </w:rPr>
-              <w:lastRenderedPageBreak/>
               <w:t>background</w:t>
             </w:r>
           </w:p>
@@ -32575,6 +33789,7 @@
                 <w:b w:val="0"/>
                 <w:bCs w:val="0"/>
               </w:rPr>
+              <w:lastRenderedPageBreak/>
               <w:t>cols</w:t>
             </w:r>
           </w:p>
@@ -32911,7 +34126,6 @@
         <w:pStyle w:val="Normalafterlist"/>
       </w:pPr>
       <w:r>
-        <w:lastRenderedPageBreak/>
         <w:t xml:space="preserve">The operator can threshold images by specifying </w:t>
       </w:r>
       <w:proofErr w:type="spellStart"/>
@@ -33741,6 +34955,7 @@
         <w:pStyle w:val="Normalafterlist"/>
       </w:pPr>
       <w:r>
+        <w:lastRenderedPageBreak/>
         <w:t xml:space="preserve">If </w:t>
       </w:r>
       <w:proofErr w:type="spellStart"/>
@@ -34210,7 +35425,6 @@
       <w:bookmarkStart w:id="9" w:name="_Ref112926370"/>
       <w:proofErr w:type="spellStart"/>
       <w:r>
-        <w:lastRenderedPageBreak/>
         <w:t>Github</w:t>
       </w:r>
       <w:proofErr w:type="spellEnd"/>
@@ -34419,6 +35633,7 @@
         <w:pStyle w:val="Code"/>
       </w:pPr>
       <w:r>
+        <w:lastRenderedPageBreak/>
         <w:t>image-morph</w:t>
       </w:r>
     </w:p>
@@ -34743,7 +35958,6 @@
                 <w:b w:val="0"/>
                 <w:bCs w:val="0"/>
               </w:rPr>
-              <w:lastRenderedPageBreak/>
               <w:t>max-col</w:t>
             </w:r>
             <w:proofErr w:type="gramEnd"/>
@@ -35152,6 +36366,7 @@
         <w:pStyle w:val="Code"/>
       </w:pPr>
       <w:r>
+        <w:lastRenderedPageBreak/>
         <w:t xml:space="preserve">        mean                148.429</w:t>
       </w:r>
     </w:p>
@@ -35333,7 +36548,6 @@
         <w:pStyle w:val="Heading3"/>
       </w:pPr>
       <w:r>
-        <w:lastRenderedPageBreak/>
         <w:t>image-read</w:t>
       </w:r>
     </w:p>
@@ -35564,7 +36778,7 @@
       <w:rPr>
         <w:noProof/>
       </w:rPr>
-      <w:t>9/8/2022 4:09 PM</w:t>
+      <w:t>9/9/2022 8:14 AM</w:t>
     </w:r>
     <w:r>
       <w:fldChar w:fldCharType="end"/>
@@ -35624,7 +36838,7 @@
       <w:rPr>
         <w:noProof/>
       </w:rPr>
-      <w:t>9/8/2022 4:09 PM</w:t>
+      <w:t>9/9/2022 8:14 AM</w:t>
     </w:r>
     <w:r>
       <w:fldChar w:fldCharType="end"/>
@@ -36758,6 +37972,119 @@
     </w:lvl>
   </w:abstractNum>
   <w:abstractNum w:abstractNumId="8" w15:restartNumberingAfterBreak="0">
+    <w:nsid w:val="19766D4E"/>
+    <w:multiLevelType w:val="hybridMultilevel"/>
+    <w:tmpl w:val="54F4AA26"/>
+    <w:lvl w:ilvl="0" w:tplc="04090001">
+      <w:start w:val="1"/>
+      <w:numFmt w:val="bullet"/>
+      <w:lvlText w:val=""/>
+      <w:lvlJc w:val="left"/>
+      <w:pPr>
+        <w:ind w:left="720" w:hanging="360"/>
+      </w:pPr>
+      <w:rPr>
+        <w:rFonts w:ascii="Symbol" w:hAnsi="Symbol" w:hint="default"/>
+      </w:rPr>
+    </w:lvl>
+    <w:lvl w:ilvl="1" w:tplc="04090003" w:tentative="1">
+      <w:start w:val="1"/>
+      <w:numFmt w:val="bullet"/>
+      <w:lvlText w:val="o"/>
+      <w:lvlJc w:val="left"/>
+      <w:pPr>
+        <w:ind w:left="1440" w:hanging="360"/>
+      </w:pPr>
+      <w:rPr>
+        <w:rFonts w:ascii="Courier New" w:hAnsi="Courier New" w:cs="Courier New" w:hint="default"/>
+      </w:rPr>
+    </w:lvl>
+    <w:lvl w:ilvl="2" w:tplc="04090005" w:tentative="1">
+      <w:start w:val="1"/>
+      <w:numFmt w:val="bullet"/>
+      <w:lvlText w:val=""/>
+      <w:lvlJc w:val="left"/>
+      <w:pPr>
+        <w:ind w:left="2160" w:hanging="360"/>
+      </w:pPr>
+      <w:rPr>
+        <w:rFonts w:ascii="Wingdings" w:hAnsi="Wingdings" w:hint="default"/>
+      </w:rPr>
+    </w:lvl>
+    <w:lvl w:ilvl="3" w:tplc="04090001" w:tentative="1">
+      <w:start w:val="1"/>
+      <w:numFmt w:val="bullet"/>
+      <w:lvlText w:val=""/>
+      <w:lvlJc w:val="left"/>
+      <w:pPr>
+        <w:ind w:left="2880" w:hanging="360"/>
+      </w:pPr>
+      <w:rPr>
+        <w:rFonts w:ascii="Symbol" w:hAnsi="Symbol" w:hint="default"/>
+      </w:rPr>
+    </w:lvl>
+    <w:lvl w:ilvl="4" w:tplc="04090003" w:tentative="1">
+      <w:start w:val="1"/>
+      <w:numFmt w:val="bullet"/>
+      <w:lvlText w:val="o"/>
+      <w:lvlJc w:val="left"/>
+      <w:pPr>
+        <w:ind w:left="3600" w:hanging="360"/>
+      </w:pPr>
+      <w:rPr>
+        <w:rFonts w:ascii="Courier New" w:hAnsi="Courier New" w:cs="Courier New" w:hint="default"/>
+      </w:rPr>
+    </w:lvl>
+    <w:lvl w:ilvl="5" w:tplc="04090005" w:tentative="1">
+      <w:start w:val="1"/>
+      <w:numFmt w:val="bullet"/>
+      <w:lvlText w:val=""/>
+      <w:lvlJc w:val="left"/>
+      <w:pPr>
+        <w:ind w:left="4320" w:hanging="360"/>
+      </w:pPr>
+      <w:rPr>
+        <w:rFonts w:ascii="Wingdings" w:hAnsi="Wingdings" w:hint="default"/>
+      </w:rPr>
+    </w:lvl>
+    <w:lvl w:ilvl="6" w:tplc="04090001" w:tentative="1">
+      <w:start w:val="1"/>
+      <w:numFmt w:val="bullet"/>
+      <w:lvlText w:val=""/>
+      <w:lvlJc w:val="left"/>
+      <w:pPr>
+        <w:ind w:left="5040" w:hanging="360"/>
+      </w:pPr>
+      <w:rPr>
+        <w:rFonts w:ascii="Symbol" w:hAnsi="Symbol" w:hint="default"/>
+      </w:rPr>
+    </w:lvl>
+    <w:lvl w:ilvl="7" w:tplc="04090003" w:tentative="1">
+      <w:start w:val="1"/>
+      <w:numFmt w:val="bullet"/>
+      <w:lvlText w:val="o"/>
+      <w:lvlJc w:val="left"/>
+      <w:pPr>
+        <w:ind w:left="5760" w:hanging="360"/>
+      </w:pPr>
+      <w:rPr>
+        <w:rFonts w:ascii="Courier New" w:hAnsi="Courier New" w:cs="Courier New" w:hint="default"/>
+      </w:rPr>
+    </w:lvl>
+    <w:lvl w:ilvl="8" w:tplc="04090005" w:tentative="1">
+      <w:start w:val="1"/>
+      <w:numFmt w:val="bullet"/>
+      <w:lvlText w:val=""/>
+      <w:lvlJc w:val="left"/>
+      <w:pPr>
+        <w:ind w:left="6480" w:hanging="360"/>
+      </w:pPr>
+      <w:rPr>
+        <w:rFonts w:ascii="Wingdings" w:hAnsi="Wingdings" w:hint="default"/>
+      </w:rPr>
+    </w:lvl>
+  </w:abstractNum>
+  <w:abstractNum w:abstractNumId="9" w15:restartNumberingAfterBreak="0">
     <w:nsid w:val="1A14152B"/>
     <w:multiLevelType w:val="hybridMultilevel"/>
     <w:tmpl w:val="FFFFFFFF"/>
@@ -36871,7 +38198,7 @@
       </w:rPr>
     </w:lvl>
   </w:abstractNum>
-  <w:abstractNum w:abstractNumId="9" w15:restartNumberingAfterBreak="0">
+  <w:abstractNum w:abstractNumId="10" w15:restartNumberingAfterBreak="0">
     <w:nsid w:val="1BE84423"/>
     <w:multiLevelType w:val="multilevel"/>
     <w:tmpl w:val="FFFFFFFF"/>
@@ -37020,7 +38347,7 @@
       </w:rPr>
     </w:lvl>
   </w:abstractNum>
-  <w:abstractNum w:abstractNumId="10" w15:restartNumberingAfterBreak="0">
+  <w:abstractNum w:abstractNumId="11" w15:restartNumberingAfterBreak="0">
     <w:nsid w:val="21E57545"/>
     <w:multiLevelType w:val="multilevel"/>
     <w:tmpl w:val="FFFFFFFF"/>
@@ -37169,7 +38496,7 @@
       </w:rPr>
     </w:lvl>
   </w:abstractNum>
-  <w:abstractNum w:abstractNumId="11" w15:restartNumberingAfterBreak="0">
+  <w:abstractNum w:abstractNumId="12" w15:restartNumberingAfterBreak="0">
     <w:nsid w:val="2E6F021B"/>
     <w:multiLevelType w:val="hybridMultilevel"/>
     <w:tmpl w:val="FFFFFFFF"/>
@@ -37282,7 +38609,7 @@
       </w:rPr>
     </w:lvl>
   </w:abstractNum>
-  <w:abstractNum w:abstractNumId="12" w15:restartNumberingAfterBreak="0">
+  <w:abstractNum w:abstractNumId="13" w15:restartNumberingAfterBreak="0">
     <w:nsid w:val="30C11414"/>
     <w:multiLevelType w:val="hybridMultilevel"/>
     <w:tmpl w:val="FFFFFFFF"/>
@@ -37395,7 +38722,7 @@
       </w:rPr>
     </w:lvl>
   </w:abstractNum>
-  <w:abstractNum w:abstractNumId="13" w15:restartNumberingAfterBreak="0">
+  <w:abstractNum w:abstractNumId="14" w15:restartNumberingAfterBreak="0">
     <w:nsid w:val="33C7059A"/>
     <w:multiLevelType w:val="hybridMultilevel"/>
     <w:tmpl w:val="FFFFFFFF"/>
@@ -37508,7 +38835,7 @@
       </w:rPr>
     </w:lvl>
   </w:abstractNum>
-  <w:abstractNum w:abstractNumId="14" w15:restartNumberingAfterBreak="0">
+  <w:abstractNum w:abstractNumId="15" w15:restartNumberingAfterBreak="0">
     <w:nsid w:val="375C0357"/>
     <w:multiLevelType w:val="multilevel"/>
     <w:tmpl w:val="FFFFFFFF"/>
@@ -37657,7 +38984,7 @@
       </w:rPr>
     </w:lvl>
   </w:abstractNum>
-  <w:abstractNum w:abstractNumId="15" w15:restartNumberingAfterBreak="0">
+  <w:abstractNum w:abstractNumId="16" w15:restartNumberingAfterBreak="0">
     <w:nsid w:val="39A23496"/>
     <w:multiLevelType w:val="hybridMultilevel"/>
     <w:tmpl w:val="FFFFFFFF"/>
@@ -37770,7 +39097,7 @@
       </w:rPr>
     </w:lvl>
   </w:abstractNum>
-  <w:abstractNum w:abstractNumId="16" w15:restartNumberingAfterBreak="0">
+  <w:abstractNum w:abstractNumId="17" w15:restartNumberingAfterBreak="0">
     <w:nsid w:val="4805304A"/>
     <w:multiLevelType w:val="multilevel"/>
     <w:tmpl w:val="FFFFFFFF"/>
@@ -37919,7 +39246,7 @@
       </w:rPr>
     </w:lvl>
   </w:abstractNum>
-  <w:abstractNum w:abstractNumId="17" w15:restartNumberingAfterBreak="0">
+  <w:abstractNum w:abstractNumId="18" w15:restartNumberingAfterBreak="0">
     <w:nsid w:val="49E805AF"/>
     <w:multiLevelType w:val="multilevel"/>
     <w:tmpl w:val="FFFFFFFF"/>
@@ -38068,7 +39395,7 @@
       </w:rPr>
     </w:lvl>
   </w:abstractNum>
-  <w:abstractNum w:abstractNumId="18" w15:restartNumberingAfterBreak="0">
+  <w:abstractNum w:abstractNumId="19" w15:restartNumberingAfterBreak="0">
     <w:nsid w:val="4D6D164E"/>
     <w:multiLevelType w:val="multilevel"/>
     <w:tmpl w:val="FFFFFFFF"/>
@@ -38190,7 +39517,7 @@
       </w:rPr>
     </w:lvl>
   </w:abstractNum>
-  <w:abstractNum w:abstractNumId="19" w15:restartNumberingAfterBreak="0">
+  <w:abstractNum w:abstractNumId="20" w15:restartNumberingAfterBreak="0">
     <w:nsid w:val="51AD2221"/>
     <w:multiLevelType w:val="hybridMultilevel"/>
     <w:tmpl w:val="FFFFFFFF"/>
@@ -38303,7 +39630,7 @@
       </w:rPr>
     </w:lvl>
   </w:abstractNum>
-  <w:abstractNum w:abstractNumId="20" w15:restartNumberingAfterBreak="0">
+  <w:abstractNum w:abstractNumId="21" w15:restartNumberingAfterBreak="0">
     <w:nsid w:val="58074D11"/>
     <w:multiLevelType w:val="hybridMultilevel"/>
     <w:tmpl w:val="FFFFFFFF"/>
@@ -38416,7 +39743,7 @@
       </w:rPr>
     </w:lvl>
   </w:abstractNum>
-  <w:abstractNum w:abstractNumId="21" w15:restartNumberingAfterBreak="0">
+  <w:abstractNum w:abstractNumId="22" w15:restartNumberingAfterBreak="0">
     <w:nsid w:val="58655697"/>
     <w:multiLevelType w:val="hybridMultilevel"/>
     <w:tmpl w:val="FFFFFFFF"/>
@@ -38529,7 +39856,7 @@
       </w:rPr>
     </w:lvl>
   </w:abstractNum>
-  <w:abstractNum w:abstractNumId="22" w15:restartNumberingAfterBreak="0">
+  <w:abstractNum w:abstractNumId="23" w15:restartNumberingAfterBreak="0">
     <w:nsid w:val="6977567F"/>
     <w:multiLevelType w:val="hybridMultilevel"/>
     <w:tmpl w:val="2174A70E"/>
@@ -38615,7 +39942,7 @@
       </w:pPr>
     </w:lvl>
   </w:abstractNum>
-  <w:abstractNum w:abstractNumId="23" w15:restartNumberingAfterBreak="0">
+  <w:abstractNum w:abstractNumId="24" w15:restartNumberingAfterBreak="0">
     <w:nsid w:val="6CC05501"/>
     <w:multiLevelType w:val="multilevel"/>
     <w:tmpl w:val="FFFFFFFF"/>
@@ -38764,7 +40091,7 @@
       </w:rPr>
     </w:lvl>
   </w:abstractNum>
-  <w:abstractNum w:abstractNumId="24" w15:restartNumberingAfterBreak="0">
+  <w:abstractNum w:abstractNumId="25" w15:restartNumberingAfterBreak="0">
     <w:nsid w:val="6E866A20"/>
     <w:multiLevelType w:val="multilevel"/>
     <w:tmpl w:val="FFFFFFFF"/>
@@ -38913,7 +40240,7 @@
       </w:rPr>
     </w:lvl>
   </w:abstractNum>
-  <w:abstractNum w:abstractNumId="25" w15:restartNumberingAfterBreak="0">
+  <w:abstractNum w:abstractNumId="26" w15:restartNumberingAfterBreak="0">
     <w:nsid w:val="714956CB"/>
     <w:multiLevelType w:val="hybridMultilevel"/>
     <w:tmpl w:val="FFFFFFFF"/>
@@ -39026,7 +40353,7 @@
       </w:rPr>
     </w:lvl>
   </w:abstractNum>
-  <w:abstractNum w:abstractNumId="26" w15:restartNumberingAfterBreak="0">
+  <w:abstractNum w:abstractNumId="27" w15:restartNumberingAfterBreak="0">
     <w:nsid w:val="77E136CD"/>
     <w:multiLevelType w:val="hybridMultilevel"/>
     <w:tmpl w:val="FFFFFFFF"/>
@@ -39139,7 +40466,7 @@
       </w:rPr>
     </w:lvl>
   </w:abstractNum>
-  <w:abstractNum w:abstractNumId="27" w15:restartNumberingAfterBreak="0">
+  <w:abstractNum w:abstractNumId="28" w15:restartNumberingAfterBreak="0">
     <w:nsid w:val="78036FDF"/>
     <w:multiLevelType w:val="hybridMultilevel"/>
     <w:tmpl w:val="FFFFFFFF"/>
@@ -39252,7 +40579,7 @@
       </w:rPr>
     </w:lvl>
   </w:abstractNum>
-  <w:abstractNum w:abstractNumId="28" w15:restartNumberingAfterBreak="0">
+  <w:abstractNum w:abstractNumId="29" w15:restartNumberingAfterBreak="0">
     <w:nsid w:val="788134B7"/>
     <w:multiLevelType w:val="multilevel"/>
     <w:tmpl w:val="FFFFFFFF"/>
@@ -39401,7 +40728,7 @@
       </w:rPr>
     </w:lvl>
   </w:abstractNum>
-  <w:abstractNum w:abstractNumId="29" w15:restartNumberingAfterBreak="0">
+  <w:abstractNum w:abstractNumId="30" w15:restartNumberingAfterBreak="0">
     <w:nsid w:val="7A7363B7"/>
     <w:multiLevelType w:val="hybridMultilevel"/>
     <w:tmpl w:val="FFFFFFFF"/>
@@ -39514,7 +40841,7 @@
       </w:rPr>
     </w:lvl>
   </w:abstractNum>
-  <w:abstractNum w:abstractNumId="30" w15:restartNumberingAfterBreak="0">
+  <w:abstractNum w:abstractNumId="31" w15:restartNumberingAfterBreak="0">
     <w:nsid w:val="7EA272B7"/>
     <w:multiLevelType w:val="multilevel"/>
     <w:tmpl w:val="FFFFFFFF"/>
@@ -39664,7 +40991,7 @@
     </w:lvl>
   </w:abstractNum>
   <w:num w:numId="1" w16cid:durableId="155649927">
-    <w:abstractNumId w:val="10"/>
+    <w:abstractNumId w:val="11"/>
   </w:num>
   <w:num w:numId="2" w16cid:durableId="2109348777">
     <w:abstractNumId w:val="5"/>
@@ -39673,88 +41000,91 @@
     <w:abstractNumId w:val="0"/>
   </w:num>
   <w:num w:numId="4" w16cid:durableId="815296739">
-    <w:abstractNumId w:val="14"/>
+    <w:abstractNumId w:val="15"/>
   </w:num>
   <w:num w:numId="5" w16cid:durableId="185338666">
     <w:abstractNumId w:val="1"/>
   </w:num>
   <w:num w:numId="6" w16cid:durableId="1886867229">
-    <w:abstractNumId w:val="30"/>
+    <w:abstractNumId w:val="31"/>
   </w:num>
   <w:num w:numId="7" w16cid:durableId="1090201329">
-    <w:abstractNumId w:val="23"/>
+    <w:abstractNumId w:val="24"/>
   </w:num>
   <w:num w:numId="8" w16cid:durableId="890113768">
-    <w:abstractNumId w:val="9"/>
+    <w:abstractNumId w:val="10"/>
   </w:num>
   <w:num w:numId="9" w16cid:durableId="411270851">
     <w:abstractNumId w:val="6"/>
   </w:num>
   <w:num w:numId="10" w16cid:durableId="1459911913">
-    <w:abstractNumId w:val="28"/>
+    <w:abstractNumId w:val="29"/>
   </w:num>
   <w:num w:numId="11" w16cid:durableId="1387988607">
-    <w:abstractNumId w:val="24"/>
+    <w:abstractNumId w:val="25"/>
   </w:num>
   <w:num w:numId="12" w16cid:durableId="1944220820">
-    <w:abstractNumId w:val="16"/>
+    <w:abstractNumId w:val="17"/>
   </w:num>
   <w:num w:numId="13" w16cid:durableId="378820147">
-    <w:abstractNumId w:val="18"/>
+    <w:abstractNumId w:val="19"/>
   </w:num>
   <w:num w:numId="14" w16cid:durableId="638344844">
     <w:abstractNumId w:val="7"/>
   </w:num>
   <w:num w:numId="15" w16cid:durableId="1858150011">
-    <w:abstractNumId w:val="17"/>
+    <w:abstractNumId w:val="18"/>
   </w:num>
   <w:num w:numId="16" w16cid:durableId="488979259">
-    <w:abstractNumId w:val="8"/>
+    <w:abstractNumId w:val="9"/>
   </w:num>
   <w:num w:numId="17" w16cid:durableId="2046757515">
     <w:abstractNumId w:val="3"/>
   </w:num>
   <w:num w:numId="18" w16cid:durableId="898832216">
-    <w:abstractNumId w:val="29"/>
+    <w:abstractNumId w:val="30"/>
   </w:num>
   <w:num w:numId="19" w16cid:durableId="1232080886">
-    <w:abstractNumId w:val="12"/>
+    <w:abstractNumId w:val="13"/>
   </w:num>
   <w:num w:numId="20" w16cid:durableId="2122995811">
-    <w:abstractNumId w:val="19"/>
+    <w:abstractNumId w:val="20"/>
   </w:num>
   <w:num w:numId="21" w16cid:durableId="626199169">
-    <w:abstractNumId w:val="25"/>
+    <w:abstractNumId w:val="26"/>
   </w:num>
   <w:num w:numId="22" w16cid:durableId="833254068">
-    <w:abstractNumId w:val="26"/>
+    <w:abstractNumId w:val="27"/>
   </w:num>
   <w:num w:numId="23" w16cid:durableId="754320962">
-    <w:abstractNumId w:val="11"/>
+    <w:abstractNumId w:val="12"/>
   </w:num>
   <w:num w:numId="24" w16cid:durableId="1355377652">
     <w:abstractNumId w:val="4"/>
   </w:num>
   <w:num w:numId="25" w16cid:durableId="1113940201">
-    <w:abstractNumId w:val="27"/>
+    <w:abstractNumId w:val="28"/>
   </w:num>
   <w:num w:numId="26" w16cid:durableId="165173812">
-    <w:abstractNumId w:val="15"/>
+    <w:abstractNumId w:val="16"/>
   </w:num>
   <w:num w:numId="27" w16cid:durableId="1451631651">
+    <w:abstractNumId w:val="22"/>
+  </w:num>
+  <w:num w:numId="28" w16cid:durableId="2079016697">
+    <w:abstractNumId w:val="14"/>
+  </w:num>
+  <w:num w:numId="29" w16cid:durableId="208609796">
     <w:abstractNumId w:val="21"/>
   </w:num>
-  <w:num w:numId="28" w16cid:durableId="2079016697">
-    <w:abstractNumId w:val="13"/>
-  </w:num>
-  <w:num w:numId="29" w16cid:durableId="208609796">
-    <w:abstractNumId w:val="20"/>
-  </w:num>
   <w:num w:numId="30" w16cid:durableId="334303902">
-    <w:abstractNumId w:val="22"/>
+    <w:abstractNumId w:val="23"/>
   </w:num>
   <w:num w:numId="31" w16cid:durableId="413665286">
     <w:abstractNumId w:val="2"/>
+  </w:num>
+  <w:num w:numId="32" w16cid:durableId="727997146">
+    <w:abstractNumId w:val="8"/>
   </w:num>
 </w:numbering>
 </file>

</xml_diff>

<commit_message>
interim checking hough peak lines
</commit_message>
<xml_diff>
--- a/doc/cv-workbench manual.docx
+++ b/doc/cv-workbench manual.docx
@@ -113,7 +113,15 @@
         <w:t xml:space="preserve"> and</w:t>
       </w:r>
       <w:r>
-        <w:t xml:space="preserve"> running operations on different sets of data, and </w:t>
+        <w:t xml:space="preserve"> running operations on different sets of </w:t>
+      </w:r>
+      <w:proofErr w:type="gramStart"/>
+      <w:r>
+        <w:t>data, and</w:t>
+      </w:r>
+      <w:proofErr w:type="gramEnd"/>
+      <w:r>
+        <w:t xml:space="preserve"> </w:t>
       </w:r>
       <w:r>
         <w:t xml:space="preserve">are </w:t>
@@ -205,7 +213,15 @@
         <w:t xml:space="preserve">. What you need to learn isn’t hard. </w:t>
       </w:r>
       <w:r>
-        <w:t>Apple MacOS is similar to Linux but will not run CV Workbench natively.</w:t>
+        <w:t xml:space="preserve">Apple MacOS is </w:t>
+      </w:r>
+      <w:proofErr w:type="gramStart"/>
+      <w:r>
+        <w:t>similar to</w:t>
+      </w:r>
+      <w:proofErr w:type="gramEnd"/>
+      <w:r>
+        <w:t xml:space="preserve"> Linux but will not run CV Workbench natively.</w:t>
       </w:r>
       <w:r>
         <w:t xml:space="preserve"> Versions to run on MacOS and Windows can be produced eventually.</w:t>
@@ -859,7 +875,15 @@
               <w:cnfStyle w:val="000000100000" w:firstRow="0" w:lastRow="0" w:firstColumn="0" w:lastColumn="0" w:oddVBand="0" w:evenVBand="0" w:oddHBand="1" w:evenHBand="0" w:firstRowFirstColumn="0" w:firstRowLastColumn="0" w:lastRowFirstColumn="0" w:lastRowLastColumn="0"/>
             </w:pPr>
             <w:r>
-              <w:t>These are various different image operations including:</w:t>
+              <w:t xml:space="preserve">These are </w:t>
+            </w:r>
+            <w:proofErr w:type="gramStart"/>
+            <w:r>
+              <w:t>various different</w:t>
+            </w:r>
+            <w:proofErr w:type="gramEnd"/>
+            <w:r>
+              <w:t xml:space="preserve"> image operations including:</w:t>
             </w:r>
           </w:p>
           <w:p>
@@ -1008,7 +1032,15 @@
         </w:r>
       </w:hyperlink>
       <w:r>
-        <w:t xml:space="preserve"> are frequency distributions of image or other data values. Histograms consist of a number of bins, where each bin contains counts for a range of values. This diagram shows how histograms are calculated.</w:t>
+        <w:t xml:space="preserve"> are frequency distributions of image or other data values. Histograms consist of </w:t>
+      </w:r>
+      <w:proofErr w:type="gramStart"/>
+      <w:r>
+        <w:t>a number of</w:t>
+      </w:r>
+      <w:proofErr w:type="gramEnd"/>
+      <w:r>
+        <w:t xml:space="preserve"> bins, where each bin contains counts for a range of values. This diagram shows how histograms are calculated.</w:t>
       </w:r>
     </w:p>
     <w:p>
@@ -1663,7 +1695,15 @@
         <w:sym w:font="Symbol" w:char="F0B0"/>
       </w:r>
       <w:r>
-        <w:t>, with a fixed increment between angles, is tested. The lines are counted and the most common ones correspond to the strongest lines in the image.</w:t>
+        <w:t xml:space="preserve">, with a fixed increment between angles, is tested. The lines are </w:t>
+      </w:r>
+      <w:proofErr w:type="gramStart"/>
+      <w:r>
+        <w:t>counted</w:t>
+      </w:r>
+      <w:proofErr w:type="gramEnd"/>
+      <w:r>
+        <w:t xml:space="preserve"> and the most common ones correspond to the strongest lines in the image.</w:t>
       </w:r>
     </w:p>
     <w:p>
@@ -1809,7 +1849,31 @@
         <w:fldChar w:fldCharType="end"/>
       </w:r>
       <w:r>
-        <w:t xml:space="preserve">. Image data saved as unsigned 8 bit values can be visualized as a JPEG image. Much of the data is stored in signed integer for floating point format because the data values involved lie outside the unsigned 8 bit range of 0 to 255. On saving data values outside the range of 0 to 255 in unsigned 8 bit images, the exact value saved in undefined. Other data formats include tab-delimited text output that is viewable in Microsoft Excel or </w:t>
+        <w:t xml:space="preserve">. Image data saved as unsigned </w:t>
+      </w:r>
+      <w:proofErr w:type="gramStart"/>
+      <w:r>
+        <w:t>8 bit</w:t>
+      </w:r>
+      <w:proofErr w:type="gramEnd"/>
+      <w:r>
+        <w:t xml:space="preserve"> values can be visualized as a JPEG image. Much of the data is stored in signed integer for floating point format because the data values involved lie outside the unsigned </w:t>
+      </w:r>
+      <w:proofErr w:type="gramStart"/>
+      <w:r>
+        <w:t>8 bit</w:t>
+      </w:r>
+      <w:proofErr w:type="gramEnd"/>
+      <w:r>
+        <w:t xml:space="preserve"> range of 0 to 255. On saving data values outside the range of 0 to 255 in unsigned </w:t>
+      </w:r>
+      <w:proofErr w:type="gramStart"/>
+      <w:r>
+        <w:t>8 bit</w:t>
+      </w:r>
+      <w:proofErr w:type="gramEnd"/>
+      <w:r>
+        <w:t xml:space="preserve"> images, the exact value saved in undefined. Other data formats include tab-delimited text output that is viewable in Microsoft Excel or </w:t>
       </w:r>
       <w:hyperlink r:id="rId17" w:history="1">
         <w:proofErr w:type="spellStart"/>
@@ -2305,7 +2369,15 @@
     </w:p>
     <w:p>
       <w:r>
-        <w:t>The binary image data file format has the following format. Color RGB pixels are stored as three consecutive pixel values, one for each component. The three pixel values represent the red, green, and blue components.</w:t>
+        <w:t xml:space="preserve">The binary image data file format has the following format. Color RGB pixels are stored as three consecutive pixel values, one for each component. The </w:t>
+      </w:r>
+      <w:proofErr w:type="gramStart"/>
+      <w:r>
+        <w:t>three pixel</w:t>
+      </w:r>
+      <w:proofErr w:type="gramEnd"/>
+      <w:r>
+        <w:t xml:space="preserve"> values represent the red, green, and blue components.</w:t>
       </w:r>
     </w:p>
     <w:tbl>
@@ -2675,7 +2747,15 @@
     </w:p>
     <w:p>
       <w:r>
-        <w:t xml:space="preserve">Histograms count the number of different values for any data type containing a range of values, such as images or Hough accumulators. The histogram bins correspond to a data values ranging from a lower to an upper value. The number of histogram bins </w:t>
+        <w:t xml:space="preserve">Histograms count the number of different values for any data type containing a range of values, such as images or Hough accumulators. The histogram bins correspond to a </w:t>
+      </w:r>
+      <w:proofErr w:type="gramStart"/>
+      <w:r>
+        <w:t>data values</w:t>
+      </w:r>
+      <w:proofErr w:type="gramEnd"/>
+      <w:r>
+        <w:t xml:space="preserve"> ranging from a lower to an upper value. The number of histogram bins </w:t>
       </w:r>
       <w:proofErr w:type="spellStart"/>
       <w:r>
@@ -2793,7 +2873,15 @@
         <w:pStyle w:val="code0"/>
       </w:pPr>
       <w:r>
-        <w:t xml:space="preserve">    bin = round((</w:t>
+        <w:t xml:space="preserve">    bin = </w:t>
+      </w:r>
+      <w:proofErr w:type="gramStart"/>
+      <w:r>
+        <w:t>round(</w:t>
+      </w:r>
+      <w:proofErr w:type="gramEnd"/>
+      <w:r>
+        <w:t>(</w:t>
       </w:r>
       <w:proofErr w:type="spellStart"/>
       <w:r>
@@ -2833,7 +2921,15 @@
         <w:pStyle w:val="Normalafterlist"/>
       </w:pPr>
       <w:r>
-        <w:t xml:space="preserve">The histogram data type format indicates how histogram data is stored. There are both binary and text stored histogram formats. Binary histogram files are used only within this software. Text histogram files may visualized with </w:t>
+        <w:t xml:space="preserve">The histogram data type format indicates how histogram data is stored. There are both binary and text stored histogram formats. Binary histogram files are used only within this software. Text histogram files may </w:t>
+      </w:r>
+      <w:proofErr w:type="gramStart"/>
+      <w:r>
+        <w:t>visualized</w:t>
+      </w:r>
+      <w:proofErr w:type="gramEnd"/>
+      <w:r>
+        <w:t xml:space="preserve"> with </w:t>
       </w:r>
       <w:proofErr w:type="spellStart"/>
       <w:r>
@@ -3313,7 +3409,15 @@
         <w:t>output-filename</w:t>
       </w:r>
       <w:r>
-        <w:t>.txt' using 2:xtic(1)</w:t>
+        <w:t xml:space="preserve">.txt' using </w:t>
+      </w:r>
+      <w:proofErr w:type="gramStart"/>
+      <w:r>
+        <w:t>2:xtic</w:t>
+      </w:r>
+      <w:proofErr w:type="gramEnd"/>
+      <w:r>
+        <w:t>(1)</w:t>
       </w:r>
     </w:p>
     <w:p>
@@ -4851,8 +4955,13 @@
         </w:rPr>
       </w:pPr>
       <w:r>
-        <w:t>the accumulator count</w:t>
-      </w:r>
+        <w:t xml:space="preserve">the accumulator </w:t>
+      </w:r>
+      <w:proofErr w:type="gramStart"/>
+      <w:r>
+        <w:t>count</w:t>
+      </w:r>
+      <w:proofErr w:type="gramEnd"/>
     </w:p>
     <w:p>
       <w:pPr>
@@ -4900,84 +5009,24 @@
       <w:r>
         <w:t>The binary Hough peak line data is defined by the workbench and has the following format. Polar line data is stored as (</w:t>
       </w:r>
-      <w:proofErr w:type="spellStart"/>
       <w:r>
         <w:rPr>
           <w:rStyle w:val="CodeChar"/>
         </w:rPr>
-        <w:t>rho_index</w:t>
-      </w:r>
-      <w:proofErr w:type="spellEnd"/>
+        <w:t>rho</w:t>
+      </w:r>
       <w:r>
         <w:t xml:space="preserve">, </w:t>
       </w:r>
-      <w:proofErr w:type="spellStart"/>
       <w:r>
         <w:rPr>
           <w:rStyle w:val="CodeChar"/>
         </w:rPr>
-        <w:t>theta_index</w:t>
-      </w:r>
-      <w:proofErr w:type="spellEnd"/>
-      <w:r>
-        <w:t>). The corresponding rho and theta can be derived from:</w:t>
-      </w:r>
-    </w:p>
-    <w:p>
-      <w:pPr>
-        <w:pStyle w:val="code0"/>
-      </w:pPr>
-      <w:r>
-        <w:t xml:space="preserve">rho = </w:t>
-      </w:r>
-      <w:proofErr w:type="spellStart"/>
-      <w:r>
-        <w:t>rho_index</w:t>
-      </w:r>
-      <w:proofErr w:type="spellEnd"/>
-      <w:r>
-        <w:t xml:space="preserve"> – </w:t>
-      </w:r>
-      <w:proofErr w:type="spellStart"/>
-      <w:r>
-        <w:t>n</w:t>
-      </w:r>
-      <w:r>
-        <w:t>rho</w:t>
-      </w:r>
-      <w:r>
-        <w:t>s</w:t>
-      </w:r>
-      <w:proofErr w:type="spellEnd"/>
-      <w:r>
-        <w:t xml:space="preserve"> / 2</w:t>
-      </w:r>
-    </w:p>
-    <w:p>
-      <w:pPr>
-        <w:pStyle w:val="code0"/>
-      </w:pPr>
-      <w:r>
-        <w:t xml:space="preserve">theta degrees = </w:t>
-      </w:r>
-      <w:proofErr w:type="spellStart"/>
-      <w:r>
-        <w:t>theta_index</w:t>
-      </w:r>
-      <w:proofErr w:type="spellEnd"/>
-      <w:r>
-        <w:t xml:space="preserve"> * </w:t>
-      </w:r>
-      <w:proofErr w:type="spellStart"/>
-      <w:r>
-        <w:t>theta_inc</w:t>
-      </w:r>
-      <w:proofErr w:type="spellEnd"/>
-    </w:p>
-    <w:p>
-      <w:pPr>
-        <w:pStyle w:val="code0"/>
-      </w:pPr>
+        <w:t>theta</w:t>
+      </w:r>
+      <w:r>
+        <w:t>).</w:t>
+      </w:r>
     </w:p>
     <w:tbl>
       <w:tblPr>
@@ -4986,9 +5035,9 @@
         <w:tblLook w:val="04A0" w:firstRow="1" w:lastRow="0" w:firstColumn="1" w:lastColumn="0" w:noHBand="0" w:noVBand="1"/>
       </w:tblPr>
       <w:tblGrid>
-        <w:gridCol w:w="2046"/>
-        <w:gridCol w:w="2423"/>
-        <w:gridCol w:w="4881"/>
+        <w:gridCol w:w="2296"/>
+        <w:gridCol w:w="2785"/>
+        <w:gridCol w:w="3217"/>
       </w:tblGrid>
       <w:tr>
         <w:trPr>
@@ -5056,15 +5105,38 @@
                 <w:bCs w:val="0"/>
               </w:rPr>
             </w:pPr>
+            <w:r>
+              <w:rPr>
+                <w:b w:val="0"/>
+                <w:bCs w:val="0"/>
+              </w:rPr>
+              <w:t>Hough peak line data</w:t>
+            </w:r>
+          </w:p>
+        </w:tc>
+        <w:tc>
+          <w:tcPr>
+            <w:tcW w:w="0" w:type="auto"/>
+          </w:tcPr>
+          <w:p>
+            <w:pPr>
+              <w:pStyle w:val="NoSpacing"/>
+              <w:cnfStyle w:val="000000100000" w:firstRow="0" w:lastRow="0" w:firstColumn="0" w:lastColumn="0" w:oddVBand="0" w:evenVBand="0" w:oddHBand="1" w:evenHBand="0" w:firstRowFirstColumn="0" w:firstRowLastColumn="0" w:lastRowFirstColumn="0" w:lastRowLastColumn="0"/>
+            </w:pPr>
+            <w:r>
+              <w:t xml:space="preserve">5 * </w:t>
+            </w:r>
             <w:proofErr w:type="spellStart"/>
             <w:r>
-              <w:rPr>
-                <w:b w:val="0"/>
-                <w:bCs w:val="0"/>
-              </w:rPr>
               <w:t>npeaks</w:t>
             </w:r>
             <w:proofErr w:type="spellEnd"/>
+            <w:r>
+              <w:t xml:space="preserve"> 32-bit </w:t>
+            </w:r>
+            <w:r>
+              <w:t>numbers</w:t>
+            </w:r>
           </w:p>
         </w:tc>
         <w:tc>
@@ -5077,266 +5149,66 @@
               <w:cnfStyle w:val="000000100000" w:firstRow="0" w:lastRow="0" w:firstColumn="0" w:lastColumn="0" w:oddVBand="0" w:evenVBand="0" w:oddHBand="1" w:evenHBand="0" w:firstRowFirstColumn="0" w:firstRowLastColumn="0" w:lastRowFirstColumn="0" w:lastRowLastColumn="0"/>
             </w:pPr>
             <w:r>
-              <w:t>32-bit integer</w:t>
-            </w:r>
-          </w:p>
-        </w:tc>
-        <w:tc>
-          <w:tcPr>
-            <w:tcW w:w="0" w:type="auto"/>
-          </w:tcPr>
-          <w:p>
-            <w:pPr>
-              <w:pStyle w:val="NoSpacing"/>
+              <w:t>The polar line data</w:t>
+            </w:r>
+            <w:r>
+              <w:t>:</w:t>
+            </w:r>
+          </w:p>
+          <w:p>
+            <w:pPr>
+              <w:pStyle w:val="tablebullet"/>
               <w:cnfStyle w:val="000000100000" w:firstRow="0" w:lastRow="0" w:firstColumn="0" w:lastColumn="0" w:oddVBand="0" w:evenVBand="0" w:oddHBand="1" w:evenHBand="0" w:firstRowFirstColumn="0" w:firstRowLastColumn="0" w:lastRowFirstColumn="0" w:lastRowLastColumn="0"/>
             </w:pPr>
             <w:r>
-              <w:t>The number of polar lines (</w:t>
-            </w:r>
+              <w:t>rho (</w:t>
+            </w:r>
+            <w:r>
+              <w:t>float</w:t>
+            </w:r>
+            <w:r>
+              <w:t>)</w:t>
+            </w:r>
+          </w:p>
+          <w:p>
+            <w:pPr>
+              <w:pStyle w:val="tablebullet"/>
+              <w:cnfStyle w:val="000000100000" w:firstRow="0" w:lastRow="0" w:firstColumn="0" w:lastColumn="0" w:oddVBand="0" w:evenVBand="0" w:oddHBand="1" w:evenHBand="0" w:firstRowFirstColumn="0" w:firstRowLastColumn="0" w:lastRowFirstColumn="0" w:lastRowLastColumn="0"/>
+            </w:pPr>
             <w:proofErr w:type="spellStart"/>
             <w:r>
-              <w:t>rho_index</w:t>
+              <w:t>theta</w:t>
+            </w:r>
+            <w:r>
+              <w:t>_index</w:t>
             </w:r>
             <w:proofErr w:type="spellEnd"/>
             <w:r>
-              <w:t xml:space="preserve">, </w:t>
-            </w:r>
-            <w:proofErr w:type="spellStart"/>
-            <w:r>
-              <w:t>theta_index</w:t>
-            </w:r>
-            <w:proofErr w:type="spellEnd"/>
-            <w:r>
-              <w:t xml:space="preserve">, count) </w:t>
-            </w:r>
-          </w:p>
-        </w:tc>
-      </w:tr>
-      <w:tr>
-        <w:tc>
-          <w:tcPr>
-            <w:cnfStyle w:val="001000000000" w:firstRow="0" w:lastRow="0" w:firstColumn="1" w:lastColumn="0" w:oddVBand="0" w:evenVBand="0" w:oddHBand="0" w:evenHBand="0" w:firstRowFirstColumn="0" w:firstRowLastColumn="0" w:lastRowFirstColumn="0" w:lastRowLastColumn="0"/>
-            <w:tcW w:w="0" w:type="auto"/>
-          </w:tcPr>
-          <w:p>
-            <w:pPr>
-              <w:pStyle w:val="NoSpacing"/>
-              <w:rPr>
-                <w:b w:val="0"/>
-                <w:bCs w:val="0"/>
-              </w:rPr>
-            </w:pPr>
-            <w:proofErr w:type="spellStart"/>
-            <w:r>
-              <w:rPr>
-                <w:b w:val="0"/>
-                <w:bCs w:val="0"/>
-              </w:rPr>
-              <w:t>theta_inc</w:t>
-            </w:r>
-            <w:proofErr w:type="spellEnd"/>
-          </w:p>
-        </w:tc>
-        <w:tc>
-          <w:tcPr>
-            <w:tcW w:w="0" w:type="auto"/>
-          </w:tcPr>
-          <w:p>
-            <w:pPr>
-              <w:pStyle w:val="NoSpacing"/>
-              <w:cnfStyle w:val="000000000000" w:firstRow="0" w:lastRow="0" w:firstColumn="0" w:lastColumn="0" w:oddVBand="0" w:evenVBand="0" w:oddHBand="0" w:evenHBand="0" w:firstRowFirstColumn="0" w:firstRowLastColumn="0" w:lastRowFirstColumn="0" w:lastRowLastColumn="0"/>
-            </w:pPr>
-            <w:r>
-              <w:t>32-bit integer</w:t>
-            </w:r>
-          </w:p>
-        </w:tc>
-        <w:tc>
-          <w:tcPr>
-            <w:tcW w:w="0" w:type="auto"/>
-          </w:tcPr>
-          <w:p>
-            <w:pPr>
-              <w:pStyle w:val="NoSpacing"/>
-              <w:cnfStyle w:val="000000000000" w:firstRow="0" w:lastRow="0" w:firstColumn="0" w:lastColumn="0" w:oddVBand="0" w:evenVBand="0" w:oddHBand="0" w:evenHBand="0" w:firstRowFirstColumn="0" w:firstRowLastColumn="0" w:lastRowFirstColumn="0" w:lastRowLastColumn="0"/>
-            </w:pPr>
-            <w:r>
-              <w:t>The increment between sampled angles in degrees</w:t>
-            </w:r>
-          </w:p>
-        </w:tc>
-      </w:tr>
-      <w:tr>
-        <w:trPr>
-          <w:cnfStyle w:val="000000100000" w:firstRow="0" w:lastRow="0" w:firstColumn="0" w:lastColumn="0" w:oddVBand="0" w:evenVBand="0" w:oddHBand="1" w:evenHBand="0" w:firstRowFirstColumn="0" w:firstRowLastColumn="0" w:lastRowFirstColumn="0" w:lastRowLastColumn="0"/>
-        </w:trPr>
-        <w:tc>
-          <w:tcPr>
-            <w:cnfStyle w:val="001000000000" w:firstRow="0" w:lastRow="0" w:firstColumn="1" w:lastColumn="0" w:oddVBand="0" w:evenVBand="0" w:oddHBand="0" w:evenHBand="0" w:firstRowFirstColumn="0" w:firstRowLastColumn="0" w:lastRowFirstColumn="0" w:lastRowLastColumn="0"/>
-            <w:tcW w:w="0" w:type="auto"/>
-          </w:tcPr>
-          <w:p>
-            <w:pPr>
-              <w:pStyle w:val="NoSpacing"/>
-              <w:rPr>
-                <w:b w:val="0"/>
-                <w:bCs w:val="0"/>
-              </w:rPr>
-            </w:pPr>
-            <w:proofErr w:type="spellStart"/>
-            <w:r>
-              <w:rPr>
-                <w:b w:val="0"/>
-                <w:bCs w:val="0"/>
-              </w:rPr>
-              <w:t>nrhos</w:t>
-            </w:r>
-            <w:proofErr w:type="spellEnd"/>
-          </w:p>
-        </w:tc>
-        <w:tc>
-          <w:tcPr>
-            <w:tcW w:w="0" w:type="auto"/>
-          </w:tcPr>
-          <w:p>
-            <w:pPr>
-              <w:pStyle w:val="NoSpacing"/>
+              <w:t xml:space="preserve"> (integer)</w:t>
+            </w:r>
+          </w:p>
+          <w:p>
+            <w:pPr>
+              <w:pStyle w:val="tablebullet"/>
               <w:cnfStyle w:val="000000100000" w:firstRow="0" w:lastRow="0" w:firstColumn="0" w:lastColumn="0" w:oddVBand="0" w:evenVBand="0" w:oddHBand="1" w:evenHBand="0" w:firstRowFirstColumn="0" w:firstRowLastColumn="0" w:lastRowFirstColumn="0" w:lastRowLastColumn="0"/>
             </w:pPr>
             <w:r>
-              <w:t>32-bit integer</w:t>
-            </w:r>
-          </w:p>
-        </w:tc>
-        <w:tc>
-          <w:tcPr>
-            <w:tcW w:w="0" w:type="auto"/>
-          </w:tcPr>
-          <w:p>
-            <w:pPr>
-              <w:pStyle w:val="NoSpacing"/>
+              <w:t>count (integer)</w:t>
+            </w:r>
+          </w:p>
+          <w:p>
+            <w:pPr>
+              <w:pStyle w:val="tablebullet"/>
               <w:cnfStyle w:val="000000100000" w:firstRow="0" w:lastRow="0" w:firstColumn="0" w:lastColumn="0" w:oddVBand="0" w:evenVBand="0" w:oddHBand="1" w:evenHBand="0" w:firstRowFirstColumn="0" w:firstRowLastColumn="0" w:lastRowFirstColumn="0" w:lastRowLastColumn="0"/>
             </w:pPr>
             <w:r>
-              <w:t>The number of rho values sampled</w:t>
-            </w:r>
-          </w:p>
-        </w:tc>
-      </w:tr>
-      <w:tr>
-        <w:tc>
-          <w:tcPr>
-            <w:cnfStyle w:val="001000000000" w:firstRow="0" w:lastRow="0" w:firstColumn="1" w:lastColumn="0" w:oddVBand="0" w:evenVBand="0" w:oddHBand="0" w:evenHBand="0" w:firstRowFirstColumn="0" w:firstRowLastColumn="0" w:lastRowFirstColumn="0" w:lastRowLastColumn="0"/>
-            <w:tcW w:w="0" w:type="auto"/>
-          </w:tcPr>
-          <w:p>
-            <w:pPr>
-              <w:pStyle w:val="NoSpacing"/>
-              <w:rPr>
-                <w:b w:val="0"/>
-                <w:bCs w:val="0"/>
-              </w:rPr>
-            </w:pPr>
-            <w:r>
-              <w:rPr>
-                <w:b w:val="0"/>
-                <w:bCs w:val="0"/>
-              </w:rPr>
-              <w:t>Hough peak line data</w:t>
-            </w:r>
-          </w:p>
-        </w:tc>
-        <w:tc>
-          <w:tcPr>
-            <w:tcW w:w="0" w:type="auto"/>
-          </w:tcPr>
-          <w:p>
-            <w:pPr>
-              <w:pStyle w:val="NoSpacing"/>
-              <w:cnfStyle w:val="000000000000" w:firstRow="0" w:lastRow="0" w:firstColumn="0" w:lastColumn="0" w:oddVBand="0" w:evenVBand="0" w:oddHBand="0" w:evenHBand="0" w:firstRowFirstColumn="0" w:firstRowLastColumn="0" w:lastRowFirstColumn="0" w:lastRowLastColumn="0"/>
-            </w:pPr>
-            <w:r>
-              <w:t xml:space="preserve">5 * </w:t>
-            </w:r>
-            <w:proofErr w:type="spellStart"/>
-            <w:r>
-              <w:t>npeaks</w:t>
-            </w:r>
-            <w:proofErr w:type="spellEnd"/>
-            <w:r>
-              <w:t xml:space="preserve"> 32-bit </w:t>
-            </w:r>
-            <w:r>
-              <w:t>numbers</w:t>
-            </w:r>
-          </w:p>
-        </w:tc>
-        <w:tc>
-          <w:tcPr>
-            <w:tcW w:w="0" w:type="auto"/>
-          </w:tcPr>
-          <w:p>
-            <w:pPr>
-              <w:pStyle w:val="NoSpacing"/>
-              <w:cnfStyle w:val="000000000000" w:firstRow="0" w:lastRow="0" w:firstColumn="0" w:lastColumn="0" w:oddVBand="0" w:evenVBand="0" w:oddHBand="0" w:evenHBand="0" w:firstRowFirstColumn="0" w:firstRowLastColumn="0" w:lastRowFirstColumn="0" w:lastRowLastColumn="0"/>
-            </w:pPr>
-            <w:r>
-              <w:t>The polar line data</w:t>
-            </w:r>
-            <w:r>
-              <w:t>:</w:t>
+              <w:t>total difference (integer)</w:t>
             </w:r>
           </w:p>
           <w:p>
             <w:pPr>
               <w:pStyle w:val="tablebullet"/>
-              <w:cnfStyle w:val="000000000000" w:firstRow="0" w:lastRow="0" w:firstColumn="0" w:lastColumn="0" w:oddVBand="0" w:evenVBand="0" w:oddHBand="0" w:evenHBand="0" w:firstRowFirstColumn="0" w:firstRowLastColumn="0" w:lastRowFirstColumn="0" w:lastRowLastColumn="0"/>
-            </w:pPr>
-            <w:proofErr w:type="spellStart"/>
-            <w:r>
-              <w:t>rho_index</w:t>
-            </w:r>
-            <w:proofErr w:type="spellEnd"/>
-            <w:r>
-              <w:t xml:space="preserve"> (integer)</w:t>
-            </w:r>
-          </w:p>
-          <w:p>
-            <w:pPr>
-              <w:pStyle w:val="tablebullet"/>
-              <w:cnfStyle w:val="000000000000" w:firstRow="0" w:lastRow="0" w:firstColumn="0" w:lastColumn="0" w:oddVBand="0" w:evenVBand="0" w:oddHBand="0" w:evenHBand="0" w:firstRowFirstColumn="0" w:firstRowLastColumn="0" w:lastRowFirstColumn="0" w:lastRowLastColumn="0"/>
-            </w:pPr>
-            <w:proofErr w:type="spellStart"/>
-            <w:r>
-              <w:t>theta_index</w:t>
-            </w:r>
-            <w:proofErr w:type="spellEnd"/>
-            <w:r>
-              <w:t xml:space="preserve"> (integer)</w:t>
-            </w:r>
-          </w:p>
-          <w:p>
-            <w:pPr>
-              <w:pStyle w:val="tablebullet"/>
-              <w:cnfStyle w:val="000000000000" w:firstRow="0" w:lastRow="0" w:firstColumn="0" w:lastColumn="0" w:oddVBand="0" w:evenVBand="0" w:oddHBand="0" w:evenHBand="0" w:firstRowFirstColumn="0" w:firstRowLastColumn="0" w:lastRowFirstColumn="0" w:lastRowLastColumn="0"/>
-            </w:pPr>
-            <w:r>
-              <w:t>count (integer)</w:t>
-            </w:r>
-          </w:p>
-          <w:p>
-            <w:pPr>
-              <w:pStyle w:val="tablebullet"/>
-              <w:cnfStyle w:val="000000000000" w:firstRow="0" w:lastRow="0" w:firstColumn="0" w:lastColumn="0" w:oddVBand="0" w:evenVBand="0" w:oddHBand="0" w:evenHBand="0" w:firstRowFirstColumn="0" w:firstRowLastColumn="0" w:lastRowFirstColumn="0" w:lastRowLastColumn="0"/>
-            </w:pPr>
-            <w:r>
-              <w:t>total difference (integer)</w:t>
-            </w:r>
-          </w:p>
-          <w:p>
-            <w:pPr>
-              <w:pStyle w:val="tablebullet"/>
-              <w:cnfStyle w:val="000000000000" w:firstRow="0" w:lastRow="0" w:firstColumn="0" w:lastColumn="0" w:oddVBand="0" w:evenVBand="0" w:oddHBand="0" w:evenHBand="0" w:firstRowFirstColumn="0" w:firstRowLastColumn="0" w:lastRowFirstColumn="0" w:lastRowLastColumn="0"/>
+              <w:cnfStyle w:val="000000100000" w:firstRow="0" w:lastRow="0" w:firstColumn="0" w:lastColumn="0" w:oddVBand="0" w:evenVBand="0" w:oddHBand="1" w:evenHBand="0" w:firstRowFirstColumn="0" w:firstRowLastColumn="0" w:lastRowFirstColumn="0" w:lastRowLastColumn="0"/>
             </w:pPr>
             <w:r>
               <w:t>percent difference (0</w:t>
@@ -5376,7 +5248,13 @@
         <w:t>Hough peak line text data is stored as tab-delimited text files</w:t>
       </w:r>
       <w:r>
-        <w:t xml:space="preserve"> where the first line is:</w:t>
+        <w:t xml:space="preserve">. The file is written with </w:t>
+      </w:r>
+      <w:r>
+        <w:t>each</w:t>
+      </w:r>
+      <w:r>
+        <w:t xml:space="preserve"> record in the following format. </w:t>
       </w:r>
     </w:p>
     <w:p>
@@ -5384,83 +5262,46 @@
         <w:pStyle w:val="Code"/>
       </w:pPr>
       <w:r>
-        <w:t xml:space="preserve">  </w:t>
+        <w:t xml:space="preserve">  rho theta count difference percent-difference</w:t>
+      </w:r>
+    </w:p>
+    <w:p>
+      <w:pPr>
+        <w:pStyle w:val="Normalafterlist"/>
+      </w:pPr>
+      <w:r>
+        <w:t>These files can be imported into Microsoft Excel for review.</w:t>
+      </w:r>
+      <w:r>
+        <w:t xml:space="preserve"> </w:t>
+      </w:r>
+    </w:p>
+    <w:p>
+      <w:pPr>
+        <w:pStyle w:val="Normalafterlist"/>
+      </w:pPr>
+      <w:r>
+        <w:t xml:space="preserve">The text file </w:t>
+      </w:r>
+      <w:r>
+        <w:t xml:space="preserve">records </w:t>
+      </w:r>
+      <w:r>
+        <w:t>can be read in this format</w:t>
+      </w:r>
+      <w:r>
+        <w:t xml:space="preserve"> for the purpose of drawing lines with the </w:t>
       </w:r>
       <w:proofErr w:type="spellStart"/>
       <w:r>
-        <w:t>npeaks</w:t>
+        <w:t>hough_draw_lines</w:t>
       </w:r>
       <w:proofErr w:type="spellEnd"/>
       <w:r>
-        <w:t xml:space="preserve"> </w:t>
-      </w:r>
-      <w:proofErr w:type="spellStart"/>
-      <w:r>
-        <w:t>theta_inc</w:t>
-      </w:r>
-      <w:proofErr w:type="spellEnd"/>
-      <w:r>
-        <w:t xml:space="preserve"> </w:t>
-      </w:r>
-      <w:proofErr w:type="spellStart"/>
-      <w:r>
-        <w:t>nrhos</w:t>
-      </w:r>
-      <w:proofErr w:type="spellEnd"/>
-    </w:p>
-    <w:p>
-      <w:pPr>
-        <w:pStyle w:val="Normalafterlist"/>
-      </w:pPr>
-      <w:r>
-        <w:t xml:space="preserve">followed by </w:t>
-      </w:r>
-      <w:proofErr w:type="spellStart"/>
-      <w:r>
-        <w:rPr>
-          <w:rStyle w:val="CodeChar"/>
-        </w:rPr>
-        <w:t>n</w:t>
-      </w:r>
-      <w:r>
-        <w:rPr>
-          <w:rStyle w:val="CodeChar"/>
-        </w:rPr>
-        <w:t>peak</w:t>
-      </w:r>
-      <w:r>
-        <w:rPr>
-          <w:rStyle w:val="CodeChar"/>
-        </w:rPr>
-        <w:t>s</w:t>
-      </w:r>
-      <w:proofErr w:type="spellEnd"/>
-      <w:r>
-        <w:t xml:space="preserve"> lines as a record in the following format. </w:t>
-      </w:r>
-    </w:p>
-    <w:p>
-      <w:pPr>
-        <w:pStyle w:val="Code"/>
-      </w:pPr>
-      <w:r>
-        <w:t xml:space="preserve">  rho-index </w:t>
-      </w:r>
-      <w:proofErr w:type="spellStart"/>
-      <w:r>
-        <w:t>theta_index</w:t>
-      </w:r>
-      <w:proofErr w:type="spellEnd"/>
-      <w:r>
-        <w:t xml:space="preserve"> count difference percent-difference</w:t>
-      </w:r>
-    </w:p>
-    <w:p>
-      <w:pPr>
-        <w:pStyle w:val="Normalafterlist"/>
-      </w:pPr>
-      <w:r>
-        <w:t>These files can be imported into Microsoft Excel for review.</w:t>
+        <w:t xml:space="preserve"> operator</w:t>
+      </w:r>
+      <w:r>
+        <w:t>, though only the rho and theta will be read. The count, difference, and percent-difference will be ignored.</w:t>
       </w:r>
     </w:p>
     <w:p>
@@ -5598,7 +5439,6 @@
           <w:i/>
           <w:iCs/>
         </w:rPr>
-        <w:lastRenderedPageBreak/>
         <w:tab/>
       </w:r>
       <w:r>
@@ -5611,8 +5451,13 @@
       </w:pPr>
       <w:r>
         <w:tab/>
-        <w:t xml:space="preserve">      additional-steps</w:t>
-      </w:r>
+        <w:t xml:space="preserve">      </w:t>
+      </w:r>
+      <w:proofErr w:type="gramStart"/>
+      <w:r>
+        <w:t>additional-steps</w:t>
+      </w:r>
+      <w:proofErr w:type="gramEnd"/>
     </w:p>
     <w:p>
       <w:pPr>
@@ -5679,6 +5524,7 @@
         <w:pStyle w:val="Code"/>
       </w:pPr>
       <w:r>
+        <w:lastRenderedPageBreak/>
         <w:tab/>
         <w:t xml:space="preserve">  "id": </w:t>
       </w:r>
@@ -5718,7 +5564,15 @@
       </w:pPr>
       <w:r>
         <w:tab/>
-        <w:t xml:space="preserve">  “input-data”: [</w:t>
+        <w:t xml:space="preserve">  “</w:t>
+      </w:r>
+      <w:proofErr w:type="gramStart"/>
+      <w:r>
+        <w:t>input</w:t>
+      </w:r>
+      <w:proofErr w:type="gramEnd"/>
+      <w:r>
+        <w:t>-data”: [</w:t>
       </w:r>
     </w:p>
     <w:p>
@@ -5756,7 +5610,15 @@
       </w:pPr>
       <w:r>
         <w:tab/>
-        <w:t xml:space="preserve">  “output-data”: [</w:t>
+        <w:t xml:space="preserve">  “</w:t>
+      </w:r>
+      <w:proofErr w:type="gramStart"/>
+      <w:r>
+        <w:t>output</w:t>
+      </w:r>
+      <w:proofErr w:type="gramEnd"/>
+      <w:r>
+        <w:t>-data”: [</w:t>
       </w:r>
     </w:p>
     <w:p>
@@ -5902,6 +5764,7 @@
         <w:tab/>
         <w:t xml:space="preserve">  "type": "</w:t>
       </w:r>
+      <w:proofErr w:type="gramStart"/>
       <w:r>
         <w:rPr>
           <w:i/>
@@ -5909,6 +5772,7 @@
         </w:rPr>
         <w:t>data-type</w:t>
       </w:r>
+      <w:proofErr w:type="gramEnd"/>
       <w:r>
         <w:t>,</w:t>
       </w:r>
@@ -6002,7 +5866,15 @@
         <w:pStyle w:val="Code"/>
       </w:pPr>
       <w:r>
-        <w:t xml:space="preserve">          "parameter-name": "value"</w:t>
+        <w:t xml:space="preserve">          "</w:t>
+      </w:r>
+      <w:proofErr w:type="gramStart"/>
+      <w:r>
+        <w:t>parameter</w:t>
+      </w:r>
+      <w:proofErr w:type="gramEnd"/>
+      <w:r>
+        <w:t>-name": "value"</w:t>
       </w:r>
     </w:p>
     <w:p>
@@ -6032,6 +5904,7 @@
       <w:r>
         <w:t xml:space="preserve">The </w:t>
       </w:r>
+      <w:proofErr w:type="gramStart"/>
       <w:r>
         <w:rPr>
           <w:i/>
@@ -6039,6 +5912,7 @@
         </w:rPr>
         <w:t>data-type</w:t>
       </w:r>
+      <w:proofErr w:type="gramEnd"/>
       <w:r>
         <w:t xml:space="preserve"> describes the type of input or output object used by an image operator as described in section </w:t>
       </w:r>
@@ -6097,8 +5971,13 @@
             <w:pPr>
               <w:cnfStyle w:val="100000000000" w:firstRow="1" w:lastRow="0" w:firstColumn="0" w:lastColumn="0" w:oddVBand="0" w:evenVBand="0" w:oddHBand="0" w:evenHBand="0" w:firstRowFirstColumn="0" w:firstRowLastColumn="0" w:lastRowFirstColumn="0" w:lastRowLastColumn="0"/>
             </w:pPr>
-            <w:r>
-              <w:t xml:space="preserve">data-type </w:t>
+            <w:proofErr w:type="gramStart"/>
+            <w:r>
+              <w:t>data-type</w:t>
+            </w:r>
+            <w:proofErr w:type="gramEnd"/>
+            <w:r>
+              <w:t xml:space="preserve"> </w:t>
             </w:r>
           </w:p>
         </w:tc>
@@ -6163,11 +6042,7 @@
               <w:cnfStyle w:val="000000100000" w:firstRow="0" w:lastRow="0" w:firstColumn="0" w:lastColumn="0" w:oddVBand="0" w:evenVBand="0" w:oddHBand="1" w:evenHBand="0" w:firstRowFirstColumn="0" w:firstRowLastColumn="0" w:lastRowFirstColumn="0" w:lastRowLastColumn="0"/>
             </w:pPr>
             <w:r>
-              <w:t xml:space="preserve">An array of pixels that are stored as integer or real numbers. Programs on most computers can view integer images with </w:t>
-            </w:r>
-            <w:r>
-              <w:lastRenderedPageBreak/>
-              <w:t xml:space="preserve">unsigned byte pixels having values from 0 to 255 stored on the filesystem in JPEG format. </w:t>
+              <w:t xml:space="preserve">An array of pixels that are stored as integer or real numbers. Programs on most computers can view integer images with unsigned byte pixels having values from 0 to 255 stored on the filesystem in JPEG format. </w:t>
             </w:r>
           </w:p>
           <w:p>
@@ -6217,7 +6092,6 @@
                 <w:b w:val="0"/>
                 <w:bCs w:val="0"/>
               </w:rPr>
-              <w:lastRenderedPageBreak/>
               <w:t>Histogram</w:t>
             </w:r>
           </w:p>
@@ -6270,6 +6144,7 @@
                 <w:b w:val="0"/>
                 <w:bCs w:val="0"/>
               </w:rPr>
+              <w:lastRenderedPageBreak/>
               <w:t>Hough accumulator data</w:t>
             </w:r>
           </w:p>
@@ -6340,7 +6215,13 @@
               <w:cnfStyle w:val="000000000000" w:firstRow="0" w:lastRow="0" w:firstColumn="0" w:lastColumn="0" w:oddVBand="0" w:evenVBand="0" w:oddHBand="0" w:evenHBand="0" w:firstRowFirstColumn="0" w:firstRowLastColumn="0" w:lastRowFirstColumn="0" w:lastRowLastColumn="0"/>
             </w:pPr>
             <w:r>
-              <w:t>“polar-line”</w:t>
+              <w:t>“</w:t>
+            </w:r>
+            <w:r>
+              <w:t>peaks</w:t>
+            </w:r>
+            <w:r>
+              <w:t>”</w:t>
             </w:r>
           </w:p>
         </w:tc>
@@ -6353,7 +6234,7 @@
               <w:cnfStyle w:val="000000000000" w:firstRow="0" w:lastRow="0" w:firstColumn="0" w:lastColumn="0" w:oddVBand="0" w:evenVBand="0" w:oddHBand="0" w:evenHBand="0" w:firstRowFirstColumn="0" w:firstRowLastColumn="0" w:lastRowFirstColumn="0" w:lastRowLastColumn="0"/>
             </w:pPr>
             <w:r>
-              <w:t>Hough peak lines are the positions of lines in an image having a minimum number of counts that the lines occur in the image.</w:t>
+              <w:t>Hough peak lines are the positions of lines in an image.</w:t>
             </w:r>
           </w:p>
         </w:tc>
@@ -6857,12 +6738,21 @@
               <w:t>“</w:t>
             </w:r>
             <w:proofErr w:type="spellStart"/>
-            <w:r>
-              <w:rPr>
-                <w:b w:val="0"/>
-                <w:bCs w:val="0"/>
-              </w:rPr>
-              <w:t>berkeley_db</w:t>
+            <w:proofErr w:type="gramStart"/>
+            <w:r>
+              <w:rPr>
+                <w:b w:val="0"/>
+                <w:bCs w:val="0"/>
+              </w:rPr>
+              <w:t>berkeley</w:t>
+            </w:r>
+            <w:proofErr w:type="gramEnd"/>
+            <w:r>
+              <w:rPr>
+                <w:b w:val="0"/>
+                <w:bCs w:val="0"/>
+              </w:rPr>
+              <w:t>_db</w:t>
             </w:r>
             <w:proofErr w:type="spellEnd"/>
             <w:r>
@@ -6998,6 +6888,7 @@
       <w:r>
         <w:t xml:space="preserve">      "type": "</w:t>
       </w:r>
+      <w:proofErr w:type="gramStart"/>
       <w:r>
         <w:rPr>
           <w:i/>
@@ -7005,6 +6896,7 @@
         </w:rPr>
         <w:t>data-type</w:t>
       </w:r>
+      <w:proofErr w:type="gramEnd"/>
       <w:r>
         <w:t>",</w:t>
       </w:r>
@@ -7092,7 +6984,6 @@
         <w:pStyle w:val="Normalafterlist"/>
       </w:pPr>
       <w:r>
-        <w:lastRenderedPageBreak/>
         <w:t>The filesystem data repository supports all data types and data formats listed above. The file path associated with the data descriptor is “</w:t>
       </w:r>
       <w:r>
@@ -7147,12 +7038,21 @@
         <w:pStyle w:val="Heading2"/>
       </w:pPr>
       <w:r>
+        <w:lastRenderedPageBreak/>
         <w:t>Script run results logging</w:t>
       </w:r>
     </w:p>
     <w:p>
       <w:r>
-        <w:t xml:space="preserve">Scripts run results are saved with the original experiment run JSON text file into  a log file. Results are logged into different levels of the script. The format in which results are added to the top-level of the experiment script follows. The log results are added at the end of each </w:t>
+        <w:t xml:space="preserve">Scripts run results are saved with the original experiment run JSON text file </w:t>
+      </w:r>
+      <w:proofErr w:type="gramStart"/>
+      <w:r>
+        <w:t>into  a</w:t>
+      </w:r>
+      <w:proofErr w:type="gramEnd"/>
+      <w:r>
+        <w:t xml:space="preserve"> log file. Results are logged into different levels of the script. The format in which results are added to the top-level of the experiment script follows. The log results are added at the end of each </w:t>
       </w:r>
       <w:r>
         <w:rPr>
@@ -7188,7 +7088,15 @@
       </w:pPr>
       <w:r>
         <w:tab/>
-        <w:t xml:space="preserve">    “run” : {</w:t>
+        <w:t xml:space="preserve">    “run</w:t>
+      </w:r>
+      <w:proofErr w:type="gramStart"/>
+      <w:r>
+        <w:t>” :</w:t>
+      </w:r>
+      <w:proofErr w:type="gramEnd"/>
+      <w:r>
+        <w:t xml:space="preserve"> {</w:t>
       </w:r>
     </w:p>
     <w:p>
@@ -7197,7 +7105,15 @@
       </w:pPr>
       <w:r>
         <w:tab/>
-        <w:t xml:space="preserve">        “script-path”: “</w:t>
+        <w:t xml:space="preserve">        “</w:t>
+      </w:r>
+      <w:proofErr w:type="gramStart"/>
+      <w:r>
+        <w:t>script</w:t>
+      </w:r>
+      <w:proofErr w:type="gramEnd"/>
+      <w:r>
+        <w:t>-path”: “</w:t>
       </w:r>
       <w:r>
         <w:rPr>
@@ -7423,6 +7339,7 @@
         <w:tab/>
         <w:t xml:space="preserve">      </w:t>
       </w:r>
+      <w:proofErr w:type="gramStart"/>
       <w:r>
         <w:rPr>
           <w:i/>
@@ -7430,6 +7347,7 @@
         </w:rPr>
         <w:t>additional-steps</w:t>
       </w:r>
+      <w:proofErr w:type="gramEnd"/>
     </w:p>
     <w:p>
       <w:pPr>
@@ -7562,15 +7480,28 @@
         <w:pStyle w:val="Code"/>
       </w:pPr>
       <w:r>
-        <w:t xml:space="preserve">    "run":{</w:t>
-      </w:r>
+        <w:t xml:space="preserve">    "run</w:t>
+      </w:r>
+      <w:proofErr w:type="gramStart"/>
+      <w:r>
+        <w:t>":{</w:t>
+      </w:r>
+      <w:proofErr w:type="gramEnd"/>
     </w:p>
     <w:p>
       <w:pPr>
         <w:pStyle w:val="Code"/>
       </w:pPr>
       <w:r>
-        <w:t xml:space="preserve">      "script-path":"</w:t>
+        <w:t xml:space="preserve">      "</w:t>
+      </w:r>
+      <w:proofErr w:type="gramStart"/>
+      <w:r>
+        <w:t>script</w:t>
+      </w:r>
+      <w:proofErr w:type="gramEnd"/>
+      <w:r>
+        <w:t>-path":"</w:t>
       </w:r>
       <w:proofErr w:type="spellStart"/>
       <w:r>
@@ -7730,7 +7661,15 @@
       </w:pPr>
       <w:r>
         <w:tab/>
-        <w:t xml:space="preserve">  “input-data”: [</w:t>
+        <w:t xml:space="preserve">  “</w:t>
+      </w:r>
+      <w:proofErr w:type="gramStart"/>
+      <w:r>
+        <w:t>input</w:t>
+      </w:r>
+      <w:proofErr w:type="gramEnd"/>
+      <w:r>
+        <w:t>-data”: [</w:t>
       </w:r>
     </w:p>
     <w:p>
@@ -7768,7 +7707,15 @@
       </w:pPr>
       <w:r>
         <w:tab/>
-        <w:t xml:space="preserve">  “output-data”: [</w:t>
+        <w:t xml:space="preserve">  “</w:t>
+      </w:r>
+      <w:proofErr w:type="gramStart"/>
+      <w:r>
+        <w:t>output</w:t>
+      </w:r>
+      <w:proofErr w:type="gramEnd"/>
+      <w:r>
+        <w:t>-data”: [</w:t>
       </w:r>
     </w:p>
     <w:p>
@@ -7881,7 +7828,6 @@
         <w:pStyle w:val="Code"/>
       </w:pPr>
       <w:r>
-        <w:lastRenderedPageBreak/>
         <w:tab/>
         <w:t>}</w:t>
       </w:r>
@@ -7909,7 +7855,15 @@
         <w:pStyle w:val="Code"/>
       </w:pPr>
       <w:r>
-        <w:t xml:space="preserve">  “module-id”: “error-message”</w:t>
+        <w:t xml:space="preserve">  “</w:t>
+      </w:r>
+      <w:proofErr w:type="gramStart"/>
+      <w:r>
+        <w:t>module</w:t>
+      </w:r>
+      <w:proofErr w:type="gramEnd"/>
+      <w:r>
+        <w:t>-id”: “error-message”</w:t>
       </w:r>
     </w:p>
     <w:p>
@@ -7917,6 +7871,7 @@
         <w:pStyle w:val="Normalafterlist"/>
       </w:pPr>
       <w:r>
+        <w:lastRenderedPageBreak/>
         <w:t xml:space="preserve">where </w:t>
       </w:r>
       <w:r>
@@ -8071,7 +8026,15 @@
         <w:pStyle w:val="code0"/>
       </w:pPr>
       <w:r>
-        <w:t xml:space="preserve">  $ ./cv-workbench </w:t>
+        <w:t xml:space="preserve">  </w:t>
+      </w:r>
+      <w:proofErr w:type="gramStart"/>
+      <w:r>
+        <w:t>$ .</w:t>
+      </w:r>
+      <w:proofErr w:type="gramEnd"/>
+      <w:r>
+        <w:t xml:space="preserve">/cv-workbench </w:t>
       </w:r>
       <w:r>
         <w:rPr>
@@ -8197,7 +8160,15 @@
       </w:pPr>
       <w:r>
         <w:tab/>
-        <w:t xml:space="preserve">  "input-data": [</w:t>
+        <w:t xml:space="preserve">  "</w:t>
+      </w:r>
+      <w:proofErr w:type="gramStart"/>
+      <w:r>
+        <w:t>input</w:t>
+      </w:r>
+      <w:proofErr w:type="gramEnd"/>
+      <w:r>
+        <w:t>-data": [</w:t>
       </w:r>
     </w:p>
     <w:p>
@@ -8304,7 +8275,15 @@
       </w:pPr>
       <w:r>
         <w:tab/>
-        <w:t xml:space="preserve">  "output-data": [</w:t>
+        <w:t xml:space="preserve">  "</w:t>
+      </w:r>
+      <w:proofErr w:type="gramStart"/>
+      <w:r>
+        <w:t>output</w:t>
+      </w:r>
+      <w:proofErr w:type="gramEnd"/>
+      <w:r>
+        <w:t>-data": [</w:t>
       </w:r>
     </w:p>
     <w:p>
@@ -8392,7 +8371,6 @@
         <w:pStyle w:val="Code"/>
       </w:pPr>
       <w:r>
-        <w:lastRenderedPageBreak/>
         <w:tab/>
         <w:t xml:space="preserve">    }</w:t>
       </w:r>
@@ -8453,6 +8431,7 @@
         <w:pStyle w:val="Normalafterlist"/>
       </w:pPr>
       <w:r>
+        <w:lastRenderedPageBreak/>
         <w:t>The significant elements of the script are:</w:t>
       </w:r>
     </w:p>
@@ -8604,7 +8583,23 @@
                 <w:b w:val="0"/>
                 <w:bCs w:val="0"/>
               </w:rPr>
-              <w:t xml:space="preserve">  "input-data": [</w:t>
+              <w:t xml:space="preserve">  "</w:t>
+            </w:r>
+            <w:proofErr w:type="gramStart"/>
+            <w:r>
+              <w:rPr>
+                <w:b w:val="0"/>
+                <w:bCs w:val="0"/>
+              </w:rPr>
+              <w:t>input</w:t>
+            </w:r>
+            <w:proofErr w:type="gramEnd"/>
+            <w:r>
+              <w:rPr>
+                <w:b w:val="0"/>
+                <w:bCs w:val="0"/>
+              </w:rPr>
+              <w:t>-data": [</w:t>
             </w:r>
           </w:p>
           <w:p>
@@ -8829,7 +8824,23 @@
                 <w:b w:val="0"/>
                 <w:bCs w:val="0"/>
               </w:rPr>
-              <w:t xml:space="preserve">  "output-data": [</w:t>
+              <w:t xml:space="preserve">  "</w:t>
+            </w:r>
+            <w:proofErr w:type="gramStart"/>
+            <w:r>
+              <w:rPr>
+                <w:b w:val="0"/>
+                <w:bCs w:val="0"/>
+              </w:rPr>
+              <w:t>output</w:t>
+            </w:r>
+            <w:proofErr w:type="gramEnd"/>
+            <w:r>
+              <w:rPr>
+                <w:b w:val="0"/>
+                <w:bCs w:val="0"/>
+              </w:rPr>
+              <w:t>-data": [</w:t>
             </w:r>
           </w:p>
           <w:p>
@@ -9184,7 +9195,15 @@
       </w:pPr>
       <w:r>
         <w:tab/>
-        <w:t xml:space="preserve">  "input-data": [</w:t>
+        <w:t xml:space="preserve">  "</w:t>
+      </w:r>
+      <w:proofErr w:type="gramStart"/>
+      <w:r>
+        <w:t>input</w:t>
+      </w:r>
+      <w:proofErr w:type="gramEnd"/>
+      <w:r>
+        <w:t>-data": [</w:t>
       </w:r>
     </w:p>
     <w:p>
@@ -9291,7 +9310,15 @@
       </w:pPr>
       <w:r>
         <w:tab/>
-        <w:t xml:space="preserve">  "output-data": [</w:t>
+        <w:t xml:space="preserve">  "</w:t>
+      </w:r>
+      <w:proofErr w:type="gramStart"/>
+      <w:r>
+        <w:t>output</w:t>
+      </w:r>
+      <w:proofErr w:type="gramEnd"/>
+      <w:r>
+        <w:t>-data": [</w:t>
       </w:r>
     </w:p>
     <w:p>
@@ -9353,53 +9380,97 @@
         <w:pStyle w:val="Code"/>
       </w:pPr>
       <w:r>
+        <w:tab/>
+        <w:t xml:space="preserve">      "filename": "square45-90_sobel_gray",</w:t>
+      </w:r>
+    </w:p>
+    <w:p>
+      <w:pPr>
+        <w:pStyle w:val="Code"/>
+      </w:pPr>
+      <w:r>
+        <w:tab/>
+        <w:t xml:space="preserve">      "</w:t>
+      </w:r>
+      <w:proofErr w:type="spellStart"/>
+      <w:r>
+        <w:t>ext</w:t>
+      </w:r>
+      <w:proofErr w:type="spellEnd"/>
+      <w:r>
+        <w:t>": "jpg"</w:t>
+      </w:r>
+    </w:p>
+    <w:p>
+      <w:pPr>
+        <w:pStyle w:val="Code"/>
+      </w:pPr>
+      <w:r>
+        <w:tab/>
+        <w:t xml:space="preserve">    }</w:t>
+      </w:r>
+    </w:p>
+    <w:p>
+      <w:pPr>
+        <w:pStyle w:val="Code"/>
+      </w:pPr>
+      <w:r>
+        <w:tab/>
+        <w:t xml:space="preserve">  ],</w:t>
+      </w:r>
+    </w:p>
+    <w:p>
+      <w:pPr>
+        <w:pStyle w:val="Code"/>
+      </w:pPr>
+      <w:r>
+        <w:tab/>
+        <w:t xml:space="preserve">  "parameters": {</w:t>
+      </w:r>
+    </w:p>
+    <w:p>
+      <w:pPr>
+        <w:pStyle w:val="Code"/>
+      </w:pPr>
+      <w:r>
+        <w:tab/>
+        <w:t xml:space="preserve">    "</w:t>
+      </w:r>
+      <w:proofErr w:type="spellStart"/>
+      <w:proofErr w:type="gramStart"/>
+      <w:r>
+        <w:t>lower</w:t>
+      </w:r>
+      <w:proofErr w:type="gramEnd"/>
+      <w:r>
+        <w:t>_in</w:t>
+      </w:r>
+      <w:proofErr w:type="spellEnd"/>
+      <w:r>
+        <w:t>": "-1020",</w:t>
+      </w:r>
+    </w:p>
+    <w:p>
+      <w:pPr>
+        <w:pStyle w:val="Code"/>
+      </w:pPr>
+      <w:r>
         <w:lastRenderedPageBreak/>
         <w:tab/>
-        <w:t xml:space="preserve">      "filename": "square45-90_sobel_gray",</w:t>
-      </w:r>
-    </w:p>
-    <w:p>
-      <w:pPr>
-        <w:pStyle w:val="Code"/>
-      </w:pPr>
-      <w:r>
-        <w:tab/>
-        <w:t xml:space="preserve">      "</w:t>
+        <w:t xml:space="preserve">    "</w:t>
       </w:r>
       <w:proofErr w:type="spellStart"/>
-      <w:r>
-        <w:t>ext</w:t>
+      <w:proofErr w:type="gramStart"/>
+      <w:r>
+        <w:t>upper</w:t>
+      </w:r>
+      <w:proofErr w:type="gramEnd"/>
+      <w:r>
+        <w:t>_in</w:t>
       </w:r>
       <w:proofErr w:type="spellEnd"/>
       <w:r>
-        <w:t>": "jpg"</w:t>
-      </w:r>
-    </w:p>
-    <w:p>
-      <w:pPr>
-        <w:pStyle w:val="Code"/>
-      </w:pPr>
-      <w:r>
-        <w:tab/>
-        <w:t xml:space="preserve">    }</w:t>
-      </w:r>
-    </w:p>
-    <w:p>
-      <w:pPr>
-        <w:pStyle w:val="Code"/>
-      </w:pPr>
-      <w:r>
-        <w:tab/>
-        <w:t xml:space="preserve">  ],</w:t>
-      </w:r>
-    </w:p>
-    <w:p>
-      <w:pPr>
-        <w:pStyle w:val="Code"/>
-      </w:pPr>
-      <w:r>
-        <w:tab/>
-        <w:t xml:space="preserve">  "parameters": {</w:t>
+        <w:t>": "1020",</w:t>
       </w:r>
     </w:p>
     <w:p>
@@ -9411,12 +9482,17 @@
         <w:t xml:space="preserve">    "</w:t>
       </w:r>
       <w:proofErr w:type="spellStart"/>
-      <w:r>
-        <w:t>lower_in</w:t>
+      <w:proofErr w:type="gramStart"/>
+      <w:r>
+        <w:t>lower</w:t>
+      </w:r>
+      <w:proofErr w:type="gramEnd"/>
+      <w:r>
+        <w:t>_out</w:t>
       </w:r>
       <w:proofErr w:type="spellEnd"/>
       <w:r>
-        <w:t>": "-1020",</w:t>
+        <w:t>": "0",</w:t>
       </w:r>
     </w:p>
     <w:p>
@@ -9428,42 +9504,13 @@
         <w:t xml:space="preserve">    "</w:t>
       </w:r>
       <w:proofErr w:type="spellStart"/>
-      <w:r>
-        <w:t>upper_in</w:t>
-      </w:r>
-      <w:proofErr w:type="spellEnd"/>
-      <w:r>
-        <w:t>": "1020",</w:t>
-      </w:r>
-    </w:p>
-    <w:p>
-      <w:pPr>
-        <w:pStyle w:val="Code"/>
-      </w:pPr>
-      <w:r>
-        <w:tab/>
-        <w:t xml:space="preserve">    "</w:t>
-      </w:r>
-      <w:proofErr w:type="spellStart"/>
-      <w:r>
-        <w:t>lower_out</w:t>
-      </w:r>
-      <w:proofErr w:type="spellEnd"/>
-      <w:r>
-        <w:t>": "0",</w:t>
-      </w:r>
-    </w:p>
-    <w:p>
-      <w:pPr>
-        <w:pStyle w:val="Code"/>
-      </w:pPr>
-      <w:r>
-        <w:tab/>
-        <w:t xml:space="preserve">    "</w:t>
-      </w:r>
-      <w:proofErr w:type="spellStart"/>
-      <w:r>
-        <w:t>upper_out</w:t>
+      <w:proofErr w:type="gramStart"/>
+      <w:r>
+        <w:t>upper</w:t>
+      </w:r>
+      <w:proofErr w:type="gramEnd"/>
+      <w:r>
+        <w:t>_out</w:t>
       </w:r>
       <w:proofErr w:type="spellEnd"/>
       <w:r>
@@ -9634,7 +9681,23 @@
                 <w:b w:val="0"/>
                 <w:bCs w:val="0"/>
               </w:rPr>
-              <w:t xml:space="preserve">  "input-data": [</w:t>
+              <w:t xml:space="preserve">  "</w:t>
+            </w:r>
+            <w:proofErr w:type="gramStart"/>
+            <w:r>
+              <w:rPr>
+                <w:b w:val="0"/>
+                <w:bCs w:val="0"/>
+              </w:rPr>
+              <w:t>input</w:t>
+            </w:r>
+            <w:proofErr w:type="gramEnd"/>
+            <w:r>
+              <w:rPr>
+                <w:b w:val="0"/>
+                <w:bCs w:val="0"/>
+              </w:rPr>
+              <w:t>-data": [</w:t>
             </w:r>
           </w:p>
           <w:p>
@@ -9850,7 +9913,23 @@
                 <w:b w:val="0"/>
                 <w:bCs w:val="0"/>
               </w:rPr>
-              <w:t xml:space="preserve">  "output-data": [</w:t>
+              <w:t xml:space="preserve">  "</w:t>
+            </w:r>
+            <w:proofErr w:type="gramStart"/>
+            <w:r>
+              <w:rPr>
+                <w:b w:val="0"/>
+                <w:bCs w:val="0"/>
+              </w:rPr>
+              <w:t>output</w:t>
+            </w:r>
+            <w:proofErr w:type="gramEnd"/>
+            <w:r>
+              <w:rPr>
+                <w:b w:val="0"/>
+                <w:bCs w:val="0"/>
+              </w:rPr>
+              <w:t>-data": [</w:t>
             </w:r>
           </w:p>
           <w:p>
@@ -10082,12 +10161,21 @@
               <w:t xml:space="preserve">    "</w:t>
             </w:r>
             <w:proofErr w:type="spellStart"/>
-            <w:r>
-              <w:rPr>
-                <w:b w:val="0"/>
-                <w:bCs w:val="0"/>
-              </w:rPr>
-              <w:t>lower_in</w:t>
+            <w:proofErr w:type="gramStart"/>
+            <w:r>
+              <w:rPr>
+                <w:b w:val="0"/>
+                <w:bCs w:val="0"/>
+              </w:rPr>
+              <w:t>lower</w:t>
+            </w:r>
+            <w:proofErr w:type="gramEnd"/>
+            <w:r>
+              <w:rPr>
+                <w:b w:val="0"/>
+                <w:bCs w:val="0"/>
+              </w:rPr>
+              <w:t>_in</w:t>
             </w:r>
             <w:proofErr w:type="spellEnd"/>
             <w:r>
@@ -10114,12 +10202,21 @@
               <w:t xml:space="preserve">    "</w:t>
             </w:r>
             <w:proofErr w:type="spellStart"/>
-            <w:r>
-              <w:rPr>
-                <w:b w:val="0"/>
-                <w:bCs w:val="0"/>
-              </w:rPr>
-              <w:t>upper_in</w:t>
+            <w:proofErr w:type="gramStart"/>
+            <w:r>
+              <w:rPr>
+                <w:b w:val="0"/>
+                <w:bCs w:val="0"/>
+              </w:rPr>
+              <w:t>upper</w:t>
+            </w:r>
+            <w:proofErr w:type="gramEnd"/>
+            <w:r>
+              <w:rPr>
+                <w:b w:val="0"/>
+                <w:bCs w:val="0"/>
+              </w:rPr>
+              <w:t>_in</w:t>
             </w:r>
             <w:proofErr w:type="spellEnd"/>
             <w:r>
@@ -10146,12 +10243,21 @@
               <w:t xml:space="preserve">    "</w:t>
             </w:r>
             <w:proofErr w:type="spellStart"/>
-            <w:r>
-              <w:rPr>
-                <w:b w:val="0"/>
-                <w:bCs w:val="0"/>
-              </w:rPr>
-              <w:t>lower_out</w:t>
+            <w:proofErr w:type="gramStart"/>
+            <w:r>
+              <w:rPr>
+                <w:b w:val="0"/>
+                <w:bCs w:val="0"/>
+              </w:rPr>
+              <w:t>lower</w:t>
+            </w:r>
+            <w:proofErr w:type="gramEnd"/>
+            <w:r>
+              <w:rPr>
+                <w:b w:val="0"/>
+                <w:bCs w:val="0"/>
+              </w:rPr>
+              <w:t>_out</w:t>
             </w:r>
             <w:proofErr w:type="spellEnd"/>
             <w:r>
@@ -10178,12 +10284,21 @@
               <w:t xml:space="preserve">    "</w:t>
             </w:r>
             <w:proofErr w:type="spellStart"/>
-            <w:r>
-              <w:rPr>
-                <w:b w:val="0"/>
-                <w:bCs w:val="0"/>
-              </w:rPr>
-              <w:t>upper_out</w:t>
+            <w:proofErr w:type="gramStart"/>
+            <w:r>
+              <w:rPr>
+                <w:b w:val="0"/>
+                <w:bCs w:val="0"/>
+              </w:rPr>
+              <w:t>upper</w:t>
+            </w:r>
+            <w:proofErr w:type="gramEnd"/>
+            <w:r>
+              <w:rPr>
+                <w:b w:val="0"/>
+                <w:bCs w:val="0"/>
+              </w:rPr>
+              <w:t>_out</w:t>
             </w:r>
             <w:proofErr w:type="spellEnd"/>
             <w:r>
@@ -10220,7 +10335,15 @@
               <w:cnfStyle w:val="000000000000" w:firstRow="0" w:lastRow="0" w:firstColumn="0" w:lastColumn="0" w:oddVBand="0" w:evenVBand="0" w:oddHBand="0" w:evenHBand="0" w:firstRowFirstColumn="0" w:firstRowLastColumn="0" w:lastRowFirstColumn="0" w:lastRowLastColumn="0"/>
             </w:pPr>
             <w:r>
-              <w:t xml:space="preserve">The script parameter define </w:t>
+              <w:t xml:space="preserve">The script parameter </w:t>
+            </w:r>
+            <w:proofErr w:type="gramStart"/>
+            <w:r>
+              <w:t>define</w:t>
+            </w:r>
+            <w:proofErr w:type="gramEnd"/>
+            <w:r>
+              <w:t xml:space="preserve"> </w:t>
             </w:r>
             <w:proofErr w:type="spellStart"/>
             <w:r>
@@ -11098,7 +11221,6 @@
                 <w:b w:val="0"/>
                 <w:bCs w:val="0"/>
               </w:rPr>
-              <w:lastRenderedPageBreak/>
               <w:t>Filter</w:t>
             </w:r>
           </w:p>
@@ -11419,6 +11541,7 @@
                 <w:b w:val="0"/>
                 <w:bCs w:val="0"/>
               </w:rPr>
+              <w:lastRenderedPageBreak/>
               <w:t>Hough</w:t>
             </w:r>
           </w:p>
@@ -13101,7 +13224,6 @@
                 <w:b w:val="0"/>
                 <w:bCs w:val="0"/>
               </w:rPr>
-              <w:lastRenderedPageBreak/>
               <w:t>S</w:t>
             </w:r>
           </w:p>
@@ -13453,6 +13575,7 @@
                 <w:b w:val="0"/>
                 <w:bCs w:val="0"/>
               </w:rPr>
+              <w:lastRenderedPageBreak/>
               <w:t>E</w:t>
             </w:r>
           </w:p>
@@ -14214,6 +14337,7 @@
                 <w:bCs w:val="0"/>
               </w:rPr>
             </w:pPr>
+            <w:proofErr w:type="gramStart"/>
             <w:r>
               <w:rPr>
                 <w:b w:val="0"/>
@@ -14221,6 +14345,7 @@
               </w:rPr>
               <w:t>max-row</w:t>
             </w:r>
+            <w:proofErr w:type="gramEnd"/>
           </w:p>
         </w:tc>
         <w:tc>
@@ -14315,6 +14440,7 @@
                 <w:bCs w:val="0"/>
               </w:rPr>
             </w:pPr>
+            <w:proofErr w:type="gramStart"/>
             <w:r>
               <w:rPr>
                 <w:b w:val="0"/>
@@ -14322,6 +14448,7 @@
               </w:rPr>
               <w:t>max-col</w:t>
             </w:r>
+            <w:proofErr w:type="gramEnd"/>
           </w:p>
         </w:tc>
         <w:tc>
@@ -14816,7 +14943,6 @@
         <w:pStyle w:val="Heading2"/>
       </w:pPr>
       <w:r>
-        <w:lastRenderedPageBreak/>
         <w:t>filter-edge-</w:t>
       </w:r>
       <w:proofErr w:type="spellStart"/>
@@ -14909,6 +15035,7 @@
                 <w:b w:val="0"/>
                 <w:bCs w:val="0"/>
               </w:rPr>
+              <w:lastRenderedPageBreak/>
               <w:t>0</w:t>
             </w:r>
           </w:p>
@@ -15679,6 +15806,7 @@
                 <w:bCs w:val="0"/>
               </w:rPr>
             </w:pPr>
+            <w:proofErr w:type="gramStart"/>
             <w:r>
               <w:rPr>
                 <w:b w:val="0"/>
@@ -15686,6 +15814,7 @@
               </w:rPr>
               <w:t>max-row</w:t>
             </w:r>
+            <w:proofErr w:type="gramEnd"/>
           </w:p>
         </w:tc>
         <w:tc>
@@ -15780,6 +15909,7 @@
                 <w:bCs w:val="0"/>
               </w:rPr>
             </w:pPr>
+            <w:proofErr w:type="gramStart"/>
             <w:r>
               <w:rPr>
                 <w:b w:val="0"/>
@@ -15787,6 +15917,7 @@
               </w:rPr>
               <w:t>max-col</w:t>
             </w:r>
+            <w:proofErr w:type="gramEnd"/>
           </w:p>
         </w:tc>
         <w:tc>
@@ -16313,7 +16444,6 @@
               <w:pStyle w:val="NoSpacing"/>
             </w:pPr>
             <w:r>
-              <w:lastRenderedPageBreak/>
               <w:t>orientation</w:t>
             </w:r>
           </w:p>
@@ -16620,6 +16750,7 @@
           </w:tcPr>
           <w:p>
             <w:r>
+              <w:lastRenderedPageBreak/>
               <w:t>Descriptor type</w:t>
             </w:r>
           </w:p>
@@ -17011,6 +17142,7 @@
                 <w:bCs w:val="0"/>
               </w:rPr>
             </w:pPr>
+            <w:proofErr w:type="gramStart"/>
             <w:r>
               <w:rPr>
                 <w:b w:val="0"/>
@@ -17018,6 +17150,7 @@
               </w:rPr>
               <w:t>max-row</w:t>
             </w:r>
+            <w:proofErr w:type="gramEnd"/>
           </w:p>
         </w:tc>
         <w:tc>
@@ -17112,6 +17245,7 @@
                 <w:bCs w:val="0"/>
               </w:rPr>
             </w:pPr>
+            <w:proofErr w:type="gramStart"/>
             <w:r>
               <w:rPr>
                 <w:b w:val="0"/>
@@ -17119,6 +17253,7 @@
               </w:rPr>
               <w:t>max-col</w:t>
             </w:r>
+            <w:proofErr w:type="gramEnd"/>
           </w:p>
         </w:tc>
         <w:tc>
@@ -18036,7 +18171,6 @@
         <w:pStyle w:val="Normalafterlist"/>
       </w:pPr>
       <w:r>
-        <w:lastRenderedPageBreak/>
         <w:t>The operator takes the following data descriptors:</w:t>
       </w:r>
     </w:p>
@@ -18219,6 +18353,7 @@
                 <w:b w:val="0"/>
                 <w:bCs w:val="0"/>
               </w:rPr>
+              <w:lastRenderedPageBreak/>
               <w:t>output</w:t>
             </w:r>
           </w:p>
@@ -18457,6 +18592,7 @@
                 <w:bCs w:val="0"/>
               </w:rPr>
             </w:pPr>
+            <w:proofErr w:type="gramStart"/>
             <w:r>
               <w:rPr>
                 <w:b w:val="0"/>
@@ -18464,6 +18600,7 @@
               </w:rPr>
               <w:t>max-row</w:t>
             </w:r>
+            <w:proofErr w:type="gramEnd"/>
           </w:p>
         </w:tc>
         <w:tc>
@@ -18558,6 +18695,7 @@
                 <w:bCs w:val="0"/>
               </w:rPr>
             </w:pPr>
+            <w:proofErr w:type="gramStart"/>
             <w:r>
               <w:rPr>
                 <w:b w:val="0"/>
@@ -18565,6 +18703,7 @@
               </w:rPr>
               <w:t>max-col</w:t>
             </w:r>
+            <w:proofErr w:type="gramEnd"/>
           </w:p>
         </w:tc>
         <w:tc>
@@ -19066,7 +19205,15 @@
         <w:t xml:space="preserve">structuring element </w:t>
       </w:r>
       <w:r>
-        <w:t xml:space="preserve">at each pixel position and decides as to what output value to produce. Erosion selects the minimum value under the mask and dilation selects the maximum value. This will give the appropriate result for both binary and grayscale images. The operator produce output images of the same depth as the input images. </w:t>
+        <w:t xml:space="preserve">at each pixel position and decides as to what output value to produce. Erosion selects the minimum value under the mask and dilation selects the maximum value. This will give the appropriate result for both binary and grayscale images. The operator </w:t>
+      </w:r>
+      <w:proofErr w:type="gramStart"/>
+      <w:r>
+        <w:t>produce</w:t>
+      </w:r>
+      <w:proofErr w:type="gramEnd"/>
+      <w:r>
+        <w:t xml:space="preserve"> output images of the same depth as the input images. </w:t>
       </w:r>
     </w:p>
     <w:tbl>
@@ -19484,7 +19631,6 @@
         <w:pStyle w:val="Normalafterlist"/>
       </w:pPr>
       <w:r>
-        <w:lastRenderedPageBreak/>
         <w:t>The operator takes the following data descriptors. The output data format is ignored.</w:t>
       </w:r>
     </w:p>
@@ -19514,6 +19660,7 @@
           </w:tcPr>
           <w:p>
             <w:r>
+              <w:lastRenderedPageBreak/>
               <w:t>Descriptor type</w:t>
             </w:r>
           </w:p>
@@ -20088,6 +20235,7 @@
                 <w:bCs w:val="0"/>
               </w:rPr>
             </w:pPr>
+            <w:proofErr w:type="gramStart"/>
             <w:r>
               <w:rPr>
                 <w:b w:val="0"/>
@@ -20095,6 +20243,7 @@
               </w:rPr>
               <w:t>max-row</w:t>
             </w:r>
+            <w:proofErr w:type="gramEnd"/>
           </w:p>
         </w:tc>
         <w:tc>
@@ -20189,6 +20338,7 @@
                 <w:bCs w:val="0"/>
               </w:rPr>
             </w:pPr>
+            <w:proofErr w:type="gramStart"/>
             <w:r>
               <w:rPr>
                 <w:b w:val="0"/>
@@ -20196,6 +20346,7 @@
               </w:rPr>
               <w:t>max-col</w:t>
             </w:r>
+            <w:proofErr w:type="gramEnd"/>
           </w:p>
         </w:tc>
         <w:tc>
@@ -20675,7 +20826,15 @@
     </w:p>
     <w:p>
       <w:r>
-        <w:t>The filter smooth average operator convolves the image with a kernel that averages the pixels under the kernel. For a kernel that is size rows x cols, the output pixel is the sum of the pixels in a rectangle rows x cols around the input pixel, divided by 1/(rows * cols).</w:t>
+        <w:t>The filter smooth average operator convolves the image with a kernel that averages the pixels under the kernel. For a kernel that is size rows x cols, the output pixel is the sum of the pixels in a rectangle rows x cols around the input pixel, divided by 1</w:t>
+      </w:r>
+      <w:proofErr w:type="gramStart"/>
+      <w:r>
+        <w:t>/(</w:t>
+      </w:r>
+      <w:proofErr w:type="gramEnd"/>
+      <w:r>
+        <w:t>rows * cols).</w:t>
       </w:r>
     </w:p>
     <w:p>
@@ -21153,6 +21312,7 @@
                 <w:bCs w:val="0"/>
               </w:rPr>
             </w:pPr>
+            <w:proofErr w:type="gramStart"/>
             <w:r>
               <w:rPr>
                 <w:b w:val="0"/>
@@ -21160,6 +21320,7 @@
               </w:rPr>
               <w:t>max-row</w:t>
             </w:r>
+            <w:proofErr w:type="gramEnd"/>
           </w:p>
         </w:tc>
         <w:tc>
@@ -21254,6 +21415,7 @@
                 <w:bCs w:val="0"/>
               </w:rPr>
             </w:pPr>
+            <w:proofErr w:type="gramStart"/>
             <w:r>
               <w:rPr>
                 <w:b w:val="0"/>
@@ -21261,6 +21423,7 @@
               </w:rPr>
               <w:t>max-col</w:t>
             </w:r>
+            <w:proofErr w:type="gramEnd"/>
           </w:p>
         </w:tc>
         <w:tc>
@@ -22887,6 +23050,7 @@
                 <w:bCs w:val="0"/>
               </w:rPr>
             </w:pPr>
+            <w:proofErr w:type="gramStart"/>
             <w:r>
               <w:rPr>
                 <w:b w:val="0"/>
@@ -22894,6 +23058,7 @@
               </w:rPr>
               <w:t>max-row</w:t>
             </w:r>
+            <w:proofErr w:type="gramEnd"/>
           </w:p>
         </w:tc>
         <w:tc>
@@ -22988,6 +23153,7 @@
                 <w:bCs w:val="0"/>
               </w:rPr>
             </w:pPr>
+            <w:proofErr w:type="gramStart"/>
             <w:r>
               <w:rPr>
                 <w:b w:val="0"/>
@@ -22995,6 +23161,7 @@
               </w:rPr>
               <w:t>max-col</w:t>
             </w:r>
+            <w:proofErr w:type="gramEnd"/>
           </w:p>
         </w:tc>
         <w:tc>
@@ -23932,6 +24099,7 @@
                 <w:bCs w:val="0"/>
               </w:rPr>
             </w:pPr>
+            <w:proofErr w:type="gramStart"/>
             <w:r>
               <w:rPr>
                 <w:b w:val="0"/>
@@ -23939,6 +24107,7 @@
               </w:rPr>
               <w:t>lower-value</w:t>
             </w:r>
+            <w:proofErr w:type="gramEnd"/>
           </w:p>
         </w:tc>
         <w:tc>
@@ -23987,6 +24156,7 @@
                 <w:bCs w:val="0"/>
               </w:rPr>
             </w:pPr>
+            <w:proofErr w:type="gramStart"/>
             <w:r>
               <w:rPr>
                 <w:b w:val="0"/>
@@ -23994,6 +24164,7 @@
               </w:rPr>
               <w:t>upper-value</w:t>
             </w:r>
+            <w:proofErr w:type="gramEnd"/>
           </w:p>
         </w:tc>
         <w:tc>
@@ -24230,12 +24401,21 @@
                 <w:bCs w:val="0"/>
               </w:rPr>
             </w:pPr>
-            <w:r>
-              <w:rPr>
-                <w:b w:val="0"/>
-                <w:bCs w:val="0"/>
-              </w:rPr>
-              <w:t>accumulator mean</w:t>
+            <w:proofErr w:type="gramStart"/>
+            <w:r>
+              <w:rPr>
+                <w:b w:val="0"/>
+                <w:bCs w:val="0"/>
+              </w:rPr>
+              <w:t>accumulator</w:t>
+            </w:r>
+            <w:proofErr w:type="gramEnd"/>
+            <w:r>
+              <w:rPr>
+                <w:b w:val="0"/>
+                <w:bCs w:val="0"/>
+              </w:rPr>
+              <w:t xml:space="preserve"> mean</w:t>
             </w:r>
           </w:p>
         </w:tc>
@@ -24912,6 +25092,7 @@
                 <w:bCs w:val="0"/>
               </w:rPr>
             </w:pPr>
+            <w:proofErr w:type="gramStart"/>
             <w:r>
               <w:rPr>
                 <w:b w:val="0"/>
@@ -24920,6 +25101,7 @@
               <w:lastRenderedPageBreak/>
               <w:t>lower-value</w:t>
             </w:r>
+            <w:proofErr w:type="gramEnd"/>
           </w:p>
         </w:tc>
         <w:tc>
@@ -24968,6 +25150,7 @@
                 <w:bCs w:val="0"/>
               </w:rPr>
             </w:pPr>
+            <w:proofErr w:type="gramStart"/>
             <w:r>
               <w:rPr>
                 <w:b w:val="0"/>
@@ -24975,6 +25158,7 @@
               </w:rPr>
               <w:t>upper-value</w:t>
             </w:r>
+            <w:proofErr w:type="gramEnd"/>
           </w:p>
         </w:tc>
         <w:tc>
@@ -25071,6 +25255,7 @@
                 <w:bCs w:val="0"/>
               </w:rPr>
             </w:pPr>
+            <w:proofErr w:type="gramStart"/>
             <w:r>
               <w:rPr>
                 <w:b w:val="0"/>
@@ -25078,6 +25263,7 @@
               </w:rPr>
               <w:t>max-row</w:t>
             </w:r>
+            <w:proofErr w:type="gramEnd"/>
           </w:p>
         </w:tc>
         <w:tc>
@@ -25178,6 +25364,7 @@
                 <w:bCs w:val="0"/>
               </w:rPr>
             </w:pPr>
+            <w:proofErr w:type="gramStart"/>
             <w:r>
               <w:rPr>
                 <w:b w:val="0"/>
@@ -25185,6 +25372,7 @@
               </w:rPr>
               <w:t>max-col</w:t>
             </w:r>
+            <w:proofErr w:type="gramEnd"/>
           </w:p>
         </w:tc>
         <w:tc>
@@ -26021,7 +26209,15 @@
               <w:cnfStyle w:val="000000100000" w:firstRow="0" w:lastRow="0" w:firstColumn="0" w:lastColumn="0" w:oddVBand="0" w:evenVBand="0" w:oddHBand="1" w:evenHBand="0" w:firstRowFirstColumn="0" w:firstRowLastColumn="0" w:lastRowFirstColumn="0" w:lastRowLastColumn="0"/>
             </w:pPr>
             <w:r>
-              <w:t xml:space="preserve">increment for the Hough accumulator angle. The number of angles are 180 / </w:t>
+              <w:t xml:space="preserve">increment for the Hough accumulator angle. The number of angles </w:t>
+            </w:r>
+            <w:proofErr w:type="gramStart"/>
+            <w:r>
+              <w:t>are</w:t>
+            </w:r>
+            <w:proofErr w:type="gramEnd"/>
+            <w:r>
+              <w:t xml:space="preserve"> 180 / </w:t>
             </w:r>
             <w:proofErr w:type="spellStart"/>
             <w:r>
@@ -26334,6 +26530,7 @@
                 <w:bCs w:val="0"/>
               </w:rPr>
             </w:pPr>
+            <w:proofErr w:type="gramStart"/>
             <w:r>
               <w:rPr>
                 <w:b w:val="0"/>
@@ -26342,6 +26539,7 @@
               <w:lastRenderedPageBreak/>
               <w:t>max-row</w:t>
             </w:r>
+            <w:proofErr w:type="gramEnd"/>
           </w:p>
         </w:tc>
         <w:tc>
@@ -26442,6 +26640,7 @@
                 <w:bCs w:val="0"/>
               </w:rPr>
             </w:pPr>
+            <w:proofErr w:type="gramStart"/>
             <w:r>
               <w:rPr>
                 <w:b w:val="0"/>
@@ -26449,6 +26648,7 @@
               </w:rPr>
               <w:t>max-col</w:t>
             </w:r>
+            <w:proofErr w:type="gramEnd"/>
           </w:p>
         </w:tc>
         <w:tc>
@@ -27127,7 +27327,15 @@
               <w:cnfStyle w:val="000000100000" w:firstRow="0" w:lastRow="0" w:firstColumn="0" w:lastColumn="0" w:oddVBand="0" w:evenVBand="0" w:oddHBand="1" w:evenHBand="0" w:firstRowFirstColumn="0" w:firstRowLastColumn="0" w:lastRowFirstColumn="0" w:lastRowLastColumn="0"/>
             </w:pPr>
             <w:r>
-              <w:t xml:space="preserve">increment for the Hough accumulator angle. The number of angles are 180 / </w:t>
+              <w:t xml:space="preserve">increment for the Hough accumulator angle. The number of angles </w:t>
+            </w:r>
+            <w:proofErr w:type="gramStart"/>
+            <w:r>
+              <w:t>are</w:t>
+            </w:r>
+            <w:proofErr w:type="gramEnd"/>
+            <w:r>
+              <w:t xml:space="preserve"> 180 / </w:t>
             </w:r>
             <w:proofErr w:type="spellStart"/>
             <w:r>
@@ -27254,6 +27462,7 @@
                 <w:bCs w:val="0"/>
               </w:rPr>
             </w:pPr>
+            <w:proofErr w:type="gramStart"/>
             <w:r>
               <w:rPr>
                 <w:b w:val="0"/>
@@ -27261,6 +27470,7 @@
               </w:rPr>
               <w:t>max-row</w:t>
             </w:r>
+            <w:proofErr w:type="gramEnd"/>
           </w:p>
         </w:tc>
         <w:tc>
@@ -27355,6 +27565,7 @@
                 <w:bCs w:val="0"/>
               </w:rPr>
             </w:pPr>
+            <w:proofErr w:type="gramStart"/>
             <w:r>
               <w:rPr>
                 <w:b w:val="0"/>
@@ -27362,6 +27573,7 @@
               </w:rPr>
               <w:t>max-col</w:t>
             </w:r>
+            <w:proofErr w:type="gramEnd"/>
           </w:p>
         </w:tc>
         <w:tc>
@@ -27970,8 +28182,13 @@
     </w:p>
     <w:p>
       <w:r>
-        <w:t>The Hough peak detect operator finds polar lines (rho, theta) in the Hough accumulator data where the counts exceed a threshold..</w:t>
-      </w:r>
+        <w:t xml:space="preserve">The Hough peak detect operator finds polar lines (rho, theta) in the Hough accumulator data where the counts exceed a </w:t>
+      </w:r>
+      <w:proofErr w:type="gramStart"/>
+      <w:r>
+        <w:t>threshold..</w:t>
+      </w:r>
+      <w:proofErr w:type="gramEnd"/>
     </w:p>
     <w:p>
       <w:r>
@@ -29297,12 +29514,25 @@
     </w:p>
     <w:p>
       <w:r>
-        <w:t>The transform image combine operator does a linear recombination of two images. The formula for the output values are:</w:t>
-      </w:r>
-    </w:p>
-    <w:p>
-      <w:r>
-        <w:t>output(row, col) = scale</w:t>
+        <w:t xml:space="preserve">The transform image combine operator does a linear recombination of two images. The formula for the output values </w:t>
+      </w:r>
+      <w:proofErr w:type="gramStart"/>
+      <w:r>
+        <w:t>are</w:t>
+      </w:r>
+      <w:proofErr w:type="gramEnd"/>
+      <w:r>
+        <w:t>:</w:t>
+      </w:r>
+    </w:p>
+    <w:p>
+      <w:proofErr w:type="gramStart"/>
+      <w:r>
+        <w:t>output(</w:t>
+      </w:r>
+      <w:proofErr w:type="gramEnd"/>
+      <w:r>
+        <w:t>row, col) = scale</w:t>
       </w:r>
       <w:r>
         <w:rPr>
@@ -29749,6 +29979,7 @@
                 <w:bCs w:val="0"/>
               </w:rPr>
             </w:pPr>
+            <w:proofErr w:type="gramStart"/>
             <w:r>
               <w:rPr>
                 <w:b w:val="0"/>
@@ -29756,6 +29987,7 @@
               </w:rPr>
               <w:t>scale-1</w:t>
             </w:r>
+            <w:proofErr w:type="gramEnd"/>
           </w:p>
         </w:tc>
         <w:tc>
@@ -29800,6 +30032,7 @@
                 <w:bCs w:val="0"/>
               </w:rPr>
             </w:pPr>
+            <w:proofErr w:type="gramStart"/>
             <w:r>
               <w:rPr>
                 <w:b w:val="0"/>
@@ -29807,6 +30040,7 @@
               </w:rPr>
               <w:t>scale-2</w:t>
             </w:r>
+            <w:proofErr w:type="gramEnd"/>
           </w:p>
         </w:tc>
         <w:tc>
@@ -29957,6 +30191,7 @@
                 <w:bCs w:val="0"/>
               </w:rPr>
             </w:pPr>
+            <w:proofErr w:type="gramStart"/>
             <w:r>
               <w:rPr>
                 <w:b w:val="0"/>
@@ -29964,6 +30199,7 @@
               </w:rPr>
               <w:t>max-row</w:t>
             </w:r>
+            <w:proofErr w:type="gramEnd"/>
           </w:p>
         </w:tc>
         <w:tc>
@@ -30058,6 +30294,7 @@
                 <w:bCs w:val="0"/>
               </w:rPr>
             </w:pPr>
+            <w:proofErr w:type="gramStart"/>
             <w:r>
               <w:rPr>
                 <w:b w:val="0"/>
@@ -30065,6 +30302,7 @@
               </w:rPr>
               <w:t>max-col</w:t>
             </w:r>
+            <w:proofErr w:type="gramEnd"/>
           </w:p>
         </w:tc>
         <w:tc>
@@ -31645,7 +31883,15 @@
         </w:numPr>
       </w:pPr>
       <w:r>
-        <w:t xml:space="preserve">If a text input file is specified, each line consists of space or tab delimited numeric intensities. The number of rows is the number of lines in the file. The number of columns is the number of fields on each line. The number of fields must be the same on each line. If the output format is JPEG, field values outside the range of 0..255 will be truncated. </w:t>
+        <w:t xml:space="preserve">If a text input file is specified, each line consists of space or tab delimited numeric intensities. The number of rows is the number of lines in the file. The number of columns is the number of fields on each line. The number of fields must be the same on each line. If the output format is JPEG, field values outside the range of </w:t>
+      </w:r>
+      <w:proofErr w:type="gramStart"/>
+      <w:r>
+        <w:t>0..</w:t>
+      </w:r>
+      <w:proofErr w:type="gramEnd"/>
+      <w:r>
+        <w:t xml:space="preserve">255 will be truncated. </w:t>
       </w:r>
     </w:p>
     <w:tbl>
@@ -32219,10 +32465,12 @@
               <w:t>A point to add to the image as ‘</w:t>
             </w:r>
             <w:proofErr w:type="spellStart"/>
+            <w:proofErr w:type="gramStart"/>
             <w:r>
               <w:t>row,col</w:t>
             </w:r>
             <w:proofErr w:type="spellEnd"/>
+            <w:proofErr w:type="gramEnd"/>
             <w:r>
               <w:t>’</w:t>
             </w:r>
@@ -32278,10 +32526,12 @@
               <w:t>A line segment ‘(</w:t>
             </w:r>
             <w:proofErr w:type="spellStart"/>
+            <w:proofErr w:type="gramStart"/>
             <w:r>
               <w:t>row,col</w:t>
             </w:r>
             <w:proofErr w:type="spellEnd"/>
+            <w:proofErr w:type="gramEnd"/>
             <w:r>
               <w:t>):(</w:t>
             </w:r>
@@ -32363,10 +32613,12 @@
               <w:t>A rectangle ‘(</w:t>
             </w:r>
             <w:proofErr w:type="spellStart"/>
+            <w:proofErr w:type="gramStart"/>
             <w:r>
               <w:t>row,col</w:t>
             </w:r>
             <w:proofErr w:type="spellEnd"/>
+            <w:proofErr w:type="gramEnd"/>
             <w:r>
               <w:t>):(</w:t>
             </w:r>
@@ -32443,7 +32695,15 @@
               <w:cnfStyle w:val="000000000000" w:firstRow="0" w:lastRow="0" w:firstColumn="0" w:lastColumn="0" w:oddVBand="0" w:evenVBand="0" w:oddHBand="0" w:evenHBand="0" w:firstRowFirstColumn="0" w:firstRowLastColumn="0" w:lastRowFirstColumn="0" w:lastRowLastColumn="0"/>
             </w:pPr>
             <w:r>
-              <w:t>Similar to the ‘rectangle’ parameter, but creates a filled rectangle.</w:t>
+              <w:t xml:space="preserve">Similar to the ‘rectangle’ </w:t>
+            </w:r>
+            <w:proofErr w:type="gramStart"/>
+            <w:r>
+              <w:t>parameter, but</w:t>
+            </w:r>
+            <w:proofErr w:type="gramEnd"/>
+            <w:r>
+              <w:t xml:space="preserve"> creates a filled rectangle.</w:t>
             </w:r>
           </w:p>
         </w:tc>
@@ -32513,6 +32773,7 @@
                 <w:bCs w:val="0"/>
               </w:rPr>
             </w:pPr>
+            <w:proofErr w:type="gramStart"/>
             <w:r>
               <w:rPr>
                 <w:b w:val="0"/>
@@ -32520,6 +32781,7 @@
               </w:rPr>
               <w:t>max-row</w:t>
             </w:r>
+            <w:proofErr w:type="gramEnd"/>
           </w:p>
         </w:tc>
         <w:tc>
@@ -32614,6 +32876,7 @@
                 <w:bCs w:val="0"/>
               </w:rPr>
             </w:pPr>
+            <w:proofErr w:type="gramStart"/>
             <w:r>
               <w:rPr>
                 <w:b w:val="0"/>
@@ -32621,6 +32884,7 @@
               </w:rPr>
               <w:t>max-col</w:t>
             </w:r>
+            <w:proofErr w:type="gramEnd"/>
           </w:p>
         </w:tc>
         <w:tc>
@@ -32667,6 +32931,7 @@
         <w:t>“point”: “(</w:t>
       </w:r>
       <w:proofErr w:type="spellStart"/>
+      <w:proofErr w:type="gramStart"/>
       <w:r>
         <w:rPr>
           <w:i/>
@@ -32685,6 +32950,7 @@
         <w:t>col</w:t>
       </w:r>
       <w:proofErr w:type="spellEnd"/>
+      <w:proofErr w:type="gramEnd"/>
       <w:r>
         <w:t>)|(</w:t>
       </w:r>
@@ -32719,6 +32985,7 @@
         <w:t>“line”: “(</w:t>
       </w:r>
       <w:proofErr w:type="spellStart"/>
+      <w:proofErr w:type="gramStart"/>
       <w:r>
         <w:rPr>
           <w:i/>
@@ -32737,6 +33004,7 @@
         <w:t>col</w:t>
       </w:r>
       <w:proofErr w:type="spellEnd"/>
+      <w:proofErr w:type="gramEnd"/>
       <w:r>
         <w:t>):(</w:t>
       </w:r>
@@ -32815,6 +33083,7 @@
         <w:t>“rectangle”: “(</w:t>
       </w:r>
       <w:proofErr w:type="spellStart"/>
+      <w:proofErr w:type="gramStart"/>
       <w:r>
         <w:rPr>
           <w:i/>
@@ -32833,6 +33102,7 @@
         <w:t>col</w:t>
       </w:r>
       <w:proofErr w:type="spellEnd"/>
+      <w:proofErr w:type="gramEnd"/>
       <w:r>
         <w:t>):(</w:t>
       </w:r>
@@ -33385,7 +33655,15 @@
       </w:r>
       <w:proofErr w:type="spellEnd"/>
       <w:r>
-        <w:t xml:space="preserve"> is the output pixel value for input pixel values &gt;= threshold. Values for JPEG output images will be CV_8U and truncated to 0..255.</w:t>
+        <w:t xml:space="preserve"> is the output pixel value for input pixel values &gt;= threshold. Values for JPEG output images will be CV_8U and truncated to </w:t>
+      </w:r>
+      <w:proofErr w:type="gramStart"/>
+      <w:r>
+        <w:t>0..</w:t>
+      </w:r>
+      <w:proofErr w:type="gramEnd"/>
+      <w:r>
+        <w:t>255.</w:t>
       </w:r>
     </w:p>
     <w:p>
@@ -34027,6 +34305,7 @@
                 <w:bCs w:val="0"/>
               </w:rPr>
             </w:pPr>
+            <w:proofErr w:type="gramStart"/>
             <w:r>
               <w:rPr>
                 <w:b w:val="0"/>
@@ -34034,6 +34313,7 @@
               </w:rPr>
               <w:t>max-row</w:t>
             </w:r>
+            <w:proofErr w:type="gramEnd"/>
           </w:p>
         </w:tc>
         <w:tc>
@@ -34128,6 +34408,7 @@
                 <w:bCs w:val="0"/>
               </w:rPr>
             </w:pPr>
+            <w:proofErr w:type="gramStart"/>
             <w:r>
               <w:rPr>
                 <w:b w:val="0"/>
@@ -34135,6 +34416,7 @@
               </w:rPr>
               <w:t>max-col</w:t>
             </w:r>
+            <w:proofErr w:type="gramEnd"/>
           </w:p>
         </w:tc>
         <w:tc>
@@ -34775,7 +35057,15 @@
     </w:p>
     <w:p>
       <w:r>
-        <w:t xml:space="preserve">There are a number of CV-workbench programs included in the </w:t>
+        <w:t xml:space="preserve">There are </w:t>
+      </w:r>
+      <w:proofErr w:type="gramStart"/>
+      <w:r>
+        <w:t>a number of</w:t>
+      </w:r>
+      <w:proofErr w:type="gramEnd"/>
+      <w:r>
+        <w:t xml:space="preserve"> CV-workbench programs included in the </w:t>
       </w:r>
       <w:r>
         <w:rPr>
@@ -34889,7 +35179,14 @@
       </w:pPr>
       <w:r>
         <w:br/>
-        <w:t xml:space="preserve">$ ./cv-workbench </w:t>
+      </w:r>
+      <w:proofErr w:type="gramStart"/>
+      <w:r>
+        <w:t>$ .</w:t>
+      </w:r>
+      <w:proofErr w:type="gramEnd"/>
+      <w:r>
+        <w:t xml:space="preserve">/cv-workbench </w:t>
       </w:r>
       <w:r>
         <w:rPr>
@@ -34936,8 +35233,13 @@
       <w:pPr>
         <w:pStyle w:val="Code"/>
       </w:pPr>
-      <w:r>
-        <w:t xml:space="preserve">$./image-copy </w:t>
+      <w:proofErr w:type="gramStart"/>
+      <w:r>
+        <w:t>$./</w:t>
+      </w:r>
+      <w:proofErr w:type="gramEnd"/>
+      <w:r>
+        <w:t xml:space="preserve">image-copy </w:t>
       </w:r>
       <w:proofErr w:type="spellStart"/>
       <w:r>
@@ -35070,6 +35372,7 @@
                 <w:bCs w:val="0"/>
               </w:rPr>
             </w:pPr>
+            <w:proofErr w:type="gramStart"/>
             <w:r>
               <w:rPr>
                 <w:b w:val="0"/>
@@ -35077,6 +35380,7 @@
               </w:rPr>
               <w:t>max-row</w:t>
             </w:r>
+            <w:proofErr w:type="gramEnd"/>
           </w:p>
         </w:tc>
         <w:tc>
@@ -35145,6 +35449,7 @@
                 <w:bCs w:val="0"/>
               </w:rPr>
             </w:pPr>
+            <w:proofErr w:type="gramStart"/>
             <w:r>
               <w:rPr>
                 <w:b w:val="0"/>
@@ -35152,6 +35457,7 @@
               </w:rPr>
               <w:t>max-col</w:t>
             </w:r>
+            <w:proofErr w:type="gramEnd"/>
           </w:p>
         </w:tc>
         <w:tc>
@@ -35186,8 +35492,13 @@
       <w:pPr>
         <w:pStyle w:val="Code"/>
       </w:pPr>
-      <w:r>
-        <w:t xml:space="preserve">$ ./image-dump </w:t>
+      <w:proofErr w:type="gramStart"/>
+      <w:r>
+        <w:t>$ .</w:t>
+      </w:r>
+      <w:proofErr w:type="gramEnd"/>
+      <w:r>
+        <w:t xml:space="preserve">/image-dump </w:t>
       </w:r>
       <w:r>
         <w:rPr>
@@ -35287,8 +35598,13 @@
           <w:iCs/>
         </w:rPr>
       </w:pPr>
-      <w:r>
-        <w:t xml:space="preserve">$ ./image-info </w:t>
+      <w:proofErr w:type="gramStart"/>
+      <w:r>
+        <w:t>$ .</w:t>
+      </w:r>
+      <w:proofErr w:type="gramEnd"/>
+      <w:r>
+        <w:t xml:space="preserve">/image-info </w:t>
       </w:r>
       <w:r>
         <w:rPr>
@@ -35334,15 +35650,28 @@
         <w:t>in-filename</w:t>
       </w:r>
       <w:r>
-        <w:t xml:space="preserve"> has a “.jpg” or “.bin” extension to indicate whether it is a JPEG image file or a binary internal format image file. It writes statistics of the image similar to this:</w:t>
+        <w:t xml:space="preserve"> has a “.jpg” or “.bin” extension to indicate whether it is a JPEG image file or a binary internal format image file. It writes statistics of the image </w:t>
+      </w:r>
+      <w:proofErr w:type="gramStart"/>
+      <w:r>
+        <w:t>similar to</w:t>
+      </w:r>
+      <w:proofErr w:type="gramEnd"/>
+      <w:r>
+        <w:t xml:space="preserve"> this:</w:t>
       </w:r>
     </w:p>
     <w:p>
       <w:pPr>
         <w:pStyle w:val="Code"/>
       </w:pPr>
-      <w:r>
-        <w:t>$ ./image-info test/reference/du_map_gray.jpg</w:t>
+      <w:proofErr w:type="gramStart"/>
+      <w:r>
+        <w:t>$ .</w:t>
+      </w:r>
+      <w:proofErr w:type="gramEnd"/>
+      <w:r>
+        <w:t>/image-info test/reference/du_map_gray.jpg</w:t>
       </w:r>
     </w:p>
     <w:p>
@@ -35559,8 +35888,13 @@
         <w:pStyle w:val="Code"/>
       </w:pPr>
       <w:r>
-        <w:t xml:space="preserve">        standard deviation  33.5635</w:t>
-      </w:r>
+        <w:t xml:space="preserve">        standard </w:t>
+      </w:r>
+      <w:proofErr w:type="gramStart"/>
+      <w:r>
+        <w:t>deviation  33.5635</w:t>
+      </w:r>
+      <w:proofErr w:type="gramEnd"/>
     </w:p>
     <w:p>
       <w:pPr>
@@ -35595,8 +35929,13 @@
       <w:pPr>
         <w:pStyle w:val="Code"/>
       </w:pPr>
-      <w:r>
-        <w:t xml:space="preserve">$ ./image-map </w:t>
+      <w:proofErr w:type="gramStart"/>
+      <w:r>
+        <w:t>$ .</w:t>
+      </w:r>
+      <w:proofErr w:type="gramEnd"/>
+      <w:r>
+        <w:t xml:space="preserve">/image-map </w:t>
       </w:r>
       <w:proofErr w:type="spellStart"/>
       <w:r>
@@ -35643,15 +35982,28 @@
     </w:p>
     <w:p>
       <w:r>
-        <w:t>This is a program that tests the filter-image-morphology operator. It is runs all morphology operators on the input image with:</w:t>
+        <w:t xml:space="preserve">This is a program that tests the filter-image-morphology operator. It is </w:t>
+      </w:r>
+      <w:proofErr w:type="gramStart"/>
+      <w:r>
+        <w:t>runs</w:t>
+      </w:r>
+      <w:proofErr w:type="gramEnd"/>
+      <w:r>
+        <w:t xml:space="preserve"> all morphology operators on the input image with:</w:t>
       </w:r>
     </w:p>
     <w:p>
       <w:pPr>
         <w:pStyle w:val="Code"/>
       </w:pPr>
-      <w:r>
-        <w:t xml:space="preserve">$ ./image-morph </w:t>
+      <w:proofErr w:type="gramStart"/>
+      <w:r>
+        <w:t>$ .</w:t>
+      </w:r>
+      <w:proofErr w:type="gramEnd"/>
+      <w:r>
+        <w:t xml:space="preserve">/image-morph </w:t>
       </w:r>
       <w:proofErr w:type="spellStart"/>
       <w:r>
@@ -35705,8 +36057,13 @@
       <w:pPr>
         <w:pStyle w:val="Code"/>
       </w:pPr>
-      <w:r>
-        <w:t xml:space="preserve">$ ./image-read </w:t>
+      <w:proofErr w:type="gramStart"/>
+      <w:r>
+        <w:t>$ .</w:t>
+      </w:r>
+      <w:proofErr w:type="gramEnd"/>
+      <w:r>
+        <w:t xml:space="preserve">/image-read </w:t>
       </w:r>
       <w:r>
         <w:rPr>
@@ -35776,8 +36133,13 @@
       <w:pPr>
         <w:pStyle w:val="Code"/>
       </w:pPr>
-      <w:r>
-        <w:t xml:space="preserve">./image-trig </w:t>
+      <w:proofErr w:type="gramStart"/>
+      <w:r>
+        <w:t>./</w:t>
+      </w:r>
+      <w:proofErr w:type="gramEnd"/>
+      <w:r>
+        <w:t xml:space="preserve">image-trig </w:t>
       </w:r>
     </w:p>
     <w:p>
@@ -35801,7 +36163,14 @@
       </w:pPr>
       <w:r>
         <w:br/>
-        <w:t>$ ./</w:t>
+      </w:r>
+      <w:proofErr w:type="gramStart"/>
+      <w:r>
+        <w:t>$ .</w:t>
+      </w:r>
+      <w:proofErr w:type="gramEnd"/>
+      <w:r>
+        <w:t>/</w:t>
       </w:r>
       <w:proofErr w:type="spellStart"/>
       <w:r>
@@ -35906,7 +36275,7 @@
       <w:rPr>
         <w:noProof/>
       </w:rPr>
-      <w:t>9/9/2022 8:01 PM</w:t>
+      <w:t>9/10/2022 9:19 AM</w:t>
     </w:r>
     <w:r>
       <w:fldChar w:fldCharType="end"/>
@@ -35966,7 +36335,7 @@
       <w:rPr>
         <w:noProof/>
       </w:rPr>
-      <w:t>9/9/2022 8:01 PM</w:t>
+      <w:t>9/10/2022 9:19 AM</w:t>
     </w:r>
     <w:r>
       <w:fldChar w:fldCharType="end"/>

</xml_diff>

<commit_message>
refactored hough to use rho_inc
</commit_message>
<xml_diff>
--- a/doc/cv-workbench manual.docx
+++ b/doc/cv-workbench manual.docx
@@ -77,15 +77,7 @@
         </w:numPr>
       </w:pPr>
       <w:r>
-        <w:t xml:space="preserve">Users write scripts that allow exactly reproducing results and running operations on different sets of </w:t>
-      </w:r>
-      <w:proofErr w:type="gramStart"/>
-      <w:r>
-        <w:t>data, and</w:t>
-      </w:r>
-      <w:proofErr w:type="gramEnd"/>
-      <w:r>
-        <w:t xml:space="preserve"> are easily changed and reused to try different operations with differ parameter settings. </w:t>
+        <w:t xml:space="preserve">Users write scripts that allow exactly reproducing results and running operations on different sets of data, and are easily changed and reused to try different operations with differ parameter settings. </w:t>
       </w:r>
     </w:p>
     <w:p>
@@ -117,15 +109,7 @@
         </w:r>
       </w:hyperlink>
       <w:r>
-        <w:t xml:space="preserve">. What you need to learn isn’t hard. Apple MacOS is </w:t>
-      </w:r>
-      <w:proofErr w:type="gramStart"/>
-      <w:r>
-        <w:t>similar to</w:t>
-      </w:r>
-      <w:proofErr w:type="gramEnd"/>
-      <w:r>
-        <w:t xml:space="preserve"> Linux but will not run CV Workbench natively. Versions to run on MacOS and Windows can be produced eventually.</w:t>
+        <w:t>. What you need to learn isn’t hard. Apple MacOS is similar to Linux but will not run CV Workbench natively. Versions to run on MacOS and Windows can be produced eventually.</w:t>
       </w:r>
     </w:p>
     <w:p>
@@ -770,15 +754,7 @@
               <w:cnfStyle w:val="000000100000" w:firstRow="0" w:lastRow="0" w:firstColumn="0" w:lastColumn="0" w:oddVBand="0" w:evenVBand="0" w:oddHBand="1" w:evenHBand="0" w:firstRowFirstColumn="0" w:firstRowLastColumn="0" w:lastRowFirstColumn="0" w:lastRowLastColumn="0"/>
             </w:pPr>
             <w:r>
-              <w:t xml:space="preserve">These are </w:t>
-            </w:r>
-            <w:proofErr w:type="gramStart"/>
-            <w:r>
-              <w:t>various different</w:t>
-            </w:r>
-            <w:proofErr w:type="gramEnd"/>
-            <w:r>
-              <w:t xml:space="preserve"> image operations including:</w:t>
+              <w:t>These are various different image operations including:</w:t>
             </w:r>
           </w:p>
           <w:p>
@@ -871,7 +847,7 @@
           <w:noProof/>
         </w:rPr>
         <w:drawing>
-          <wp:inline distT="0" distB="0" distL="0" distR="0" wp14:anchorId="51C2D860" wp14:editId="3AF3A940">
+          <wp:inline distT="0" distB="0" distL="0" distR="0">
             <wp:extent cx="5497384" cy="2235200"/>
             <wp:effectExtent l="0" t="0" r="8255" b="0"/>
             <wp:docPr id="1" name="Picture 1"/>
@@ -927,15 +903,7 @@
         </w:r>
       </w:hyperlink>
       <w:r>
-        <w:t xml:space="preserve"> are frequency distributions of image or other data values. Histograms consist of </w:t>
-      </w:r>
-      <w:proofErr w:type="gramStart"/>
-      <w:r>
-        <w:t>a number of</w:t>
-      </w:r>
-      <w:proofErr w:type="gramEnd"/>
-      <w:r>
-        <w:t xml:space="preserve"> bins, where each bin contains counts for a range of values. This diagram shows how histograms are calculated.</w:t>
+        <w:t xml:space="preserve"> are frequency distributions of image or other data values. Histograms consist of a number of bins, where each bin contains counts for a range of values. This diagram shows how histograms are calculated.</w:t>
       </w:r>
     </w:p>
     <w:p>
@@ -1088,7 +1056,7 @@
         </w:rPr>
         <w:lastRenderedPageBreak/>
         <w:drawing>
-          <wp:inline distT="0" distB="0" distL="0" distR="0" wp14:anchorId="30B0D5F1" wp14:editId="0B0C424A">
+          <wp:inline distT="0" distB="0" distL="0" distR="0">
             <wp:extent cx="4210050" cy="3520070"/>
             <wp:effectExtent l="0" t="0" r="0" b="4445"/>
             <wp:docPr id="5" name="Picture 5"/>
@@ -1590,15 +1558,7 @@
         <w:sym w:font="Symbol" w:char="F0B0"/>
       </w:r>
       <w:r>
-        <w:t xml:space="preserve">, with a fixed increment between angles, is tested. The lines are </w:t>
-      </w:r>
-      <w:proofErr w:type="gramStart"/>
-      <w:r>
-        <w:t>counted</w:t>
-      </w:r>
-      <w:proofErr w:type="gramEnd"/>
-      <w:r>
-        <w:t xml:space="preserve"> and the most common ones correspond to the strongest lines in the image.</w:t>
+        <w:t>, with a fixed increment between angles, is tested. The lines are counted and the most common ones correspond to the strongest lines in the image.</w:t>
       </w:r>
     </w:p>
     <w:p>
@@ -1608,7 +1568,7 @@
         </w:rPr>
         <w:lastRenderedPageBreak/>
         <w:drawing>
-          <wp:inline distT="0" distB="0" distL="0" distR="0" wp14:anchorId="7057CC26" wp14:editId="733FC1A4">
+          <wp:inline distT="0" distB="0" distL="0" distR="0">
             <wp:extent cx="4570275" cy="3106420"/>
             <wp:effectExtent l="0" t="0" r="1905" b="0"/>
             <wp:docPr id="6" name="Picture 6"/>
@@ -1744,41 +1704,15 @@
         <w:fldChar w:fldCharType="end"/>
       </w:r>
       <w:r>
-        <w:t xml:space="preserve">. Image data saved as unsigned </w:t>
-      </w:r>
-      <w:proofErr w:type="gramStart"/>
-      <w:r>
-        <w:t>8 bit</w:t>
-      </w:r>
-      <w:proofErr w:type="gramEnd"/>
-      <w:r>
-        <w:t xml:space="preserve"> values can be visualized as a JPEG image. Much of the data is stored in signed integer for floating point format because the data values involved lie outside the unsigned </w:t>
-      </w:r>
-      <w:proofErr w:type="gramStart"/>
-      <w:r>
-        <w:t>8 bit</w:t>
-      </w:r>
-      <w:proofErr w:type="gramEnd"/>
-      <w:r>
-        <w:t xml:space="preserve"> range of 0 to 255. On saving data values outside the range of 0 to 255 in unsigned </w:t>
-      </w:r>
-      <w:proofErr w:type="gramStart"/>
-      <w:r>
-        <w:t>8 bit</w:t>
-      </w:r>
-      <w:proofErr w:type="gramEnd"/>
-      <w:r>
-        <w:t xml:space="preserve"> images, the exact value saved in undefined. Other data formats include tab-delimited text output that is viewable in Microsoft Excel or </w:t>
+        <w:t xml:space="preserve">. Image data saved as unsigned 8 bit values can be visualized as a JPEG image. Much of the data is stored in signed integer for floating point format because the data values involved lie outside the unsigned 8 bit range of 0 to 255. On saving data values outside the range of 0 to 255 in unsigned 8 bit images, the exact value saved in undefined. Other data formats include tab-delimited text output that is viewable in Microsoft Excel or </w:t>
       </w:r>
       <w:hyperlink r:id="rId17" w:history="1">
-        <w:proofErr w:type="spellStart"/>
         <w:r>
           <w:rPr>
             <w:rStyle w:val="Hyperlink"/>
           </w:rPr>
           <w:t>gnuplot</w:t>
         </w:r>
-        <w:proofErr w:type="spellEnd"/>
       </w:hyperlink>
       <w:r>
         <w:t>, for example.</w:t>
@@ -2264,15 +2198,7 @@
     </w:p>
     <w:p>
       <w:r>
-        <w:t xml:space="preserve">The binary image data file format has the following format. Color RGB pixels are stored as three consecutive pixel values, one for each component. The </w:t>
-      </w:r>
-      <w:proofErr w:type="gramStart"/>
-      <w:r>
-        <w:t>three pixel</w:t>
-      </w:r>
-      <w:proofErr w:type="gramEnd"/>
-      <w:r>
-        <w:t xml:space="preserve"> values represent the red, green, and blue components.</w:t>
+        <w:t>The binary image data file format has the following format. Color RGB pixels are stored as three consecutive pixel values, one for each component. The three pixel values represent the red, green, and blue components.</w:t>
       </w:r>
     </w:p>
     <w:tbl>
@@ -2642,15 +2568,7 @@
     </w:p>
     <w:p>
       <w:r>
-        <w:t xml:space="preserve">Histograms count the number of different values for any data type containing a range of values, such as images or Hough accumulators. The histogram bins correspond to a </w:t>
-      </w:r>
-      <w:proofErr w:type="gramStart"/>
-      <w:r>
-        <w:t>data values</w:t>
-      </w:r>
-      <w:proofErr w:type="gramEnd"/>
-      <w:r>
-        <w:t xml:space="preserve"> ranging from a lower to an upper value. The number of histogram bins </w:t>
+        <w:t xml:space="preserve">Histograms count the number of different values for any data type containing a range of values, such as images or Hough accumulators. The histogram bins correspond to a data values ranging from a lower to an upper value. The number of histogram bins </w:t>
       </w:r>
       <w:proofErr w:type="spellStart"/>
       <w:r>
@@ -2768,15 +2686,7 @@
         <w:pStyle w:val="code0"/>
       </w:pPr>
       <w:r>
-        <w:t xml:space="preserve">    bin = </w:t>
-      </w:r>
-      <w:proofErr w:type="gramStart"/>
-      <w:r>
-        <w:t>round(</w:t>
-      </w:r>
-      <w:proofErr w:type="gramEnd"/>
-      <w:r>
-        <w:t>(</w:t>
+        <w:t xml:space="preserve">    bin = round((</w:t>
       </w:r>
       <w:proofErr w:type="spellStart"/>
       <w:r>
@@ -2816,23 +2726,7 @@
         <w:pStyle w:val="Normalafterlist"/>
       </w:pPr>
       <w:r>
-        <w:t xml:space="preserve">The histogram data type format indicates how histogram data is stored. There are both binary and text stored histogram formats. Binary histogram files are used only within this software. Text histogram files may </w:t>
-      </w:r>
-      <w:proofErr w:type="gramStart"/>
-      <w:r>
-        <w:t>visualized</w:t>
-      </w:r>
-      <w:proofErr w:type="gramEnd"/>
-      <w:r>
-        <w:t xml:space="preserve"> with </w:t>
-      </w:r>
-      <w:proofErr w:type="spellStart"/>
-      <w:r>
-        <w:t>gnuplot</w:t>
-      </w:r>
-      <w:proofErr w:type="spellEnd"/>
-      <w:r>
-        <w:t xml:space="preserve"> or Microsoft Excel.</w:t>
+        <w:t>The histogram data type format indicates how histogram data is stored. There are both binary and text stored histogram formats. Binary histogram files are used only within this software. Text histogram files may visualized with gnuplot or Microsoft Excel.</w:t>
       </w:r>
     </w:p>
     <w:p>
@@ -3149,15 +3043,7 @@
     </w:p>
     <w:p>
       <w:r>
-        <w:t xml:space="preserve">Histogram text files are stored as input to display with </w:t>
-      </w:r>
-      <w:proofErr w:type="spellStart"/>
-      <w:r>
-        <w:t>gnuplot</w:t>
-      </w:r>
-      <w:proofErr w:type="spellEnd"/>
-      <w:r>
-        <w:t xml:space="preserve"> or import into Microsoft Excel. Two files are created. A data file </w:t>
+        <w:t xml:space="preserve">Histogram text files are stored as input to display with gnuplot or import into Microsoft Excel. Two files are created. A data file </w:t>
       </w:r>
       <w:r>
         <w:rPr>
@@ -3260,25 +3146,29 @@
     </w:p>
     <w:p>
       <w:r>
-        <w:t xml:space="preserve">A </w:t>
-      </w:r>
-      <w:proofErr w:type="spellStart"/>
-      <w:r>
-        <w:t>gnuplot</w:t>
-      </w:r>
-      <w:proofErr w:type="spellEnd"/>
-      <w:r>
-        <w:t xml:space="preserve"> script file </w:t>
+        <w:t xml:space="preserve">A gnuplot script file </w:t>
       </w:r>
       <w:r>
         <w:rPr>
           <w:i/>
           <w:iCs/>
         </w:rPr>
-        <w:t>output-filename.</w:t>
-      </w:r>
-      <w:r>
-        <w:t>gp is generated to display the histogram as:</w:t>
+        <w:t>output-</w:t>
+      </w:r>
+      <w:proofErr w:type="spellStart"/>
+      <w:r>
+        <w:rPr>
+          <w:i/>
+          <w:iCs/>
+        </w:rPr>
+        <w:t>filename.</w:t>
+      </w:r>
+      <w:r>
+        <w:t>gp</w:t>
+      </w:r>
+      <w:proofErr w:type="spellEnd"/>
+      <w:r>
+        <w:t xml:space="preserve"> is generated to display the histogram as:</w:t>
       </w:r>
     </w:p>
     <w:p>
@@ -3304,15 +3194,7 @@
         <w:t>output-filename</w:t>
       </w:r>
       <w:r>
-        <w:t xml:space="preserve">.txt' using </w:t>
-      </w:r>
-      <w:proofErr w:type="gramStart"/>
-      <w:r>
-        <w:t>2:xtic</w:t>
-      </w:r>
-      <w:proofErr w:type="gramEnd"/>
-      <w:r>
-        <w:t>(1)</w:t>
+        <w:t>.txt' using 2:xtic(1)</w:t>
       </w:r>
     </w:p>
     <w:p>
@@ -3333,32 +3215,21 @@
     </w:p>
     <w:p>
       <w:r>
-        <w:t xml:space="preserve">The script is run with this command, assuming </w:t>
+        <w:t>The script is run with this command, assuming gnuplot is installed:</w:t>
+      </w:r>
+    </w:p>
+    <w:p>
+      <w:pPr>
+        <w:pStyle w:val="code0"/>
+      </w:pPr>
+      <w:r>
+        <w:t xml:space="preserve">  $ gnuplot output-</w:t>
       </w:r>
       <w:proofErr w:type="spellStart"/>
       <w:r>
-        <w:t>gnuplot</w:t>
+        <w:t>filename.gp</w:t>
       </w:r>
       <w:proofErr w:type="spellEnd"/>
-      <w:r>
-        <w:t xml:space="preserve"> is installed:</w:t>
-      </w:r>
-    </w:p>
-    <w:p>
-      <w:pPr>
-        <w:pStyle w:val="code0"/>
-      </w:pPr>
-      <w:r>
-        <w:t xml:space="preserve">  $ </w:t>
-      </w:r>
-      <w:proofErr w:type="spellStart"/>
-      <w:r>
-        <w:t>gnuplot</w:t>
-      </w:r>
-      <w:proofErr w:type="spellEnd"/>
-      <w:r>
-        <w:t xml:space="preserve"> output-filename.gp</w:t>
-      </w:r>
     </w:p>
     <w:p>
       <w:pPr>
@@ -3647,18 +3518,7 @@
         <w:pStyle w:val="Normalafterlist"/>
       </w:pPr>
       <w:r>
-        <w:t xml:space="preserve">The number of rho values </w:t>
-      </w:r>
-      <w:proofErr w:type="spellStart"/>
-      <w:r>
-        <w:rPr>
-          <w:rStyle w:val="CodeChar"/>
-        </w:rPr>
-        <w:t>nrhos</w:t>
-      </w:r>
-      <w:proofErr w:type="spellEnd"/>
-      <w:r>
-        <w:t xml:space="preserve"> for images is:</w:t>
+        <w:t>The maximum of rho values for images is:</w:t>
       </w:r>
     </w:p>
     <w:p>
@@ -3671,7 +3531,7 @@
             <w:rPr>
               <w:rFonts w:ascii="Cambria Math" w:hAnsi="Cambria Math"/>
             </w:rPr>
-            <m:t xml:space="preserve">nrhos= </m:t>
+            <m:t xml:space="preserve">max_rhos= </m:t>
           </m:r>
           <m:rad>
             <m:radPr>
@@ -3753,8 +3613,102 @@
         <w:pStyle w:val="Normalafterlist"/>
       </w:pPr>
       <w:r>
-        <w:t xml:space="preserve">Each </w:t>
-      </w:r>
+        <w:t xml:space="preserve">The number of </w:t>
+      </w:r>
+      <w:r>
+        <w:t xml:space="preserve">sampled </w:t>
+      </w:r>
+      <w:r>
+        <w:t xml:space="preserve">rho values </w:t>
+      </w:r>
+      <w:proofErr w:type="spellStart"/>
+      <w:r>
+        <w:rPr>
+          <w:rStyle w:val="CodeChar"/>
+        </w:rPr>
+        <w:t>nrhos</w:t>
+      </w:r>
+      <w:proofErr w:type="spellEnd"/>
+      <w:r>
+        <w:t xml:space="preserve"> for images is</w:t>
+      </w:r>
+    </w:p>
+    <w:p>
+      <w:pPr>
+        <w:pStyle w:val="Normalafterlist"/>
+      </w:pPr>
+      <m:oMathPara>
+        <m:oMath>
+          <m:r>
+            <w:rPr>
+              <w:rFonts w:ascii="Cambria Math" w:hAnsi="Cambria Math"/>
+            </w:rPr>
+            <m:t>nr</m:t>
+          </m:r>
+          <m:r>
+            <w:rPr>
+              <w:rFonts w:ascii="Cambria Math" w:hAnsi="Cambria Math"/>
+            </w:rPr>
+            <m:t xml:space="preserve">hos= </m:t>
+          </m:r>
+          <m:f>
+            <m:fPr>
+              <m:ctrlPr>
+                <w:rPr>
+                  <w:rFonts w:ascii="Cambria Math" w:hAnsi="Cambria Math"/>
+                </w:rPr>
+              </m:ctrlPr>
+            </m:fPr>
+            <m:num>
+              <m:r>
+                <w:rPr>
+                  <w:rFonts w:ascii="Cambria Math" w:hAnsi="Cambria Math"/>
+                </w:rPr>
+                <m:t>max</m:t>
+              </m:r>
+              <m:r>
+                <w:rPr>
+                  <w:rFonts w:ascii="Cambria Math" w:hAnsi="Cambria Math"/>
+                </w:rPr>
+                <m:t>_rhos</m:t>
+              </m:r>
+            </m:num>
+            <m:den>
+              <m:sSub>
+                <m:sSubPr>
+                  <m:ctrlPr>
+                    <w:rPr>
+                      <w:rFonts w:ascii="Cambria Math" w:hAnsi="Cambria Math"/>
+                      <w:i/>
+                    </w:rPr>
+                  </m:ctrlPr>
+                </m:sSubPr>
+                <m:e>
+                  <m:r>
+                    <w:rPr>
+                      <w:rFonts w:ascii="Cambria Math" w:hAnsi="Cambria Math"/>
+                    </w:rPr>
+                    <m:t>rho</m:t>
+                  </m:r>
+                </m:e>
+                <m:sub>
+                  <m:r>
+                    <w:rPr>
+                      <w:rFonts w:ascii="Cambria Math" w:hAnsi="Cambria Math"/>
+                    </w:rPr>
+                    <m:t>inc</m:t>
+                  </m:r>
+                </m:sub>
+              </m:sSub>
+            </m:den>
+          </m:f>
+        </m:oMath>
+      </m:oMathPara>
+    </w:p>
+    <w:p>
+      <w:pPr>
+        <w:pStyle w:val="Normalafterlist"/>
+      </w:pPr>
       <w:r>
         <w:rPr>
           <w:rStyle w:val="CodeChar"/>
@@ -3782,58 +3736,22 @@
         <w:t>rho</w:t>
       </w:r>
       <w:r>
-        <w:t xml:space="preserve"> with the formulas:</w:t>
+        <w:t xml:space="preserve"> to the formula:</w:t>
       </w:r>
     </w:p>
     <w:p>
       <w:pPr>
         <w:pStyle w:val="code0"/>
-        <w:rPr>
-          <w:sz w:val="22"/>
-          <w:szCs w:val="22"/>
-        </w:rPr>
       </w:pPr>
       <m:oMathPara>
         <m:oMath>
-          <m:sSub>
-            <m:sSubPr>
-              <m:ctrlPr>
-                <w:rPr>
-                  <w:rFonts w:ascii="Cambria Math" w:hAnsi="Cambria Math"/>
-                  <w:i/>
-                  <w:sz w:val="22"/>
-                  <w:szCs w:val="22"/>
-                </w:rPr>
-              </m:ctrlPr>
-            </m:sSubPr>
-            <m:e>
-              <m:r>
-                <w:rPr>
-                  <w:rFonts w:ascii="Cambria Math" w:hAnsi="Cambria Math"/>
-                  <w:sz w:val="22"/>
-                  <w:szCs w:val="22"/>
-                </w:rPr>
-                <m:t>rho</m:t>
-              </m:r>
-            </m:e>
-            <m:sub>
-              <m:r>
-                <w:rPr>
-                  <w:rFonts w:ascii="Cambria Math" w:hAnsi="Cambria Math"/>
-                  <w:sz w:val="22"/>
-                  <w:szCs w:val="22"/>
-                </w:rPr>
-                <m:t>index</m:t>
-              </m:r>
-            </m:sub>
-          </m:sSub>
           <m:r>
             <w:rPr>
               <w:rFonts w:ascii="Cambria Math" w:hAnsi="Cambria Math"/>
               <w:sz w:val="22"/>
               <w:szCs w:val="22"/>
             </w:rPr>
-            <m:t>= rho+</m:t>
+            <m:t>rho+</m:t>
           </m:r>
           <m:f>
             <m:fPr>
@@ -3853,7 +3771,23 @@
                   <w:sz w:val="22"/>
                   <w:szCs w:val="22"/>
                 </w:rPr>
-                <m:t>nrhos</m:t>
+                <m:t>max</m:t>
+              </m:r>
+              <m:r>
+                <w:rPr>
+                  <w:rFonts w:ascii="Cambria Math" w:hAnsi="Cambria Math"/>
+                  <w:sz w:val="22"/>
+                  <w:szCs w:val="22"/>
+                </w:rPr>
+                <m:t>_</m:t>
+              </m:r>
+              <m:r>
+                <w:rPr>
+                  <w:rFonts w:ascii="Cambria Math" w:hAnsi="Cambria Math"/>
+                  <w:sz w:val="22"/>
+                  <w:szCs w:val="22"/>
+                </w:rPr>
+                <m:t>rho</m:t>
               </m:r>
             </m:num>
             <m:den>
@@ -3867,31 +3801,13 @@
               </m:r>
             </m:den>
           </m:f>
-        </m:oMath>
-      </m:oMathPara>
-    </w:p>
-    <w:p>
-      <w:pPr>
-        <w:pStyle w:val="code0"/>
-        <w:rPr>
-          <w:sz w:val="22"/>
-          <w:szCs w:val="22"/>
-        </w:rPr>
-      </w:pPr>
-    </w:p>
-    <w:p>
-      <w:pPr>
-        <w:pStyle w:val="code0"/>
-      </w:pPr>
-      <m:oMathPara>
-        <m:oMath>
           <m:r>
             <w:rPr>
               <w:rFonts w:ascii="Cambria Math" w:hAnsi="Cambria Math"/>
               <w:sz w:val="22"/>
               <w:szCs w:val="22"/>
             </w:rPr>
-            <m:t xml:space="preserve">rho= </m:t>
+            <m:t xml:space="preserve">= </m:t>
           </m:r>
           <m:sSub>
             <m:sSubPr>
@@ -3925,16 +3841,8 @@
               </m:r>
             </m:sub>
           </m:sSub>
-          <m:r>
-            <w:rPr>
-              <w:rFonts w:ascii="Cambria Math" w:hAnsi="Cambria Math"/>
-              <w:sz w:val="22"/>
-              <w:szCs w:val="22"/>
-            </w:rPr>
-            <m:t>-</m:t>
-          </m:r>
-          <m:f>
-            <m:fPr>
+          <m:sSub>
+            <m:sSubPr>
               <m:ctrlPr>
                 <w:rPr>
                   <w:rFonts w:ascii="Cambria Math" w:hAnsi="Cambria Math"/>
@@ -3943,28 +3851,36 @@
                   <w:szCs w:val="22"/>
                 </w:rPr>
               </m:ctrlPr>
-            </m:fPr>
-            <m:num>
+            </m:sSubPr>
+            <m:e>
               <m:r>
                 <w:rPr>
                   <w:rFonts w:ascii="Cambria Math" w:hAnsi="Cambria Math"/>
                   <w:sz w:val="22"/>
                   <w:szCs w:val="22"/>
                 </w:rPr>
-                <m:t>nrhos</m:t>
+                <m:t>rho</m:t>
               </m:r>
-            </m:num>
-            <m:den>
+            </m:e>
+            <m:sub>
               <m:r>
                 <w:rPr>
                   <w:rFonts w:ascii="Cambria Math" w:hAnsi="Cambria Math"/>
                   <w:sz w:val="22"/>
                   <w:szCs w:val="22"/>
                 </w:rPr>
-                <m:t>2</m:t>
+                <m:t>in</m:t>
               </m:r>
-            </m:den>
-          </m:f>
+              <m:r>
+                <w:rPr>
+                  <w:rFonts w:ascii="Cambria Math" w:hAnsi="Cambria Math"/>
+                  <w:sz w:val="22"/>
+                  <w:szCs w:val="22"/>
+                </w:rPr>
+                <m:t>c</m:t>
+              </m:r>
+            </m:sub>
+          </m:sSub>
         </m:oMath>
       </m:oMathPara>
     </w:p>
@@ -4462,13 +4378,15 @@
                 <w:bCs w:val="0"/>
               </w:rPr>
             </w:pPr>
-            <w:r>
-              <w:rPr>
-                <w:b w:val="0"/>
-                <w:bCs w:val="0"/>
-              </w:rPr>
-              <w:t>rows</w:t>
-            </w:r>
+            <w:proofErr w:type="spellStart"/>
+            <w:r>
+              <w:rPr>
+                <w:b w:val="0"/>
+                <w:bCs w:val="0"/>
+              </w:rPr>
+              <w:t>rho_inc</w:t>
+            </w:r>
+            <w:proofErr w:type="spellEnd"/>
           </w:p>
         </w:tc>
         <w:tc>
@@ -4495,7 +4413,10 @@
               <w:cnfStyle w:val="000000000000" w:firstRow="0" w:lastRow="0" w:firstColumn="0" w:lastColumn="0" w:oddVBand="0" w:evenVBand="0" w:oddHBand="0" w:evenHBand="0" w:firstRowFirstColumn="0" w:firstRowLastColumn="0" w:lastRowFirstColumn="0" w:lastRowLastColumn="0"/>
             </w:pPr>
             <w:r>
-              <w:t>The number of rows in the image used to create the accumulator</w:t>
+              <w:t xml:space="preserve">The increment between sampled </w:t>
+            </w:r>
+            <w:r>
+              <w:t>polar line distances</w:t>
             </w:r>
           </w:p>
         </w:tc>
@@ -4522,6 +4443,58 @@
                 <w:b w:val="0"/>
                 <w:bCs w:val="0"/>
               </w:rPr>
+              <w:t>rows</w:t>
+            </w:r>
+          </w:p>
+        </w:tc>
+        <w:tc>
+          <w:tcPr>
+            <w:tcW w:w="0" w:type="auto"/>
+          </w:tcPr>
+          <w:p>
+            <w:pPr>
+              <w:pStyle w:val="NoSpacing"/>
+              <w:cnfStyle w:val="000000100000" w:firstRow="0" w:lastRow="0" w:firstColumn="0" w:lastColumn="0" w:oddVBand="0" w:evenVBand="0" w:oddHBand="1" w:evenHBand="0" w:firstRowFirstColumn="0" w:firstRowLastColumn="0" w:lastRowFirstColumn="0" w:lastRowLastColumn="0"/>
+            </w:pPr>
+            <w:r>
+              <w:t>32-bit integer</w:t>
+            </w:r>
+          </w:p>
+        </w:tc>
+        <w:tc>
+          <w:tcPr>
+            <w:tcW w:w="0" w:type="auto"/>
+          </w:tcPr>
+          <w:p>
+            <w:pPr>
+              <w:pStyle w:val="NoSpacing"/>
+              <w:cnfStyle w:val="000000100000" w:firstRow="0" w:lastRow="0" w:firstColumn="0" w:lastColumn="0" w:oddVBand="0" w:evenVBand="0" w:oddHBand="1" w:evenHBand="0" w:firstRowFirstColumn="0" w:firstRowLastColumn="0" w:lastRowFirstColumn="0" w:lastRowLastColumn="0"/>
+            </w:pPr>
+            <w:r>
+              <w:t>The number of rows in the image used to create the accumulator</w:t>
+            </w:r>
+          </w:p>
+        </w:tc>
+      </w:tr>
+      <w:tr>
+        <w:tc>
+          <w:tcPr>
+            <w:cnfStyle w:val="001000000000" w:firstRow="0" w:lastRow="0" w:firstColumn="1" w:lastColumn="0" w:oddVBand="0" w:evenVBand="0" w:oddHBand="0" w:evenHBand="0" w:firstRowFirstColumn="0" w:firstRowLastColumn="0" w:lastRowFirstColumn="0" w:lastRowLastColumn="0"/>
+            <w:tcW w:w="0" w:type="auto"/>
+          </w:tcPr>
+          <w:p>
+            <w:pPr>
+              <w:pStyle w:val="NoSpacing"/>
+              <w:rPr>
+                <w:b w:val="0"/>
+                <w:bCs w:val="0"/>
+              </w:rPr>
+            </w:pPr>
+            <w:r>
+              <w:rPr>
+                <w:b w:val="0"/>
+                <w:bCs w:val="0"/>
+              </w:rPr>
               <w:t>cols</w:t>
             </w:r>
           </w:p>
@@ -4533,10 +4506,93 @@
           <w:p>
             <w:pPr>
               <w:pStyle w:val="NoSpacing"/>
+              <w:cnfStyle w:val="000000000000" w:firstRow="0" w:lastRow="0" w:firstColumn="0" w:lastColumn="0" w:oddVBand="0" w:evenVBand="0" w:oddHBand="0" w:evenHBand="0" w:firstRowFirstColumn="0" w:firstRowLastColumn="0" w:lastRowFirstColumn="0" w:lastRowLastColumn="0"/>
+            </w:pPr>
+            <w:r>
+              <w:t>32-bit integer</w:t>
+            </w:r>
+          </w:p>
+        </w:tc>
+        <w:tc>
+          <w:tcPr>
+            <w:tcW w:w="0" w:type="auto"/>
+          </w:tcPr>
+          <w:p>
+            <w:pPr>
+              <w:pStyle w:val="NoSpacing"/>
+              <w:cnfStyle w:val="000000000000" w:firstRow="0" w:lastRow="0" w:firstColumn="0" w:lastColumn="0" w:oddVBand="0" w:evenVBand="0" w:oddHBand="0" w:evenHBand="0" w:firstRowFirstColumn="0" w:firstRowLastColumn="0" w:lastRowFirstColumn="0" w:lastRowLastColumn="0"/>
+            </w:pPr>
+            <w:r>
+              <w:t>The number of columns in the image used to create the accumulator</w:t>
+            </w:r>
+          </w:p>
+        </w:tc>
+      </w:tr>
+      <w:tr>
+        <w:trPr>
+          <w:cnfStyle w:val="000000100000" w:firstRow="0" w:lastRow="0" w:firstColumn="0" w:lastColumn="0" w:oddVBand="0" w:evenVBand="0" w:oddHBand="1" w:evenHBand="0" w:firstRowFirstColumn="0" w:firstRowLastColumn="0" w:lastRowFirstColumn="0" w:lastRowLastColumn="0"/>
+        </w:trPr>
+        <w:tc>
+          <w:tcPr>
+            <w:cnfStyle w:val="001000000000" w:firstRow="0" w:lastRow="0" w:firstColumn="1" w:lastColumn="0" w:oddVBand="0" w:evenVBand="0" w:oddHBand="0" w:evenHBand="0" w:firstRowFirstColumn="0" w:firstRowLastColumn="0" w:lastRowFirstColumn="0" w:lastRowLastColumn="0"/>
+            <w:tcW w:w="0" w:type="auto"/>
+          </w:tcPr>
+          <w:p>
+            <w:pPr>
+              <w:pStyle w:val="NoSpacing"/>
+              <w:rPr>
+                <w:b w:val="0"/>
+                <w:bCs w:val="0"/>
+              </w:rPr>
+            </w:pPr>
+            <w:proofErr w:type="spellStart"/>
+            <w:r>
+              <w:rPr>
+                <w:b w:val="0"/>
+                <w:bCs w:val="0"/>
+              </w:rPr>
+              <w:t>hough</w:t>
+            </w:r>
+            <w:proofErr w:type="spellEnd"/>
+            <w:r>
+              <w:rPr>
+                <w:b w:val="0"/>
+                <w:bCs w:val="0"/>
+              </w:rPr>
+              <w:t xml:space="preserve"> accumulator data</w:t>
+            </w:r>
+          </w:p>
+        </w:tc>
+        <w:tc>
+          <w:tcPr>
+            <w:tcW w:w="0" w:type="auto"/>
+          </w:tcPr>
+          <w:p>
+            <w:pPr>
+              <w:pStyle w:val="NoSpacing"/>
               <w:cnfStyle w:val="000000100000" w:firstRow="0" w:lastRow="0" w:firstColumn="0" w:lastColumn="0" w:oddVBand="0" w:evenVBand="0" w:oddHBand="1" w:evenHBand="0" w:firstRowFirstColumn="0" w:firstRowLastColumn="0" w:lastRowFirstColumn="0" w:lastRowLastColumn="0"/>
             </w:pPr>
-            <w:r>
-              <w:t>32-bit integer</w:t>
+            <w:proofErr w:type="spellStart"/>
+            <w:r>
+              <w:rPr>
+                <w:rStyle w:val="CodeChar"/>
+              </w:rPr>
+              <w:t>nrhos</w:t>
+            </w:r>
+            <w:proofErr w:type="spellEnd"/>
+            <w:r>
+              <w:t xml:space="preserve"> * </w:t>
+            </w:r>
+            <w:proofErr w:type="spellStart"/>
+            <w:r>
+              <w:rPr>
+                <w:rStyle w:val="CodeChar"/>
+              </w:rPr>
+              <w:t>nthetas</w:t>
+            </w:r>
+            <w:proofErr w:type="spellEnd"/>
+            <w:r>
+              <w:t xml:space="preserve"> 32-bit integers</w:t>
             </w:r>
           </w:p>
         </w:tc>
@@ -4548,86 +4604,6 @@
             <w:pPr>
               <w:pStyle w:val="NoSpacing"/>
               <w:cnfStyle w:val="000000100000" w:firstRow="0" w:lastRow="0" w:firstColumn="0" w:lastColumn="0" w:oddVBand="0" w:evenVBand="0" w:oddHBand="1" w:evenHBand="0" w:firstRowFirstColumn="0" w:firstRowLastColumn="0" w:lastRowFirstColumn="0" w:lastRowLastColumn="0"/>
-            </w:pPr>
-            <w:r>
-              <w:t>The number of columns in the image used to create the accumulator</w:t>
-            </w:r>
-          </w:p>
-        </w:tc>
-      </w:tr>
-      <w:tr>
-        <w:tc>
-          <w:tcPr>
-            <w:cnfStyle w:val="001000000000" w:firstRow="0" w:lastRow="0" w:firstColumn="1" w:lastColumn="0" w:oddVBand="0" w:evenVBand="0" w:oddHBand="0" w:evenHBand="0" w:firstRowFirstColumn="0" w:firstRowLastColumn="0" w:lastRowFirstColumn="0" w:lastRowLastColumn="0"/>
-            <w:tcW w:w="0" w:type="auto"/>
-          </w:tcPr>
-          <w:p>
-            <w:pPr>
-              <w:pStyle w:val="NoSpacing"/>
-              <w:rPr>
-                <w:b w:val="0"/>
-                <w:bCs w:val="0"/>
-              </w:rPr>
-            </w:pPr>
-            <w:proofErr w:type="spellStart"/>
-            <w:r>
-              <w:rPr>
-                <w:b w:val="0"/>
-                <w:bCs w:val="0"/>
-              </w:rPr>
-              <w:t>hough</w:t>
-            </w:r>
-            <w:proofErr w:type="spellEnd"/>
-            <w:r>
-              <w:rPr>
-                <w:b w:val="0"/>
-                <w:bCs w:val="0"/>
-              </w:rPr>
-              <w:t xml:space="preserve"> accumulator data</w:t>
-            </w:r>
-          </w:p>
-        </w:tc>
-        <w:tc>
-          <w:tcPr>
-            <w:tcW w:w="0" w:type="auto"/>
-          </w:tcPr>
-          <w:p>
-            <w:pPr>
-              <w:pStyle w:val="NoSpacing"/>
-              <w:cnfStyle w:val="000000000000" w:firstRow="0" w:lastRow="0" w:firstColumn="0" w:lastColumn="0" w:oddVBand="0" w:evenVBand="0" w:oddHBand="0" w:evenHBand="0" w:firstRowFirstColumn="0" w:firstRowLastColumn="0" w:lastRowFirstColumn="0" w:lastRowLastColumn="0"/>
-            </w:pPr>
-            <w:proofErr w:type="spellStart"/>
-            <w:r>
-              <w:rPr>
-                <w:rStyle w:val="CodeChar"/>
-              </w:rPr>
-              <w:t>nrhos</w:t>
-            </w:r>
-            <w:proofErr w:type="spellEnd"/>
-            <w:r>
-              <w:t xml:space="preserve"> * </w:t>
-            </w:r>
-            <w:proofErr w:type="spellStart"/>
-            <w:r>
-              <w:rPr>
-                <w:rStyle w:val="CodeChar"/>
-              </w:rPr>
-              <w:t>nthetas</w:t>
-            </w:r>
-            <w:proofErr w:type="spellEnd"/>
-            <w:r>
-              <w:t xml:space="preserve"> 32-bit integers</w:t>
-            </w:r>
-          </w:p>
-        </w:tc>
-        <w:tc>
-          <w:tcPr>
-            <w:tcW w:w="0" w:type="auto"/>
-          </w:tcPr>
-          <w:p>
-            <w:pPr>
-              <w:pStyle w:val="NoSpacing"/>
-              <w:cnfStyle w:val="000000000000" w:firstRow="0" w:lastRow="0" w:firstColumn="0" w:lastColumn="0" w:oddVBand="0" w:evenVBand="0" w:oddHBand="0" w:evenHBand="0" w:firstRowFirstColumn="0" w:firstRowLastColumn="0" w:lastRowFirstColumn="0" w:lastRowLastColumn="0"/>
             </w:pPr>
             <w:r>
               <w:t>The Hough accumulator (</w:t>
@@ -4696,6 +4672,7 @@
           </w:tcPr>
           <w:p>
             <w:r>
+              <w:lastRenderedPageBreak/>
               <w:t>first line:</w:t>
             </w:r>
           </w:p>
@@ -4788,7 +4765,6 @@
       </w:pPr>
       <w:bookmarkStart w:id="4" w:name="_Ref110426442"/>
       <w:r>
-        <w:lastRenderedPageBreak/>
         <w:t xml:space="preserve">Hough peak line data type </w:t>
       </w:r>
       <w:bookmarkEnd w:id="4"/>
@@ -4841,13 +4817,8 @@
         </w:rPr>
       </w:pPr>
       <w:r>
-        <w:t xml:space="preserve">the accumulator </w:t>
-      </w:r>
-      <w:proofErr w:type="gramStart"/>
-      <w:r>
-        <w:t>count</w:t>
-      </w:r>
-      <w:proofErr w:type="gramEnd"/>
+        <w:t>the accumulator count</w:t>
+      </w:r>
     </w:p>
     <w:p>
       <w:pPr>
@@ -5297,13 +5268,8 @@
       </w:pPr>
       <w:r>
         <w:tab/>
-        <w:t xml:space="preserve">      </w:t>
-      </w:r>
-      <w:proofErr w:type="gramStart"/>
-      <w:r>
-        <w:t>additional-steps</w:t>
-      </w:r>
-      <w:proofErr w:type="gramEnd"/>
+        <w:t xml:space="preserve">      additional-steps</w:t>
+      </w:r>
     </w:p>
     <w:p>
       <w:pPr>
@@ -5325,6 +5291,7 @@
         <w:pStyle w:val="Code"/>
       </w:pPr>
       <w:r>
+        <w:lastRenderedPageBreak/>
         <w:tab/>
         <w:t xml:space="preserve">  }</w:t>
       </w:r>
@@ -5361,7 +5328,6 @@
         <w:pStyle w:val="Code"/>
       </w:pPr>
       <w:r>
-        <w:lastRenderedPageBreak/>
         <w:tab/>
         <w:t>{</w:t>
       </w:r>
@@ -5410,15 +5376,7 @@
       </w:pPr>
       <w:r>
         <w:tab/>
-        <w:t xml:space="preserve">  “</w:t>
-      </w:r>
-      <w:proofErr w:type="gramStart"/>
-      <w:r>
-        <w:t>input</w:t>
-      </w:r>
-      <w:proofErr w:type="gramEnd"/>
-      <w:r>
-        <w:t>-data”: [</w:t>
+        <w:t xml:space="preserve">  “input-data”: [</w:t>
       </w:r>
     </w:p>
     <w:p>
@@ -5456,15 +5414,7 @@
       </w:pPr>
       <w:r>
         <w:tab/>
-        <w:t xml:space="preserve">  “</w:t>
-      </w:r>
-      <w:proofErr w:type="gramStart"/>
-      <w:r>
-        <w:t>output</w:t>
-      </w:r>
-      <w:proofErr w:type="gramEnd"/>
-      <w:r>
-        <w:t>-data”: [</w:t>
+        <w:t xml:space="preserve">  “output-data”: [</w:t>
       </w:r>
     </w:p>
     <w:p>
@@ -5610,7 +5560,6 @@
         <w:tab/>
         <w:t xml:space="preserve">  "type": "</w:t>
       </w:r>
-      <w:proofErr w:type="gramStart"/>
       <w:r>
         <w:rPr>
           <w:i/>
@@ -5618,7 +5567,6 @@
         </w:rPr>
         <w:t>data-type</w:t>
       </w:r>
-      <w:proofErr w:type="gramEnd"/>
       <w:r>
         <w:t>,</w:t>
       </w:r>
@@ -5712,15 +5660,7 @@
         <w:pStyle w:val="Code"/>
       </w:pPr>
       <w:r>
-        <w:t xml:space="preserve">          "</w:t>
-      </w:r>
-      <w:proofErr w:type="gramStart"/>
-      <w:r>
-        <w:t>parameter</w:t>
-      </w:r>
-      <w:proofErr w:type="gramEnd"/>
-      <w:r>
-        <w:t>-name": "value"</w:t>
+        <w:t xml:space="preserve">          "parameter-name": "value"</w:t>
       </w:r>
     </w:p>
     <w:p>
@@ -5750,7 +5690,6 @@
       <w:r>
         <w:t xml:space="preserve">The </w:t>
       </w:r>
-      <w:proofErr w:type="gramStart"/>
       <w:r>
         <w:rPr>
           <w:i/>
@@ -5758,7 +5697,6 @@
         </w:rPr>
         <w:t>data-type</w:t>
       </w:r>
-      <w:proofErr w:type="gramEnd"/>
       <w:r>
         <w:t xml:space="preserve"> describes the type of input or output object used by an image operator as described in section </w:t>
       </w:r>
@@ -5817,13 +5755,8 @@
             <w:pPr>
               <w:cnfStyle w:val="100000000000" w:firstRow="1" w:lastRow="0" w:firstColumn="0" w:lastColumn="0" w:oddVBand="0" w:evenVBand="0" w:oddHBand="0" w:evenHBand="0" w:firstRowFirstColumn="0" w:firstRowLastColumn="0" w:lastRowFirstColumn="0" w:lastRowLastColumn="0"/>
             </w:pPr>
-            <w:proofErr w:type="gramStart"/>
-            <w:r>
-              <w:t>data-type</w:t>
-            </w:r>
-            <w:proofErr w:type="gramEnd"/>
-            <w:r>
-              <w:t xml:space="preserve"> </w:t>
+            <w:r>
+              <w:t xml:space="preserve">data-type </w:t>
             </w:r>
           </w:p>
         </w:tc>
@@ -5906,6 +5839,7 @@
               <w:cnfStyle w:val="000000100000" w:firstRow="0" w:lastRow="0" w:firstColumn="0" w:lastColumn="0" w:oddVBand="0" w:evenVBand="0" w:oddHBand="1" w:evenHBand="0" w:firstRowFirstColumn="0" w:firstRowLastColumn="0" w:lastRowFirstColumn="0" w:lastRowLastColumn="0"/>
             </w:pPr>
             <w:r>
+              <w:lastRenderedPageBreak/>
               <w:t>CV_32S pixels are signed 32-bit integer pixels</w:t>
             </w:r>
           </w:p>
@@ -5938,6 +5872,7 @@
                 <w:b w:val="0"/>
                 <w:bCs w:val="0"/>
               </w:rPr>
+              <w:lastRenderedPageBreak/>
               <w:t>Histogram</w:t>
             </w:r>
           </w:p>
@@ -5990,7 +5925,6 @@
                 <w:b w:val="0"/>
                 <w:bCs w:val="0"/>
               </w:rPr>
-              <w:lastRenderedPageBreak/>
               <w:t>Hough accumulator data</w:t>
             </w:r>
           </w:p>
@@ -6100,15 +6034,7 @@
         <w:t>data-format</w:t>
       </w:r>
       <w:r>
-        <w:t xml:space="preserve"> is how an object of a data typed is stored on the filesystem. Tab-delimited text data can be displayed using Microsoft Excel or </w:t>
-      </w:r>
-      <w:proofErr w:type="spellStart"/>
-      <w:r>
-        <w:t>gnuplot</w:t>
-      </w:r>
-      <w:proofErr w:type="spellEnd"/>
-      <w:r>
-        <w:t>.</w:t>
+        <w:t xml:space="preserve"> is how an object of a data typed is stored on the filesystem. Tab-delimited text data can be displayed using Microsoft Excel or gnuplot.</w:t>
       </w:r>
     </w:p>
     <w:tbl>
@@ -6578,21 +6504,12 @@
               <w:t>“</w:t>
             </w:r>
             <w:proofErr w:type="spellStart"/>
-            <w:proofErr w:type="gramStart"/>
-            <w:r>
-              <w:rPr>
-                <w:b w:val="0"/>
-                <w:bCs w:val="0"/>
-              </w:rPr>
-              <w:t>berkeley</w:t>
-            </w:r>
-            <w:proofErr w:type="gramEnd"/>
-            <w:r>
-              <w:rPr>
-                <w:b w:val="0"/>
-                <w:bCs w:val="0"/>
-              </w:rPr>
-              <w:t>_db</w:t>
+            <w:r>
+              <w:rPr>
+                <w:b w:val="0"/>
+                <w:bCs w:val="0"/>
+              </w:rPr>
+              <w:t>berkeley_db</w:t>
             </w:r>
             <w:proofErr w:type="spellEnd"/>
             <w:r>
@@ -6728,7 +6645,6 @@
       <w:r>
         <w:t xml:space="preserve">      "type": "</w:t>
       </w:r>
-      <w:proofErr w:type="gramStart"/>
       <w:r>
         <w:rPr>
           <w:i/>
@@ -6736,7 +6652,6 @@
         </w:rPr>
         <w:t>data-type</w:t>
       </w:r>
-      <w:proofErr w:type="gramEnd"/>
       <w:r>
         <w:t>",</w:t>
       </w:r>
@@ -6870,7 +6785,11 @@
         <w:t>-extension</w:t>
       </w:r>
       <w:r>
-        <w:t>". The extension may default to specific values for certain operations, such as that the default extension for image JPEG data is “jpg”.</w:t>
+        <w:t xml:space="preserve">". The </w:t>
+      </w:r>
+      <w:r>
+        <w:lastRenderedPageBreak/>
+        <w:t>extension may default to specific values for certain operations, such as that the default extension for image JPEG data is “jpg”.</w:t>
       </w:r>
     </w:p>
     <w:p>
@@ -6878,21 +6797,12 @@
         <w:pStyle w:val="Heading2"/>
       </w:pPr>
       <w:r>
-        <w:lastRenderedPageBreak/>
         <w:t>Script run results logging</w:t>
       </w:r>
     </w:p>
     <w:p>
       <w:r>
-        <w:t xml:space="preserve">Scripts run results are saved with the original experiment run JSON text file </w:t>
-      </w:r>
-      <w:proofErr w:type="gramStart"/>
-      <w:r>
-        <w:t>into  a</w:t>
-      </w:r>
-      <w:proofErr w:type="gramEnd"/>
-      <w:r>
-        <w:t xml:space="preserve"> log file. Results are logged into different levels of the script. The format in which results are added to the top-level of the experiment script follows. The log results are added at the end of each </w:t>
+        <w:t xml:space="preserve">Scripts run results are saved with the original experiment run JSON text file into  a log file. Results are logged into different levels of the script. The format in which results are added to the top-level of the experiment script follows. The log results are added at the end of each </w:t>
       </w:r>
       <w:r>
         <w:rPr>
@@ -6928,15 +6838,7 @@
       </w:pPr>
       <w:r>
         <w:tab/>
-        <w:t xml:space="preserve">    “run</w:t>
-      </w:r>
-      <w:proofErr w:type="gramStart"/>
-      <w:r>
-        <w:t>” :</w:t>
-      </w:r>
-      <w:proofErr w:type="gramEnd"/>
-      <w:r>
-        <w:t xml:space="preserve"> {</w:t>
+        <w:t xml:space="preserve">    “run” : {</w:t>
       </w:r>
     </w:p>
     <w:p>
@@ -6945,15 +6847,7 @@
       </w:pPr>
       <w:r>
         <w:tab/>
-        <w:t xml:space="preserve">        “</w:t>
-      </w:r>
-      <w:proofErr w:type="gramStart"/>
-      <w:r>
-        <w:t>script</w:t>
-      </w:r>
-      <w:proofErr w:type="gramEnd"/>
-      <w:r>
-        <w:t>-path”: “</w:t>
+        <w:t xml:space="preserve">        “script-path”: “</w:t>
       </w:r>
       <w:r>
         <w:rPr>
@@ -7179,7 +7073,6 @@
         <w:tab/>
         <w:t xml:space="preserve">      </w:t>
       </w:r>
-      <w:proofErr w:type="gramStart"/>
       <w:r>
         <w:rPr>
           <w:i/>
@@ -7187,7 +7080,6 @@
         </w:rPr>
         <w:t>additional-steps</w:t>
       </w:r>
-      <w:proofErr w:type="gramEnd"/>
     </w:p>
     <w:p>
       <w:pPr>
@@ -7320,28 +7212,15 @@
         <w:pStyle w:val="Code"/>
       </w:pPr>
       <w:r>
-        <w:t xml:space="preserve">    "run</w:t>
-      </w:r>
-      <w:proofErr w:type="gramStart"/>
-      <w:r>
-        <w:t>":{</w:t>
-      </w:r>
-      <w:proofErr w:type="gramEnd"/>
+        <w:t xml:space="preserve">    "run":{</w:t>
+      </w:r>
     </w:p>
     <w:p>
       <w:pPr>
         <w:pStyle w:val="Code"/>
       </w:pPr>
       <w:r>
-        <w:t xml:space="preserve">      "</w:t>
-      </w:r>
-      <w:proofErr w:type="gramStart"/>
-      <w:r>
-        <w:t>script</w:t>
-      </w:r>
-      <w:proofErr w:type="gramEnd"/>
-      <w:r>
-        <w:t>-path":"</w:t>
+        <w:t xml:space="preserve">      "script-path":"</w:t>
       </w:r>
       <w:proofErr w:type="spellStart"/>
       <w:r>
@@ -7501,15 +7380,7 @@
       </w:pPr>
       <w:r>
         <w:tab/>
-        <w:t xml:space="preserve">  “</w:t>
-      </w:r>
-      <w:proofErr w:type="gramStart"/>
-      <w:r>
-        <w:t>input</w:t>
-      </w:r>
-      <w:proofErr w:type="gramEnd"/>
-      <w:r>
-        <w:t>-data”: [</w:t>
+        <w:t xml:space="preserve">  “input-data”: [</w:t>
       </w:r>
     </w:p>
     <w:p>
@@ -7547,15 +7418,7 @@
       </w:pPr>
       <w:r>
         <w:tab/>
-        <w:t xml:space="preserve">  “</w:t>
-      </w:r>
-      <w:proofErr w:type="gramStart"/>
-      <w:r>
-        <w:t>output</w:t>
-      </w:r>
-      <w:proofErr w:type="gramEnd"/>
-      <w:r>
-        <w:t>-data”: [</w:t>
+        <w:t xml:space="preserve">  “output-data”: [</w:t>
       </w:r>
     </w:p>
     <w:p>
@@ -7695,15 +7558,8 @@
         <w:pStyle w:val="Code"/>
       </w:pPr>
       <w:r>
-        <w:t xml:space="preserve">  “</w:t>
-      </w:r>
-      <w:proofErr w:type="gramStart"/>
-      <w:r>
-        <w:t>module</w:t>
-      </w:r>
-      <w:proofErr w:type="gramEnd"/>
-      <w:r>
-        <w:t>-id”: “error-message”</w:t>
+        <w:lastRenderedPageBreak/>
+        <w:t xml:space="preserve">  “module-id”: “error-message”</w:t>
       </w:r>
     </w:p>
     <w:p>
@@ -7711,7 +7567,6 @@
         <w:pStyle w:val="Normalafterlist"/>
       </w:pPr>
       <w:r>
-        <w:lastRenderedPageBreak/>
         <w:t xml:space="preserve">where </w:t>
       </w:r>
       <w:r>
@@ -7866,15 +7721,7 @@
         <w:pStyle w:val="code0"/>
       </w:pPr>
       <w:r>
-        <w:t xml:space="preserve">  </w:t>
-      </w:r>
-      <w:proofErr w:type="gramStart"/>
-      <w:r>
-        <w:t>$ .</w:t>
-      </w:r>
-      <w:proofErr w:type="gramEnd"/>
-      <w:r>
-        <w:t xml:space="preserve">/cv-workbench </w:t>
+        <w:t xml:space="preserve">  $ ./cv-workbench </w:t>
       </w:r>
       <w:r>
         <w:rPr>
@@ -8000,15 +7847,7 @@
       </w:pPr>
       <w:r>
         <w:tab/>
-        <w:t xml:space="preserve">  "</w:t>
-      </w:r>
-      <w:proofErr w:type="gramStart"/>
-      <w:r>
-        <w:t>input</w:t>
-      </w:r>
-      <w:proofErr w:type="gramEnd"/>
-      <w:r>
-        <w:t>-data": [</w:t>
+        <w:t xml:space="preserve">  "input-data": [</w:t>
       </w:r>
     </w:p>
     <w:p>
@@ -8115,15 +7954,7 @@
       </w:pPr>
       <w:r>
         <w:tab/>
-        <w:t xml:space="preserve">  "</w:t>
-      </w:r>
-      <w:proofErr w:type="gramStart"/>
-      <w:r>
-        <w:t>output</w:t>
-      </w:r>
-      <w:proofErr w:type="gramEnd"/>
-      <w:r>
-        <w:t>-data": [</w:t>
+        <w:t xml:space="preserve">  "output-data": [</w:t>
       </w:r>
     </w:p>
     <w:p>
@@ -8247,6 +8078,7 @@
         <w:pStyle w:val="Code"/>
       </w:pPr>
       <w:r>
+        <w:lastRenderedPageBreak/>
         <w:tab/>
         <w:t xml:space="preserve">  }</w:t>
       </w:r>
@@ -8271,7 +8103,6 @@
         <w:pStyle w:val="Normalafterlist"/>
       </w:pPr>
       <w:r>
-        <w:lastRenderedPageBreak/>
         <w:t>The significant elements of the script are:</w:t>
       </w:r>
     </w:p>
@@ -8423,23 +8254,7 @@
                 <w:b w:val="0"/>
                 <w:bCs w:val="0"/>
               </w:rPr>
-              <w:t xml:space="preserve">  "</w:t>
-            </w:r>
-            <w:proofErr w:type="gramStart"/>
-            <w:r>
-              <w:rPr>
-                <w:b w:val="0"/>
-                <w:bCs w:val="0"/>
-              </w:rPr>
-              <w:t>input</w:t>
-            </w:r>
-            <w:proofErr w:type="gramEnd"/>
-            <w:r>
-              <w:rPr>
-                <w:b w:val="0"/>
-                <w:bCs w:val="0"/>
-              </w:rPr>
-              <w:t>-data": [</w:t>
+              <w:t xml:space="preserve">  "input-data": [</w:t>
             </w:r>
           </w:p>
           <w:p>
@@ -8664,23 +8479,7 @@
                 <w:b w:val="0"/>
                 <w:bCs w:val="0"/>
               </w:rPr>
-              <w:t xml:space="preserve">  "</w:t>
-            </w:r>
-            <w:proofErr w:type="gramStart"/>
-            <w:r>
-              <w:rPr>
-                <w:b w:val="0"/>
-                <w:bCs w:val="0"/>
-              </w:rPr>
-              <w:t>output</w:t>
-            </w:r>
-            <w:proofErr w:type="gramEnd"/>
-            <w:r>
-              <w:rPr>
-                <w:b w:val="0"/>
-                <w:bCs w:val="0"/>
-              </w:rPr>
-              <w:t>-data": [</w:t>
+              <w:t xml:space="preserve">  "output-data": [</w:t>
             </w:r>
           </w:p>
           <w:p>
@@ -9035,15 +8834,7 @@
       </w:pPr>
       <w:r>
         <w:tab/>
-        <w:t xml:space="preserve">  "</w:t>
-      </w:r>
-      <w:proofErr w:type="gramStart"/>
-      <w:r>
-        <w:t>input</w:t>
-      </w:r>
-      <w:proofErr w:type="gramEnd"/>
-      <w:r>
-        <w:t>-data": [</w:t>
+        <w:t xml:space="preserve">  "input-data": [</w:t>
       </w:r>
     </w:p>
     <w:p>
@@ -9150,15 +8941,7 @@
       </w:pPr>
       <w:r>
         <w:tab/>
-        <w:t xml:space="preserve">  "</w:t>
-      </w:r>
-      <w:proofErr w:type="gramStart"/>
-      <w:r>
-        <w:t>output</w:t>
-      </w:r>
-      <w:proofErr w:type="gramEnd"/>
-      <w:r>
-        <w:t>-data": [</w:t>
+        <w:t xml:space="preserve">  "output-data": [</w:t>
       </w:r>
     </w:p>
     <w:p>
@@ -9264,6 +9047,7 @@
         <w:pStyle w:val="Code"/>
       </w:pPr>
       <w:r>
+        <w:lastRenderedPageBreak/>
         <w:tab/>
         <w:t xml:space="preserve">  "parameters": {</w:t>
       </w:r>
@@ -9277,13 +9061,8 @@
         <w:t xml:space="preserve">    "</w:t>
       </w:r>
       <w:proofErr w:type="spellStart"/>
-      <w:proofErr w:type="gramStart"/>
-      <w:r>
-        <w:t>lower</w:t>
-      </w:r>
-      <w:proofErr w:type="gramEnd"/>
-      <w:r>
-        <w:t>_in</w:t>
+      <w:r>
+        <w:t>lower_in</w:t>
       </w:r>
       <w:proofErr w:type="spellEnd"/>
       <w:r>
@@ -9295,18 +9074,12 @@
         <w:pStyle w:val="Code"/>
       </w:pPr>
       <w:r>
-        <w:lastRenderedPageBreak/>
         <w:tab/>
         <w:t xml:space="preserve">    "</w:t>
       </w:r>
       <w:proofErr w:type="spellStart"/>
-      <w:proofErr w:type="gramStart"/>
-      <w:r>
-        <w:t>upper</w:t>
-      </w:r>
-      <w:proofErr w:type="gramEnd"/>
-      <w:r>
-        <w:t>_in</w:t>
+      <w:r>
+        <w:t>upper_in</w:t>
       </w:r>
       <w:proofErr w:type="spellEnd"/>
       <w:r>
@@ -9322,13 +9095,8 @@
         <w:t xml:space="preserve">    "</w:t>
       </w:r>
       <w:proofErr w:type="spellStart"/>
-      <w:proofErr w:type="gramStart"/>
-      <w:r>
-        <w:t>lower</w:t>
-      </w:r>
-      <w:proofErr w:type="gramEnd"/>
-      <w:r>
-        <w:t>_out</w:t>
+      <w:r>
+        <w:t>lower_out</w:t>
       </w:r>
       <w:proofErr w:type="spellEnd"/>
       <w:r>
@@ -9344,13 +9112,8 @@
         <w:t xml:space="preserve">    "</w:t>
       </w:r>
       <w:proofErr w:type="spellStart"/>
-      <w:proofErr w:type="gramStart"/>
-      <w:r>
-        <w:t>upper</w:t>
-      </w:r>
-      <w:proofErr w:type="gramEnd"/>
-      <w:r>
-        <w:t>_out</w:t>
+      <w:r>
+        <w:t>upper_out</w:t>
       </w:r>
       <w:proofErr w:type="spellEnd"/>
       <w:r>
@@ -9521,23 +9284,7 @@
                 <w:b w:val="0"/>
                 <w:bCs w:val="0"/>
               </w:rPr>
-              <w:t xml:space="preserve">  "</w:t>
-            </w:r>
-            <w:proofErr w:type="gramStart"/>
-            <w:r>
-              <w:rPr>
-                <w:b w:val="0"/>
-                <w:bCs w:val="0"/>
-              </w:rPr>
-              <w:t>input</w:t>
-            </w:r>
-            <w:proofErr w:type="gramEnd"/>
-            <w:r>
-              <w:rPr>
-                <w:b w:val="0"/>
-                <w:bCs w:val="0"/>
-              </w:rPr>
-              <w:t>-data": [</w:t>
+              <w:t xml:space="preserve">  "input-data": [</w:t>
             </w:r>
           </w:p>
           <w:p>
@@ -9753,23 +9500,7 @@
                 <w:b w:val="0"/>
                 <w:bCs w:val="0"/>
               </w:rPr>
-              <w:t xml:space="preserve">  "</w:t>
-            </w:r>
-            <w:proofErr w:type="gramStart"/>
-            <w:r>
-              <w:rPr>
-                <w:b w:val="0"/>
-                <w:bCs w:val="0"/>
-              </w:rPr>
-              <w:t>output</w:t>
-            </w:r>
-            <w:proofErr w:type="gramEnd"/>
-            <w:r>
-              <w:rPr>
-                <w:b w:val="0"/>
-                <w:bCs w:val="0"/>
-              </w:rPr>
-              <w:t>-data": [</w:t>
+              <w:t xml:space="preserve">  "output-data": [</w:t>
             </w:r>
           </w:p>
           <w:p>
@@ -10001,21 +9732,12 @@
               <w:t xml:space="preserve">    "</w:t>
             </w:r>
             <w:proofErr w:type="spellStart"/>
-            <w:proofErr w:type="gramStart"/>
-            <w:r>
-              <w:rPr>
-                <w:b w:val="0"/>
-                <w:bCs w:val="0"/>
-              </w:rPr>
-              <w:t>lower</w:t>
-            </w:r>
-            <w:proofErr w:type="gramEnd"/>
-            <w:r>
-              <w:rPr>
-                <w:b w:val="0"/>
-                <w:bCs w:val="0"/>
-              </w:rPr>
-              <w:t>_in</w:t>
+            <w:r>
+              <w:rPr>
+                <w:b w:val="0"/>
+                <w:bCs w:val="0"/>
+              </w:rPr>
+              <w:t>lower_in</w:t>
             </w:r>
             <w:proofErr w:type="spellEnd"/>
             <w:r>
@@ -10042,21 +9764,12 @@
               <w:t xml:space="preserve">    "</w:t>
             </w:r>
             <w:proofErr w:type="spellStart"/>
-            <w:proofErr w:type="gramStart"/>
-            <w:r>
-              <w:rPr>
-                <w:b w:val="0"/>
-                <w:bCs w:val="0"/>
-              </w:rPr>
-              <w:t>upper</w:t>
-            </w:r>
-            <w:proofErr w:type="gramEnd"/>
-            <w:r>
-              <w:rPr>
-                <w:b w:val="0"/>
-                <w:bCs w:val="0"/>
-              </w:rPr>
-              <w:t>_in</w:t>
+            <w:r>
+              <w:rPr>
+                <w:b w:val="0"/>
+                <w:bCs w:val="0"/>
+              </w:rPr>
+              <w:t>upper_in</w:t>
             </w:r>
             <w:proofErr w:type="spellEnd"/>
             <w:r>
@@ -10083,21 +9796,12 @@
               <w:t xml:space="preserve">    "</w:t>
             </w:r>
             <w:proofErr w:type="spellStart"/>
-            <w:proofErr w:type="gramStart"/>
-            <w:r>
-              <w:rPr>
-                <w:b w:val="0"/>
-                <w:bCs w:val="0"/>
-              </w:rPr>
-              <w:t>lower</w:t>
-            </w:r>
-            <w:proofErr w:type="gramEnd"/>
-            <w:r>
-              <w:rPr>
-                <w:b w:val="0"/>
-                <w:bCs w:val="0"/>
-              </w:rPr>
-              <w:t>_out</w:t>
+            <w:r>
+              <w:rPr>
+                <w:b w:val="0"/>
+                <w:bCs w:val="0"/>
+              </w:rPr>
+              <w:t>lower_out</w:t>
             </w:r>
             <w:proofErr w:type="spellEnd"/>
             <w:r>
@@ -10124,21 +9828,12 @@
               <w:t xml:space="preserve">    "</w:t>
             </w:r>
             <w:proofErr w:type="spellStart"/>
-            <w:proofErr w:type="gramStart"/>
-            <w:r>
-              <w:rPr>
-                <w:b w:val="0"/>
-                <w:bCs w:val="0"/>
-              </w:rPr>
-              <w:t>upper</w:t>
-            </w:r>
-            <w:proofErr w:type="gramEnd"/>
-            <w:r>
-              <w:rPr>
-                <w:b w:val="0"/>
-                <w:bCs w:val="0"/>
-              </w:rPr>
-              <w:t>_out</w:t>
+            <w:r>
+              <w:rPr>
+                <w:b w:val="0"/>
+                <w:bCs w:val="0"/>
+              </w:rPr>
+              <w:t>upper_out</w:t>
             </w:r>
             <w:proofErr w:type="spellEnd"/>
             <w:r>
@@ -10175,15 +9870,7 @@
               <w:cnfStyle w:val="000000000000" w:firstRow="0" w:lastRow="0" w:firstColumn="0" w:lastColumn="0" w:oddVBand="0" w:evenVBand="0" w:oddHBand="0" w:evenHBand="0" w:firstRowFirstColumn="0" w:firstRowLastColumn="0" w:lastRowFirstColumn="0" w:lastRowLastColumn="0"/>
             </w:pPr>
             <w:r>
-              <w:t xml:space="preserve">The script parameter </w:t>
-            </w:r>
-            <w:proofErr w:type="gramStart"/>
-            <w:r>
-              <w:t>define</w:t>
-            </w:r>
-            <w:proofErr w:type="gramEnd"/>
-            <w:r>
-              <w:t xml:space="preserve"> </w:t>
+              <w:t xml:space="preserve">The script parameter define </w:t>
             </w:r>
             <w:proofErr w:type="spellStart"/>
             <w:r>
@@ -11221,6 +10908,7 @@
                 <w:b w:val="0"/>
                 <w:bCs w:val="0"/>
               </w:rPr>
+              <w:lastRenderedPageBreak/>
               <w:t>Histogram</w:t>
             </w:r>
           </w:p>
@@ -11381,7 +11069,6 @@
                 <w:b w:val="0"/>
                 <w:bCs w:val="0"/>
               </w:rPr>
-              <w:lastRenderedPageBreak/>
               <w:t>Hough</w:t>
             </w:r>
           </w:p>
@@ -13238,6 +12925,7 @@
                 <w:b w:val="0"/>
                 <w:bCs w:val="0"/>
               </w:rPr>
+              <w:lastRenderedPageBreak/>
               <w:t>SE</w:t>
             </w:r>
           </w:p>
@@ -13415,7 +13103,6 @@
                 <w:b w:val="0"/>
                 <w:bCs w:val="0"/>
               </w:rPr>
-              <w:lastRenderedPageBreak/>
               <w:t>E</w:t>
             </w:r>
           </w:p>
@@ -14177,7 +13864,6 @@
                 <w:bCs w:val="0"/>
               </w:rPr>
             </w:pPr>
-            <w:proofErr w:type="gramStart"/>
             <w:r>
               <w:rPr>
                 <w:b w:val="0"/>
@@ -14185,7 +13871,6 @@
               </w:rPr>
               <w:t>max-row</w:t>
             </w:r>
-            <w:proofErr w:type="gramEnd"/>
           </w:p>
         </w:tc>
         <w:tc>
@@ -14280,7 +13965,6 @@
                 <w:bCs w:val="0"/>
               </w:rPr>
             </w:pPr>
-            <w:proofErr w:type="gramStart"/>
             <w:r>
               <w:rPr>
                 <w:b w:val="0"/>
@@ -14288,7 +13972,6 @@
               </w:rPr>
               <w:t>max-col</w:t>
             </w:r>
-            <w:proofErr w:type="gramEnd"/>
           </w:p>
         </w:tc>
         <w:tc>
@@ -14834,6 +14517,7 @@
               <w:pStyle w:val="NoSpacing"/>
             </w:pPr>
             <w:r>
+              <w:lastRenderedPageBreak/>
               <w:t>orientation</w:t>
             </w:r>
           </w:p>
@@ -14875,7 +14559,6 @@
                 <w:b w:val="0"/>
                 <w:bCs w:val="0"/>
               </w:rPr>
-              <w:lastRenderedPageBreak/>
               <w:t>0</w:t>
             </w:r>
           </w:p>
@@ -15646,7 +15329,6 @@
                 <w:bCs w:val="0"/>
               </w:rPr>
             </w:pPr>
-            <w:proofErr w:type="gramStart"/>
             <w:r>
               <w:rPr>
                 <w:b w:val="0"/>
@@ -15654,7 +15336,6 @@
               </w:rPr>
               <w:t>max-row</w:t>
             </w:r>
-            <w:proofErr w:type="gramEnd"/>
           </w:p>
         </w:tc>
         <w:tc>
@@ -15749,7 +15430,6 @@
                 <w:bCs w:val="0"/>
               </w:rPr>
             </w:pPr>
-            <w:proofErr w:type="gramStart"/>
             <w:r>
               <w:rPr>
                 <w:b w:val="0"/>
@@ -15757,7 +15437,6 @@
               </w:rPr>
               <w:t>max-col</w:t>
             </w:r>
-            <w:proofErr w:type="gramEnd"/>
           </w:p>
         </w:tc>
         <w:tc>
@@ -16561,6 +16240,7 @@
         <w:pStyle w:val="Normalafterlist"/>
       </w:pPr>
       <w:r>
+        <w:lastRenderedPageBreak/>
         <w:t>The operator takes the following data descriptors:</w:t>
       </w:r>
     </w:p>
@@ -16590,7 +16270,6 @@
           </w:tcPr>
           <w:p>
             <w:r>
-              <w:lastRenderedPageBreak/>
               <w:t>Descriptor type</w:t>
             </w:r>
           </w:p>
@@ -16982,7 +16661,6 @@
                 <w:bCs w:val="0"/>
               </w:rPr>
             </w:pPr>
-            <w:proofErr w:type="gramStart"/>
             <w:r>
               <w:rPr>
                 <w:b w:val="0"/>
@@ -16990,7 +16668,6 @@
               </w:rPr>
               <w:t>max-row</w:t>
             </w:r>
-            <w:proofErr w:type="gramEnd"/>
           </w:p>
         </w:tc>
         <w:tc>
@@ -17085,7 +16762,6 @@
                 <w:bCs w:val="0"/>
               </w:rPr>
             </w:pPr>
-            <w:proofErr w:type="gramStart"/>
             <w:r>
               <w:rPr>
                 <w:b w:val="0"/>
@@ -17093,7 +16769,6 @@
               </w:rPr>
               <w:t>max-col</w:t>
             </w:r>
-            <w:proofErr w:type="gramEnd"/>
           </w:p>
         </w:tc>
         <w:tc>
@@ -18040,6 +17715,7 @@
           </w:tcPr>
           <w:p>
             <w:r>
+              <w:lastRenderedPageBreak/>
               <w:t>Descriptor type</w:t>
             </w:r>
           </w:p>
@@ -18193,7 +17869,6 @@
                 <w:b w:val="0"/>
                 <w:bCs w:val="0"/>
               </w:rPr>
-              <w:lastRenderedPageBreak/>
               <w:t>output</w:t>
             </w:r>
           </w:p>
@@ -18432,7 +18107,6 @@
                 <w:bCs w:val="0"/>
               </w:rPr>
             </w:pPr>
-            <w:proofErr w:type="gramStart"/>
             <w:r>
               <w:rPr>
                 <w:b w:val="0"/>
@@ -18440,7 +18114,6 @@
               </w:rPr>
               <w:t>max-row</w:t>
             </w:r>
-            <w:proofErr w:type="gramEnd"/>
           </w:p>
         </w:tc>
         <w:tc>
@@ -18535,7 +18208,6 @@
                 <w:bCs w:val="0"/>
               </w:rPr>
             </w:pPr>
-            <w:proofErr w:type="gramStart"/>
             <w:r>
               <w:rPr>
                 <w:b w:val="0"/>
@@ -18543,7 +18215,6 @@
               </w:rPr>
               <w:t>max-col</w:t>
             </w:r>
-            <w:proofErr w:type="gramEnd"/>
           </w:p>
         </w:tc>
         <w:tc>
@@ -19045,15 +18716,7 @@
         <w:t xml:space="preserve">structuring element </w:t>
       </w:r>
       <w:r>
-        <w:t xml:space="preserve">at each pixel position and decides as to what output value to produce. Erosion selects the minimum value under the mask and dilation selects the maximum value. This will give the appropriate result for both binary and grayscale images. The operator </w:t>
-      </w:r>
-      <w:proofErr w:type="gramStart"/>
-      <w:r>
-        <w:t>produce</w:t>
-      </w:r>
-      <w:proofErr w:type="gramEnd"/>
-      <w:r>
-        <w:t xml:space="preserve"> output images of the same depth as the input images. </w:t>
+        <w:t xml:space="preserve">at each pixel position and decides as to what output value to produce. Erosion selects the minimum value under the mask and dilation selects the maximum value. This will give the appropriate result for both binary and grayscale images. The operator produce output images of the same depth as the input images. </w:t>
       </w:r>
     </w:p>
     <w:tbl>
@@ -20075,7 +19738,6 @@
                 <w:bCs w:val="0"/>
               </w:rPr>
             </w:pPr>
-            <w:proofErr w:type="gramStart"/>
             <w:r>
               <w:rPr>
                 <w:b w:val="0"/>
@@ -20083,7 +19745,6 @@
               </w:rPr>
               <w:t>max-row</w:t>
             </w:r>
-            <w:proofErr w:type="gramEnd"/>
           </w:p>
         </w:tc>
         <w:tc>
@@ -20178,7 +19839,6 @@
                 <w:bCs w:val="0"/>
               </w:rPr>
             </w:pPr>
-            <w:proofErr w:type="gramStart"/>
             <w:r>
               <w:rPr>
                 <w:b w:val="0"/>
@@ -20186,7 +19846,6 @@
               </w:rPr>
               <w:t>max-col</w:t>
             </w:r>
-            <w:proofErr w:type="gramEnd"/>
           </w:p>
         </w:tc>
         <w:tc>
@@ -20666,15 +20325,7 @@
     </w:p>
     <w:p>
       <w:r>
-        <w:t>The filter smooth average operator convolves the image with a kernel that averages the pixels under the kernel. For a kernel that is size rows x cols, the output pixel is the sum of the pixels in a rectangle rows x cols around the input pixel, divided by 1</w:t>
-      </w:r>
-      <w:proofErr w:type="gramStart"/>
-      <w:r>
-        <w:t>/(</w:t>
-      </w:r>
-      <w:proofErr w:type="gramEnd"/>
-      <w:r>
-        <w:t>rows * cols).</w:t>
+        <w:t>The filter smooth average operator convolves the image with a kernel that averages the pixels under the kernel. For a kernel that is size rows x cols, the output pixel is the sum of the pixels in a rectangle rows x cols around the input pixel, divided by 1/(rows * cols).</w:t>
       </w:r>
     </w:p>
     <w:p>
@@ -21152,7 +20803,6 @@
                 <w:bCs w:val="0"/>
               </w:rPr>
             </w:pPr>
-            <w:proofErr w:type="gramStart"/>
             <w:r>
               <w:rPr>
                 <w:b w:val="0"/>
@@ -21160,7 +20810,6 @@
               </w:rPr>
               <w:t>max-row</w:t>
             </w:r>
-            <w:proofErr w:type="gramEnd"/>
           </w:p>
         </w:tc>
         <w:tc>
@@ -21255,7 +20904,6 @@
                 <w:bCs w:val="0"/>
               </w:rPr>
             </w:pPr>
-            <w:proofErr w:type="gramStart"/>
             <w:r>
               <w:rPr>
                 <w:b w:val="0"/>
@@ -21263,7 +20911,6 @@
               </w:rPr>
               <w:t>max-col</w:t>
             </w:r>
-            <w:proofErr w:type="gramEnd"/>
           </w:p>
         </w:tc>
         <w:tc>
@@ -21785,15 +21432,7 @@
         </m:sSub>
       </m:oMath>
       <w:r>
-        <w:t xml:space="preserve"> can be c</w:t>
-      </w:r>
-      <w:proofErr w:type="spellStart"/>
-      <w:r>
-        <w:t>omputed</w:t>
-      </w:r>
-      <w:proofErr w:type="spellEnd"/>
-      <w:r>
-        <w:t xml:space="preserve"> by convolving with this this formula:</w:t>
+        <w:t xml:space="preserve"> can be computed by convolving with this this formula:</w:t>
       </w:r>
     </w:p>
     <w:p>
@@ -22898,7 +22537,6 @@
                 <w:bCs w:val="0"/>
               </w:rPr>
             </w:pPr>
-            <w:proofErr w:type="gramStart"/>
             <w:r>
               <w:rPr>
                 <w:b w:val="0"/>
@@ -22906,7 +22544,6 @@
               </w:rPr>
               <w:t>max-row</w:t>
             </w:r>
-            <w:proofErr w:type="gramEnd"/>
           </w:p>
         </w:tc>
         <w:tc>
@@ -23001,7 +22638,6 @@
                 <w:bCs w:val="0"/>
               </w:rPr>
             </w:pPr>
-            <w:proofErr w:type="gramStart"/>
             <w:r>
               <w:rPr>
                 <w:b w:val="0"/>
@@ -23009,7 +22645,6 @@
               </w:rPr>
               <w:t>max-col</w:t>
             </w:r>
-            <w:proofErr w:type="gramEnd"/>
           </w:p>
         </w:tc>
         <w:tc>
@@ -23769,15 +23404,7 @@
         <w:pStyle w:val="Normalafterlist"/>
       </w:pPr>
       <w:r>
-        <w:t xml:space="preserve">For text output format, the output data descriptor extension is ignored. The output text file has the extension “.txt” and the output </w:t>
-      </w:r>
-      <w:proofErr w:type="spellStart"/>
-      <w:r>
-        <w:t>gnuplot</w:t>
-      </w:r>
-      <w:proofErr w:type="spellEnd"/>
-      <w:r>
-        <w:t xml:space="preserve"> script has the extension “.</w:t>
+        <w:t>For text output format, the output data descriptor extension is ignored. The output text file has the extension “.txt” and the output gnuplot script has the extension “.</w:t>
       </w:r>
       <w:proofErr w:type="spellStart"/>
       <w:r>
@@ -23947,7 +23574,6 @@
                 <w:bCs w:val="0"/>
               </w:rPr>
             </w:pPr>
-            <w:proofErr w:type="gramStart"/>
             <w:r>
               <w:rPr>
                 <w:b w:val="0"/>
@@ -23955,7 +23581,6 @@
               </w:rPr>
               <w:t>lower-value</w:t>
             </w:r>
-            <w:proofErr w:type="gramEnd"/>
           </w:p>
         </w:tc>
         <w:tc>
@@ -24004,7 +23629,6 @@
                 <w:bCs w:val="0"/>
               </w:rPr>
             </w:pPr>
-            <w:proofErr w:type="gramStart"/>
             <w:r>
               <w:rPr>
                 <w:b w:val="0"/>
@@ -24012,7 +23636,6 @@
               </w:rPr>
               <w:t>upper-value</w:t>
             </w:r>
-            <w:proofErr w:type="gramEnd"/>
           </w:p>
         </w:tc>
         <w:tc>
@@ -24249,21 +23872,12 @@
                 <w:bCs w:val="0"/>
               </w:rPr>
             </w:pPr>
-            <w:proofErr w:type="gramStart"/>
-            <w:r>
-              <w:rPr>
-                <w:b w:val="0"/>
-                <w:bCs w:val="0"/>
-              </w:rPr>
-              <w:t>accumulator</w:t>
-            </w:r>
-            <w:proofErr w:type="gramEnd"/>
-            <w:r>
-              <w:rPr>
-                <w:b w:val="0"/>
-                <w:bCs w:val="0"/>
-              </w:rPr>
-              <w:t xml:space="preserve"> mean</w:t>
+            <w:r>
+              <w:rPr>
+                <w:b w:val="0"/>
+                <w:bCs w:val="0"/>
+              </w:rPr>
+              <w:t>accumulator mean</w:t>
             </w:r>
           </w:p>
         </w:tc>
@@ -24754,15 +24368,7 @@
         <w:pStyle w:val="Normalafterlist"/>
       </w:pPr>
       <w:r>
-        <w:t xml:space="preserve">For text output format, the output data descriptor extension is ignored. The output text file has the extension “.txt” and the output </w:t>
-      </w:r>
-      <w:proofErr w:type="spellStart"/>
-      <w:r>
-        <w:t>gnuplot</w:t>
-      </w:r>
-      <w:proofErr w:type="spellEnd"/>
-      <w:r>
-        <w:t xml:space="preserve"> script has the extension “.</w:t>
+        <w:t>For text output format, the output data descriptor extension is ignored. The output text file has the extension “.txt” and the output gnuplot script has the extension “.</w:t>
       </w:r>
       <w:proofErr w:type="spellStart"/>
       <w:r>
@@ -24940,7 +24546,6 @@
                 <w:bCs w:val="0"/>
               </w:rPr>
             </w:pPr>
-            <w:proofErr w:type="gramStart"/>
             <w:r>
               <w:rPr>
                 <w:b w:val="0"/>
@@ -24949,7 +24554,6 @@
               <w:lastRenderedPageBreak/>
               <w:t>lower-value</w:t>
             </w:r>
-            <w:proofErr w:type="gramEnd"/>
           </w:p>
         </w:tc>
         <w:tc>
@@ -24998,7 +24602,6 @@
                 <w:bCs w:val="0"/>
               </w:rPr>
             </w:pPr>
-            <w:proofErr w:type="gramStart"/>
             <w:r>
               <w:rPr>
                 <w:b w:val="0"/>
@@ -25006,7 +24609,6 @@
               </w:rPr>
               <w:t>upper-value</w:t>
             </w:r>
-            <w:proofErr w:type="gramEnd"/>
           </w:p>
         </w:tc>
         <w:tc>
@@ -25103,7 +24705,6 @@
                 <w:bCs w:val="0"/>
               </w:rPr>
             </w:pPr>
-            <w:proofErr w:type="gramStart"/>
             <w:r>
               <w:rPr>
                 <w:b w:val="0"/>
@@ -25111,7 +24712,6 @@
               </w:rPr>
               <w:t>max-row</w:t>
             </w:r>
-            <w:proofErr w:type="gramEnd"/>
           </w:p>
         </w:tc>
         <w:tc>
@@ -25212,7 +24812,6 @@
                 <w:bCs w:val="0"/>
               </w:rPr>
             </w:pPr>
-            <w:proofErr w:type="gramStart"/>
             <w:r>
               <w:rPr>
                 <w:b w:val="0"/>
@@ -25220,7 +24819,6 @@
               </w:rPr>
               <w:t>max-col</w:t>
             </w:r>
-            <w:proofErr w:type="gramEnd"/>
           </w:p>
         </w:tc>
         <w:tc>
@@ -26025,11 +25623,25 @@
             <w:tcW w:w="0" w:type="auto"/>
           </w:tcPr>
           <w:p>
-            <w:r>
+            <w:pPr>
+              <w:rPr>
+                <w:b w:val="0"/>
+                <w:bCs w:val="0"/>
+              </w:rPr>
+            </w:pPr>
+            <w:r>
+              <w:rPr>
+                <w:b w:val="0"/>
+                <w:bCs w:val="0"/>
+              </w:rPr>
               <w:t>theta-</w:t>
             </w:r>
             <w:proofErr w:type="spellStart"/>
             <w:r>
+              <w:rPr>
+                <w:b w:val="0"/>
+                <w:bCs w:val="0"/>
+              </w:rPr>
               <w:t>inc</w:t>
             </w:r>
             <w:proofErr w:type="spellEnd"/>
@@ -26057,15 +25669,7 @@
               <w:cnfStyle w:val="000000100000" w:firstRow="0" w:lastRow="0" w:firstColumn="0" w:lastColumn="0" w:oddVBand="0" w:evenVBand="0" w:oddHBand="1" w:evenHBand="0" w:firstRowFirstColumn="0" w:firstRowLastColumn="0" w:lastRowFirstColumn="0" w:lastRowLastColumn="0"/>
             </w:pPr>
             <w:r>
-              <w:t xml:space="preserve">increment for the Hough accumulator angle. The number of angles </w:t>
-            </w:r>
-            <w:proofErr w:type="gramStart"/>
-            <w:r>
-              <w:t>are</w:t>
-            </w:r>
-            <w:proofErr w:type="gramEnd"/>
-            <w:r>
-              <w:t xml:space="preserve"> 180 / </w:t>
+              <w:t xml:space="preserve">increment for the Hough accumulator angle. The number of angles are 180 / </w:t>
             </w:r>
             <w:proofErr w:type="spellStart"/>
             <w:r>
@@ -26375,7 +25979,6 @@
                 <w:bCs w:val="0"/>
               </w:rPr>
             </w:pPr>
-            <w:proofErr w:type="gramStart"/>
             <w:r>
               <w:rPr>
                 <w:b w:val="0"/>
@@ -26384,7 +25987,6 @@
               <w:lastRenderedPageBreak/>
               <w:t>max-row</w:t>
             </w:r>
-            <w:proofErr w:type="gramEnd"/>
           </w:p>
         </w:tc>
         <w:tc>
@@ -26485,7 +26087,6 @@
                 <w:bCs w:val="0"/>
               </w:rPr>
             </w:pPr>
-            <w:proofErr w:type="gramStart"/>
             <w:r>
               <w:rPr>
                 <w:b w:val="0"/>
@@ -26493,7 +26094,6 @@
               </w:rPr>
               <w:t>max-col</w:t>
             </w:r>
-            <w:proofErr w:type="gramEnd"/>
           </w:p>
         </w:tc>
         <w:tc>
@@ -27172,15 +26772,7 @@
               <w:cnfStyle w:val="000000100000" w:firstRow="0" w:lastRow="0" w:firstColumn="0" w:lastColumn="0" w:oddVBand="0" w:evenVBand="0" w:oddHBand="1" w:evenHBand="0" w:firstRowFirstColumn="0" w:firstRowLastColumn="0" w:lastRowFirstColumn="0" w:lastRowLastColumn="0"/>
             </w:pPr>
             <w:r>
-              <w:t xml:space="preserve">increment for the Hough accumulator angle. The number of angles </w:t>
-            </w:r>
-            <w:proofErr w:type="gramStart"/>
-            <w:r>
-              <w:t>are</w:t>
-            </w:r>
-            <w:proofErr w:type="gramEnd"/>
-            <w:r>
-              <w:t xml:space="preserve"> 180 / </w:t>
+              <w:t xml:space="preserve">increment for the Hough accumulator angle. The number of angles are 180 / </w:t>
             </w:r>
             <w:proofErr w:type="spellStart"/>
             <w:r>
@@ -27206,13 +26798,15 @@
                 <w:bCs w:val="0"/>
               </w:rPr>
             </w:pPr>
-            <w:r>
-              <w:rPr>
-                <w:b w:val="0"/>
-                <w:bCs w:val="0"/>
-              </w:rPr>
-              <w:t>pixel-threshold</w:t>
-            </w:r>
+            <w:proofErr w:type="spellStart"/>
+            <w:r>
+              <w:rPr>
+                <w:b w:val="0"/>
+                <w:bCs w:val="0"/>
+              </w:rPr>
+              <w:t>rho_inc</w:t>
+            </w:r>
+            <w:proofErr w:type="spellEnd"/>
           </w:p>
         </w:tc>
         <w:tc>
@@ -27224,7 +26818,7 @@
               <w:cnfStyle w:val="000000000000" w:firstRow="0" w:lastRow="0" w:firstColumn="0" w:lastColumn="0" w:oddVBand="0" w:evenVBand="0" w:oddHBand="0" w:evenHBand="0" w:firstRowFirstColumn="0" w:firstRowLastColumn="0" w:lastRowFirstColumn="0" w:lastRowLastColumn="0"/>
             </w:pPr>
             <w:r>
-              <w:t>required</w:t>
+              <w:t>1</w:t>
             </w:r>
           </w:p>
         </w:tc>
@@ -27237,7 +26831,7 @@
               <w:cnfStyle w:val="000000000000" w:firstRow="0" w:lastRow="0" w:firstColumn="0" w:lastColumn="0" w:oddVBand="0" w:evenVBand="0" w:oddHBand="0" w:evenHBand="0" w:firstRowFirstColumn="0" w:firstRowLastColumn="0" w:lastRowFirstColumn="0" w:lastRowLastColumn="0"/>
             </w:pPr>
             <w:r>
-              <w:t xml:space="preserve">pixel value threshold above which image points are candidates for accumulating </w:t>
+              <w:t>increment for the polar line distance</w:t>
             </w:r>
           </w:p>
         </w:tc>
@@ -27263,6 +26857,55 @@
                 <w:b w:val="0"/>
                 <w:bCs w:val="0"/>
               </w:rPr>
+              <w:t>pixel-threshold</w:t>
+            </w:r>
+          </w:p>
+        </w:tc>
+        <w:tc>
+          <w:tcPr>
+            <w:tcW w:w="1705" w:type="dxa"/>
+          </w:tcPr>
+          <w:p>
+            <w:pPr>
+              <w:cnfStyle w:val="000000100000" w:firstRow="0" w:lastRow="0" w:firstColumn="0" w:lastColumn="0" w:oddVBand="0" w:evenVBand="0" w:oddHBand="1" w:evenHBand="0" w:firstRowFirstColumn="0" w:firstRowLastColumn="0" w:lastRowFirstColumn="0" w:lastRowLastColumn="0"/>
+            </w:pPr>
+            <w:r>
+              <w:t>required</w:t>
+            </w:r>
+          </w:p>
+        </w:tc>
+        <w:tc>
+          <w:tcPr>
+            <w:tcW w:w="6120" w:type="dxa"/>
+          </w:tcPr>
+          <w:p>
+            <w:pPr>
+              <w:cnfStyle w:val="000000100000" w:firstRow="0" w:lastRow="0" w:firstColumn="0" w:lastColumn="0" w:oddVBand="0" w:evenVBand="0" w:oddHBand="1" w:evenHBand="0" w:firstRowFirstColumn="0" w:firstRowLastColumn="0" w:lastRowFirstColumn="0" w:lastRowLastColumn="0"/>
+            </w:pPr>
+            <w:r>
+              <w:t xml:space="preserve">pixel value threshold above which image points are candidates for accumulating </w:t>
+            </w:r>
+          </w:p>
+        </w:tc>
+      </w:tr>
+      <w:tr>
+        <w:tc>
+          <w:tcPr>
+            <w:cnfStyle w:val="001000000000" w:firstRow="0" w:lastRow="0" w:firstColumn="1" w:lastColumn="0" w:oddVBand="0" w:evenVBand="0" w:oddHBand="0" w:evenHBand="0" w:firstRowFirstColumn="0" w:firstRowLastColumn="0" w:lastRowFirstColumn="0" w:lastRowLastColumn="0"/>
+            <w:tcW w:w="0" w:type="auto"/>
+          </w:tcPr>
+          <w:p>
+            <w:pPr>
+              <w:rPr>
+                <w:b w:val="0"/>
+                <w:bCs w:val="0"/>
+              </w:rPr>
+            </w:pPr>
+            <w:r>
+              <w:rPr>
+                <w:b w:val="0"/>
+                <w:bCs w:val="0"/>
+              </w:rPr>
               <w:t>min-row</w:t>
             </w:r>
           </w:p>
@@ -27273,7 +26916,7 @@
           </w:tcPr>
           <w:p>
             <w:pPr>
-              <w:cnfStyle w:val="000000100000" w:firstRow="0" w:lastRow="0" w:firstColumn="0" w:lastColumn="0" w:oddVBand="0" w:evenVBand="0" w:oddHBand="1" w:evenHBand="0" w:firstRowFirstColumn="0" w:firstRowLastColumn="0" w:lastRowFirstColumn="0" w:lastRowLastColumn="0"/>
+              <w:cnfStyle w:val="000000000000" w:firstRow="0" w:lastRow="0" w:firstColumn="0" w:lastColumn="0" w:oddVBand="0" w:evenVBand="0" w:oddHBand="0" w:evenHBand="0" w:firstRowFirstColumn="0" w:firstRowLastColumn="0" w:lastRowFirstColumn="0" w:lastRowLastColumn="0"/>
             </w:pPr>
             <w:r>
               <w:t>0</w:t>
@@ -27286,61 +26929,10 @@
           </w:tcPr>
           <w:p>
             <w:pPr>
-              <w:cnfStyle w:val="000000100000" w:firstRow="0" w:lastRow="0" w:firstColumn="0" w:lastColumn="0" w:oddVBand="0" w:evenVBand="0" w:oddHBand="1" w:evenHBand="0" w:firstRowFirstColumn="0" w:firstRowLastColumn="0" w:lastRowFirstColumn="0" w:lastRowLastColumn="0"/>
+              <w:cnfStyle w:val="000000000000" w:firstRow="0" w:lastRow="0" w:firstColumn="0" w:lastColumn="0" w:oddVBand="0" w:evenVBand="0" w:oddHBand="0" w:evenHBand="0" w:firstRowFirstColumn="0" w:firstRowLastColumn="0" w:lastRowFirstColumn="0" w:lastRowLastColumn="0"/>
             </w:pPr>
             <w:r>
               <w:t>minimum sub-image row</w:t>
-            </w:r>
-          </w:p>
-        </w:tc>
-      </w:tr>
-      <w:tr>
-        <w:tc>
-          <w:tcPr>
-            <w:cnfStyle w:val="001000000000" w:firstRow="0" w:lastRow="0" w:firstColumn="1" w:lastColumn="0" w:oddVBand="0" w:evenVBand="0" w:oddHBand="0" w:evenHBand="0" w:firstRowFirstColumn="0" w:firstRowLastColumn="0" w:lastRowFirstColumn="0" w:lastRowLastColumn="0"/>
-            <w:tcW w:w="0" w:type="auto"/>
-          </w:tcPr>
-          <w:p>
-            <w:pPr>
-              <w:rPr>
-                <w:b w:val="0"/>
-                <w:bCs w:val="0"/>
-              </w:rPr>
-            </w:pPr>
-            <w:proofErr w:type="gramStart"/>
-            <w:r>
-              <w:rPr>
-                <w:b w:val="0"/>
-                <w:bCs w:val="0"/>
-              </w:rPr>
-              <w:t>max-row</w:t>
-            </w:r>
-            <w:proofErr w:type="gramEnd"/>
-          </w:p>
-        </w:tc>
-        <w:tc>
-          <w:tcPr>
-            <w:tcW w:w="1705" w:type="dxa"/>
-          </w:tcPr>
-          <w:p>
-            <w:pPr>
-              <w:cnfStyle w:val="000000000000" w:firstRow="0" w:lastRow="0" w:firstColumn="0" w:lastColumn="0" w:oddVBand="0" w:evenVBand="0" w:oddHBand="0" w:evenHBand="0" w:firstRowFirstColumn="0" w:firstRowLastColumn="0" w:lastRowFirstColumn="0" w:lastRowLastColumn="0"/>
-            </w:pPr>
-            <w:r>
-              <w:t>image rows - 1</w:t>
-            </w:r>
-          </w:p>
-        </w:tc>
-        <w:tc>
-          <w:tcPr>
-            <w:tcW w:w="6120" w:type="dxa"/>
-          </w:tcPr>
-          <w:p>
-            <w:pPr>
-              <w:cnfStyle w:val="000000000000" w:firstRow="0" w:lastRow="0" w:firstColumn="0" w:lastColumn="0" w:oddVBand="0" w:evenVBand="0" w:oddHBand="0" w:evenHBand="0" w:firstRowFirstColumn="0" w:firstRowLastColumn="0" w:lastRowFirstColumn="0" w:lastRowLastColumn="0"/>
-            </w:pPr>
-            <w:r>
-              <w:t>maximum sub-image row</w:t>
             </w:r>
           </w:p>
         </w:tc>
@@ -27366,6 +26958,55 @@
                 <w:b w:val="0"/>
                 <w:bCs w:val="0"/>
               </w:rPr>
+              <w:t>max-row</w:t>
+            </w:r>
+          </w:p>
+        </w:tc>
+        <w:tc>
+          <w:tcPr>
+            <w:tcW w:w="1705" w:type="dxa"/>
+          </w:tcPr>
+          <w:p>
+            <w:pPr>
+              <w:cnfStyle w:val="000000100000" w:firstRow="0" w:lastRow="0" w:firstColumn="0" w:lastColumn="0" w:oddVBand="0" w:evenVBand="0" w:oddHBand="1" w:evenHBand="0" w:firstRowFirstColumn="0" w:firstRowLastColumn="0" w:lastRowFirstColumn="0" w:lastRowLastColumn="0"/>
+            </w:pPr>
+            <w:r>
+              <w:t>image rows - 1</w:t>
+            </w:r>
+          </w:p>
+        </w:tc>
+        <w:tc>
+          <w:tcPr>
+            <w:tcW w:w="6120" w:type="dxa"/>
+          </w:tcPr>
+          <w:p>
+            <w:pPr>
+              <w:cnfStyle w:val="000000100000" w:firstRow="0" w:lastRow="0" w:firstColumn="0" w:lastColumn="0" w:oddVBand="0" w:evenVBand="0" w:oddHBand="1" w:evenHBand="0" w:firstRowFirstColumn="0" w:firstRowLastColumn="0" w:lastRowFirstColumn="0" w:lastRowLastColumn="0"/>
+            </w:pPr>
+            <w:r>
+              <w:t>maximum sub-image row</w:t>
+            </w:r>
+          </w:p>
+        </w:tc>
+      </w:tr>
+      <w:tr>
+        <w:tc>
+          <w:tcPr>
+            <w:cnfStyle w:val="001000000000" w:firstRow="0" w:lastRow="0" w:firstColumn="1" w:lastColumn="0" w:oddVBand="0" w:evenVBand="0" w:oddHBand="0" w:evenHBand="0" w:firstRowFirstColumn="0" w:firstRowLastColumn="0" w:lastRowFirstColumn="0" w:lastRowLastColumn="0"/>
+            <w:tcW w:w="0" w:type="auto"/>
+          </w:tcPr>
+          <w:p>
+            <w:pPr>
+              <w:rPr>
+                <w:b w:val="0"/>
+                <w:bCs w:val="0"/>
+              </w:rPr>
+            </w:pPr>
+            <w:r>
+              <w:rPr>
+                <w:b w:val="0"/>
+                <w:bCs w:val="0"/>
+              </w:rPr>
               <w:t>min-col</w:t>
             </w:r>
           </w:p>
@@ -27376,10 +27017,62 @@
           </w:tcPr>
           <w:p>
             <w:pPr>
+              <w:cnfStyle w:val="000000000000" w:firstRow="0" w:lastRow="0" w:firstColumn="0" w:lastColumn="0" w:oddVBand="0" w:evenVBand="0" w:oddHBand="0" w:evenHBand="0" w:firstRowFirstColumn="0" w:firstRowLastColumn="0" w:lastRowFirstColumn="0" w:lastRowLastColumn="0"/>
+            </w:pPr>
+            <w:r>
+              <w:t>0</w:t>
+            </w:r>
+          </w:p>
+        </w:tc>
+        <w:tc>
+          <w:tcPr>
+            <w:tcW w:w="6120" w:type="dxa"/>
+          </w:tcPr>
+          <w:p>
+            <w:pPr>
+              <w:cnfStyle w:val="000000000000" w:firstRow="0" w:lastRow="0" w:firstColumn="0" w:lastColumn="0" w:oddVBand="0" w:evenVBand="0" w:oddHBand="0" w:evenHBand="0" w:firstRowFirstColumn="0" w:firstRowLastColumn="0" w:lastRowFirstColumn="0" w:lastRowLastColumn="0"/>
+            </w:pPr>
+            <w:r>
+              <w:t>minimum sub-image column</w:t>
+            </w:r>
+          </w:p>
+        </w:tc>
+      </w:tr>
+      <w:tr>
+        <w:trPr>
+          <w:cnfStyle w:val="000000100000" w:firstRow="0" w:lastRow="0" w:firstColumn="0" w:lastColumn="0" w:oddVBand="0" w:evenVBand="0" w:oddHBand="1" w:evenHBand="0" w:firstRowFirstColumn="0" w:firstRowLastColumn="0" w:lastRowFirstColumn="0" w:lastRowLastColumn="0"/>
+        </w:trPr>
+        <w:tc>
+          <w:tcPr>
+            <w:cnfStyle w:val="001000000000" w:firstRow="0" w:lastRow="0" w:firstColumn="1" w:lastColumn="0" w:oddVBand="0" w:evenVBand="0" w:oddHBand="0" w:evenHBand="0" w:firstRowFirstColumn="0" w:firstRowLastColumn="0" w:lastRowFirstColumn="0" w:lastRowLastColumn="0"/>
+            <w:tcW w:w="0" w:type="auto"/>
+          </w:tcPr>
+          <w:p>
+            <w:pPr>
+              <w:rPr>
+                <w:b w:val="0"/>
+                <w:bCs w:val="0"/>
+              </w:rPr>
+            </w:pPr>
+            <w:r>
+              <w:rPr>
+                <w:b w:val="0"/>
+                <w:bCs w:val="0"/>
+              </w:rPr>
+              <w:t>max-col</w:t>
+            </w:r>
+          </w:p>
+        </w:tc>
+        <w:tc>
+          <w:tcPr>
+            <w:tcW w:w="1705" w:type="dxa"/>
+          </w:tcPr>
+          <w:p>
+            <w:pPr>
               <w:cnfStyle w:val="000000100000" w:firstRow="0" w:lastRow="0" w:firstColumn="0" w:lastColumn="0" w:oddVBand="0" w:evenVBand="0" w:oddHBand="1" w:evenHBand="0" w:firstRowFirstColumn="0" w:firstRowLastColumn="0" w:lastRowFirstColumn="0" w:lastRowLastColumn="0"/>
             </w:pPr>
             <w:r>
-              <w:t>0</w:t>
+              <w:t>image cols - 1</w:t>
             </w:r>
           </w:p>
         </w:tc>
@@ -27390,57 +27083,6 @@
           <w:p>
             <w:pPr>
               <w:cnfStyle w:val="000000100000" w:firstRow="0" w:lastRow="0" w:firstColumn="0" w:lastColumn="0" w:oddVBand="0" w:evenVBand="0" w:oddHBand="1" w:evenHBand="0" w:firstRowFirstColumn="0" w:firstRowLastColumn="0" w:lastRowFirstColumn="0" w:lastRowLastColumn="0"/>
-            </w:pPr>
-            <w:r>
-              <w:t>minimum sub-image column</w:t>
-            </w:r>
-          </w:p>
-        </w:tc>
-      </w:tr>
-      <w:tr>
-        <w:tc>
-          <w:tcPr>
-            <w:cnfStyle w:val="001000000000" w:firstRow="0" w:lastRow="0" w:firstColumn="1" w:lastColumn="0" w:oddVBand="0" w:evenVBand="0" w:oddHBand="0" w:evenHBand="0" w:firstRowFirstColumn="0" w:firstRowLastColumn="0" w:lastRowFirstColumn="0" w:lastRowLastColumn="0"/>
-            <w:tcW w:w="0" w:type="auto"/>
-          </w:tcPr>
-          <w:p>
-            <w:pPr>
-              <w:rPr>
-                <w:b w:val="0"/>
-                <w:bCs w:val="0"/>
-              </w:rPr>
-            </w:pPr>
-            <w:proofErr w:type="gramStart"/>
-            <w:r>
-              <w:rPr>
-                <w:b w:val="0"/>
-                <w:bCs w:val="0"/>
-              </w:rPr>
-              <w:t>max-col</w:t>
-            </w:r>
-            <w:proofErr w:type="gramEnd"/>
-          </w:p>
-        </w:tc>
-        <w:tc>
-          <w:tcPr>
-            <w:tcW w:w="1705" w:type="dxa"/>
-          </w:tcPr>
-          <w:p>
-            <w:pPr>
-              <w:cnfStyle w:val="000000000000" w:firstRow="0" w:lastRow="0" w:firstColumn="0" w:lastColumn="0" w:oddVBand="0" w:evenVBand="0" w:oddHBand="0" w:evenHBand="0" w:firstRowFirstColumn="0" w:firstRowLastColumn="0" w:lastRowFirstColumn="0" w:lastRowLastColumn="0"/>
-            </w:pPr>
-            <w:r>
-              <w:t>image cols - 1</w:t>
-            </w:r>
-          </w:p>
-        </w:tc>
-        <w:tc>
-          <w:tcPr>
-            <w:tcW w:w="6120" w:type="dxa"/>
-          </w:tcPr>
-          <w:p>
-            <w:pPr>
-              <w:cnfStyle w:val="000000000000" w:firstRow="0" w:lastRow="0" w:firstColumn="0" w:lastColumn="0" w:oddVBand="0" w:evenVBand="0" w:oddHBand="0" w:evenHBand="0" w:firstRowFirstColumn="0" w:firstRowLastColumn="0" w:lastRowFirstColumn="0" w:lastRowLastColumn="0"/>
             </w:pPr>
             <w:r>
               <w:t>maximum sub-image column</w:t>
@@ -27710,6 +27352,7 @@
                 <w:b w:val="0"/>
                 <w:bCs w:val="0"/>
               </w:rPr>
+              <w:lastRenderedPageBreak/>
               <w:t>theta_inc</w:t>
             </w:r>
             <w:proofErr w:type="spellEnd"/>
@@ -27725,33 +27368,24 @@
               <w:cnfStyle w:val="000000100000" w:firstRow="0" w:lastRow="0" w:firstColumn="0" w:lastColumn="0" w:oddVBand="0" w:evenVBand="0" w:oddHBand="1" w:evenHBand="0" w:firstRowFirstColumn="0" w:firstRowLastColumn="0" w:lastRowFirstColumn="0" w:lastRowLastColumn="0"/>
             </w:pPr>
             <w:r>
-              <w:t>The increment between sampled angles in degrees</w:t>
-            </w:r>
-          </w:p>
-        </w:tc>
-      </w:tr>
-      <w:tr>
-        <w:tc>
-          <w:tcPr>
-            <w:cnfStyle w:val="001000000000" w:firstRow="0" w:lastRow="0" w:firstColumn="1" w:lastColumn="0" w:oddVBand="0" w:evenVBand="0" w:oddHBand="0" w:evenHBand="0" w:firstRowFirstColumn="0" w:firstRowLastColumn="0" w:lastRowFirstColumn="0" w:lastRowLastColumn="0"/>
-            <w:tcW w:w="0" w:type="auto"/>
-          </w:tcPr>
-          <w:p>
-            <w:pPr>
-              <w:pStyle w:val="NoSpacing"/>
-              <w:rPr>
-                <w:b w:val="0"/>
-                <w:bCs w:val="0"/>
-              </w:rPr>
+              <w:t>increment between sampled angles in degrees</w:t>
+            </w:r>
+          </w:p>
+        </w:tc>
+      </w:tr>
+      <w:tr>
+        <w:tc>
+          <w:tcPr>
+            <w:cnfStyle w:val="001000000000" w:firstRow="0" w:lastRow="0" w:firstColumn="1" w:lastColumn="0" w:oddVBand="0" w:evenVBand="0" w:oddHBand="0" w:evenHBand="0" w:firstRowFirstColumn="0" w:firstRowLastColumn="0" w:lastRowFirstColumn="0" w:lastRowLastColumn="0"/>
+            <w:tcW w:w="0" w:type="auto"/>
+          </w:tcPr>
+          <w:p>
+            <w:pPr>
+              <w:pStyle w:val="NoSpacing"/>
             </w:pPr>
             <w:proofErr w:type="spellStart"/>
             <w:r>
-              <w:rPr>
-                <w:b w:val="0"/>
-                <w:bCs w:val="0"/>
-              </w:rPr>
-              <w:lastRenderedPageBreak/>
-              <w:t>nthetas</w:t>
+              <w:t>rho_inc</w:t>
             </w:r>
             <w:proofErr w:type="spellEnd"/>
           </w:p>
@@ -27765,14 +27399,14 @@
               <w:pStyle w:val="NoSpacing"/>
               <w:cnfStyle w:val="000000000000" w:firstRow="0" w:lastRow="0" w:firstColumn="0" w:lastColumn="0" w:oddVBand="0" w:evenVBand="0" w:oddHBand="0" w:evenHBand="0" w:firstRowFirstColumn="0" w:firstRowLastColumn="0" w:lastRowFirstColumn="0" w:lastRowLastColumn="0"/>
             </w:pPr>
-            <w:r>
-              <w:t xml:space="preserve">The number of angles sampled = 180 / </w:t>
-            </w:r>
             <w:proofErr w:type="spellStart"/>
             <w:r>
-              <w:t>theta_inc</w:t>
+              <w:t>inrement</w:t>
             </w:r>
             <w:proofErr w:type="spellEnd"/>
+            <w:r>
+              <w:t xml:space="preserve"> between sampled polar line distances</w:t>
+            </w:r>
           </w:p>
         </w:tc>
       </w:tr>
@@ -27799,6 +27433,51 @@
                 <w:b w:val="0"/>
                 <w:bCs w:val="0"/>
               </w:rPr>
+              <w:t>nthetas</w:t>
+            </w:r>
+            <w:proofErr w:type="spellEnd"/>
+          </w:p>
+        </w:tc>
+        <w:tc>
+          <w:tcPr>
+            <w:tcW w:w="0" w:type="auto"/>
+          </w:tcPr>
+          <w:p>
+            <w:pPr>
+              <w:pStyle w:val="NoSpacing"/>
+              <w:cnfStyle w:val="000000100000" w:firstRow="0" w:lastRow="0" w:firstColumn="0" w:lastColumn="0" w:oddVBand="0" w:evenVBand="0" w:oddHBand="1" w:evenHBand="0" w:firstRowFirstColumn="0" w:firstRowLastColumn="0" w:lastRowFirstColumn="0" w:lastRowLastColumn="0"/>
+            </w:pPr>
+            <w:r>
+              <w:t xml:space="preserve">number of angles sampled = 180 / </w:t>
+            </w:r>
+            <w:proofErr w:type="spellStart"/>
+            <w:r>
+              <w:t>theta_inc</w:t>
+            </w:r>
+            <w:proofErr w:type="spellEnd"/>
+          </w:p>
+        </w:tc>
+      </w:tr>
+      <w:tr>
+        <w:tc>
+          <w:tcPr>
+            <w:cnfStyle w:val="001000000000" w:firstRow="0" w:lastRow="0" w:firstColumn="1" w:lastColumn="0" w:oddVBand="0" w:evenVBand="0" w:oddHBand="0" w:evenHBand="0" w:firstRowFirstColumn="0" w:firstRowLastColumn="0" w:lastRowFirstColumn="0" w:lastRowLastColumn="0"/>
+            <w:tcW w:w="0" w:type="auto"/>
+          </w:tcPr>
+          <w:p>
+            <w:pPr>
+              <w:pStyle w:val="NoSpacing"/>
+              <w:rPr>
+                <w:b w:val="0"/>
+                <w:bCs w:val="0"/>
+              </w:rPr>
+            </w:pPr>
+            <w:proofErr w:type="spellStart"/>
+            <w:r>
+              <w:rPr>
+                <w:b w:val="0"/>
+                <w:bCs w:val="0"/>
+              </w:rPr>
               <w:t>nrhos</w:t>
             </w:r>
             <w:proofErr w:type="spellEnd"/>
@@ -27811,57 +27490,10 @@
           <w:p>
             <w:pPr>
               <w:pStyle w:val="NoSpacing"/>
-              <w:cnfStyle w:val="000000100000" w:firstRow="0" w:lastRow="0" w:firstColumn="0" w:lastColumn="0" w:oddVBand="0" w:evenVBand="0" w:oddHBand="1" w:evenHBand="0" w:firstRowFirstColumn="0" w:firstRowLastColumn="0" w:lastRowFirstColumn="0" w:lastRowLastColumn="0"/>
-            </w:pPr>
-            <w:r>
-              <w:t>The number of rho values sampled</w:t>
-            </w:r>
-          </w:p>
-        </w:tc>
-      </w:tr>
-      <w:tr>
-        <w:tc>
-          <w:tcPr>
-            <w:cnfStyle w:val="001000000000" w:firstRow="0" w:lastRow="0" w:firstColumn="1" w:lastColumn="0" w:oddVBand="0" w:evenVBand="0" w:oddHBand="0" w:evenHBand="0" w:firstRowFirstColumn="0" w:firstRowLastColumn="0" w:lastRowFirstColumn="0" w:lastRowLastColumn="0"/>
-            <w:tcW w:w="0" w:type="auto"/>
-          </w:tcPr>
-          <w:p>
-            <w:pPr>
-              <w:pStyle w:val="NoSpacing"/>
-              <w:rPr>
-                <w:b w:val="0"/>
-                <w:bCs w:val="0"/>
-              </w:rPr>
-            </w:pPr>
-            <w:r>
-              <w:rPr>
-                <w:b w:val="0"/>
-                <w:bCs w:val="0"/>
-              </w:rPr>
-              <w:t xml:space="preserve">bin </w:t>
-            </w:r>
-            <w:proofErr w:type="spellStart"/>
-            <w:r>
-              <w:rPr>
-                <w:b w:val="0"/>
-                <w:bCs w:val="0"/>
-              </w:rPr>
-              <w:t>min_count</w:t>
-            </w:r>
-            <w:proofErr w:type="spellEnd"/>
-          </w:p>
-        </w:tc>
-        <w:tc>
-          <w:tcPr>
-            <w:tcW w:w="0" w:type="auto"/>
-          </w:tcPr>
-          <w:p>
-            <w:pPr>
-              <w:pStyle w:val="NoSpacing"/>
               <w:cnfStyle w:val="000000000000" w:firstRow="0" w:lastRow="0" w:firstColumn="0" w:lastColumn="0" w:oddVBand="0" w:evenVBand="0" w:oddHBand="0" w:evenHBand="0" w:firstRowFirstColumn="0" w:firstRowLastColumn="0" w:lastRowFirstColumn="0" w:lastRowLastColumn="0"/>
             </w:pPr>
             <w:r>
-              <w:t>The lowest count for any histogram bin</w:t>
+              <w:t>number of rho values sampled</w:t>
             </w:r>
           </w:p>
         </w:tc>
@@ -27896,6 +27528,53 @@
                 <w:b w:val="0"/>
                 <w:bCs w:val="0"/>
               </w:rPr>
+              <w:t>min_count</w:t>
+            </w:r>
+            <w:proofErr w:type="spellEnd"/>
+          </w:p>
+        </w:tc>
+        <w:tc>
+          <w:tcPr>
+            <w:tcW w:w="0" w:type="auto"/>
+          </w:tcPr>
+          <w:p>
+            <w:pPr>
+              <w:pStyle w:val="NoSpacing"/>
+              <w:cnfStyle w:val="000000100000" w:firstRow="0" w:lastRow="0" w:firstColumn="0" w:lastColumn="0" w:oddVBand="0" w:evenVBand="0" w:oddHBand="1" w:evenHBand="0" w:firstRowFirstColumn="0" w:firstRowLastColumn="0" w:lastRowFirstColumn="0" w:lastRowLastColumn="0"/>
+            </w:pPr>
+            <w:r>
+              <w:t>lowest count for any histogram bin</w:t>
+            </w:r>
+          </w:p>
+        </w:tc>
+      </w:tr>
+      <w:tr>
+        <w:tc>
+          <w:tcPr>
+            <w:cnfStyle w:val="001000000000" w:firstRow="0" w:lastRow="0" w:firstColumn="1" w:lastColumn="0" w:oddVBand="0" w:evenVBand="0" w:oddHBand="0" w:evenHBand="0" w:firstRowFirstColumn="0" w:firstRowLastColumn="0" w:lastRowFirstColumn="0" w:lastRowLastColumn="0"/>
+            <w:tcW w:w="0" w:type="auto"/>
+          </w:tcPr>
+          <w:p>
+            <w:pPr>
+              <w:pStyle w:val="NoSpacing"/>
+              <w:rPr>
+                <w:b w:val="0"/>
+                <w:bCs w:val="0"/>
+              </w:rPr>
+            </w:pPr>
+            <w:r>
+              <w:rPr>
+                <w:b w:val="0"/>
+                <w:bCs w:val="0"/>
+              </w:rPr>
+              <w:t xml:space="preserve">bin </w:t>
+            </w:r>
+            <w:proofErr w:type="spellStart"/>
+            <w:r>
+              <w:rPr>
+                <w:b w:val="0"/>
+                <w:bCs w:val="0"/>
+              </w:rPr>
               <w:t>max_count</w:t>
             </w:r>
             <w:proofErr w:type="spellEnd"/>
@@ -27908,56 +27587,10 @@
           <w:p>
             <w:pPr>
               <w:pStyle w:val="NoSpacing"/>
-              <w:cnfStyle w:val="000000100000" w:firstRow="0" w:lastRow="0" w:firstColumn="0" w:lastColumn="0" w:oddVBand="0" w:evenVBand="0" w:oddHBand="1" w:evenHBand="0" w:firstRowFirstColumn="0" w:firstRowLastColumn="0" w:lastRowFirstColumn="0" w:lastRowLastColumn="0"/>
-            </w:pPr>
-            <w:r>
-              <w:t>The largest count for any histogram bin</w:t>
-            </w:r>
-          </w:p>
-        </w:tc>
-      </w:tr>
-      <w:tr>
-        <w:tc>
-          <w:tcPr>
-            <w:cnfStyle w:val="001000000000" w:firstRow="0" w:lastRow="0" w:firstColumn="1" w:lastColumn="0" w:oddVBand="0" w:evenVBand="0" w:oddHBand="0" w:evenHBand="0" w:firstRowFirstColumn="0" w:firstRowLastColumn="0" w:lastRowFirstColumn="0" w:lastRowLastColumn="0"/>
-            <w:tcW w:w="0" w:type="auto"/>
-          </w:tcPr>
-          <w:p>
-            <w:pPr>
-              <w:pStyle w:val="NoSpacing"/>
-              <w:rPr>
-                <w:b w:val="0"/>
-                <w:bCs w:val="0"/>
-              </w:rPr>
-            </w:pPr>
-            <w:r>
-              <w:rPr>
-                <w:b w:val="0"/>
-                <w:bCs w:val="0"/>
-              </w:rPr>
-              <w:t>bin mean</w:t>
-            </w:r>
-          </w:p>
-        </w:tc>
-        <w:tc>
-          <w:tcPr>
-            <w:tcW w:w="0" w:type="auto"/>
-          </w:tcPr>
-          <w:p>
-            <w:pPr>
-              <w:pStyle w:val="NoSpacing"/>
               <w:cnfStyle w:val="000000000000" w:firstRow="0" w:lastRow="0" w:firstColumn="0" w:lastColumn="0" w:oddVBand="0" w:evenVBand="0" w:oddHBand="0" w:evenHBand="0" w:firstRowFirstColumn="0" w:firstRowLastColumn="0" w:lastRowFirstColumn="0" w:lastRowLastColumn="0"/>
             </w:pPr>
             <w:r>
-              <w:t xml:space="preserve">The mean for the </w:t>
-            </w:r>
-            <w:proofErr w:type="spellStart"/>
-            <w:r>
-              <w:t>hough</w:t>
-            </w:r>
-            <w:proofErr w:type="spellEnd"/>
-            <w:r>
-              <w:t xml:space="preserve"> accumulator counts</w:t>
+              <w:t>largest count for any histogram bin</w:t>
             </w:r>
           </w:p>
         </w:tc>
@@ -27984,6 +27617,52 @@
                 <w:b w:val="0"/>
                 <w:bCs w:val="0"/>
               </w:rPr>
+              <w:t>bin mean</w:t>
+            </w:r>
+          </w:p>
+        </w:tc>
+        <w:tc>
+          <w:tcPr>
+            <w:tcW w:w="0" w:type="auto"/>
+          </w:tcPr>
+          <w:p>
+            <w:pPr>
+              <w:pStyle w:val="NoSpacing"/>
+              <w:cnfStyle w:val="000000100000" w:firstRow="0" w:lastRow="0" w:firstColumn="0" w:lastColumn="0" w:oddVBand="0" w:evenVBand="0" w:oddHBand="1" w:evenHBand="0" w:firstRowFirstColumn="0" w:firstRowLastColumn="0" w:lastRowFirstColumn="0" w:lastRowLastColumn="0"/>
+            </w:pPr>
+            <w:r>
+              <w:t xml:space="preserve">mean for </w:t>
+            </w:r>
+            <w:proofErr w:type="spellStart"/>
+            <w:r>
+              <w:t>hough</w:t>
+            </w:r>
+            <w:proofErr w:type="spellEnd"/>
+            <w:r>
+              <w:t xml:space="preserve"> accumulator counts</w:t>
+            </w:r>
+          </w:p>
+        </w:tc>
+      </w:tr>
+      <w:tr>
+        <w:tc>
+          <w:tcPr>
+            <w:cnfStyle w:val="001000000000" w:firstRow="0" w:lastRow="0" w:firstColumn="1" w:lastColumn="0" w:oddVBand="0" w:evenVBand="0" w:oddHBand="0" w:evenHBand="0" w:firstRowFirstColumn="0" w:firstRowLastColumn="0" w:lastRowFirstColumn="0" w:lastRowLastColumn="0"/>
+            <w:tcW w:w="0" w:type="auto"/>
+          </w:tcPr>
+          <w:p>
+            <w:pPr>
+              <w:pStyle w:val="NoSpacing"/>
+              <w:rPr>
+                <w:b w:val="0"/>
+                <w:bCs w:val="0"/>
+              </w:rPr>
+            </w:pPr>
+            <w:r>
+              <w:rPr>
+                <w:b w:val="0"/>
+                <w:bCs w:val="0"/>
+              </w:rPr>
               <w:t>bin standard deviation</w:t>
             </w:r>
           </w:p>
@@ -27995,10 +27674,10 @@
           <w:p>
             <w:pPr>
               <w:pStyle w:val="NoSpacing"/>
-              <w:cnfStyle w:val="000000100000" w:firstRow="0" w:lastRow="0" w:firstColumn="0" w:lastColumn="0" w:oddVBand="0" w:evenVBand="0" w:oddHBand="1" w:evenHBand="0" w:firstRowFirstColumn="0" w:firstRowLastColumn="0" w:lastRowFirstColumn="0" w:lastRowLastColumn="0"/>
-            </w:pPr>
-            <w:r>
-              <w:t xml:space="preserve">The standard deviation for the </w:t>
+              <w:cnfStyle w:val="000000000000" w:firstRow="0" w:lastRow="0" w:firstColumn="0" w:lastColumn="0" w:oddVBand="0" w:evenVBand="0" w:oddHBand="0" w:evenHBand="0" w:firstRowFirstColumn="0" w:firstRowLastColumn="0" w:lastRowFirstColumn="0" w:lastRowLastColumn="0"/>
+            </w:pPr>
+            <w:r>
+              <w:t xml:space="preserve">standard deviation for </w:t>
             </w:r>
             <w:proofErr w:type="spellStart"/>
             <w:r>
@@ -28027,13 +27706,8 @@
     </w:p>
     <w:p>
       <w:r>
-        <w:t xml:space="preserve">The Hough peak detect operator finds polar lines (rho, theta) in the Hough accumulator data where the counts exceed a </w:t>
-      </w:r>
-      <w:proofErr w:type="gramStart"/>
-      <w:r>
-        <w:t>threshold..</w:t>
-      </w:r>
-      <w:proofErr w:type="gramEnd"/>
+        <w:t>The Hough peak detect operator finds polar lines (rho, theta) in the Hough accumulator data where the counts exceed a threshold..</w:t>
+      </w:r>
     </w:p>
     <w:p>
       <w:r>
@@ -28617,13 +28291,7 @@
               <w:cnfStyle w:val="000000100000" w:firstRow="0" w:lastRow="0" w:firstColumn="0" w:lastColumn="0" w:oddVBand="0" w:evenVBand="0" w:oddHBand="1" w:evenHBand="0" w:firstRowFirstColumn="0" w:firstRowLastColumn="0" w:lastRowFirstColumn="0" w:lastRowLastColumn="0"/>
             </w:pPr>
             <w:r>
-              <w:t xml:space="preserve">The minimum </w:t>
-            </w:r>
-            <w:r>
-              <w:t xml:space="preserve">percentage </w:t>
-            </w:r>
-            <w:r>
-              <w:t>difference between a peak and closest neighbor</w:t>
+              <w:t>The minimum percentage difference between a peak and closest neighbor</w:t>
             </w:r>
           </w:p>
         </w:tc>
@@ -29233,6 +28901,7 @@
                 <w:b w:val="0"/>
                 <w:bCs w:val="0"/>
               </w:rPr>
+              <w:lastRenderedPageBreak/>
               <w:t>percentage min</w:t>
             </w:r>
           </w:p>
@@ -29282,7 +28951,6 @@
                 <w:b w:val="0"/>
                 <w:bCs w:val="0"/>
               </w:rPr>
-              <w:lastRenderedPageBreak/>
               <w:t>percentage max</w:t>
             </w:r>
           </w:p>
@@ -29416,25 +29084,12 @@
     </w:p>
     <w:p>
       <w:r>
-        <w:t xml:space="preserve">The transform image combine operator does a linear recombination of two images. The formula for the output values </w:t>
-      </w:r>
-      <w:proofErr w:type="gramStart"/>
-      <w:r>
-        <w:t>are</w:t>
-      </w:r>
-      <w:proofErr w:type="gramEnd"/>
-      <w:r>
-        <w:t>:</w:t>
-      </w:r>
-    </w:p>
-    <w:p>
-      <w:proofErr w:type="gramStart"/>
-      <w:r>
-        <w:t>output(</w:t>
-      </w:r>
-      <w:proofErr w:type="gramEnd"/>
-      <w:r>
-        <w:t>row, col) = scale</w:t>
+        <w:t>The transform image combine operator does a linear recombination of two images. The formula for the output values are:</w:t>
+      </w:r>
+    </w:p>
+    <w:p>
+      <w:r>
+        <w:t>output(row, col) = scale</w:t>
       </w:r>
       <w:r>
         <w:rPr>
@@ -29881,7 +29536,6 @@
                 <w:bCs w:val="0"/>
               </w:rPr>
             </w:pPr>
-            <w:proofErr w:type="gramStart"/>
             <w:r>
               <w:rPr>
                 <w:b w:val="0"/>
@@ -29889,7 +29543,6 @@
               </w:rPr>
               <w:t>scale-1</w:t>
             </w:r>
-            <w:proofErr w:type="gramEnd"/>
           </w:p>
         </w:tc>
         <w:tc>
@@ -29934,7 +29587,6 @@
                 <w:bCs w:val="0"/>
               </w:rPr>
             </w:pPr>
-            <w:proofErr w:type="gramStart"/>
             <w:r>
               <w:rPr>
                 <w:b w:val="0"/>
@@ -29942,7 +29594,6 @@
               </w:rPr>
               <w:t>scale-2</w:t>
             </w:r>
-            <w:proofErr w:type="gramEnd"/>
           </w:p>
         </w:tc>
         <w:tc>
@@ -30093,7 +29744,6 @@
                 <w:bCs w:val="0"/>
               </w:rPr>
             </w:pPr>
-            <w:proofErr w:type="gramStart"/>
             <w:r>
               <w:rPr>
                 <w:b w:val="0"/>
@@ -30101,7 +29751,6 @@
               </w:rPr>
               <w:t>max-row</w:t>
             </w:r>
-            <w:proofErr w:type="gramEnd"/>
           </w:p>
         </w:tc>
         <w:tc>
@@ -30196,7 +29845,6 @@
                 <w:bCs w:val="0"/>
               </w:rPr>
             </w:pPr>
-            <w:proofErr w:type="gramStart"/>
             <w:r>
               <w:rPr>
                 <w:b w:val="0"/>
@@ -30204,7 +29852,6 @@
               </w:rPr>
               <w:t>max-col</w:t>
             </w:r>
-            <w:proofErr w:type="gramEnd"/>
           </w:p>
         </w:tc>
         <w:tc>
@@ -31785,15 +31432,7 @@
         </w:numPr>
       </w:pPr>
       <w:r>
-        <w:t xml:space="preserve">If a text input file is specified, each line consists of space or tab delimited numeric intensities. The number of rows is the number of lines in the file. The number of columns is the number of fields on each line. The number of fields must be the same on each line. If the output format is JPEG, field values outside the range of </w:t>
-      </w:r>
-      <w:proofErr w:type="gramStart"/>
-      <w:r>
-        <w:t>0..</w:t>
-      </w:r>
-      <w:proofErr w:type="gramEnd"/>
-      <w:r>
-        <w:t xml:space="preserve">255 will be truncated. </w:t>
+        <w:t xml:space="preserve">If a text input file is specified, each line consists of space or tab delimited numeric intensities. The number of rows is the number of lines in the file. The number of columns is the number of fields on each line. The number of fields must be the same on each line. If the output format is JPEG, field values outside the range of 0..255 will be truncated. </w:t>
       </w:r>
     </w:p>
     <w:tbl>
@@ -32367,12 +32006,10 @@
               <w:t>A point to add to the image as ‘</w:t>
             </w:r>
             <w:proofErr w:type="spellStart"/>
-            <w:proofErr w:type="gramStart"/>
             <w:r>
               <w:t>row,col</w:t>
             </w:r>
             <w:proofErr w:type="spellEnd"/>
-            <w:proofErr w:type="gramEnd"/>
             <w:r>
               <w:t>’</w:t>
             </w:r>
@@ -32428,12 +32065,10 @@
               <w:t>A line segment ‘(</w:t>
             </w:r>
             <w:proofErr w:type="spellStart"/>
-            <w:proofErr w:type="gramStart"/>
             <w:r>
               <w:t>row,col</w:t>
             </w:r>
             <w:proofErr w:type="spellEnd"/>
-            <w:proofErr w:type="gramEnd"/>
             <w:r>
               <w:t>):(</w:t>
             </w:r>
@@ -32515,12 +32150,10 @@
               <w:t>A rectangle ‘(</w:t>
             </w:r>
             <w:proofErr w:type="spellStart"/>
-            <w:proofErr w:type="gramStart"/>
             <w:r>
               <w:t>row,col</w:t>
             </w:r>
             <w:proofErr w:type="spellEnd"/>
-            <w:proofErr w:type="gramEnd"/>
             <w:r>
               <w:t>):(</w:t>
             </w:r>
@@ -32597,15 +32230,7 @@
               <w:cnfStyle w:val="000000000000" w:firstRow="0" w:lastRow="0" w:firstColumn="0" w:lastColumn="0" w:oddVBand="0" w:evenVBand="0" w:oddHBand="0" w:evenHBand="0" w:firstRowFirstColumn="0" w:firstRowLastColumn="0" w:lastRowFirstColumn="0" w:lastRowLastColumn="0"/>
             </w:pPr>
             <w:r>
-              <w:t xml:space="preserve">Similar to the ‘rectangle’ </w:t>
-            </w:r>
-            <w:proofErr w:type="gramStart"/>
-            <w:r>
-              <w:t>parameter, but</w:t>
-            </w:r>
-            <w:proofErr w:type="gramEnd"/>
-            <w:r>
-              <w:t xml:space="preserve"> creates a filled rectangle.</w:t>
+              <w:t>Similar to the ‘rectangle’ parameter, but creates a filled rectangle.</w:t>
             </w:r>
           </w:p>
         </w:tc>
@@ -32675,7 +32300,6 @@
                 <w:bCs w:val="0"/>
               </w:rPr>
             </w:pPr>
-            <w:proofErr w:type="gramStart"/>
             <w:r>
               <w:rPr>
                 <w:b w:val="0"/>
@@ -32683,7 +32307,6 @@
               </w:rPr>
               <w:t>max-row</w:t>
             </w:r>
-            <w:proofErr w:type="gramEnd"/>
           </w:p>
         </w:tc>
         <w:tc>
@@ -32778,7 +32401,6 @@
                 <w:bCs w:val="0"/>
               </w:rPr>
             </w:pPr>
-            <w:proofErr w:type="gramStart"/>
             <w:r>
               <w:rPr>
                 <w:b w:val="0"/>
@@ -32786,7 +32408,6 @@
               </w:rPr>
               <w:t>max-col</w:t>
             </w:r>
-            <w:proofErr w:type="gramEnd"/>
           </w:p>
         </w:tc>
         <w:tc>
@@ -32833,7 +32454,6 @@
         <w:t>“point”: “(</w:t>
       </w:r>
       <w:proofErr w:type="spellStart"/>
-      <w:proofErr w:type="gramStart"/>
       <w:r>
         <w:rPr>
           <w:i/>
@@ -32852,7 +32472,6 @@
         <w:t>col</w:t>
       </w:r>
       <w:proofErr w:type="spellEnd"/>
-      <w:proofErr w:type="gramEnd"/>
       <w:r>
         <w:t>)|(</w:t>
       </w:r>
@@ -32888,7 +32507,6 @@
         <w:t>“line”: “(</w:t>
       </w:r>
       <w:proofErr w:type="spellStart"/>
-      <w:proofErr w:type="gramStart"/>
       <w:r>
         <w:rPr>
           <w:i/>
@@ -32907,7 +32525,6 @@
         <w:t>col</w:t>
       </w:r>
       <w:proofErr w:type="spellEnd"/>
-      <w:proofErr w:type="gramEnd"/>
       <w:r>
         <w:t>):(</w:t>
       </w:r>
@@ -32986,7 +32603,6 @@
         <w:t>“rectangle”: “(</w:t>
       </w:r>
       <w:proofErr w:type="spellStart"/>
-      <w:proofErr w:type="gramStart"/>
       <w:r>
         <w:rPr>
           <w:i/>
@@ -33005,7 +32621,6 @@
         <w:t>col</w:t>
       </w:r>
       <w:proofErr w:type="spellEnd"/>
-      <w:proofErr w:type="gramEnd"/>
       <w:r>
         <w:t>):(</w:t>
       </w:r>
@@ -33557,15 +33172,7 @@
       </w:r>
       <w:proofErr w:type="spellEnd"/>
       <w:r>
-        <w:t xml:space="preserve"> is the output pixel value for input pixel values &gt;= threshold. Values for JPEG output images will be CV_8U and truncated to </w:t>
-      </w:r>
-      <w:proofErr w:type="gramStart"/>
-      <w:r>
-        <w:t>0..</w:t>
-      </w:r>
-      <w:proofErr w:type="gramEnd"/>
-      <w:r>
-        <w:t>255.</w:t>
+        <w:t xml:space="preserve"> is the output pixel value for input pixel values &gt;= threshold. Values for JPEG output images will be CV_8U and truncated to 0..255.</w:t>
       </w:r>
     </w:p>
     <w:p>
@@ -34207,7 +33814,6 @@
                 <w:bCs w:val="0"/>
               </w:rPr>
             </w:pPr>
-            <w:proofErr w:type="gramStart"/>
             <w:r>
               <w:rPr>
                 <w:b w:val="0"/>
@@ -34216,7 +33822,6 @@
               <w:lastRenderedPageBreak/>
               <w:t>max-row</w:t>
             </w:r>
-            <w:proofErr w:type="gramEnd"/>
           </w:p>
         </w:tc>
         <w:tc>
@@ -34311,7 +33916,6 @@
                 <w:bCs w:val="0"/>
               </w:rPr>
             </w:pPr>
-            <w:proofErr w:type="gramStart"/>
             <w:r>
               <w:rPr>
                 <w:b w:val="0"/>
@@ -34319,7 +33923,6 @@
               </w:rPr>
               <w:t>max-col</w:t>
             </w:r>
-            <w:proofErr w:type="gramEnd"/>
           </w:p>
         </w:tc>
         <w:tc>
@@ -34960,15 +34563,7 @@
     </w:p>
     <w:p>
       <w:r>
-        <w:t xml:space="preserve">There are </w:t>
-      </w:r>
-      <w:proofErr w:type="gramStart"/>
-      <w:r>
-        <w:t>a number of</w:t>
-      </w:r>
-      <w:proofErr w:type="gramEnd"/>
-      <w:r>
-        <w:t xml:space="preserve"> CV-workbench programs included in the </w:t>
+        <w:t xml:space="preserve">There are a number of CV-workbench programs included in the </w:t>
       </w:r>
       <w:r>
         <w:rPr>
@@ -35081,14 +34676,7 @@
       </w:pPr>
       <w:r>
         <w:br/>
-      </w:r>
-      <w:proofErr w:type="gramStart"/>
-      <w:r>
-        <w:t>$ .</w:t>
-      </w:r>
-      <w:proofErr w:type="gramEnd"/>
-      <w:r>
-        <w:t xml:space="preserve">/cv-workbench </w:t>
+        <w:t xml:space="preserve">$ ./cv-workbench </w:t>
       </w:r>
       <w:r>
         <w:rPr>
@@ -35135,13 +34723,8 @@
       <w:pPr>
         <w:pStyle w:val="Code"/>
       </w:pPr>
-      <w:proofErr w:type="gramStart"/>
-      <w:r>
-        <w:t>$./</w:t>
-      </w:r>
-      <w:proofErr w:type="gramEnd"/>
-      <w:r>
-        <w:t xml:space="preserve">image-copy </w:t>
+      <w:r>
+        <w:t xml:space="preserve">$./image-copy </w:t>
       </w:r>
       <w:proofErr w:type="spellStart"/>
       <w:r>
@@ -35274,7 +34857,6 @@
                 <w:bCs w:val="0"/>
               </w:rPr>
             </w:pPr>
-            <w:proofErr w:type="gramStart"/>
             <w:r>
               <w:rPr>
                 <w:b w:val="0"/>
@@ -35282,7 +34864,6 @@
               </w:rPr>
               <w:t>max-row</w:t>
             </w:r>
-            <w:proofErr w:type="gramEnd"/>
           </w:p>
         </w:tc>
         <w:tc>
@@ -35351,7 +34932,6 @@
                 <w:bCs w:val="0"/>
               </w:rPr>
             </w:pPr>
-            <w:proofErr w:type="gramStart"/>
             <w:r>
               <w:rPr>
                 <w:b w:val="0"/>
@@ -35359,7 +34939,6 @@
               </w:rPr>
               <w:t>max-col</w:t>
             </w:r>
-            <w:proofErr w:type="gramEnd"/>
           </w:p>
         </w:tc>
         <w:tc>
@@ -35394,13 +34973,8 @@
       <w:pPr>
         <w:pStyle w:val="Code"/>
       </w:pPr>
-      <w:proofErr w:type="gramStart"/>
-      <w:r>
-        <w:t>$ .</w:t>
-      </w:r>
-      <w:proofErr w:type="gramEnd"/>
-      <w:r>
-        <w:t xml:space="preserve">/image-dump </w:t>
+      <w:r>
+        <w:t xml:space="preserve">$ ./image-dump </w:t>
       </w:r>
       <w:r>
         <w:rPr>
@@ -35500,13 +35074,8 @@
           <w:iCs/>
         </w:rPr>
       </w:pPr>
-      <w:proofErr w:type="gramStart"/>
-      <w:r>
-        <w:t>$ .</w:t>
-      </w:r>
-      <w:proofErr w:type="gramEnd"/>
-      <w:r>
-        <w:t xml:space="preserve">/image-info </w:t>
+      <w:r>
+        <w:t xml:space="preserve">$ ./image-info </w:t>
       </w:r>
       <w:r>
         <w:rPr>
@@ -35552,28 +35121,15 @@
         <w:t>in-filename</w:t>
       </w:r>
       <w:r>
-        <w:t xml:space="preserve"> has a “.jpg” or “.bin” extension to indicate whether it is a JPEG image file or a binary internal format image file. It writes statistics of the image </w:t>
-      </w:r>
-      <w:proofErr w:type="gramStart"/>
-      <w:r>
-        <w:t>similar to</w:t>
-      </w:r>
-      <w:proofErr w:type="gramEnd"/>
-      <w:r>
-        <w:t xml:space="preserve"> this:</w:t>
+        <w:t xml:space="preserve"> has a “.jpg” or “.bin” extension to indicate whether it is a JPEG image file or a binary internal format image file. It writes statistics of the image similar to this:</w:t>
       </w:r>
     </w:p>
     <w:p>
       <w:pPr>
         <w:pStyle w:val="Code"/>
       </w:pPr>
-      <w:proofErr w:type="gramStart"/>
-      <w:r>
-        <w:t>$ .</w:t>
-      </w:r>
-      <w:proofErr w:type="gramEnd"/>
-      <w:r>
-        <w:t>/image-info test/reference/du_map_gray.jpg</w:t>
+      <w:r>
+        <w:t>$ ./image-info test/reference/du_map_gray.jpg</w:t>
       </w:r>
     </w:p>
     <w:p>
@@ -35790,13 +35346,8 @@
         <w:pStyle w:val="Code"/>
       </w:pPr>
       <w:r>
-        <w:t xml:space="preserve">        standard </w:t>
-      </w:r>
-      <w:proofErr w:type="gramStart"/>
-      <w:r>
-        <w:t>deviation  33.5635</w:t>
-      </w:r>
-      <w:proofErr w:type="gramEnd"/>
+        <w:t xml:space="preserve">        standard deviation  33.5635</w:t>
+      </w:r>
     </w:p>
     <w:p>
       <w:pPr>
@@ -35831,13 +35382,8 @@
       <w:pPr>
         <w:pStyle w:val="Code"/>
       </w:pPr>
-      <w:proofErr w:type="gramStart"/>
-      <w:r>
-        <w:t>$ .</w:t>
-      </w:r>
-      <w:proofErr w:type="gramEnd"/>
-      <w:r>
-        <w:t xml:space="preserve">/image-map </w:t>
+      <w:r>
+        <w:t xml:space="preserve">$ ./image-map </w:t>
       </w:r>
       <w:proofErr w:type="spellStart"/>
       <w:r>
@@ -35884,28 +35430,15 @@
     </w:p>
     <w:p>
       <w:r>
-        <w:t xml:space="preserve">This is a program that tests the filter-image-morphology operator. It is </w:t>
-      </w:r>
-      <w:proofErr w:type="gramStart"/>
-      <w:r>
-        <w:t>runs</w:t>
-      </w:r>
-      <w:proofErr w:type="gramEnd"/>
-      <w:r>
-        <w:t xml:space="preserve"> all morphology operators on the input image with:</w:t>
+        <w:t>This is a program that tests the filter-image-morphology operator. It is runs all morphology operators on the input image with:</w:t>
       </w:r>
     </w:p>
     <w:p>
       <w:pPr>
         <w:pStyle w:val="Code"/>
       </w:pPr>
-      <w:proofErr w:type="gramStart"/>
-      <w:r>
-        <w:t>$ .</w:t>
-      </w:r>
-      <w:proofErr w:type="gramEnd"/>
-      <w:r>
-        <w:t xml:space="preserve">/image-morph </w:t>
+      <w:r>
+        <w:t xml:space="preserve">$ ./image-morph </w:t>
       </w:r>
       <w:proofErr w:type="spellStart"/>
       <w:r>
@@ -35959,13 +35492,8 @@
       <w:pPr>
         <w:pStyle w:val="Code"/>
       </w:pPr>
-      <w:proofErr w:type="gramStart"/>
-      <w:r>
-        <w:t>$ .</w:t>
-      </w:r>
-      <w:proofErr w:type="gramEnd"/>
-      <w:r>
-        <w:t xml:space="preserve">/image-read </w:t>
+      <w:r>
+        <w:t xml:space="preserve">$ ./image-read </w:t>
       </w:r>
       <w:r>
         <w:rPr>
@@ -36035,13 +35563,8 @@
       <w:pPr>
         <w:pStyle w:val="Code"/>
       </w:pPr>
-      <w:proofErr w:type="gramStart"/>
-      <w:r>
-        <w:t>./</w:t>
-      </w:r>
-      <w:proofErr w:type="gramEnd"/>
-      <w:r>
-        <w:t xml:space="preserve">image-trig </w:t>
+      <w:r>
+        <w:t xml:space="preserve">./image-trig </w:t>
       </w:r>
     </w:p>
     <w:p>
@@ -36065,14 +35588,7 @@
       </w:pPr>
       <w:r>
         <w:br/>
-      </w:r>
-      <w:proofErr w:type="gramStart"/>
-      <w:r>
-        <w:t>$ .</w:t>
-      </w:r>
-      <w:proofErr w:type="gramEnd"/>
-      <w:r>
-        <w:t>/</w:t>
+        <w:t>$ ./</w:t>
       </w:r>
       <w:proofErr w:type="spellStart"/>
       <w:r>
@@ -36080,8 +35596,21 @@
       </w:r>
       <w:proofErr w:type="spellEnd"/>
       <w:r>
-        <w:t xml:space="preserve"> in-filename.jpg &gt;out-filename.jpg</w:t>
-      </w:r>
+        <w:t xml:space="preserve"> in-</w:t>
+      </w:r>
+      <w:proofErr w:type="spellStart"/>
+      <w:r>
+        <w:t>filename.jpg</w:t>
+      </w:r>
+      <w:proofErr w:type="spellEnd"/>
+      <w:r>
+        <w:t xml:space="preserve"> &gt;out-</w:t>
+      </w:r>
+      <w:proofErr w:type="spellStart"/>
+      <w:r>
+        <w:t>filename.jpg</w:t>
+      </w:r>
+      <w:proofErr w:type="spellEnd"/>
     </w:p>
     <w:p>
       <w:pPr>
@@ -36178,7 +35707,7 @@
       <w:rPr>
         <w:noProof/>
       </w:rPr>
-      <w:t>9/14/2022 3:19 PM</w:t>
+      <w:t>9/20/2022 2:43 PM</w:t>
     </w:r>
     <w:r>
       <w:fldChar w:fldCharType="end"/>
@@ -36238,7 +35767,7 @@
       <w:rPr>
         <w:noProof/>
       </w:rPr>
-      <w:t>9/14/2022 3:19 PM</w:t>
+      <w:t>9/20/2022 2:43 PM</w:t>
     </w:r>
     <w:r>
       <w:fldChar w:fldCharType="end"/>

</xml_diff>

<commit_message>
fixed hough-peaks exper; added filter-smooth-gaussian exper
</commit_message>
<xml_diff>
--- a/doc/cv-workbench manual.docx
+++ b/doc/cv-workbench manual.docx
@@ -77,7 +77,15 @@
         </w:numPr>
       </w:pPr>
       <w:r>
-        <w:t xml:space="preserve">Users write scripts that allow exactly reproducing results and running operations on different sets of data, and are easily changed and reused to try different operations with differ parameter settings. </w:t>
+        <w:t xml:space="preserve">Users write scripts that allow exactly reproducing results and running operations on different sets of </w:t>
+      </w:r>
+      <w:proofErr w:type="gramStart"/>
+      <w:r>
+        <w:t>data, and</w:t>
+      </w:r>
+      <w:proofErr w:type="gramEnd"/>
+      <w:r>
+        <w:t xml:space="preserve"> are easily changed and reused to try different operations with differ parameter settings. </w:t>
       </w:r>
     </w:p>
     <w:p>
@@ -109,7 +117,15 @@
         </w:r>
       </w:hyperlink>
       <w:r>
-        <w:t>. What you need to learn isn’t hard. Apple MacOS is similar to Linux but will not run CV Workbench natively. Versions to run on MacOS and Windows can be produced eventually.</w:t>
+        <w:t xml:space="preserve">. What you need to learn isn’t hard. Apple MacOS is </w:t>
+      </w:r>
+      <w:proofErr w:type="gramStart"/>
+      <w:r>
+        <w:t>similar to</w:t>
+      </w:r>
+      <w:proofErr w:type="gramEnd"/>
+      <w:r>
+        <w:t xml:space="preserve"> Linux but will not run CV Workbench natively. Versions to run on MacOS and Windows can be produced eventually.</w:t>
       </w:r>
     </w:p>
     <w:p>
@@ -754,7 +770,15 @@
               <w:cnfStyle w:val="000000100000" w:firstRow="0" w:lastRow="0" w:firstColumn="0" w:lastColumn="0" w:oddVBand="0" w:evenVBand="0" w:oddHBand="1" w:evenHBand="0" w:firstRowFirstColumn="0" w:firstRowLastColumn="0" w:lastRowFirstColumn="0" w:lastRowLastColumn="0"/>
             </w:pPr>
             <w:r>
-              <w:t>These are various different image operations including:</w:t>
+              <w:t xml:space="preserve">These are </w:t>
+            </w:r>
+            <w:proofErr w:type="gramStart"/>
+            <w:r>
+              <w:t>various different</w:t>
+            </w:r>
+            <w:proofErr w:type="gramEnd"/>
+            <w:r>
+              <w:t xml:space="preserve"> image operations including:</w:t>
             </w:r>
           </w:p>
           <w:p>
@@ -847,7 +871,7 @@
           <w:noProof/>
         </w:rPr>
         <w:drawing>
-          <wp:inline distT="0" distB="0" distL="0" distR="0">
+          <wp:inline distT="0" distB="0" distL="0" distR="0" wp14:anchorId="036F9854" wp14:editId="6B337121">
             <wp:extent cx="5497384" cy="2235200"/>
             <wp:effectExtent l="0" t="0" r="8255" b="0"/>
             <wp:docPr id="1" name="Picture 1"/>
@@ -903,7 +927,15 @@
         </w:r>
       </w:hyperlink>
       <w:r>
-        <w:t xml:space="preserve"> are frequency distributions of image or other data values. Histograms consist of a number of bins, where each bin contains counts for a range of values. This diagram shows how histograms are calculated.</w:t>
+        <w:t xml:space="preserve"> are frequency distributions of image or other data values. Histograms consist of </w:t>
+      </w:r>
+      <w:proofErr w:type="gramStart"/>
+      <w:r>
+        <w:t>a number of</w:t>
+      </w:r>
+      <w:proofErr w:type="gramEnd"/>
+      <w:r>
+        <w:t xml:space="preserve"> bins, where each bin contains counts for a range of values. This diagram shows how histograms are calculated.</w:t>
       </w:r>
     </w:p>
     <w:p>
@@ -1056,7 +1088,7 @@
         </w:rPr>
         <w:lastRenderedPageBreak/>
         <w:drawing>
-          <wp:inline distT="0" distB="0" distL="0" distR="0">
+          <wp:inline distT="0" distB="0" distL="0" distR="0" wp14:anchorId="2F87FC0C" wp14:editId="0EDD11FC">
             <wp:extent cx="4210050" cy="3520070"/>
             <wp:effectExtent l="0" t="0" r="0" b="4445"/>
             <wp:docPr id="5" name="Picture 5"/>
@@ -1558,7 +1590,15 @@
         <w:sym w:font="Symbol" w:char="F0B0"/>
       </w:r>
       <w:r>
-        <w:t>, with a fixed increment between angles, is tested. The lines are counted and the most common ones correspond to the strongest lines in the image.</w:t>
+        <w:t xml:space="preserve">, with a fixed increment between angles, is tested. The lines are </w:t>
+      </w:r>
+      <w:proofErr w:type="gramStart"/>
+      <w:r>
+        <w:t>counted</w:t>
+      </w:r>
+      <w:proofErr w:type="gramEnd"/>
+      <w:r>
+        <w:t xml:space="preserve"> and the most common ones correspond to the strongest lines in the image.</w:t>
       </w:r>
     </w:p>
     <w:p>
@@ -1568,7 +1608,7 @@
         </w:rPr>
         <w:lastRenderedPageBreak/>
         <w:drawing>
-          <wp:inline distT="0" distB="0" distL="0" distR="0">
+          <wp:inline distT="0" distB="0" distL="0" distR="0" wp14:anchorId="520797CF" wp14:editId="0857C0EF">
             <wp:extent cx="4570275" cy="3106420"/>
             <wp:effectExtent l="0" t="0" r="1905" b="0"/>
             <wp:docPr id="6" name="Picture 6"/>
@@ -1704,7 +1744,31 @@
         <w:fldChar w:fldCharType="end"/>
       </w:r>
       <w:r>
-        <w:t xml:space="preserve">. Image data saved as unsigned 8 bit values can be visualized as a JPEG image. Much of the data is stored in signed integer for floating point format because the data values involved lie outside the unsigned 8 bit range of 0 to 255. On saving data values outside the range of 0 to 255 in unsigned 8 bit images, the exact value saved in undefined. Other data formats include tab-delimited text output that is viewable in Microsoft Excel or </w:t>
+        <w:t xml:space="preserve">. Image data saved as unsigned </w:t>
+      </w:r>
+      <w:proofErr w:type="gramStart"/>
+      <w:r>
+        <w:t>8 bit</w:t>
+      </w:r>
+      <w:proofErr w:type="gramEnd"/>
+      <w:r>
+        <w:t xml:space="preserve"> values can be visualized as a JPEG image. Much of the data is stored in signed integer for floating point format because the data values involved lie outside the unsigned </w:t>
+      </w:r>
+      <w:proofErr w:type="gramStart"/>
+      <w:r>
+        <w:t>8 bit</w:t>
+      </w:r>
+      <w:proofErr w:type="gramEnd"/>
+      <w:r>
+        <w:t xml:space="preserve"> range of 0 to 255. On saving data values outside the range of 0 to 255 in unsigned </w:t>
+      </w:r>
+      <w:proofErr w:type="gramStart"/>
+      <w:r>
+        <w:t>8 bit</w:t>
+      </w:r>
+      <w:proofErr w:type="gramEnd"/>
+      <w:r>
+        <w:t xml:space="preserve"> images, the exact value saved in undefined. Other data formats include tab-delimited text output that is viewable in Microsoft Excel or </w:t>
       </w:r>
       <w:hyperlink r:id="rId17" w:history="1">
         <w:r>
@@ -2198,7 +2262,15 @@
     </w:p>
     <w:p>
       <w:r>
-        <w:t>The binary image data file format has the following format. Color RGB pixels are stored as three consecutive pixel values, one for each component. The three pixel values represent the red, green, and blue components.</w:t>
+        <w:t xml:space="preserve">The binary image data file format has the following format. Color RGB pixels are stored as three consecutive pixel values, one for each component. The </w:t>
+      </w:r>
+      <w:proofErr w:type="gramStart"/>
+      <w:r>
+        <w:t>three pixel</w:t>
+      </w:r>
+      <w:proofErr w:type="gramEnd"/>
+      <w:r>
+        <w:t xml:space="preserve"> values represent the red, green, and blue components.</w:t>
       </w:r>
     </w:p>
     <w:tbl>
@@ -2568,7 +2640,15 @@
     </w:p>
     <w:p>
       <w:r>
-        <w:t xml:space="preserve">Histograms count the number of different values for any data type containing a range of values, such as images or Hough accumulators. The histogram bins correspond to a data values ranging from a lower to an upper value. The number of histogram bins </w:t>
+        <w:t xml:space="preserve">Histograms count the number of different values for any data type containing a range of values, such as images or Hough accumulators. The histogram bins correspond to a </w:t>
+      </w:r>
+      <w:proofErr w:type="gramStart"/>
+      <w:r>
+        <w:t>data values</w:t>
+      </w:r>
+      <w:proofErr w:type="gramEnd"/>
+      <w:r>
+        <w:t xml:space="preserve"> ranging from a lower to an upper value. The number of histogram bins </w:t>
       </w:r>
       <w:proofErr w:type="spellStart"/>
       <w:r>
@@ -2686,7 +2766,15 @@
         <w:pStyle w:val="code0"/>
       </w:pPr>
       <w:r>
-        <w:t xml:space="preserve">    bin = round((</w:t>
+        <w:t xml:space="preserve">    bin = </w:t>
+      </w:r>
+      <w:proofErr w:type="gramStart"/>
+      <w:r>
+        <w:t>round(</w:t>
+      </w:r>
+      <w:proofErr w:type="gramEnd"/>
+      <w:r>
+        <w:t>(</w:t>
       </w:r>
       <w:proofErr w:type="spellStart"/>
       <w:r>
@@ -2726,7 +2814,15 @@
         <w:pStyle w:val="Normalafterlist"/>
       </w:pPr>
       <w:r>
-        <w:t>The histogram data type format indicates how histogram data is stored. There are both binary and text stored histogram formats. Binary histogram files are used only within this software. Text histogram files may visualized with gnuplot or Microsoft Excel.</w:t>
+        <w:t xml:space="preserve">The histogram data type format indicates how histogram data is stored. There are both binary and text stored histogram formats. Binary histogram files are used only within this software. Text histogram files may </w:t>
+      </w:r>
+      <w:proofErr w:type="gramStart"/>
+      <w:r>
+        <w:t>visualized</w:t>
+      </w:r>
+      <w:proofErr w:type="gramEnd"/>
+      <w:r>
+        <w:t xml:space="preserve"> with gnuplot or Microsoft Excel.</w:t>
       </w:r>
     </w:p>
     <w:p>
@@ -3146,29 +3242,25 @@
     </w:p>
     <w:p>
       <w:r>
-        <w:t xml:space="preserve">A gnuplot script file </w:t>
+        <w:t xml:space="preserve">A </w:t>
+      </w:r>
+      <w:proofErr w:type="spellStart"/>
+      <w:r>
+        <w:t>gnuplot</w:t>
+      </w:r>
+      <w:proofErr w:type="spellEnd"/>
+      <w:r>
+        <w:t xml:space="preserve"> script file </w:t>
       </w:r>
       <w:r>
         <w:rPr>
           <w:i/>
           <w:iCs/>
         </w:rPr>
-        <w:t>output-</w:t>
-      </w:r>
-      <w:proofErr w:type="spellStart"/>
-      <w:r>
-        <w:rPr>
-          <w:i/>
-          <w:iCs/>
-        </w:rPr>
-        <w:t>filename.</w:t>
-      </w:r>
-      <w:r>
-        <w:t>gp</w:t>
-      </w:r>
-      <w:proofErr w:type="spellEnd"/>
-      <w:r>
-        <w:t xml:space="preserve"> is generated to display the histogram as:</w:t>
+        <w:t>output-filename.</w:t>
+      </w:r>
+      <w:r>
+        <w:t>gp is generated to display the histogram as:</w:t>
       </w:r>
     </w:p>
     <w:p>
@@ -3194,7 +3286,15 @@
         <w:t>output-filename</w:t>
       </w:r>
       <w:r>
-        <w:t>.txt' using 2:xtic(1)</w:t>
+        <w:t xml:space="preserve">.txt' using </w:t>
+      </w:r>
+      <w:proofErr w:type="gramStart"/>
+      <w:r>
+        <w:t>2:xtic</w:t>
+      </w:r>
+      <w:proofErr w:type="gramEnd"/>
+      <w:r>
+        <w:t>(1)</w:t>
       </w:r>
     </w:p>
     <w:p>
@@ -3223,13 +3323,16 @@
         <w:pStyle w:val="code0"/>
       </w:pPr>
       <w:r>
-        <w:t xml:space="preserve">  $ gnuplot output-</w:t>
+        <w:t xml:space="preserve">  $ </w:t>
       </w:r>
       <w:proofErr w:type="spellStart"/>
       <w:r>
-        <w:t>filename.gp</w:t>
+        <w:t>gnuplot</w:t>
       </w:r>
       <w:proofErr w:type="spellEnd"/>
+      <w:r>
+        <w:t xml:space="preserve"> output-filename.gp</w:t>
+      </w:r>
     </w:p>
     <w:p>
       <w:pPr>
@@ -3613,13 +3716,7 @@
         <w:pStyle w:val="Normalafterlist"/>
       </w:pPr>
       <w:r>
-        <w:t xml:space="preserve">The number of </w:t>
-      </w:r>
-      <w:r>
-        <w:t xml:space="preserve">sampled </w:t>
-      </w:r>
-      <w:r>
-        <w:t xml:space="preserve">rho values </w:t>
+        <w:t xml:space="preserve">The number of sampled rho values </w:t>
       </w:r>
       <w:proofErr w:type="spellStart"/>
       <w:r>
@@ -3643,13 +3740,7 @@
             <w:rPr>
               <w:rFonts w:ascii="Cambria Math" w:hAnsi="Cambria Math"/>
             </w:rPr>
-            <m:t>nr</m:t>
-          </m:r>
-          <m:r>
-            <w:rPr>
-              <w:rFonts w:ascii="Cambria Math" w:hAnsi="Cambria Math"/>
-            </w:rPr>
-            <m:t xml:space="preserve">hos= </m:t>
+            <m:t xml:space="preserve">nrhos= </m:t>
           </m:r>
           <m:f>
             <m:fPr>
@@ -3664,13 +3755,7 @@
                 <w:rPr>
                   <w:rFonts w:ascii="Cambria Math" w:hAnsi="Cambria Math"/>
                 </w:rPr>
-                <m:t>max</m:t>
-              </m:r>
-              <m:r>
-                <w:rPr>
-                  <w:rFonts w:ascii="Cambria Math" w:hAnsi="Cambria Math"/>
-                </w:rPr>
-                <m:t>_rhos</m:t>
+                <m:t>max_rhos</m:t>
               </m:r>
             </m:num>
             <m:den>
@@ -3771,23 +3856,7 @@
                   <w:sz w:val="22"/>
                   <w:szCs w:val="22"/>
                 </w:rPr>
-                <m:t>max</m:t>
-              </m:r>
-              <m:r>
-                <w:rPr>
-                  <w:rFonts w:ascii="Cambria Math" w:hAnsi="Cambria Math"/>
-                  <w:sz w:val="22"/>
-                  <w:szCs w:val="22"/>
-                </w:rPr>
-                <m:t>_</m:t>
-              </m:r>
-              <m:r>
-                <w:rPr>
-                  <w:rFonts w:ascii="Cambria Math" w:hAnsi="Cambria Math"/>
-                  <w:sz w:val="22"/>
-                  <w:szCs w:val="22"/>
-                </w:rPr>
-                <m:t>rho</m:t>
+                <m:t>max_rho</m:t>
               </m:r>
             </m:num>
             <m:den>
@@ -3869,15 +3938,7 @@
                   <w:sz w:val="22"/>
                   <w:szCs w:val="22"/>
                 </w:rPr>
-                <m:t>in</m:t>
-              </m:r>
-              <m:r>
-                <w:rPr>
-                  <w:rFonts w:ascii="Cambria Math" w:hAnsi="Cambria Math"/>
-                  <w:sz w:val="22"/>
-                  <w:szCs w:val="22"/>
-                </w:rPr>
-                <m:t>c</m:t>
+                <m:t>inc</m:t>
               </m:r>
             </m:sub>
           </m:sSub>
@@ -4413,10 +4474,7 @@
               <w:cnfStyle w:val="000000000000" w:firstRow="0" w:lastRow="0" w:firstColumn="0" w:lastColumn="0" w:oddVBand="0" w:evenVBand="0" w:oddHBand="0" w:evenHBand="0" w:firstRowFirstColumn="0" w:firstRowLastColumn="0" w:lastRowFirstColumn="0" w:lastRowLastColumn="0"/>
             </w:pPr>
             <w:r>
-              <w:t xml:space="preserve">The increment between sampled </w:t>
-            </w:r>
-            <w:r>
-              <w:t>polar line distances</w:t>
+              <w:t>The increment between sampled polar line distances</w:t>
             </w:r>
           </w:p>
         </w:tc>
@@ -4817,8 +4875,13 @@
         </w:rPr>
       </w:pPr>
       <w:r>
-        <w:t>the accumulator count</w:t>
-      </w:r>
+        <w:t xml:space="preserve">the accumulator </w:t>
+      </w:r>
+      <w:proofErr w:type="gramStart"/>
+      <w:r>
+        <w:t>count</w:t>
+      </w:r>
+      <w:proofErr w:type="gramEnd"/>
     </w:p>
     <w:p>
       <w:pPr>
@@ -5268,8 +5331,13 @@
       </w:pPr>
       <w:r>
         <w:tab/>
-        <w:t xml:space="preserve">      additional-steps</w:t>
-      </w:r>
+        <w:t xml:space="preserve">      </w:t>
+      </w:r>
+      <w:proofErr w:type="gramStart"/>
+      <w:r>
+        <w:t>additional-steps</w:t>
+      </w:r>
+      <w:proofErr w:type="gramEnd"/>
     </w:p>
     <w:p>
       <w:pPr>
@@ -5376,7 +5444,15 @@
       </w:pPr>
       <w:r>
         <w:tab/>
-        <w:t xml:space="preserve">  “input-data”: [</w:t>
+        <w:t xml:space="preserve">  “</w:t>
+      </w:r>
+      <w:proofErr w:type="gramStart"/>
+      <w:r>
+        <w:t>input</w:t>
+      </w:r>
+      <w:proofErr w:type="gramEnd"/>
+      <w:r>
+        <w:t>-data”: [</w:t>
       </w:r>
     </w:p>
     <w:p>
@@ -5414,7 +5490,15 @@
       </w:pPr>
       <w:r>
         <w:tab/>
-        <w:t xml:space="preserve">  “output-data”: [</w:t>
+        <w:t xml:space="preserve">  “</w:t>
+      </w:r>
+      <w:proofErr w:type="gramStart"/>
+      <w:r>
+        <w:t>output</w:t>
+      </w:r>
+      <w:proofErr w:type="gramEnd"/>
+      <w:r>
+        <w:t>-data”: [</w:t>
       </w:r>
     </w:p>
     <w:p>
@@ -5560,6 +5644,7 @@
         <w:tab/>
         <w:t xml:space="preserve">  "type": "</w:t>
       </w:r>
+      <w:proofErr w:type="gramStart"/>
       <w:r>
         <w:rPr>
           <w:i/>
@@ -5567,6 +5652,7 @@
         </w:rPr>
         <w:t>data-type</w:t>
       </w:r>
+      <w:proofErr w:type="gramEnd"/>
       <w:r>
         <w:t>,</w:t>
       </w:r>
@@ -5660,7 +5746,15 @@
         <w:pStyle w:val="Code"/>
       </w:pPr>
       <w:r>
-        <w:t xml:space="preserve">          "parameter-name": "value"</w:t>
+        <w:t xml:space="preserve">          "</w:t>
+      </w:r>
+      <w:proofErr w:type="gramStart"/>
+      <w:r>
+        <w:t>parameter</w:t>
+      </w:r>
+      <w:proofErr w:type="gramEnd"/>
+      <w:r>
+        <w:t>-name": "value"</w:t>
       </w:r>
     </w:p>
     <w:p>
@@ -5690,6 +5784,7 @@
       <w:r>
         <w:t xml:space="preserve">The </w:t>
       </w:r>
+      <w:proofErr w:type="gramStart"/>
       <w:r>
         <w:rPr>
           <w:i/>
@@ -5697,6 +5792,7 @@
         </w:rPr>
         <w:t>data-type</w:t>
       </w:r>
+      <w:proofErr w:type="gramEnd"/>
       <w:r>
         <w:t xml:space="preserve"> describes the type of input or output object used by an image operator as described in section </w:t>
       </w:r>
@@ -5755,8 +5851,13 @@
             <w:pPr>
               <w:cnfStyle w:val="100000000000" w:firstRow="1" w:lastRow="0" w:firstColumn="0" w:lastColumn="0" w:oddVBand="0" w:evenVBand="0" w:oddHBand="0" w:evenHBand="0" w:firstRowFirstColumn="0" w:firstRowLastColumn="0" w:lastRowFirstColumn="0" w:lastRowLastColumn="0"/>
             </w:pPr>
-            <w:r>
-              <w:t xml:space="preserve">data-type </w:t>
+            <w:proofErr w:type="gramStart"/>
+            <w:r>
+              <w:t>data-type</w:t>
+            </w:r>
+            <w:proofErr w:type="gramEnd"/>
+            <w:r>
+              <w:t xml:space="preserve"> </w:t>
             </w:r>
           </w:p>
         </w:tc>
@@ -6504,12 +6605,21 @@
               <w:t>“</w:t>
             </w:r>
             <w:proofErr w:type="spellStart"/>
-            <w:r>
-              <w:rPr>
-                <w:b w:val="0"/>
-                <w:bCs w:val="0"/>
-              </w:rPr>
-              <w:t>berkeley_db</w:t>
+            <w:proofErr w:type="gramStart"/>
+            <w:r>
+              <w:rPr>
+                <w:b w:val="0"/>
+                <w:bCs w:val="0"/>
+              </w:rPr>
+              <w:t>berkeley</w:t>
+            </w:r>
+            <w:proofErr w:type="gramEnd"/>
+            <w:r>
+              <w:rPr>
+                <w:b w:val="0"/>
+                <w:bCs w:val="0"/>
+              </w:rPr>
+              <w:t>_db</w:t>
             </w:r>
             <w:proofErr w:type="spellEnd"/>
             <w:r>
@@ -6645,6 +6755,7 @@
       <w:r>
         <w:t xml:space="preserve">      "type": "</w:t>
       </w:r>
+      <w:proofErr w:type="gramStart"/>
       <w:r>
         <w:rPr>
           <w:i/>
@@ -6652,6 +6763,7 @@
         </w:rPr>
         <w:t>data-type</w:t>
       </w:r>
+      <w:proofErr w:type="gramEnd"/>
       <w:r>
         <w:t>",</w:t>
       </w:r>
@@ -6802,7 +6914,15 @@
     </w:p>
     <w:p>
       <w:r>
-        <w:t xml:space="preserve">Scripts run results are saved with the original experiment run JSON text file into  a log file. Results are logged into different levels of the script. The format in which results are added to the top-level of the experiment script follows. The log results are added at the end of each </w:t>
+        <w:t xml:space="preserve">Scripts run results are saved with the original experiment run JSON text file </w:t>
+      </w:r>
+      <w:proofErr w:type="gramStart"/>
+      <w:r>
+        <w:t>into  a</w:t>
+      </w:r>
+      <w:proofErr w:type="gramEnd"/>
+      <w:r>
+        <w:t xml:space="preserve"> log file. Results are logged into different levels of the script. The format in which results are added to the top-level of the experiment script follows. The log results are added at the end of each </w:t>
       </w:r>
       <w:r>
         <w:rPr>
@@ -6838,7 +6958,15 @@
       </w:pPr>
       <w:r>
         <w:tab/>
-        <w:t xml:space="preserve">    “run” : {</w:t>
+        <w:t xml:space="preserve">    “run</w:t>
+      </w:r>
+      <w:proofErr w:type="gramStart"/>
+      <w:r>
+        <w:t>” :</w:t>
+      </w:r>
+      <w:proofErr w:type="gramEnd"/>
+      <w:r>
+        <w:t xml:space="preserve"> {</w:t>
       </w:r>
     </w:p>
     <w:p>
@@ -6847,7 +6975,15 @@
       </w:pPr>
       <w:r>
         <w:tab/>
-        <w:t xml:space="preserve">        “script-path”: “</w:t>
+        <w:t xml:space="preserve">        “</w:t>
+      </w:r>
+      <w:proofErr w:type="gramStart"/>
+      <w:r>
+        <w:t>script</w:t>
+      </w:r>
+      <w:proofErr w:type="gramEnd"/>
+      <w:r>
+        <w:t>-path”: “</w:t>
       </w:r>
       <w:r>
         <w:rPr>
@@ -7073,6 +7209,7 @@
         <w:tab/>
         <w:t xml:space="preserve">      </w:t>
       </w:r>
+      <w:proofErr w:type="gramStart"/>
       <w:r>
         <w:rPr>
           <w:i/>
@@ -7080,6 +7217,7 @@
         </w:rPr>
         <w:t>additional-steps</w:t>
       </w:r>
+      <w:proofErr w:type="gramEnd"/>
     </w:p>
     <w:p>
       <w:pPr>
@@ -7212,15 +7350,28 @@
         <w:pStyle w:val="Code"/>
       </w:pPr>
       <w:r>
-        <w:t xml:space="preserve">    "run":{</w:t>
-      </w:r>
+        <w:t xml:space="preserve">    "run</w:t>
+      </w:r>
+      <w:proofErr w:type="gramStart"/>
+      <w:r>
+        <w:t>":{</w:t>
+      </w:r>
+      <w:proofErr w:type="gramEnd"/>
     </w:p>
     <w:p>
       <w:pPr>
         <w:pStyle w:val="Code"/>
       </w:pPr>
       <w:r>
-        <w:t xml:space="preserve">      "script-path":"</w:t>
+        <w:t xml:space="preserve">      "</w:t>
+      </w:r>
+      <w:proofErr w:type="gramStart"/>
+      <w:r>
+        <w:t>script</w:t>
+      </w:r>
+      <w:proofErr w:type="gramEnd"/>
+      <w:r>
+        <w:t>-path":"</w:t>
       </w:r>
       <w:proofErr w:type="spellStart"/>
       <w:r>
@@ -7380,7 +7531,15 @@
       </w:pPr>
       <w:r>
         <w:tab/>
-        <w:t xml:space="preserve">  “input-data”: [</w:t>
+        <w:t xml:space="preserve">  “</w:t>
+      </w:r>
+      <w:proofErr w:type="gramStart"/>
+      <w:r>
+        <w:t>input</w:t>
+      </w:r>
+      <w:proofErr w:type="gramEnd"/>
+      <w:r>
+        <w:t>-data”: [</w:t>
       </w:r>
     </w:p>
     <w:p>
@@ -7418,7 +7577,15 @@
       </w:pPr>
       <w:r>
         <w:tab/>
-        <w:t xml:space="preserve">  “output-data”: [</w:t>
+        <w:t xml:space="preserve">  “</w:t>
+      </w:r>
+      <w:proofErr w:type="gramStart"/>
+      <w:r>
+        <w:t>output</w:t>
+      </w:r>
+      <w:proofErr w:type="gramEnd"/>
+      <w:r>
+        <w:t>-data”: [</w:t>
       </w:r>
     </w:p>
     <w:p>
@@ -7559,7 +7726,15 @@
       </w:pPr>
       <w:r>
         <w:lastRenderedPageBreak/>
-        <w:t xml:space="preserve">  “module-id”: “error-message”</w:t>
+        <w:t xml:space="preserve">  “</w:t>
+      </w:r>
+      <w:proofErr w:type="gramStart"/>
+      <w:r>
+        <w:t>module</w:t>
+      </w:r>
+      <w:proofErr w:type="gramEnd"/>
+      <w:r>
+        <w:t>-id”: “error-message”</w:t>
       </w:r>
     </w:p>
     <w:p>
@@ -7721,7 +7896,15 @@
         <w:pStyle w:val="code0"/>
       </w:pPr>
       <w:r>
-        <w:t xml:space="preserve">  $ ./cv-workbench </w:t>
+        <w:t xml:space="preserve">  </w:t>
+      </w:r>
+      <w:proofErr w:type="gramStart"/>
+      <w:r>
+        <w:t>$ .</w:t>
+      </w:r>
+      <w:proofErr w:type="gramEnd"/>
+      <w:r>
+        <w:t xml:space="preserve">/cv-workbench </w:t>
       </w:r>
       <w:r>
         <w:rPr>
@@ -7847,7 +8030,15 @@
       </w:pPr>
       <w:r>
         <w:tab/>
-        <w:t xml:space="preserve">  "input-data": [</w:t>
+        <w:t xml:space="preserve">  "</w:t>
+      </w:r>
+      <w:proofErr w:type="gramStart"/>
+      <w:r>
+        <w:t>input</w:t>
+      </w:r>
+      <w:proofErr w:type="gramEnd"/>
+      <w:r>
+        <w:t>-data": [</w:t>
       </w:r>
     </w:p>
     <w:p>
@@ -7954,7 +8145,15 @@
       </w:pPr>
       <w:r>
         <w:tab/>
-        <w:t xml:space="preserve">  "output-data": [</w:t>
+        <w:t xml:space="preserve">  "</w:t>
+      </w:r>
+      <w:proofErr w:type="gramStart"/>
+      <w:r>
+        <w:t>output</w:t>
+      </w:r>
+      <w:proofErr w:type="gramEnd"/>
+      <w:r>
+        <w:t>-data": [</w:t>
       </w:r>
     </w:p>
     <w:p>
@@ -8254,7 +8453,23 @@
                 <w:b w:val="0"/>
                 <w:bCs w:val="0"/>
               </w:rPr>
-              <w:t xml:space="preserve">  "input-data": [</w:t>
+              <w:t xml:space="preserve">  "</w:t>
+            </w:r>
+            <w:proofErr w:type="gramStart"/>
+            <w:r>
+              <w:rPr>
+                <w:b w:val="0"/>
+                <w:bCs w:val="0"/>
+              </w:rPr>
+              <w:t>input</w:t>
+            </w:r>
+            <w:proofErr w:type="gramEnd"/>
+            <w:r>
+              <w:rPr>
+                <w:b w:val="0"/>
+                <w:bCs w:val="0"/>
+              </w:rPr>
+              <w:t>-data": [</w:t>
             </w:r>
           </w:p>
           <w:p>
@@ -8479,7 +8694,23 @@
                 <w:b w:val="0"/>
                 <w:bCs w:val="0"/>
               </w:rPr>
-              <w:t xml:space="preserve">  "output-data": [</w:t>
+              <w:t xml:space="preserve">  "</w:t>
+            </w:r>
+            <w:proofErr w:type="gramStart"/>
+            <w:r>
+              <w:rPr>
+                <w:b w:val="0"/>
+                <w:bCs w:val="0"/>
+              </w:rPr>
+              <w:t>output</w:t>
+            </w:r>
+            <w:proofErr w:type="gramEnd"/>
+            <w:r>
+              <w:rPr>
+                <w:b w:val="0"/>
+                <w:bCs w:val="0"/>
+              </w:rPr>
+              <w:t>-data": [</w:t>
             </w:r>
           </w:p>
           <w:p>
@@ -8834,7 +9065,15 @@
       </w:pPr>
       <w:r>
         <w:tab/>
-        <w:t xml:space="preserve">  "input-data": [</w:t>
+        <w:t xml:space="preserve">  "</w:t>
+      </w:r>
+      <w:proofErr w:type="gramStart"/>
+      <w:r>
+        <w:t>input</w:t>
+      </w:r>
+      <w:proofErr w:type="gramEnd"/>
+      <w:r>
+        <w:t>-data": [</w:t>
       </w:r>
     </w:p>
     <w:p>
@@ -8941,7 +9180,15 @@
       </w:pPr>
       <w:r>
         <w:tab/>
-        <w:t xml:space="preserve">  "output-data": [</w:t>
+        <w:t xml:space="preserve">  "</w:t>
+      </w:r>
+      <w:proofErr w:type="gramStart"/>
+      <w:r>
+        <w:t>output</w:t>
+      </w:r>
+      <w:proofErr w:type="gramEnd"/>
+      <w:r>
+        <w:t>-data": [</w:t>
       </w:r>
     </w:p>
     <w:p>
@@ -9061,8 +9308,13 @@
         <w:t xml:space="preserve">    "</w:t>
       </w:r>
       <w:proofErr w:type="spellStart"/>
-      <w:r>
-        <w:t>lower_in</w:t>
+      <w:proofErr w:type="gramStart"/>
+      <w:r>
+        <w:t>lower</w:t>
+      </w:r>
+      <w:proofErr w:type="gramEnd"/>
+      <w:r>
+        <w:t>_in</w:t>
       </w:r>
       <w:proofErr w:type="spellEnd"/>
       <w:r>
@@ -9078,8 +9330,13 @@
         <w:t xml:space="preserve">    "</w:t>
       </w:r>
       <w:proofErr w:type="spellStart"/>
-      <w:r>
-        <w:t>upper_in</w:t>
+      <w:proofErr w:type="gramStart"/>
+      <w:r>
+        <w:t>upper</w:t>
+      </w:r>
+      <w:proofErr w:type="gramEnd"/>
+      <w:r>
+        <w:t>_in</w:t>
       </w:r>
       <w:proofErr w:type="spellEnd"/>
       <w:r>
@@ -9095,8 +9352,13 @@
         <w:t xml:space="preserve">    "</w:t>
       </w:r>
       <w:proofErr w:type="spellStart"/>
-      <w:r>
-        <w:t>lower_out</w:t>
+      <w:proofErr w:type="gramStart"/>
+      <w:r>
+        <w:t>lower</w:t>
+      </w:r>
+      <w:proofErr w:type="gramEnd"/>
+      <w:r>
+        <w:t>_out</w:t>
       </w:r>
       <w:proofErr w:type="spellEnd"/>
       <w:r>
@@ -9112,8 +9374,13 @@
         <w:t xml:space="preserve">    "</w:t>
       </w:r>
       <w:proofErr w:type="spellStart"/>
-      <w:r>
-        <w:t>upper_out</w:t>
+      <w:proofErr w:type="gramStart"/>
+      <w:r>
+        <w:t>upper</w:t>
+      </w:r>
+      <w:proofErr w:type="gramEnd"/>
+      <w:r>
+        <w:t>_out</w:t>
       </w:r>
       <w:proofErr w:type="spellEnd"/>
       <w:r>
@@ -9284,7 +9551,23 @@
                 <w:b w:val="0"/>
                 <w:bCs w:val="0"/>
               </w:rPr>
-              <w:t xml:space="preserve">  "input-data": [</w:t>
+              <w:t xml:space="preserve">  "</w:t>
+            </w:r>
+            <w:proofErr w:type="gramStart"/>
+            <w:r>
+              <w:rPr>
+                <w:b w:val="0"/>
+                <w:bCs w:val="0"/>
+              </w:rPr>
+              <w:t>input</w:t>
+            </w:r>
+            <w:proofErr w:type="gramEnd"/>
+            <w:r>
+              <w:rPr>
+                <w:b w:val="0"/>
+                <w:bCs w:val="0"/>
+              </w:rPr>
+              <w:t>-data": [</w:t>
             </w:r>
           </w:p>
           <w:p>
@@ -9500,7 +9783,23 @@
                 <w:b w:val="0"/>
                 <w:bCs w:val="0"/>
               </w:rPr>
-              <w:t xml:space="preserve">  "output-data": [</w:t>
+              <w:t xml:space="preserve">  "</w:t>
+            </w:r>
+            <w:proofErr w:type="gramStart"/>
+            <w:r>
+              <w:rPr>
+                <w:b w:val="0"/>
+                <w:bCs w:val="0"/>
+              </w:rPr>
+              <w:t>output</w:t>
+            </w:r>
+            <w:proofErr w:type="gramEnd"/>
+            <w:r>
+              <w:rPr>
+                <w:b w:val="0"/>
+                <w:bCs w:val="0"/>
+              </w:rPr>
+              <w:t>-data": [</w:t>
             </w:r>
           </w:p>
           <w:p>
@@ -9732,12 +10031,21 @@
               <w:t xml:space="preserve">    "</w:t>
             </w:r>
             <w:proofErr w:type="spellStart"/>
-            <w:r>
-              <w:rPr>
-                <w:b w:val="0"/>
-                <w:bCs w:val="0"/>
-              </w:rPr>
-              <w:t>lower_in</w:t>
+            <w:proofErr w:type="gramStart"/>
+            <w:r>
+              <w:rPr>
+                <w:b w:val="0"/>
+                <w:bCs w:val="0"/>
+              </w:rPr>
+              <w:t>lower</w:t>
+            </w:r>
+            <w:proofErr w:type="gramEnd"/>
+            <w:r>
+              <w:rPr>
+                <w:b w:val="0"/>
+                <w:bCs w:val="0"/>
+              </w:rPr>
+              <w:t>_in</w:t>
             </w:r>
             <w:proofErr w:type="spellEnd"/>
             <w:r>
@@ -9764,12 +10072,21 @@
               <w:t xml:space="preserve">    "</w:t>
             </w:r>
             <w:proofErr w:type="spellStart"/>
-            <w:r>
-              <w:rPr>
-                <w:b w:val="0"/>
-                <w:bCs w:val="0"/>
-              </w:rPr>
-              <w:t>upper_in</w:t>
+            <w:proofErr w:type="gramStart"/>
+            <w:r>
+              <w:rPr>
+                <w:b w:val="0"/>
+                <w:bCs w:val="0"/>
+              </w:rPr>
+              <w:t>upper</w:t>
+            </w:r>
+            <w:proofErr w:type="gramEnd"/>
+            <w:r>
+              <w:rPr>
+                <w:b w:val="0"/>
+                <w:bCs w:val="0"/>
+              </w:rPr>
+              <w:t>_in</w:t>
             </w:r>
             <w:proofErr w:type="spellEnd"/>
             <w:r>
@@ -9796,12 +10113,21 @@
               <w:t xml:space="preserve">    "</w:t>
             </w:r>
             <w:proofErr w:type="spellStart"/>
-            <w:r>
-              <w:rPr>
-                <w:b w:val="0"/>
-                <w:bCs w:val="0"/>
-              </w:rPr>
-              <w:t>lower_out</w:t>
+            <w:proofErr w:type="gramStart"/>
+            <w:r>
+              <w:rPr>
+                <w:b w:val="0"/>
+                <w:bCs w:val="0"/>
+              </w:rPr>
+              <w:t>lower</w:t>
+            </w:r>
+            <w:proofErr w:type="gramEnd"/>
+            <w:r>
+              <w:rPr>
+                <w:b w:val="0"/>
+                <w:bCs w:val="0"/>
+              </w:rPr>
+              <w:t>_out</w:t>
             </w:r>
             <w:proofErr w:type="spellEnd"/>
             <w:r>
@@ -9828,12 +10154,21 @@
               <w:t xml:space="preserve">    "</w:t>
             </w:r>
             <w:proofErr w:type="spellStart"/>
-            <w:r>
-              <w:rPr>
-                <w:b w:val="0"/>
-                <w:bCs w:val="0"/>
-              </w:rPr>
-              <w:t>upper_out</w:t>
+            <w:proofErr w:type="gramStart"/>
+            <w:r>
+              <w:rPr>
+                <w:b w:val="0"/>
+                <w:bCs w:val="0"/>
+              </w:rPr>
+              <w:t>upper</w:t>
+            </w:r>
+            <w:proofErr w:type="gramEnd"/>
+            <w:r>
+              <w:rPr>
+                <w:b w:val="0"/>
+                <w:bCs w:val="0"/>
+              </w:rPr>
+              <w:t>_out</w:t>
             </w:r>
             <w:proofErr w:type="spellEnd"/>
             <w:r>
@@ -9870,7 +10205,15 @@
               <w:cnfStyle w:val="000000000000" w:firstRow="0" w:lastRow="0" w:firstColumn="0" w:lastColumn="0" w:oddVBand="0" w:evenVBand="0" w:oddHBand="0" w:evenHBand="0" w:firstRowFirstColumn="0" w:firstRowLastColumn="0" w:lastRowFirstColumn="0" w:lastRowLastColumn="0"/>
             </w:pPr>
             <w:r>
-              <w:t xml:space="preserve">The script parameter define </w:t>
+              <w:t xml:space="preserve">The script parameter </w:t>
+            </w:r>
+            <w:proofErr w:type="gramStart"/>
+            <w:r>
+              <w:t>define</w:t>
+            </w:r>
+            <w:proofErr w:type="gramEnd"/>
+            <w:r>
+              <w:t xml:space="preserve"> </w:t>
             </w:r>
             <w:proofErr w:type="spellStart"/>
             <w:r>
@@ -13689,7 +14032,21 @@
         <w:pStyle w:val="Normalafterlist"/>
       </w:pPr>
       <w:r>
-        <w:t>The parameter to the Kirsch operator is:</w:t>
+        <w:t>The parameter</w:t>
+      </w:r>
+      <w:r>
+        <w:t>s</w:t>
+      </w:r>
+      <w:r>
+        <w:t xml:space="preserve"> to the Kirsch operator </w:t>
+      </w:r>
+      <w:proofErr w:type="gramStart"/>
+      <w:r>
+        <w:t>is</w:t>
+      </w:r>
+      <w:proofErr w:type="gramEnd"/>
+      <w:r>
+        <w:t>:</w:t>
       </w:r>
     </w:p>
     <w:tbl>
@@ -13864,6 +14221,7 @@
                 <w:bCs w:val="0"/>
               </w:rPr>
             </w:pPr>
+            <w:proofErr w:type="gramStart"/>
             <w:r>
               <w:rPr>
                 <w:b w:val="0"/>
@@ -13871,6 +14229,7 @@
               </w:rPr>
               <w:t>max-row</w:t>
             </w:r>
+            <w:proofErr w:type="gramEnd"/>
           </w:p>
         </w:tc>
         <w:tc>
@@ -13965,6 +14324,7 @@
                 <w:bCs w:val="0"/>
               </w:rPr>
             </w:pPr>
+            <w:proofErr w:type="gramStart"/>
             <w:r>
               <w:rPr>
                 <w:b w:val="0"/>
@@ -13972,6 +14332,7 @@
               </w:rPr>
               <w:t>max-col</w:t>
             </w:r>
+            <w:proofErr w:type="gramEnd"/>
           </w:p>
         </w:tc>
         <w:tc>
@@ -15154,7 +15515,21 @@
         <w:pStyle w:val="Normalafterlist"/>
       </w:pPr>
       <w:r>
-        <w:t>The parameter to the Prewitt operator is:</w:t>
+        <w:t>The parameter</w:t>
+      </w:r>
+      <w:r>
+        <w:t>s</w:t>
+      </w:r>
+      <w:r>
+        <w:t xml:space="preserve"> to the Prewitt operator </w:t>
+      </w:r>
+      <w:proofErr w:type="gramStart"/>
+      <w:r>
+        <w:t>is</w:t>
+      </w:r>
+      <w:proofErr w:type="gramEnd"/>
+      <w:r>
+        <w:t>:</w:t>
       </w:r>
     </w:p>
     <w:tbl>
@@ -15329,6 +15704,7 @@
                 <w:bCs w:val="0"/>
               </w:rPr>
             </w:pPr>
+            <w:proofErr w:type="gramStart"/>
             <w:r>
               <w:rPr>
                 <w:b w:val="0"/>
@@ -15336,6 +15712,7 @@
               </w:rPr>
               <w:t>max-row</w:t>
             </w:r>
+            <w:proofErr w:type="gramEnd"/>
           </w:p>
         </w:tc>
         <w:tc>
@@ -15430,6 +15807,7 @@
                 <w:bCs w:val="0"/>
               </w:rPr>
             </w:pPr>
+            <w:proofErr w:type="gramStart"/>
             <w:r>
               <w:rPr>
                 <w:b w:val="0"/>
@@ -15437,6 +15815,7 @@
               </w:rPr>
               <w:t>max-col</w:t>
             </w:r>
+            <w:proofErr w:type="gramEnd"/>
           </w:p>
         </w:tc>
         <w:tc>
@@ -16486,7 +16865,21 @@
         <w:pStyle w:val="Normalafterlist"/>
       </w:pPr>
       <w:r>
-        <w:t>The parameter to the Roberts operator is:</w:t>
+        <w:t>The parameter</w:t>
+      </w:r>
+      <w:r>
+        <w:t>s</w:t>
+      </w:r>
+      <w:r>
+        <w:t xml:space="preserve"> to the Roberts operator </w:t>
+      </w:r>
+      <w:proofErr w:type="gramStart"/>
+      <w:r>
+        <w:t>is</w:t>
+      </w:r>
+      <w:proofErr w:type="gramEnd"/>
+      <w:r>
+        <w:t>:</w:t>
       </w:r>
     </w:p>
     <w:tbl>
@@ -16661,6 +17054,7 @@
                 <w:bCs w:val="0"/>
               </w:rPr>
             </w:pPr>
+            <w:proofErr w:type="gramStart"/>
             <w:r>
               <w:rPr>
                 <w:b w:val="0"/>
@@ -16668,6 +17062,7 @@
               </w:rPr>
               <w:t>max-row</w:t>
             </w:r>
+            <w:proofErr w:type="gramEnd"/>
           </w:p>
         </w:tc>
         <w:tc>
@@ -16762,6 +17157,7 @@
                 <w:bCs w:val="0"/>
               </w:rPr>
             </w:pPr>
+            <w:proofErr w:type="gramStart"/>
             <w:r>
               <w:rPr>
                 <w:b w:val="0"/>
@@ -16769,6 +17165,7 @@
               </w:rPr>
               <w:t>max-col</w:t>
             </w:r>
+            <w:proofErr w:type="gramEnd"/>
           </w:p>
         </w:tc>
         <w:tc>
@@ -17932,7 +18329,21 @@
         <w:pStyle w:val="Normalafterlist"/>
       </w:pPr>
       <w:r>
-        <w:t>The parameter to the Sobel operator is:</w:t>
+        <w:t>The parameter</w:t>
+      </w:r>
+      <w:r>
+        <w:t>s</w:t>
+      </w:r>
+      <w:r>
+        <w:t xml:space="preserve"> to the Sobel operator </w:t>
+      </w:r>
+      <w:proofErr w:type="gramStart"/>
+      <w:r>
+        <w:t>is</w:t>
+      </w:r>
+      <w:proofErr w:type="gramEnd"/>
+      <w:r>
+        <w:t>:</w:t>
       </w:r>
     </w:p>
     <w:tbl>
@@ -18107,6 +18518,7 @@
                 <w:bCs w:val="0"/>
               </w:rPr>
             </w:pPr>
+            <w:proofErr w:type="gramStart"/>
             <w:r>
               <w:rPr>
                 <w:b w:val="0"/>
@@ -18114,6 +18526,7 @@
               </w:rPr>
               <w:t>max-row</w:t>
             </w:r>
+            <w:proofErr w:type="gramEnd"/>
           </w:p>
         </w:tc>
         <w:tc>
@@ -18208,6 +18621,7 @@
                 <w:bCs w:val="0"/>
               </w:rPr>
             </w:pPr>
+            <w:proofErr w:type="gramStart"/>
             <w:r>
               <w:rPr>
                 <w:b w:val="0"/>
@@ -18215,6 +18629,7 @@
               </w:rPr>
               <w:t>max-col</w:t>
             </w:r>
+            <w:proofErr w:type="gramEnd"/>
           </w:p>
         </w:tc>
         <w:tc>
@@ -18716,7 +19131,15 @@
         <w:t xml:space="preserve">structuring element </w:t>
       </w:r>
       <w:r>
-        <w:t xml:space="preserve">at each pixel position and decides as to what output value to produce. Erosion selects the minimum value under the mask and dilation selects the maximum value. This will give the appropriate result for both binary and grayscale images. The operator produce output images of the same depth as the input images. </w:t>
+        <w:t xml:space="preserve">at each pixel position and decides as to what output value to produce. Erosion selects the minimum value under the mask and dilation selects the maximum value. This will give the appropriate result for both binary and grayscale images. The operator </w:t>
+      </w:r>
+      <w:proofErr w:type="gramStart"/>
+      <w:r>
+        <w:t>produce</w:t>
+      </w:r>
+      <w:proofErr w:type="gramEnd"/>
+      <w:r>
+        <w:t xml:space="preserve"> output images of the same depth as the input images. </w:t>
       </w:r>
     </w:p>
     <w:tbl>
@@ -19738,6 +20161,7 @@
                 <w:bCs w:val="0"/>
               </w:rPr>
             </w:pPr>
+            <w:proofErr w:type="gramStart"/>
             <w:r>
               <w:rPr>
                 <w:b w:val="0"/>
@@ -19745,6 +20169,7 @@
               </w:rPr>
               <w:t>max-row</w:t>
             </w:r>
+            <w:proofErr w:type="gramEnd"/>
           </w:p>
         </w:tc>
         <w:tc>
@@ -19839,6 +20264,7 @@
                 <w:bCs w:val="0"/>
               </w:rPr>
             </w:pPr>
+            <w:proofErr w:type="gramStart"/>
             <w:r>
               <w:rPr>
                 <w:b w:val="0"/>
@@ -19846,6 +20272,7 @@
               </w:rPr>
               <w:t>max-col</w:t>
             </w:r>
+            <w:proofErr w:type="gramEnd"/>
           </w:p>
         </w:tc>
         <w:tc>
@@ -20325,7 +20752,15 @@
     </w:p>
     <w:p>
       <w:r>
-        <w:t>The filter smooth average operator convolves the image with a kernel that averages the pixels under the kernel. For a kernel that is size rows x cols, the output pixel is the sum of the pixels in a rectangle rows x cols around the input pixel, divided by 1/(rows * cols).</w:t>
+        <w:t>The filter smooth average operator convolves the image with a kernel that averages the pixels under the kernel. For a kernel that is size rows x cols, the output pixel is the sum of the pixels in a rectangle rows x cols around the input pixel, divided by 1</w:t>
+      </w:r>
+      <w:proofErr w:type="gramStart"/>
+      <w:r>
+        <w:t>/(</w:t>
+      </w:r>
+      <w:proofErr w:type="gramEnd"/>
+      <w:r>
+        <w:t>rows * cols).</w:t>
       </w:r>
     </w:p>
     <w:p>
@@ -20803,6 +21238,7 @@
                 <w:bCs w:val="0"/>
               </w:rPr>
             </w:pPr>
+            <w:proofErr w:type="gramStart"/>
             <w:r>
               <w:rPr>
                 <w:b w:val="0"/>
@@ -20810,6 +21246,7 @@
               </w:rPr>
               <w:t>max-row</w:t>
             </w:r>
+            <w:proofErr w:type="gramEnd"/>
           </w:p>
         </w:tc>
         <w:tc>
@@ -20904,6 +21341,7 @@
                 <w:bCs w:val="0"/>
               </w:rPr>
             </w:pPr>
+            <w:proofErr w:type="gramStart"/>
             <w:r>
               <w:rPr>
                 <w:b w:val="0"/>
@@ -20911,6 +21349,7 @@
               </w:rPr>
               <w:t>max-col</w:t>
             </w:r>
+            <w:proofErr w:type="gramEnd"/>
           </w:p>
         </w:tc>
         <w:tc>
@@ -22537,6 +22976,7 @@
                 <w:bCs w:val="0"/>
               </w:rPr>
             </w:pPr>
+            <w:proofErr w:type="gramStart"/>
             <w:r>
               <w:rPr>
                 <w:b w:val="0"/>
@@ -22544,6 +22984,7 @@
               </w:rPr>
               <w:t>max-row</w:t>
             </w:r>
+            <w:proofErr w:type="gramEnd"/>
           </w:p>
         </w:tc>
         <w:tc>
@@ -22638,6 +23079,7 @@
                 <w:bCs w:val="0"/>
               </w:rPr>
             </w:pPr>
+            <w:proofErr w:type="gramStart"/>
             <w:r>
               <w:rPr>
                 <w:b w:val="0"/>
@@ -22645,6 +23087,7 @@
               </w:rPr>
               <w:t>max-col</w:t>
             </w:r>
+            <w:proofErr w:type="gramEnd"/>
           </w:p>
         </w:tc>
         <w:tc>
@@ -23574,6 +24017,7 @@
                 <w:bCs w:val="0"/>
               </w:rPr>
             </w:pPr>
+            <w:proofErr w:type="gramStart"/>
             <w:r>
               <w:rPr>
                 <w:b w:val="0"/>
@@ -23581,6 +24025,7 @@
               </w:rPr>
               <w:t>lower-value</w:t>
             </w:r>
+            <w:proofErr w:type="gramEnd"/>
           </w:p>
         </w:tc>
         <w:tc>
@@ -23629,6 +24074,7 @@
                 <w:bCs w:val="0"/>
               </w:rPr>
             </w:pPr>
+            <w:proofErr w:type="gramStart"/>
             <w:r>
               <w:rPr>
                 <w:b w:val="0"/>
@@ -23636,6 +24082,7 @@
               </w:rPr>
               <w:t>upper-value</w:t>
             </w:r>
+            <w:proofErr w:type="gramEnd"/>
           </w:p>
         </w:tc>
         <w:tc>
@@ -23872,12 +24319,21 @@
                 <w:bCs w:val="0"/>
               </w:rPr>
             </w:pPr>
-            <w:r>
-              <w:rPr>
-                <w:b w:val="0"/>
-                <w:bCs w:val="0"/>
-              </w:rPr>
-              <w:t>accumulator mean</w:t>
+            <w:proofErr w:type="gramStart"/>
+            <w:r>
+              <w:rPr>
+                <w:b w:val="0"/>
+                <w:bCs w:val="0"/>
+              </w:rPr>
+              <w:t>accumulator</w:t>
+            </w:r>
+            <w:proofErr w:type="gramEnd"/>
+            <w:r>
+              <w:rPr>
+                <w:b w:val="0"/>
+                <w:bCs w:val="0"/>
+              </w:rPr>
+              <w:t xml:space="preserve"> mean</w:t>
             </w:r>
           </w:p>
         </w:tc>
@@ -24546,6 +25002,7 @@
                 <w:bCs w:val="0"/>
               </w:rPr>
             </w:pPr>
+            <w:proofErr w:type="gramStart"/>
             <w:r>
               <w:rPr>
                 <w:b w:val="0"/>
@@ -24554,6 +25011,7 @@
               <w:lastRenderedPageBreak/>
               <w:t>lower-value</w:t>
             </w:r>
+            <w:proofErr w:type="gramEnd"/>
           </w:p>
         </w:tc>
         <w:tc>
@@ -24602,6 +25060,7 @@
                 <w:bCs w:val="0"/>
               </w:rPr>
             </w:pPr>
+            <w:proofErr w:type="gramStart"/>
             <w:r>
               <w:rPr>
                 <w:b w:val="0"/>
@@ -24609,6 +25068,7 @@
               </w:rPr>
               <w:t>upper-value</w:t>
             </w:r>
+            <w:proofErr w:type="gramEnd"/>
           </w:p>
         </w:tc>
         <w:tc>
@@ -24705,6 +25165,7 @@
                 <w:bCs w:val="0"/>
               </w:rPr>
             </w:pPr>
+            <w:proofErr w:type="gramStart"/>
             <w:r>
               <w:rPr>
                 <w:b w:val="0"/>
@@ -24712,6 +25173,7 @@
               </w:rPr>
               <w:t>max-row</w:t>
             </w:r>
+            <w:proofErr w:type="gramEnd"/>
           </w:p>
         </w:tc>
         <w:tc>
@@ -24812,6 +25274,7 @@
                 <w:bCs w:val="0"/>
               </w:rPr>
             </w:pPr>
+            <w:proofErr w:type="gramStart"/>
             <w:r>
               <w:rPr>
                 <w:b w:val="0"/>
@@ -24819,6 +25282,7 @@
               </w:rPr>
               <w:t>max-col</w:t>
             </w:r>
+            <w:proofErr w:type="gramEnd"/>
           </w:p>
         </w:tc>
         <w:tc>
@@ -25669,7 +26133,15 @@
               <w:cnfStyle w:val="000000100000" w:firstRow="0" w:lastRow="0" w:firstColumn="0" w:lastColumn="0" w:oddVBand="0" w:evenVBand="0" w:oddHBand="1" w:evenHBand="0" w:firstRowFirstColumn="0" w:firstRowLastColumn="0" w:lastRowFirstColumn="0" w:lastRowLastColumn="0"/>
             </w:pPr>
             <w:r>
-              <w:t xml:space="preserve">increment for the Hough accumulator angle. The number of angles are 180 / </w:t>
+              <w:t xml:space="preserve">increment for the Hough accumulator angle. The number of angles </w:t>
+            </w:r>
+            <w:proofErr w:type="gramStart"/>
+            <w:r>
+              <w:t>are</w:t>
+            </w:r>
+            <w:proofErr w:type="gramEnd"/>
+            <w:r>
+              <w:t xml:space="preserve"> 180 / </w:t>
             </w:r>
             <w:proofErr w:type="spellStart"/>
             <w:r>
@@ -25979,6 +26451,7 @@
                 <w:bCs w:val="0"/>
               </w:rPr>
             </w:pPr>
+            <w:proofErr w:type="gramStart"/>
             <w:r>
               <w:rPr>
                 <w:b w:val="0"/>
@@ -25987,6 +26460,7 @@
               <w:lastRenderedPageBreak/>
               <w:t>max-row</w:t>
             </w:r>
+            <w:proofErr w:type="gramEnd"/>
           </w:p>
         </w:tc>
         <w:tc>
@@ -26087,6 +26561,7 @@
                 <w:bCs w:val="0"/>
               </w:rPr>
             </w:pPr>
+            <w:proofErr w:type="gramStart"/>
             <w:r>
               <w:rPr>
                 <w:b w:val="0"/>
@@ -26094,6 +26569,7 @@
               </w:rPr>
               <w:t>max-col</w:t>
             </w:r>
+            <w:proofErr w:type="gramEnd"/>
           </w:p>
         </w:tc>
         <w:tc>
@@ -26772,7 +27248,15 @@
               <w:cnfStyle w:val="000000100000" w:firstRow="0" w:lastRow="0" w:firstColumn="0" w:lastColumn="0" w:oddVBand="0" w:evenVBand="0" w:oddHBand="1" w:evenHBand="0" w:firstRowFirstColumn="0" w:firstRowLastColumn="0" w:lastRowFirstColumn="0" w:lastRowLastColumn="0"/>
             </w:pPr>
             <w:r>
-              <w:t xml:space="preserve">increment for the Hough accumulator angle. The number of angles are 180 / </w:t>
+              <w:t xml:space="preserve">increment for the Hough accumulator angle. The number of angles </w:t>
+            </w:r>
+            <w:proofErr w:type="gramStart"/>
+            <w:r>
+              <w:t>are</w:t>
+            </w:r>
+            <w:proofErr w:type="gramEnd"/>
+            <w:r>
+              <w:t xml:space="preserve"> 180 / </w:t>
             </w:r>
             <w:proofErr w:type="spellStart"/>
             <w:r>
@@ -26798,13 +27282,27 @@
                 <w:bCs w:val="0"/>
               </w:rPr>
             </w:pPr>
+            <w:r>
+              <w:rPr>
+                <w:b w:val="0"/>
+                <w:bCs w:val="0"/>
+              </w:rPr>
+              <w:t>rho</w:t>
+            </w:r>
+            <w:r>
+              <w:rPr>
+                <w:b w:val="0"/>
+                <w:bCs w:val="0"/>
+              </w:rPr>
+              <w:t>-</w:t>
+            </w:r>
             <w:proofErr w:type="spellStart"/>
             <w:r>
               <w:rPr>
                 <w:b w:val="0"/>
                 <w:bCs w:val="0"/>
               </w:rPr>
-              <w:t>rho_inc</w:t>
+              <w:t>inc</w:t>
             </w:r>
             <w:proofErr w:type="spellEnd"/>
           </w:p>
@@ -26953,6 +27451,7 @@
                 <w:bCs w:val="0"/>
               </w:rPr>
             </w:pPr>
+            <w:proofErr w:type="gramStart"/>
             <w:r>
               <w:rPr>
                 <w:b w:val="0"/>
@@ -26960,6 +27459,7 @@
               </w:rPr>
               <w:t>max-row</w:t>
             </w:r>
+            <w:proofErr w:type="gramEnd"/>
           </w:p>
         </w:tc>
         <w:tc>
@@ -27054,6 +27554,7 @@
                 <w:bCs w:val="0"/>
               </w:rPr>
             </w:pPr>
+            <w:proofErr w:type="gramStart"/>
             <w:r>
               <w:rPr>
                 <w:b w:val="0"/>
@@ -27061,6 +27562,7 @@
               </w:rPr>
               <w:t>max-col</w:t>
             </w:r>
+            <w:proofErr w:type="gramEnd"/>
           </w:p>
         </w:tc>
         <w:tc>
@@ -27706,8 +28208,13 @@
     </w:p>
     <w:p>
       <w:r>
-        <w:t>The Hough peak detect operator finds polar lines (rho, theta) in the Hough accumulator data where the counts exceed a threshold..</w:t>
-      </w:r>
+        <w:t xml:space="preserve">The Hough peak detect operator finds polar lines (rho, theta) in the Hough accumulator data where the counts exceed a </w:t>
+      </w:r>
+      <w:proofErr w:type="gramStart"/>
+      <w:r>
+        <w:t>threshold..</w:t>
+      </w:r>
+      <w:proofErr w:type="gramEnd"/>
     </w:p>
     <w:p>
       <w:r>
@@ -29084,12 +29591,25 @@
     </w:p>
     <w:p>
       <w:r>
-        <w:t>The transform image combine operator does a linear recombination of two images. The formula for the output values are:</w:t>
-      </w:r>
-    </w:p>
-    <w:p>
-      <w:r>
-        <w:t>output(row, col) = scale</w:t>
+        <w:t xml:space="preserve">The transform image combine operator does a linear recombination of two images. The formula for the output values </w:t>
+      </w:r>
+      <w:proofErr w:type="gramStart"/>
+      <w:r>
+        <w:t>are</w:t>
+      </w:r>
+      <w:proofErr w:type="gramEnd"/>
+      <w:r>
+        <w:t>:</w:t>
+      </w:r>
+    </w:p>
+    <w:p>
+      <w:proofErr w:type="gramStart"/>
+      <w:r>
+        <w:t>output(</w:t>
+      </w:r>
+      <w:proofErr w:type="gramEnd"/>
+      <w:r>
+        <w:t>row, col) = scale</w:t>
       </w:r>
       <w:r>
         <w:rPr>
@@ -29536,6 +30056,7 @@
                 <w:bCs w:val="0"/>
               </w:rPr>
             </w:pPr>
+            <w:proofErr w:type="gramStart"/>
             <w:r>
               <w:rPr>
                 <w:b w:val="0"/>
@@ -29543,6 +30064,7 @@
               </w:rPr>
               <w:t>scale-1</w:t>
             </w:r>
+            <w:proofErr w:type="gramEnd"/>
           </w:p>
         </w:tc>
         <w:tc>
@@ -29587,6 +30109,7 @@
                 <w:bCs w:val="0"/>
               </w:rPr>
             </w:pPr>
+            <w:proofErr w:type="gramStart"/>
             <w:r>
               <w:rPr>
                 <w:b w:val="0"/>
@@ -29594,6 +30117,7 @@
               </w:rPr>
               <w:t>scale-2</w:t>
             </w:r>
+            <w:proofErr w:type="gramEnd"/>
           </w:p>
         </w:tc>
         <w:tc>
@@ -29744,6 +30268,7 @@
                 <w:bCs w:val="0"/>
               </w:rPr>
             </w:pPr>
+            <w:proofErr w:type="gramStart"/>
             <w:r>
               <w:rPr>
                 <w:b w:val="0"/>
@@ -29751,6 +30276,7 @@
               </w:rPr>
               <w:t>max-row</w:t>
             </w:r>
+            <w:proofErr w:type="gramEnd"/>
           </w:p>
         </w:tc>
         <w:tc>
@@ -29845,6 +30371,7 @@
                 <w:bCs w:val="0"/>
               </w:rPr>
             </w:pPr>
+            <w:proofErr w:type="gramStart"/>
             <w:r>
               <w:rPr>
                 <w:b w:val="0"/>
@@ -29852,6 +30379,7 @@
               </w:rPr>
               <w:t>max-col</w:t>
             </w:r>
+            <w:proofErr w:type="gramEnd"/>
           </w:p>
         </w:tc>
         <w:tc>
@@ -31432,7 +31960,15 @@
         </w:numPr>
       </w:pPr>
       <w:r>
-        <w:t xml:space="preserve">If a text input file is specified, each line consists of space or tab delimited numeric intensities. The number of rows is the number of lines in the file. The number of columns is the number of fields on each line. The number of fields must be the same on each line. If the output format is JPEG, field values outside the range of 0..255 will be truncated. </w:t>
+        <w:t xml:space="preserve">If a text input file is specified, each line consists of space or tab delimited numeric intensities. The number of rows is the number of lines in the file. The number of columns is the number of fields on each line. The number of fields must be the same on each line. If the output format is JPEG, field values outside the range of </w:t>
+      </w:r>
+      <w:proofErr w:type="gramStart"/>
+      <w:r>
+        <w:t>0..</w:t>
+      </w:r>
+      <w:proofErr w:type="gramEnd"/>
+      <w:r>
+        <w:t xml:space="preserve">255 will be truncated. </w:t>
       </w:r>
     </w:p>
     <w:tbl>
@@ -32006,10 +32542,12 @@
               <w:t>A point to add to the image as ‘</w:t>
             </w:r>
             <w:proofErr w:type="spellStart"/>
+            <w:proofErr w:type="gramStart"/>
             <w:r>
               <w:t>row,col</w:t>
             </w:r>
             <w:proofErr w:type="spellEnd"/>
+            <w:proofErr w:type="gramEnd"/>
             <w:r>
               <w:t>’</w:t>
             </w:r>
@@ -32065,10 +32603,12 @@
               <w:t>A line segment ‘(</w:t>
             </w:r>
             <w:proofErr w:type="spellStart"/>
+            <w:proofErr w:type="gramStart"/>
             <w:r>
               <w:t>row,col</w:t>
             </w:r>
             <w:proofErr w:type="spellEnd"/>
+            <w:proofErr w:type="gramEnd"/>
             <w:r>
               <w:t>):(</w:t>
             </w:r>
@@ -32150,10 +32690,12 @@
               <w:t>A rectangle ‘(</w:t>
             </w:r>
             <w:proofErr w:type="spellStart"/>
+            <w:proofErr w:type="gramStart"/>
             <w:r>
               <w:t>row,col</w:t>
             </w:r>
             <w:proofErr w:type="spellEnd"/>
+            <w:proofErr w:type="gramEnd"/>
             <w:r>
               <w:t>):(</w:t>
             </w:r>
@@ -32230,7 +32772,15 @@
               <w:cnfStyle w:val="000000000000" w:firstRow="0" w:lastRow="0" w:firstColumn="0" w:lastColumn="0" w:oddVBand="0" w:evenVBand="0" w:oddHBand="0" w:evenHBand="0" w:firstRowFirstColumn="0" w:firstRowLastColumn="0" w:lastRowFirstColumn="0" w:lastRowLastColumn="0"/>
             </w:pPr>
             <w:r>
-              <w:t>Similar to the ‘rectangle’ parameter, but creates a filled rectangle.</w:t>
+              <w:t xml:space="preserve">Similar to the ‘rectangle’ </w:t>
+            </w:r>
+            <w:proofErr w:type="gramStart"/>
+            <w:r>
+              <w:t>parameter, but</w:t>
+            </w:r>
+            <w:proofErr w:type="gramEnd"/>
+            <w:r>
+              <w:t xml:space="preserve"> creates a filled rectangle.</w:t>
             </w:r>
           </w:p>
         </w:tc>
@@ -32300,6 +32850,7 @@
                 <w:bCs w:val="0"/>
               </w:rPr>
             </w:pPr>
+            <w:proofErr w:type="gramStart"/>
             <w:r>
               <w:rPr>
                 <w:b w:val="0"/>
@@ -32307,6 +32858,7 @@
               </w:rPr>
               <w:t>max-row</w:t>
             </w:r>
+            <w:proofErr w:type="gramEnd"/>
           </w:p>
         </w:tc>
         <w:tc>
@@ -32401,6 +32953,7 @@
                 <w:bCs w:val="0"/>
               </w:rPr>
             </w:pPr>
+            <w:proofErr w:type="gramStart"/>
             <w:r>
               <w:rPr>
                 <w:b w:val="0"/>
@@ -32408,6 +32961,7 @@
               </w:rPr>
               <w:t>max-col</w:t>
             </w:r>
+            <w:proofErr w:type="gramEnd"/>
           </w:p>
         </w:tc>
         <w:tc>
@@ -32454,6 +33008,7 @@
         <w:t>“point”: “(</w:t>
       </w:r>
       <w:proofErr w:type="spellStart"/>
+      <w:proofErr w:type="gramStart"/>
       <w:r>
         <w:rPr>
           <w:i/>
@@ -32472,6 +33027,7 @@
         <w:t>col</w:t>
       </w:r>
       <w:proofErr w:type="spellEnd"/>
+      <w:proofErr w:type="gramEnd"/>
       <w:r>
         <w:t>)|(</w:t>
       </w:r>
@@ -32507,6 +33063,7 @@
         <w:t>“line”: “(</w:t>
       </w:r>
       <w:proofErr w:type="spellStart"/>
+      <w:proofErr w:type="gramStart"/>
       <w:r>
         <w:rPr>
           <w:i/>
@@ -32525,6 +33082,7 @@
         <w:t>col</w:t>
       </w:r>
       <w:proofErr w:type="spellEnd"/>
+      <w:proofErr w:type="gramEnd"/>
       <w:r>
         <w:t>):(</w:t>
       </w:r>
@@ -32603,6 +33161,7 @@
         <w:t>“rectangle”: “(</w:t>
       </w:r>
       <w:proofErr w:type="spellStart"/>
+      <w:proofErr w:type="gramStart"/>
       <w:r>
         <w:rPr>
           <w:i/>
@@ -32621,6 +33180,7 @@
         <w:t>col</w:t>
       </w:r>
       <w:proofErr w:type="spellEnd"/>
+      <w:proofErr w:type="gramEnd"/>
       <w:r>
         <w:t>):(</w:t>
       </w:r>
@@ -33172,7 +33732,15 @@
       </w:r>
       <w:proofErr w:type="spellEnd"/>
       <w:r>
-        <w:t xml:space="preserve"> is the output pixel value for input pixel values &gt;= threshold. Values for JPEG output images will be CV_8U and truncated to 0..255.</w:t>
+        <w:t xml:space="preserve"> is the output pixel value for input pixel values &gt;= threshold. Values for JPEG output images will be CV_8U and truncated to </w:t>
+      </w:r>
+      <w:proofErr w:type="gramStart"/>
+      <w:r>
+        <w:t>0..</w:t>
+      </w:r>
+      <w:proofErr w:type="gramEnd"/>
+      <w:r>
+        <w:t>255.</w:t>
       </w:r>
     </w:p>
     <w:p>
@@ -33814,6 +34382,7 @@
                 <w:bCs w:val="0"/>
               </w:rPr>
             </w:pPr>
+            <w:proofErr w:type="gramStart"/>
             <w:r>
               <w:rPr>
                 <w:b w:val="0"/>
@@ -33822,6 +34391,7 @@
               <w:lastRenderedPageBreak/>
               <w:t>max-row</w:t>
             </w:r>
+            <w:proofErr w:type="gramEnd"/>
           </w:p>
         </w:tc>
         <w:tc>
@@ -33916,6 +34486,7 @@
                 <w:bCs w:val="0"/>
               </w:rPr>
             </w:pPr>
+            <w:proofErr w:type="gramStart"/>
             <w:r>
               <w:rPr>
                 <w:b w:val="0"/>
@@ -33923,6 +34494,7 @@
               </w:rPr>
               <w:t>max-col</w:t>
             </w:r>
+            <w:proofErr w:type="gramEnd"/>
           </w:p>
         </w:tc>
         <w:tc>
@@ -34563,7 +35135,15 @@
     </w:p>
     <w:p>
       <w:r>
-        <w:t xml:space="preserve">There are a number of CV-workbench programs included in the </w:t>
+        <w:t xml:space="preserve">There are </w:t>
+      </w:r>
+      <w:proofErr w:type="gramStart"/>
+      <w:r>
+        <w:t>a number of</w:t>
+      </w:r>
+      <w:proofErr w:type="gramEnd"/>
+      <w:r>
+        <w:t xml:space="preserve"> CV-workbench programs included in the </w:t>
       </w:r>
       <w:r>
         <w:rPr>
@@ -34676,7 +35256,14 @@
       </w:pPr>
       <w:r>
         <w:br/>
-        <w:t xml:space="preserve">$ ./cv-workbench </w:t>
+      </w:r>
+      <w:proofErr w:type="gramStart"/>
+      <w:r>
+        <w:t>$ .</w:t>
+      </w:r>
+      <w:proofErr w:type="gramEnd"/>
+      <w:r>
+        <w:t xml:space="preserve">/cv-workbench </w:t>
       </w:r>
       <w:r>
         <w:rPr>
@@ -34723,8 +35310,13 @@
       <w:pPr>
         <w:pStyle w:val="Code"/>
       </w:pPr>
-      <w:r>
-        <w:t xml:space="preserve">$./image-copy </w:t>
+      <w:proofErr w:type="gramStart"/>
+      <w:r>
+        <w:t>$./</w:t>
+      </w:r>
+      <w:proofErr w:type="gramEnd"/>
+      <w:r>
+        <w:t xml:space="preserve">image-copy </w:t>
       </w:r>
       <w:proofErr w:type="spellStart"/>
       <w:r>
@@ -34857,6 +35449,7 @@
                 <w:bCs w:val="0"/>
               </w:rPr>
             </w:pPr>
+            <w:proofErr w:type="gramStart"/>
             <w:r>
               <w:rPr>
                 <w:b w:val="0"/>
@@ -34864,6 +35457,7 @@
               </w:rPr>
               <w:t>max-row</w:t>
             </w:r>
+            <w:proofErr w:type="gramEnd"/>
           </w:p>
         </w:tc>
         <w:tc>
@@ -34932,6 +35526,7 @@
                 <w:bCs w:val="0"/>
               </w:rPr>
             </w:pPr>
+            <w:proofErr w:type="gramStart"/>
             <w:r>
               <w:rPr>
                 <w:b w:val="0"/>
@@ -34939,6 +35534,7 @@
               </w:rPr>
               <w:t>max-col</w:t>
             </w:r>
+            <w:proofErr w:type="gramEnd"/>
           </w:p>
         </w:tc>
         <w:tc>
@@ -34973,8 +35569,13 @@
       <w:pPr>
         <w:pStyle w:val="Code"/>
       </w:pPr>
-      <w:r>
-        <w:t xml:space="preserve">$ ./image-dump </w:t>
+      <w:proofErr w:type="gramStart"/>
+      <w:r>
+        <w:t>$ .</w:t>
+      </w:r>
+      <w:proofErr w:type="gramEnd"/>
+      <w:r>
+        <w:t xml:space="preserve">/image-dump </w:t>
       </w:r>
       <w:r>
         <w:rPr>
@@ -35074,8 +35675,13 @@
           <w:iCs/>
         </w:rPr>
       </w:pPr>
-      <w:r>
-        <w:t xml:space="preserve">$ ./image-info </w:t>
+      <w:proofErr w:type="gramStart"/>
+      <w:r>
+        <w:t>$ .</w:t>
+      </w:r>
+      <w:proofErr w:type="gramEnd"/>
+      <w:r>
+        <w:t xml:space="preserve">/image-info </w:t>
       </w:r>
       <w:r>
         <w:rPr>
@@ -35121,15 +35727,28 @@
         <w:t>in-filename</w:t>
       </w:r>
       <w:r>
-        <w:t xml:space="preserve"> has a “.jpg” or “.bin” extension to indicate whether it is a JPEG image file or a binary internal format image file. It writes statistics of the image similar to this:</w:t>
+        <w:t xml:space="preserve"> has a “.jpg” or “.bin” extension to indicate whether it is a JPEG image file or a binary internal format image file. It writes statistics of the image </w:t>
+      </w:r>
+      <w:proofErr w:type="gramStart"/>
+      <w:r>
+        <w:t>similar to</w:t>
+      </w:r>
+      <w:proofErr w:type="gramEnd"/>
+      <w:r>
+        <w:t xml:space="preserve"> this:</w:t>
       </w:r>
     </w:p>
     <w:p>
       <w:pPr>
         <w:pStyle w:val="Code"/>
       </w:pPr>
-      <w:r>
-        <w:t>$ ./image-info test/reference/du_map_gray.jpg</w:t>
+      <w:proofErr w:type="gramStart"/>
+      <w:r>
+        <w:t>$ .</w:t>
+      </w:r>
+      <w:proofErr w:type="gramEnd"/>
+      <w:r>
+        <w:t>/image-info test/reference/du_map_gray.jpg</w:t>
       </w:r>
     </w:p>
     <w:p>
@@ -35346,8 +35965,13 @@
         <w:pStyle w:val="Code"/>
       </w:pPr>
       <w:r>
-        <w:t xml:space="preserve">        standard deviation  33.5635</w:t>
-      </w:r>
+        <w:t xml:space="preserve">        standard </w:t>
+      </w:r>
+      <w:proofErr w:type="gramStart"/>
+      <w:r>
+        <w:t>deviation  33.5635</w:t>
+      </w:r>
+      <w:proofErr w:type="gramEnd"/>
     </w:p>
     <w:p>
       <w:pPr>
@@ -35382,8 +36006,13 @@
       <w:pPr>
         <w:pStyle w:val="Code"/>
       </w:pPr>
-      <w:r>
-        <w:t xml:space="preserve">$ ./image-map </w:t>
+      <w:proofErr w:type="gramStart"/>
+      <w:r>
+        <w:t>$ .</w:t>
+      </w:r>
+      <w:proofErr w:type="gramEnd"/>
+      <w:r>
+        <w:t xml:space="preserve">/image-map </w:t>
       </w:r>
       <w:proofErr w:type="spellStart"/>
       <w:r>
@@ -35430,15 +36059,28 @@
     </w:p>
     <w:p>
       <w:r>
-        <w:t>This is a program that tests the filter-image-morphology operator. It is runs all morphology operators on the input image with:</w:t>
+        <w:t xml:space="preserve">This is a program that tests the filter-image-morphology operator. It is </w:t>
+      </w:r>
+      <w:proofErr w:type="gramStart"/>
+      <w:r>
+        <w:t>runs</w:t>
+      </w:r>
+      <w:proofErr w:type="gramEnd"/>
+      <w:r>
+        <w:t xml:space="preserve"> all morphology operators on the input image with:</w:t>
       </w:r>
     </w:p>
     <w:p>
       <w:pPr>
         <w:pStyle w:val="Code"/>
       </w:pPr>
-      <w:r>
-        <w:t xml:space="preserve">$ ./image-morph </w:t>
+      <w:proofErr w:type="gramStart"/>
+      <w:r>
+        <w:t>$ .</w:t>
+      </w:r>
+      <w:proofErr w:type="gramEnd"/>
+      <w:r>
+        <w:t xml:space="preserve">/image-morph </w:t>
       </w:r>
       <w:proofErr w:type="spellStart"/>
       <w:r>
@@ -35492,8 +36134,13 @@
       <w:pPr>
         <w:pStyle w:val="Code"/>
       </w:pPr>
-      <w:r>
-        <w:t xml:space="preserve">$ ./image-read </w:t>
+      <w:proofErr w:type="gramStart"/>
+      <w:r>
+        <w:t>$ .</w:t>
+      </w:r>
+      <w:proofErr w:type="gramEnd"/>
+      <w:r>
+        <w:t xml:space="preserve">/image-read </w:t>
       </w:r>
       <w:r>
         <w:rPr>
@@ -35563,8 +36210,13 @@
       <w:pPr>
         <w:pStyle w:val="Code"/>
       </w:pPr>
-      <w:r>
-        <w:t xml:space="preserve">./image-trig </w:t>
+      <w:proofErr w:type="gramStart"/>
+      <w:r>
+        <w:t>./</w:t>
+      </w:r>
+      <w:proofErr w:type="gramEnd"/>
+      <w:r>
+        <w:t xml:space="preserve">image-trig </w:t>
       </w:r>
     </w:p>
     <w:p>
@@ -35588,7 +36240,14 @@
       </w:pPr>
       <w:r>
         <w:br/>
-        <w:t>$ ./</w:t>
+      </w:r>
+      <w:proofErr w:type="gramStart"/>
+      <w:r>
+        <w:t>$ .</w:t>
+      </w:r>
+      <w:proofErr w:type="gramEnd"/>
+      <w:r>
+        <w:t>/</w:t>
       </w:r>
       <w:proofErr w:type="spellStart"/>
       <w:r>
@@ -35596,21 +36255,8 @@
       </w:r>
       <w:proofErr w:type="spellEnd"/>
       <w:r>
-        <w:t xml:space="preserve"> in-</w:t>
-      </w:r>
-      <w:proofErr w:type="spellStart"/>
-      <w:r>
-        <w:t>filename.jpg</w:t>
-      </w:r>
-      <w:proofErr w:type="spellEnd"/>
-      <w:r>
-        <w:t xml:space="preserve"> &gt;out-</w:t>
-      </w:r>
-      <w:proofErr w:type="spellStart"/>
-      <w:r>
-        <w:t>filename.jpg</w:t>
-      </w:r>
-      <w:proofErr w:type="spellEnd"/>
+        <w:t xml:space="preserve"> in-filename.jpg &gt;out-filename.jpg</w:t>
+      </w:r>
     </w:p>
     <w:p>
       <w:pPr>
@@ -35707,7 +36353,7 @@
       <w:rPr>
         <w:noProof/>
       </w:rPr>
-      <w:t>9/20/2022 2:43 PM</w:t>
+      <w:t>9/22/2022 8:59 AM</w:t>
     </w:r>
     <w:r>
       <w:fldChar w:fldCharType="end"/>
@@ -35767,7 +36413,7 @@
       <w:rPr>
         <w:noProof/>
       </w:rPr>
-      <w:t>9/20/2022 2:43 PM</w:t>
+      <w:t>9/22/2022 8:59 AM</w:t>
     </w:r>
     <w:r>
       <w:fldChar w:fldCharType="end"/>

</xml_diff>

<commit_message>
updated hough peak exper
</commit_message>
<xml_diff>
--- a/doc/cv-workbench manual.docx
+++ b/doc/cv-workbench manual.docx
@@ -77,15 +77,7 @@
         </w:numPr>
       </w:pPr>
       <w:r>
-        <w:t xml:space="preserve">Users write scripts that allow exactly reproducing results and running operations on different sets of </w:t>
-      </w:r>
-      <w:proofErr w:type="gramStart"/>
-      <w:r>
-        <w:t>data, and</w:t>
-      </w:r>
-      <w:proofErr w:type="gramEnd"/>
-      <w:r>
-        <w:t xml:space="preserve"> are easily changed and reused to try different operations with differ parameter settings. </w:t>
+        <w:t xml:space="preserve">Users write scripts that allow exactly reproducing results and running operations on different sets of data, and are easily changed and reused to try different operations with differ parameter settings. </w:t>
       </w:r>
     </w:p>
     <w:p>
@@ -117,15 +109,7 @@
         </w:r>
       </w:hyperlink>
       <w:r>
-        <w:t xml:space="preserve">. What you need to learn isn’t hard. Apple MacOS is </w:t>
-      </w:r>
-      <w:proofErr w:type="gramStart"/>
-      <w:r>
-        <w:t>similar to</w:t>
-      </w:r>
-      <w:proofErr w:type="gramEnd"/>
-      <w:r>
-        <w:t xml:space="preserve"> Linux but will not run CV Workbench natively. Versions to run on MacOS and Windows can be produced eventually.</w:t>
+        <w:t>. What you need to learn isn’t hard. Apple MacOS is similar to Linux but will not run CV Workbench natively. Versions to run on MacOS and Windows can be produced eventually.</w:t>
       </w:r>
     </w:p>
     <w:p>
@@ -770,15 +754,7 @@
               <w:cnfStyle w:val="000000100000" w:firstRow="0" w:lastRow="0" w:firstColumn="0" w:lastColumn="0" w:oddVBand="0" w:evenVBand="0" w:oddHBand="1" w:evenHBand="0" w:firstRowFirstColumn="0" w:firstRowLastColumn="0" w:lastRowFirstColumn="0" w:lastRowLastColumn="0"/>
             </w:pPr>
             <w:r>
-              <w:t xml:space="preserve">These are </w:t>
-            </w:r>
-            <w:proofErr w:type="gramStart"/>
-            <w:r>
-              <w:t>various different</w:t>
-            </w:r>
-            <w:proofErr w:type="gramEnd"/>
-            <w:r>
-              <w:t xml:space="preserve"> image operations including:</w:t>
+              <w:t>These are various different image operations including:</w:t>
             </w:r>
           </w:p>
           <w:p>
@@ -871,7 +847,7 @@
           <w:noProof/>
         </w:rPr>
         <w:drawing>
-          <wp:inline distT="0" distB="0" distL="0" distR="0" wp14:anchorId="036F9854" wp14:editId="6B337121">
+          <wp:inline distT="0" distB="0" distL="0" distR="0">
             <wp:extent cx="5497384" cy="2235200"/>
             <wp:effectExtent l="0" t="0" r="8255" b="0"/>
             <wp:docPr id="1" name="Picture 1"/>
@@ -927,15 +903,7 @@
         </w:r>
       </w:hyperlink>
       <w:r>
-        <w:t xml:space="preserve"> are frequency distributions of image or other data values. Histograms consist of </w:t>
-      </w:r>
-      <w:proofErr w:type="gramStart"/>
-      <w:r>
-        <w:t>a number of</w:t>
-      </w:r>
-      <w:proofErr w:type="gramEnd"/>
-      <w:r>
-        <w:t xml:space="preserve"> bins, where each bin contains counts for a range of values. This diagram shows how histograms are calculated.</w:t>
+        <w:t xml:space="preserve"> are frequency distributions of image or other data values. Histograms consist of a number of bins, where each bin contains counts for a range of values. This diagram shows how histograms are calculated.</w:t>
       </w:r>
     </w:p>
     <w:p>
@@ -1088,7 +1056,7 @@
         </w:rPr>
         <w:lastRenderedPageBreak/>
         <w:drawing>
-          <wp:inline distT="0" distB="0" distL="0" distR="0" wp14:anchorId="2F87FC0C" wp14:editId="0EDD11FC">
+          <wp:inline distT="0" distB="0" distL="0" distR="0">
             <wp:extent cx="4210050" cy="3520070"/>
             <wp:effectExtent l="0" t="0" r="0" b="4445"/>
             <wp:docPr id="5" name="Picture 5"/>
@@ -1590,15 +1558,7 @@
         <w:sym w:font="Symbol" w:char="F0B0"/>
       </w:r>
       <w:r>
-        <w:t xml:space="preserve">, with a fixed increment between angles, is tested. The lines are </w:t>
-      </w:r>
-      <w:proofErr w:type="gramStart"/>
-      <w:r>
-        <w:t>counted</w:t>
-      </w:r>
-      <w:proofErr w:type="gramEnd"/>
-      <w:r>
-        <w:t xml:space="preserve"> and the most common ones correspond to the strongest lines in the image.</w:t>
+        <w:t>, with a fixed increment between angles, is tested. The lines are counted and the most common ones correspond to the strongest lines in the image.</w:t>
       </w:r>
     </w:p>
     <w:p>
@@ -1608,7 +1568,7 @@
         </w:rPr>
         <w:lastRenderedPageBreak/>
         <w:drawing>
-          <wp:inline distT="0" distB="0" distL="0" distR="0" wp14:anchorId="520797CF" wp14:editId="0857C0EF">
+          <wp:inline distT="0" distB="0" distL="0" distR="0">
             <wp:extent cx="4570275" cy="3106420"/>
             <wp:effectExtent l="0" t="0" r="1905" b="0"/>
             <wp:docPr id="6" name="Picture 6"/>
@@ -1744,31 +1704,7 @@
         <w:fldChar w:fldCharType="end"/>
       </w:r>
       <w:r>
-        <w:t xml:space="preserve">. Image data saved as unsigned </w:t>
-      </w:r>
-      <w:proofErr w:type="gramStart"/>
-      <w:r>
-        <w:t>8 bit</w:t>
-      </w:r>
-      <w:proofErr w:type="gramEnd"/>
-      <w:r>
-        <w:t xml:space="preserve"> values can be visualized as a JPEG image. Much of the data is stored in signed integer for floating point format because the data values involved lie outside the unsigned </w:t>
-      </w:r>
-      <w:proofErr w:type="gramStart"/>
-      <w:r>
-        <w:t>8 bit</w:t>
-      </w:r>
-      <w:proofErr w:type="gramEnd"/>
-      <w:r>
-        <w:t xml:space="preserve"> range of 0 to 255. On saving data values outside the range of 0 to 255 in unsigned </w:t>
-      </w:r>
-      <w:proofErr w:type="gramStart"/>
-      <w:r>
-        <w:t>8 bit</w:t>
-      </w:r>
-      <w:proofErr w:type="gramEnd"/>
-      <w:r>
-        <w:t xml:space="preserve"> images, the exact value saved in undefined. Other data formats include tab-delimited text output that is viewable in Microsoft Excel or </w:t>
+        <w:t xml:space="preserve">. Image data saved as unsigned 8 bit values can be visualized as a JPEG image. Much of the data is stored in signed integer for floating point format because the data values involved lie outside the unsigned 8 bit range of 0 to 255. On saving data values outside the range of 0 to 255 in unsigned 8 bit images, the exact value saved in undefined. Other data formats include tab-delimited text output that is viewable in Microsoft Excel or </w:t>
       </w:r>
       <w:hyperlink r:id="rId17" w:history="1">
         <w:r>
@@ -2262,15 +2198,7 @@
     </w:p>
     <w:p>
       <w:r>
-        <w:t xml:space="preserve">The binary image data file format has the following format. Color RGB pixels are stored as three consecutive pixel values, one for each component. The </w:t>
-      </w:r>
-      <w:proofErr w:type="gramStart"/>
-      <w:r>
-        <w:t>three pixel</w:t>
-      </w:r>
-      <w:proofErr w:type="gramEnd"/>
-      <w:r>
-        <w:t xml:space="preserve"> values represent the red, green, and blue components.</w:t>
+        <w:t>The binary image data file format has the following format. Color RGB pixels are stored as three consecutive pixel values, one for each component. The three pixel values represent the red, green, and blue components.</w:t>
       </w:r>
     </w:p>
     <w:tbl>
@@ -2640,15 +2568,7 @@
     </w:p>
     <w:p>
       <w:r>
-        <w:t xml:space="preserve">Histograms count the number of different values for any data type containing a range of values, such as images or Hough accumulators. The histogram bins correspond to a </w:t>
-      </w:r>
-      <w:proofErr w:type="gramStart"/>
-      <w:r>
-        <w:t>data values</w:t>
-      </w:r>
-      <w:proofErr w:type="gramEnd"/>
-      <w:r>
-        <w:t xml:space="preserve"> ranging from a lower to an upper value. The number of histogram bins </w:t>
+        <w:t xml:space="preserve">Histograms count the number of different values for any data type containing a range of values, such as images or Hough accumulators. The histogram bins correspond to a data values ranging from a lower to an upper value. The number of histogram bins </w:t>
       </w:r>
       <w:proofErr w:type="spellStart"/>
       <w:r>
@@ -2766,15 +2686,7 @@
         <w:pStyle w:val="code0"/>
       </w:pPr>
       <w:r>
-        <w:t xml:space="preserve">    bin = </w:t>
-      </w:r>
-      <w:proofErr w:type="gramStart"/>
-      <w:r>
-        <w:t>round(</w:t>
-      </w:r>
-      <w:proofErr w:type="gramEnd"/>
-      <w:r>
-        <w:t>(</w:t>
+        <w:t xml:space="preserve">    bin = round((</w:t>
       </w:r>
       <w:proofErr w:type="spellStart"/>
       <w:r>
@@ -2814,15 +2726,7 @@
         <w:pStyle w:val="Normalafterlist"/>
       </w:pPr>
       <w:r>
-        <w:t xml:space="preserve">The histogram data type format indicates how histogram data is stored. There are both binary and text stored histogram formats. Binary histogram files are used only within this software. Text histogram files may </w:t>
-      </w:r>
-      <w:proofErr w:type="gramStart"/>
-      <w:r>
-        <w:t>visualized</w:t>
-      </w:r>
-      <w:proofErr w:type="gramEnd"/>
-      <w:r>
-        <w:t xml:space="preserve"> with gnuplot or Microsoft Excel.</w:t>
+        <w:t>The histogram data type format indicates how histogram data is stored. There are both binary and text stored histogram formats. Binary histogram files are used only within this software. Text histogram files may visualized with gnuplot or Microsoft Excel.</w:t>
       </w:r>
     </w:p>
     <w:p>
@@ -3242,25 +3146,29 @@
     </w:p>
     <w:p>
       <w:r>
-        <w:t xml:space="preserve">A </w:t>
-      </w:r>
-      <w:proofErr w:type="spellStart"/>
-      <w:r>
-        <w:t>gnuplot</w:t>
-      </w:r>
-      <w:proofErr w:type="spellEnd"/>
-      <w:r>
-        <w:t xml:space="preserve"> script file </w:t>
+        <w:t xml:space="preserve">A gnuplot script file </w:t>
       </w:r>
       <w:r>
         <w:rPr>
           <w:i/>
           <w:iCs/>
         </w:rPr>
-        <w:t>output-filename.</w:t>
-      </w:r>
-      <w:r>
-        <w:t>gp is generated to display the histogram as:</w:t>
+        <w:t>output-</w:t>
+      </w:r>
+      <w:proofErr w:type="spellStart"/>
+      <w:r>
+        <w:rPr>
+          <w:i/>
+          <w:iCs/>
+        </w:rPr>
+        <w:t>filename.</w:t>
+      </w:r>
+      <w:r>
+        <w:t>gp</w:t>
+      </w:r>
+      <w:proofErr w:type="spellEnd"/>
+      <w:r>
+        <w:t xml:space="preserve"> is generated to display the histogram as:</w:t>
       </w:r>
     </w:p>
     <w:p>
@@ -3286,15 +3194,7 @@
         <w:t>output-filename</w:t>
       </w:r>
       <w:r>
-        <w:t xml:space="preserve">.txt' using </w:t>
-      </w:r>
-      <w:proofErr w:type="gramStart"/>
-      <w:r>
-        <w:t>2:xtic</w:t>
-      </w:r>
-      <w:proofErr w:type="gramEnd"/>
-      <w:r>
-        <w:t>(1)</w:t>
+        <w:t>.txt' using 2:xtic(1)</w:t>
       </w:r>
     </w:p>
     <w:p>
@@ -3323,16 +3223,13 @@
         <w:pStyle w:val="code0"/>
       </w:pPr>
       <w:r>
-        <w:t xml:space="preserve">  $ </w:t>
+        <w:t xml:space="preserve">  $ gnuplot output-</w:t>
       </w:r>
       <w:proofErr w:type="spellStart"/>
       <w:r>
-        <w:t>gnuplot</w:t>
+        <w:t>filename.gp</w:t>
       </w:r>
       <w:proofErr w:type="spellEnd"/>
-      <w:r>
-        <w:t xml:space="preserve"> output-filename.gp</w:t>
-      </w:r>
     </w:p>
     <w:p>
       <w:pPr>
@@ -4875,13 +4772,8 @@
         </w:rPr>
       </w:pPr>
       <w:r>
-        <w:t xml:space="preserve">the accumulator </w:t>
-      </w:r>
-      <w:proofErr w:type="gramStart"/>
-      <w:r>
-        <w:t>count</w:t>
-      </w:r>
-      <w:proofErr w:type="gramEnd"/>
+        <w:t>the accumulator count</w:t>
+      </w:r>
     </w:p>
     <w:p>
       <w:pPr>
@@ -5331,13 +5223,8 @@
       </w:pPr>
       <w:r>
         <w:tab/>
-        <w:t xml:space="preserve">      </w:t>
-      </w:r>
-      <w:proofErr w:type="gramStart"/>
-      <w:r>
-        <w:t>additional-steps</w:t>
-      </w:r>
-      <w:proofErr w:type="gramEnd"/>
+        <w:t xml:space="preserve">      additional-steps</w:t>
+      </w:r>
     </w:p>
     <w:p>
       <w:pPr>
@@ -5444,15 +5331,7 @@
       </w:pPr>
       <w:r>
         <w:tab/>
-        <w:t xml:space="preserve">  “</w:t>
-      </w:r>
-      <w:proofErr w:type="gramStart"/>
-      <w:r>
-        <w:t>input</w:t>
-      </w:r>
-      <w:proofErr w:type="gramEnd"/>
-      <w:r>
-        <w:t>-data”: [</w:t>
+        <w:t xml:space="preserve">  “input-data”: [</w:t>
       </w:r>
     </w:p>
     <w:p>
@@ -5490,15 +5369,7 @@
       </w:pPr>
       <w:r>
         <w:tab/>
-        <w:t xml:space="preserve">  “</w:t>
-      </w:r>
-      <w:proofErr w:type="gramStart"/>
-      <w:r>
-        <w:t>output</w:t>
-      </w:r>
-      <w:proofErr w:type="gramEnd"/>
-      <w:r>
-        <w:t>-data”: [</w:t>
+        <w:t xml:space="preserve">  “output-data”: [</w:t>
       </w:r>
     </w:p>
     <w:p>
@@ -5644,7 +5515,6 @@
         <w:tab/>
         <w:t xml:space="preserve">  "type": "</w:t>
       </w:r>
-      <w:proofErr w:type="gramStart"/>
       <w:r>
         <w:rPr>
           <w:i/>
@@ -5652,7 +5522,6 @@
         </w:rPr>
         <w:t>data-type</w:t>
       </w:r>
-      <w:proofErr w:type="gramEnd"/>
       <w:r>
         <w:t>,</w:t>
       </w:r>
@@ -5746,15 +5615,7 @@
         <w:pStyle w:val="Code"/>
       </w:pPr>
       <w:r>
-        <w:t xml:space="preserve">          "</w:t>
-      </w:r>
-      <w:proofErr w:type="gramStart"/>
-      <w:r>
-        <w:t>parameter</w:t>
-      </w:r>
-      <w:proofErr w:type="gramEnd"/>
-      <w:r>
-        <w:t>-name": "value"</w:t>
+        <w:t xml:space="preserve">          "parameter-name": "value"</w:t>
       </w:r>
     </w:p>
     <w:p>
@@ -5784,7 +5645,6 @@
       <w:r>
         <w:t xml:space="preserve">The </w:t>
       </w:r>
-      <w:proofErr w:type="gramStart"/>
       <w:r>
         <w:rPr>
           <w:i/>
@@ -5792,7 +5652,6 @@
         </w:rPr>
         <w:t>data-type</w:t>
       </w:r>
-      <w:proofErr w:type="gramEnd"/>
       <w:r>
         <w:t xml:space="preserve"> describes the type of input or output object used by an image operator as described in section </w:t>
       </w:r>
@@ -5851,13 +5710,8 @@
             <w:pPr>
               <w:cnfStyle w:val="100000000000" w:firstRow="1" w:lastRow="0" w:firstColumn="0" w:lastColumn="0" w:oddVBand="0" w:evenVBand="0" w:oddHBand="0" w:evenHBand="0" w:firstRowFirstColumn="0" w:firstRowLastColumn="0" w:lastRowFirstColumn="0" w:lastRowLastColumn="0"/>
             </w:pPr>
-            <w:proofErr w:type="gramStart"/>
-            <w:r>
-              <w:t>data-type</w:t>
-            </w:r>
-            <w:proofErr w:type="gramEnd"/>
-            <w:r>
-              <w:t xml:space="preserve"> </w:t>
+            <w:r>
+              <w:t xml:space="preserve">data-type </w:t>
             </w:r>
           </w:p>
         </w:tc>
@@ -6605,21 +6459,12 @@
               <w:t>“</w:t>
             </w:r>
             <w:proofErr w:type="spellStart"/>
-            <w:proofErr w:type="gramStart"/>
-            <w:r>
-              <w:rPr>
-                <w:b w:val="0"/>
-                <w:bCs w:val="0"/>
-              </w:rPr>
-              <w:t>berkeley</w:t>
-            </w:r>
-            <w:proofErr w:type="gramEnd"/>
-            <w:r>
-              <w:rPr>
-                <w:b w:val="0"/>
-                <w:bCs w:val="0"/>
-              </w:rPr>
-              <w:t>_db</w:t>
+            <w:r>
+              <w:rPr>
+                <w:b w:val="0"/>
+                <w:bCs w:val="0"/>
+              </w:rPr>
+              <w:t>berkeley_db</w:t>
             </w:r>
             <w:proofErr w:type="spellEnd"/>
             <w:r>
@@ -6755,7 +6600,6 @@
       <w:r>
         <w:t xml:space="preserve">      "type": "</w:t>
       </w:r>
-      <w:proofErr w:type="gramStart"/>
       <w:r>
         <w:rPr>
           <w:i/>
@@ -6763,7 +6607,6 @@
         </w:rPr>
         <w:t>data-type</w:t>
       </w:r>
-      <w:proofErr w:type="gramEnd"/>
       <w:r>
         <w:t>",</w:t>
       </w:r>
@@ -6914,15 +6757,7 @@
     </w:p>
     <w:p>
       <w:r>
-        <w:t xml:space="preserve">Scripts run results are saved with the original experiment run JSON text file </w:t>
-      </w:r>
-      <w:proofErr w:type="gramStart"/>
-      <w:r>
-        <w:t>into  a</w:t>
-      </w:r>
-      <w:proofErr w:type="gramEnd"/>
-      <w:r>
-        <w:t xml:space="preserve"> log file. Results are logged into different levels of the script. The format in which results are added to the top-level of the experiment script follows. The log results are added at the end of each </w:t>
+        <w:t xml:space="preserve">Scripts run results are saved with the original experiment run JSON text file into  a log file. Results are logged into different levels of the script. The format in which results are added to the top-level of the experiment script follows. The log results are added at the end of each </w:t>
       </w:r>
       <w:r>
         <w:rPr>
@@ -6958,15 +6793,7 @@
       </w:pPr>
       <w:r>
         <w:tab/>
-        <w:t xml:space="preserve">    “run</w:t>
-      </w:r>
-      <w:proofErr w:type="gramStart"/>
-      <w:r>
-        <w:t>” :</w:t>
-      </w:r>
-      <w:proofErr w:type="gramEnd"/>
-      <w:r>
-        <w:t xml:space="preserve"> {</w:t>
+        <w:t xml:space="preserve">    “run” : {</w:t>
       </w:r>
     </w:p>
     <w:p>
@@ -6975,15 +6802,7 @@
       </w:pPr>
       <w:r>
         <w:tab/>
-        <w:t xml:space="preserve">        “</w:t>
-      </w:r>
-      <w:proofErr w:type="gramStart"/>
-      <w:r>
-        <w:t>script</w:t>
-      </w:r>
-      <w:proofErr w:type="gramEnd"/>
-      <w:r>
-        <w:t>-path”: “</w:t>
+        <w:t xml:space="preserve">        “script-path”: “</w:t>
       </w:r>
       <w:r>
         <w:rPr>
@@ -7209,7 +7028,6 @@
         <w:tab/>
         <w:t xml:space="preserve">      </w:t>
       </w:r>
-      <w:proofErr w:type="gramStart"/>
       <w:r>
         <w:rPr>
           <w:i/>
@@ -7217,7 +7035,6 @@
         </w:rPr>
         <w:t>additional-steps</w:t>
       </w:r>
-      <w:proofErr w:type="gramEnd"/>
     </w:p>
     <w:p>
       <w:pPr>
@@ -7350,28 +7167,15 @@
         <w:pStyle w:val="Code"/>
       </w:pPr>
       <w:r>
-        <w:t xml:space="preserve">    "run</w:t>
-      </w:r>
-      <w:proofErr w:type="gramStart"/>
-      <w:r>
-        <w:t>":{</w:t>
-      </w:r>
-      <w:proofErr w:type="gramEnd"/>
+        <w:t xml:space="preserve">    "run":{</w:t>
+      </w:r>
     </w:p>
     <w:p>
       <w:pPr>
         <w:pStyle w:val="Code"/>
       </w:pPr>
       <w:r>
-        <w:t xml:space="preserve">      "</w:t>
-      </w:r>
-      <w:proofErr w:type="gramStart"/>
-      <w:r>
-        <w:t>script</w:t>
-      </w:r>
-      <w:proofErr w:type="gramEnd"/>
-      <w:r>
-        <w:t>-path":"</w:t>
+        <w:t xml:space="preserve">      "script-path":"</w:t>
       </w:r>
       <w:proofErr w:type="spellStart"/>
       <w:r>
@@ -7531,15 +7335,7 @@
       </w:pPr>
       <w:r>
         <w:tab/>
-        <w:t xml:space="preserve">  “</w:t>
-      </w:r>
-      <w:proofErr w:type="gramStart"/>
-      <w:r>
-        <w:t>input</w:t>
-      </w:r>
-      <w:proofErr w:type="gramEnd"/>
-      <w:r>
-        <w:t>-data”: [</w:t>
+        <w:t xml:space="preserve">  “input-data”: [</w:t>
       </w:r>
     </w:p>
     <w:p>
@@ -7577,15 +7373,7 @@
       </w:pPr>
       <w:r>
         <w:tab/>
-        <w:t xml:space="preserve">  “</w:t>
-      </w:r>
-      <w:proofErr w:type="gramStart"/>
-      <w:r>
-        <w:t>output</w:t>
-      </w:r>
-      <w:proofErr w:type="gramEnd"/>
-      <w:r>
-        <w:t>-data”: [</w:t>
+        <w:t xml:space="preserve">  “output-data”: [</w:t>
       </w:r>
     </w:p>
     <w:p>
@@ -7726,15 +7514,7 @@
       </w:pPr>
       <w:r>
         <w:lastRenderedPageBreak/>
-        <w:t xml:space="preserve">  “</w:t>
-      </w:r>
-      <w:proofErr w:type="gramStart"/>
-      <w:r>
-        <w:t>module</w:t>
-      </w:r>
-      <w:proofErr w:type="gramEnd"/>
-      <w:r>
-        <w:t>-id”: “error-message”</w:t>
+        <w:t xml:space="preserve">  “module-id”: “error-message”</w:t>
       </w:r>
     </w:p>
     <w:p>
@@ -7896,15 +7676,7 @@
         <w:pStyle w:val="code0"/>
       </w:pPr>
       <w:r>
-        <w:t xml:space="preserve">  </w:t>
-      </w:r>
-      <w:proofErr w:type="gramStart"/>
-      <w:r>
-        <w:t>$ .</w:t>
-      </w:r>
-      <w:proofErr w:type="gramEnd"/>
-      <w:r>
-        <w:t xml:space="preserve">/cv-workbench </w:t>
+        <w:t xml:space="preserve">  $ ./cv-workbench </w:t>
       </w:r>
       <w:r>
         <w:rPr>
@@ -8030,15 +7802,7 @@
       </w:pPr>
       <w:r>
         <w:tab/>
-        <w:t xml:space="preserve">  "</w:t>
-      </w:r>
-      <w:proofErr w:type="gramStart"/>
-      <w:r>
-        <w:t>input</w:t>
-      </w:r>
-      <w:proofErr w:type="gramEnd"/>
-      <w:r>
-        <w:t>-data": [</w:t>
+        <w:t xml:space="preserve">  "input-data": [</w:t>
       </w:r>
     </w:p>
     <w:p>
@@ -8145,15 +7909,7 @@
       </w:pPr>
       <w:r>
         <w:tab/>
-        <w:t xml:space="preserve">  "</w:t>
-      </w:r>
-      <w:proofErr w:type="gramStart"/>
-      <w:r>
-        <w:t>output</w:t>
-      </w:r>
-      <w:proofErr w:type="gramEnd"/>
-      <w:r>
-        <w:t>-data": [</w:t>
+        <w:t xml:space="preserve">  "output-data": [</w:t>
       </w:r>
     </w:p>
     <w:p>
@@ -8453,23 +8209,7 @@
                 <w:b w:val="0"/>
                 <w:bCs w:val="0"/>
               </w:rPr>
-              <w:t xml:space="preserve">  "</w:t>
-            </w:r>
-            <w:proofErr w:type="gramStart"/>
-            <w:r>
-              <w:rPr>
-                <w:b w:val="0"/>
-                <w:bCs w:val="0"/>
-              </w:rPr>
-              <w:t>input</w:t>
-            </w:r>
-            <w:proofErr w:type="gramEnd"/>
-            <w:r>
-              <w:rPr>
-                <w:b w:val="0"/>
-                <w:bCs w:val="0"/>
-              </w:rPr>
-              <w:t>-data": [</w:t>
+              <w:t xml:space="preserve">  "input-data": [</w:t>
             </w:r>
           </w:p>
           <w:p>
@@ -8694,23 +8434,7 @@
                 <w:b w:val="0"/>
                 <w:bCs w:val="0"/>
               </w:rPr>
-              <w:t xml:space="preserve">  "</w:t>
-            </w:r>
-            <w:proofErr w:type="gramStart"/>
-            <w:r>
-              <w:rPr>
-                <w:b w:val="0"/>
-                <w:bCs w:val="0"/>
-              </w:rPr>
-              <w:t>output</w:t>
-            </w:r>
-            <w:proofErr w:type="gramEnd"/>
-            <w:r>
-              <w:rPr>
-                <w:b w:val="0"/>
-                <w:bCs w:val="0"/>
-              </w:rPr>
-              <w:t>-data": [</w:t>
+              <w:t xml:space="preserve">  "output-data": [</w:t>
             </w:r>
           </w:p>
           <w:p>
@@ -9065,15 +8789,7 @@
       </w:pPr>
       <w:r>
         <w:tab/>
-        <w:t xml:space="preserve">  "</w:t>
-      </w:r>
-      <w:proofErr w:type="gramStart"/>
-      <w:r>
-        <w:t>input</w:t>
-      </w:r>
-      <w:proofErr w:type="gramEnd"/>
-      <w:r>
-        <w:t>-data": [</w:t>
+        <w:t xml:space="preserve">  "input-data": [</w:t>
       </w:r>
     </w:p>
     <w:p>
@@ -9180,15 +8896,7 @@
       </w:pPr>
       <w:r>
         <w:tab/>
-        <w:t xml:space="preserve">  "</w:t>
-      </w:r>
-      <w:proofErr w:type="gramStart"/>
-      <w:r>
-        <w:t>output</w:t>
-      </w:r>
-      <w:proofErr w:type="gramEnd"/>
-      <w:r>
-        <w:t>-data": [</w:t>
+        <w:t xml:space="preserve">  "output-data": [</w:t>
       </w:r>
     </w:p>
     <w:p>
@@ -9308,13 +9016,8 @@
         <w:t xml:space="preserve">    "</w:t>
       </w:r>
       <w:proofErr w:type="spellStart"/>
-      <w:proofErr w:type="gramStart"/>
-      <w:r>
-        <w:t>lower</w:t>
-      </w:r>
-      <w:proofErr w:type="gramEnd"/>
-      <w:r>
-        <w:t>_in</w:t>
+      <w:r>
+        <w:t>lower_in</w:t>
       </w:r>
       <w:proofErr w:type="spellEnd"/>
       <w:r>
@@ -9330,13 +9033,8 @@
         <w:t xml:space="preserve">    "</w:t>
       </w:r>
       <w:proofErr w:type="spellStart"/>
-      <w:proofErr w:type="gramStart"/>
-      <w:r>
-        <w:t>upper</w:t>
-      </w:r>
-      <w:proofErr w:type="gramEnd"/>
-      <w:r>
-        <w:t>_in</w:t>
+      <w:r>
+        <w:t>upper_in</w:t>
       </w:r>
       <w:proofErr w:type="spellEnd"/>
       <w:r>
@@ -9352,13 +9050,8 @@
         <w:t xml:space="preserve">    "</w:t>
       </w:r>
       <w:proofErr w:type="spellStart"/>
-      <w:proofErr w:type="gramStart"/>
-      <w:r>
-        <w:t>lower</w:t>
-      </w:r>
-      <w:proofErr w:type="gramEnd"/>
-      <w:r>
-        <w:t>_out</w:t>
+      <w:r>
+        <w:t>lower_out</w:t>
       </w:r>
       <w:proofErr w:type="spellEnd"/>
       <w:r>
@@ -9374,13 +9067,8 @@
         <w:t xml:space="preserve">    "</w:t>
       </w:r>
       <w:proofErr w:type="spellStart"/>
-      <w:proofErr w:type="gramStart"/>
-      <w:r>
-        <w:t>upper</w:t>
-      </w:r>
-      <w:proofErr w:type="gramEnd"/>
-      <w:r>
-        <w:t>_out</w:t>
+      <w:r>
+        <w:t>upper_out</w:t>
       </w:r>
       <w:proofErr w:type="spellEnd"/>
       <w:r>
@@ -9551,23 +9239,7 @@
                 <w:b w:val="0"/>
                 <w:bCs w:val="0"/>
               </w:rPr>
-              <w:t xml:space="preserve">  "</w:t>
-            </w:r>
-            <w:proofErr w:type="gramStart"/>
-            <w:r>
-              <w:rPr>
-                <w:b w:val="0"/>
-                <w:bCs w:val="0"/>
-              </w:rPr>
-              <w:t>input</w:t>
-            </w:r>
-            <w:proofErr w:type="gramEnd"/>
-            <w:r>
-              <w:rPr>
-                <w:b w:val="0"/>
-                <w:bCs w:val="0"/>
-              </w:rPr>
-              <w:t>-data": [</w:t>
+              <w:t xml:space="preserve">  "input-data": [</w:t>
             </w:r>
           </w:p>
           <w:p>
@@ -9783,23 +9455,7 @@
                 <w:b w:val="0"/>
                 <w:bCs w:val="0"/>
               </w:rPr>
-              <w:t xml:space="preserve">  "</w:t>
-            </w:r>
-            <w:proofErr w:type="gramStart"/>
-            <w:r>
-              <w:rPr>
-                <w:b w:val="0"/>
-                <w:bCs w:val="0"/>
-              </w:rPr>
-              <w:t>output</w:t>
-            </w:r>
-            <w:proofErr w:type="gramEnd"/>
-            <w:r>
-              <w:rPr>
-                <w:b w:val="0"/>
-                <w:bCs w:val="0"/>
-              </w:rPr>
-              <w:t>-data": [</w:t>
+              <w:t xml:space="preserve">  "output-data": [</w:t>
             </w:r>
           </w:p>
           <w:p>
@@ -10031,21 +9687,12 @@
               <w:t xml:space="preserve">    "</w:t>
             </w:r>
             <w:proofErr w:type="spellStart"/>
-            <w:proofErr w:type="gramStart"/>
-            <w:r>
-              <w:rPr>
-                <w:b w:val="0"/>
-                <w:bCs w:val="0"/>
-              </w:rPr>
-              <w:t>lower</w:t>
-            </w:r>
-            <w:proofErr w:type="gramEnd"/>
-            <w:r>
-              <w:rPr>
-                <w:b w:val="0"/>
-                <w:bCs w:val="0"/>
-              </w:rPr>
-              <w:t>_in</w:t>
+            <w:r>
+              <w:rPr>
+                <w:b w:val="0"/>
+                <w:bCs w:val="0"/>
+              </w:rPr>
+              <w:t>lower_in</w:t>
             </w:r>
             <w:proofErr w:type="spellEnd"/>
             <w:r>
@@ -10072,21 +9719,12 @@
               <w:t xml:space="preserve">    "</w:t>
             </w:r>
             <w:proofErr w:type="spellStart"/>
-            <w:proofErr w:type="gramStart"/>
-            <w:r>
-              <w:rPr>
-                <w:b w:val="0"/>
-                <w:bCs w:val="0"/>
-              </w:rPr>
-              <w:t>upper</w:t>
-            </w:r>
-            <w:proofErr w:type="gramEnd"/>
-            <w:r>
-              <w:rPr>
-                <w:b w:val="0"/>
-                <w:bCs w:val="0"/>
-              </w:rPr>
-              <w:t>_in</w:t>
+            <w:r>
+              <w:rPr>
+                <w:b w:val="0"/>
+                <w:bCs w:val="0"/>
+              </w:rPr>
+              <w:t>upper_in</w:t>
             </w:r>
             <w:proofErr w:type="spellEnd"/>
             <w:r>
@@ -10113,21 +9751,12 @@
               <w:t xml:space="preserve">    "</w:t>
             </w:r>
             <w:proofErr w:type="spellStart"/>
-            <w:proofErr w:type="gramStart"/>
-            <w:r>
-              <w:rPr>
-                <w:b w:val="0"/>
-                <w:bCs w:val="0"/>
-              </w:rPr>
-              <w:t>lower</w:t>
-            </w:r>
-            <w:proofErr w:type="gramEnd"/>
-            <w:r>
-              <w:rPr>
-                <w:b w:val="0"/>
-                <w:bCs w:val="0"/>
-              </w:rPr>
-              <w:t>_out</w:t>
+            <w:r>
+              <w:rPr>
+                <w:b w:val="0"/>
+                <w:bCs w:val="0"/>
+              </w:rPr>
+              <w:t>lower_out</w:t>
             </w:r>
             <w:proofErr w:type="spellEnd"/>
             <w:r>
@@ -10154,21 +9783,12 @@
               <w:t xml:space="preserve">    "</w:t>
             </w:r>
             <w:proofErr w:type="spellStart"/>
-            <w:proofErr w:type="gramStart"/>
-            <w:r>
-              <w:rPr>
-                <w:b w:val="0"/>
-                <w:bCs w:val="0"/>
-              </w:rPr>
-              <w:t>upper</w:t>
-            </w:r>
-            <w:proofErr w:type="gramEnd"/>
-            <w:r>
-              <w:rPr>
-                <w:b w:val="0"/>
-                <w:bCs w:val="0"/>
-              </w:rPr>
-              <w:t>_out</w:t>
+            <w:r>
+              <w:rPr>
+                <w:b w:val="0"/>
+                <w:bCs w:val="0"/>
+              </w:rPr>
+              <w:t>upper_out</w:t>
             </w:r>
             <w:proofErr w:type="spellEnd"/>
             <w:r>
@@ -10205,15 +9825,7 @@
               <w:cnfStyle w:val="000000000000" w:firstRow="0" w:lastRow="0" w:firstColumn="0" w:lastColumn="0" w:oddVBand="0" w:evenVBand="0" w:oddHBand="0" w:evenHBand="0" w:firstRowFirstColumn="0" w:firstRowLastColumn="0" w:lastRowFirstColumn="0" w:lastRowLastColumn="0"/>
             </w:pPr>
             <w:r>
-              <w:t xml:space="preserve">The script parameter </w:t>
-            </w:r>
-            <w:proofErr w:type="gramStart"/>
-            <w:r>
-              <w:t>define</w:t>
-            </w:r>
-            <w:proofErr w:type="gramEnd"/>
-            <w:r>
-              <w:t xml:space="preserve"> </w:t>
+              <w:t xml:space="preserve">The script parameter define </w:t>
             </w:r>
             <w:proofErr w:type="spellStart"/>
             <w:r>
@@ -14032,21 +13644,7 @@
         <w:pStyle w:val="Normalafterlist"/>
       </w:pPr>
       <w:r>
-        <w:t>The parameter</w:t>
-      </w:r>
-      <w:r>
-        <w:t>s</w:t>
-      </w:r>
-      <w:r>
-        <w:t xml:space="preserve"> to the Kirsch operator </w:t>
-      </w:r>
-      <w:proofErr w:type="gramStart"/>
-      <w:r>
-        <w:t>is</w:t>
-      </w:r>
-      <w:proofErr w:type="gramEnd"/>
-      <w:r>
-        <w:t>:</w:t>
+        <w:t>The parameters to the Kirsch operator is:</w:t>
       </w:r>
     </w:p>
     <w:tbl>
@@ -14221,7 +13819,6 @@
                 <w:bCs w:val="0"/>
               </w:rPr>
             </w:pPr>
-            <w:proofErr w:type="gramStart"/>
             <w:r>
               <w:rPr>
                 <w:b w:val="0"/>
@@ -14229,7 +13826,6 @@
               </w:rPr>
               <w:t>max-row</w:t>
             </w:r>
-            <w:proofErr w:type="gramEnd"/>
           </w:p>
         </w:tc>
         <w:tc>
@@ -14324,7 +13920,6 @@
                 <w:bCs w:val="0"/>
               </w:rPr>
             </w:pPr>
-            <w:proofErr w:type="gramStart"/>
             <w:r>
               <w:rPr>
                 <w:b w:val="0"/>
@@ -14332,7 +13927,6 @@
               </w:rPr>
               <w:t>max-col</w:t>
             </w:r>
-            <w:proofErr w:type="gramEnd"/>
           </w:p>
         </w:tc>
         <w:tc>
@@ -15515,21 +15109,7 @@
         <w:pStyle w:val="Normalafterlist"/>
       </w:pPr>
       <w:r>
-        <w:t>The parameter</w:t>
-      </w:r>
-      <w:r>
-        <w:t>s</w:t>
-      </w:r>
-      <w:r>
-        <w:t xml:space="preserve"> to the Prewitt operator </w:t>
-      </w:r>
-      <w:proofErr w:type="gramStart"/>
-      <w:r>
-        <w:t>is</w:t>
-      </w:r>
-      <w:proofErr w:type="gramEnd"/>
-      <w:r>
-        <w:t>:</w:t>
+        <w:t>The parameters to the Prewitt operator is:</w:t>
       </w:r>
     </w:p>
     <w:tbl>
@@ -15704,7 +15284,6 @@
                 <w:bCs w:val="0"/>
               </w:rPr>
             </w:pPr>
-            <w:proofErr w:type="gramStart"/>
             <w:r>
               <w:rPr>
                 <w:b w:val="0"/>
@@ -15712,7 +15291,6 @@
               </w:rPr>
               <w:t>max-row</w:t>
             </w:r>
-            <w:proofErr w:type="gramEnd"/>
           </w:p>
         </w:tc>
         <w:tc>
@@ -15807,7 +15385,6 @@
                 <w:bCs w:val="0"/>
               </w:rPr>
             </w:pPr>
-            <w:proofErr w:type="gramStart"/>
             <w:r>
               <w:rPr>
                 <w:b w:val="0"/>
@@ -15815,7 +15392,6 @@
               </w:rPr>
               <w:t>max-col</w:t>
             </w:r>
-            <w:proofErr w:type="gramEnd"/>
           </w:p>
         </w:tc>
         <w:tc>
@@ -16865,21 +16441,7 @@
         <w:pStyle w:val="Normalafterlist"/>
       </w:pPr>
       <w:r>
-        <w:t>The parameter</w:t>
-      </w:r>
-      <w:r>
-        <w:t>s</w:t>
-      </w:r>
-      <w:r>
-        <w:t xml:space="preserve"> to the Roberts operator </w:t>
-      </w:r>
-      <w:proofErr w:type="gramStart"/>
-      <w:r>
-        <w:t>is</w:t>
-      </w:r>
-      <w:proofErr w:type="gramEnd"/>
-      <w:r>
-        <w:t>:</w:t>
+        <w:t>The parameters to the Roberts operator is:</w:t>
       </w:r>
     </w:p>
     <w:tbl>
@@ -17054,7 +16616,6 @@
                 <w:bCs w:val="0"/>
               </w:rPr>
             </w:pPr>
-            <w:proofErr w:type="gramStart"/>
             <w:r>
               <w:rPr>
                 <w:b w:val="0"/>
@@ -17062,7 +16623,6 @@
               </w:rPr>
               <w:t>max-row</w:t>
             </w:r>
-            <w:proofErr w:type="gramEnd"/>
           </w:p>
         </w:tc>
         <w:tc>
@@ -17157,7 +16717,6 @@
                 <w:bCs w:val="0"/>
               </w:rPr>
             </w:pPr>
-            <w:proofErr w:type="gramStart"/>
             <w:r>
               <w:rPr>
                 <w:b w:val="0"/>
@@ -17165,7 +16724,6 @@
               </w:rPr>
               <w:t>max-col</w:t>
             </w:r>
-            <w:proofErr w:type="gramEnd"/>
           </w:p>
         </w:tc>
         <w:tc>
@@ -18329,21 +17887,7 @@
         <w:pStyle w:val="Normalafterlist"/>
       </w:pPr>
       <w:r>
-        <w:t>The parameter</w:t>
-      </w:r>
-      <w:r>
-        <w:t>s</w:t>
-      </w:r>
-      <w:r>
-        <w:t xml:space="preserve"> to the Sobel operator </w:t>
-      </w:r>
-      <w:proofErr w:type="gramStart"/>
-      <w:r>
-        <w:t>is</w:t>
-      </w:r>
-      <w:proofErr w:type="gramEnd"/>
-      <w:r>
-        <w:t>:</w:t>
+        <w:t>The parameters to the Sobel operator is:</w:t>
       </w:r>
     </w:p>
     <w:tbl>
@@ -18518,7 +18062,6 @@
                 <w:bCs w:val="0"/>
               </w:rPr>
             </w:pPr>
-            <w:proofErr w:type="gramStart"/>
             <w:r>
               <w:rPr>
                 <w:b w:val="0"/>
@@ -18526,7 +18069,6 @@
               </w:rPr>
               <w:t>max-row</w:t>
             </w:r>
-            <w:proofErr w:type="gramEnd"/>
           </w:p>
         </w:tc>
         <w:tc>
@@ -18621,7 +18163,6 @@
                 <w:bCs w:val="0"/>
               </w:rPr>
             </w:pPr>
-            <w:proofErr w:type="gramStart"/>
             <w:r>
               <w:rPr>
                 <w:b w:val="0"/>
@@ -18629,7 +18170,6 @@
               </w:rPr>
               <w:t>max-col</w:t>
             </w:r>
-            <w:proofErr w:type="gramEnd"/>
           </w:p>
         </w:tc>
         <w:tc>
@@ -19131,15 +18671,7 @@
         <w:t xml:space="preserve">structuring element </w:t>
       </w:r>
       <w:r>
-        <w:t xml:space="preserve">at each pixel position and decides as to what output value to produce. Erosion selects the minimum value under the mask and dilation selects the maximum value. This will give the appropriate result for both binary and grayscale images. The operator </w:t>
-      </w:r>
-      <w:proofErr w:type="gramStart"/>
-      <w:r>
-        <w:t>produce</w:t>
-      </w:r>
-      <w:proofErr w:type="gramEnd"/>
-      <w:r>
-        <w:t xml:space="preserve"> output images of the same depth as the input images. </w:t>
+        <w:t xml:space="preserve">at each pixel position and decides as to what output value to produce. Erosion selects the minimum value under the mask and dilation selects the maximum value. This will give the appropriate result for both binary and grayscale images. The operator produce output images of the same depth as the input images. </w:t>
       </w:r>
     </w:p>
     <w:tbl>
@@ -20161,7 +19693,6 @@
                 <w:bCs w:val="0"/>
               </w:rPr>
             </w:pPr>
-            <w:proofErr w:type="gramStart"/>
             <w:r>
               <w:rPr>
                 <w:b w:val="0"/>
@@ -20169,7 +19700,6 @@
               </w:rPr>
               <w:t>max-row</w:t>
             </w:r>
-            <w:proofErr w:type="gramEnd"/>
           </w:p>
         </w:tc>
         <w:tc>
@@ -20264,7 +19794,6 @@
                 <w:bCs w:val="0"/>
               </w:rPr>
             </w:pPr>
-            <w:proofErr w:type="gramStart"/>
             <w:r>
               <w:rPr>
                 <w:b w:val="0"/>
@@ -20272,7 +19801,6 @@
               </w:rPr>
               <w:t>max-col</w:t>
             </w:r>
-            <w:proofErr w:type="gramEnd"/>
           </w:p>
         </w:tc>
         <w:tc>
@@ -20752,15 +20280,7 @@
     </w:p>
     <w:p>
       <w:r>
-        <w:t>The filter smooth average operator convolves the image with a kernel that averages the pixels under the kernel. For a kernel that is size rows x cols, the output pixel is the sum of the pixels in a rectangle rows x cols around the input pixel, divided by 1</w:t>
-      </w:r>
-      <w:proofErr w:type="gramStart"/>
-      <w:r>
-        <w:t>/(</w:t>
-      </w:r>
-      <w:proofErr w:type="gramEnd"/>
-      <w:r>
-        <w:t>rows * cols).</w:t>
+        <w:t>The filter smooth average operator convolves the image with a kernel that averages the pixels under the kernel. For a kernel that is size rows x cols, the output pixel is the sum of the pixels in a rectangle rows x cols around the input pixel, divided by 1/(rows * cols).</w:t>
       </w:r>
     </w:p>
     <w:p>
@@ -21238,7 +20758,6 @@
                 <w:bCs w:val="0"/>
               </w:rPr>
             </w:pPr>
-            <w:proofErr w:type="gramStart"/>
             <w:r>
               <w:rPr>
                 <w:b w:val="0"/>
@@ -21246,7 +20765,6 @@
               </w:rPr>
               <w:t>max-row</w:t>
             </w:r>
-            <w:proofErr w:type="gramEnd"/>
           </w:p>
         </w:tc>
         <w:tc>
@@ -21341,7 +20859,6 @@
                 <w:bCs w:val="0"/>
               </w:rPr>
             </w:pPr>
-            <w:proofErr w:type="gramStart"/>
             <w:r>
               <w:rPr>
                 <w:b w:val="0"/>
@@ -21349,7 +20866,6 @@
               </w:rPr>
               <w:t>max-col</w:t>
             </w:r>
-            <w:proofErr w:type="gramEnd"/>
           </w:p>
         </w:tc>
         <w:tc>
@@ -22976,7 +22492,6 @@
                 <w:bCs w:val="0"/>
               </w:rPr>
             </w:pPr>
-            <w:proofErr w:type="gramStart"/>
             <w:r>
               <w:rPr>
                 <w:b w:val="0"/>
@@ -22984,7 +22499,6 @@
               </w:rPr>
               <w:t>max-row</w:t>
             </w:r>
-            <w:proofErr w:type="gramEnd"/>
           </w:p>
         </w:tc>
         <w:tc>
@@ -23079,7 +22593,6 @@
                 <w:bCs w:val="0"/>
               </w:rPr>
             </w:pPr>
-            <w:proofErr w:type="gramStart"/>
             <w:r>
               <w:rPr>
                 <w:b w:val="0"/>
@@ -23087,7 +22600,6 @@
               </w:rPr>
               <w:t>max-col</w:t>
             </w:r>
-            <w:proofErr w:type="gramEnd"/>
           </w:p>
         </w:tc>
         <w:tc>
@@ -24017,7 +23529,6 @@
                 <w:bCs w:val="0"/>
               </w:rPr>
             </w:pPr>
-            <w:proofErr w:type="gramStart"/>
             <w:r>
               <w:rPr>
                 <w:b w:val="0"/>
@@ -24025,7 +23536,6 @@
               </w:rPr>
               <w:t>lower-value</w:t>
             </w:r>
-            <w:proofErr w:type="gramEnd"/>
           </w:p>
         </w:tc>
         <w:tc>
@@ -24074,7 +23584,6 @@
                 <w:bCs w:val="0"/>
               </w:rPr>
             </w:pPr>
-            <w:proofErr w:type="gramStart"/>
             <w:r>
               <w:rPr>
                 <w:b w:val="0"/>
@@ -24082,7 +23591,6 @@
               </w:rPr>
               <w:t>upper-value</w:t>
             </w:r>
-            <w:proofErr w:type="gramEnd"/>
           </w:p>
         </w:tc>
         <w:tc>
@@ -24319,21 +23827,12 @@
                 <w:bCs w:val="0"/>
               </w:rPr>
             </w:pPr>
-            <w:proofErr w:type="gramStart"/>
-            <w:r>
-              <w:rPr>
-                <w:b w:val="0"/>
-                <w:bCs w:val="0"/>
-              </w:rPr>
-              <w:t>accumulator</w:t>
-            </w:r>
-            <w:proofErr w:type="gramEnd"/>
-            <w:r>
-              <w:rPr>
-                <w:b w:val="0"/>
-                <w:bCs w:val="0"/>
-              </w:rPr>
-              <w:t xml:space="preserve"> mean</w:t>
+            <w:r>
+              <w:rPr>
+                <w:b w:val="0"/>
+                <w:bCs w:val="0"/>
+              </w:rPr>
+              <w:t>accumulator mean</w:t>
             </w:r>
           </w:p>
         </w:tc>
@@ -25002,7 +24501,6 @@
                 <w:bCs w:val="0"/>
               </w:rPr>
             </w:pPr>
-            <w:proofErr w:type="gramStart"/>
             <w:r>
               <w:rPr>
                 <w:b w:val="0"/>
@@ -25011,7 +24509,6 @@
               <w:lastRenderedPageBreak/>
               <w:t>lower-value</w:t>
             </w:r>
-            <w:proofErr w:type="gramEnd"/>
           </w:p>
         </w:tc>
         <w:tc>
@@ -25060,7 +24557,6 @@
                 <w:bCs w:val="0"/>
               </w:rPr>
             </w:pPr>
-            <w:proofErr w:type="gramStart"/>
             <w:r>
               <w:rPr>
                 <w:b w:val="0"/>
@@ -25068,7 +24564,6 @@
               </w:rPr>
               <w:t>upper-value</w:t>
             </w:r>
-            <w:proofErr w:type="gramEnd"/>
           </w:p>
         </w:tc>
         <w:tc>
@@ -25165,7 +24660,6 @@
                 <w:bCs w:val="0"/>
               </w:rPr>
             </w:pPr>
-            <w:proofErr w:type="gramStart"/>
             <w:r>
               <w:rPr>
                 <w:b w:val="0"/>
@@ -25173,7 +24667,6 @@
               </w:rPr>
               <w:t>max-row</w:t>
             </w:r>
-            <w:proofErr w:type="gramEnd"/>
           </w:p>
         </w:tc>
         <w:tc>
@@ -25274,7 +24767,6 @@
                 <w:bCs w:val="0"/>
               </w:rPr>
             </w:pPr>
-            <w:proofErr w:type="gramStart"/>
             <w:r>
               <w:rPr>
                 <w:b w:val="0"/>
@@ -25282,7 +24774,6 @@
               </w:rPr>
               <w:t>max-col</w:t>
             </w:r>
-            <w:proofErr w:type="gramEnd"/>
           </w:p>
         </w:tc>
         <w:tc>
@@ -26133,15 +25624,7 @@
               <w:cnfStyle w:val="000000100000" w:firstRow="0" w:lastRow="0" w:firstColumn="0" w:lastColumn="0" w:oddVBand="0" w:evenVBand="0" w:oddHBand="1" w:evenHBand="0" w:firstRowFirstColumn="0" w:firstRowLastColumn="0" w:lastRowFirstColumn="0" w:lastRowLastColumn="0"/>
             </w:pPr>
             <w:r>
-              <w:t xml:space="preserve">increment for the Hough accumulator angle. The number of angles </w:t>
-            </w:r>
-            <w:proofErr w:type="gramStart"/>
-            <w:r>
-              <w:t>are</w:t>
-            </w:r>
-            <w:proofErr w:type="gramEnd"/>
-            <w:r>
-              <w:t xml:space="preserve"> 180 / </w:t>
+              <w:t xml:space="preserve">increment for the Hough accumulator angle. The number of angles are 180 / </w:t>
             </w:r>
             <w:proofErr w:type="spellStart"/>
             <w:r>
@@ -26451,7 +25934,6 @@
                 <w:bCs w:val="0"/>
               </w:rPr>
             </w:pPr>
-            <w:proofErr w:type="gramStart"/>
             <w:r>
               <w:rPr>
                 <w:b w:val="0"/>
@@ -26460,7 +25942,6 @@
               <w:lastRenderedPageBreak/>
               <w:t>max-row</w:t>
             </w:r>
-            <w:proofErr w:type="gramEnd"/>
           </w:p>
         </w:tc>
         <w:tc>
@@ -26561,7 +26042,6 @@
                 <w:bCs w:val="0"/>
               </w:rPr>
             </w:pPr>
-            <w:proofErr w:type="gramStart"/>
             <w:r>
               <w:rPr>
                 <w:b w:val="0"/>
@@ -26569,7 +26049,6 @@
               </w:rPr>
               <w:t>max-col</w:t>
             </w:r>
-            <w:proofErr w:type="gramEnd"/>
           </w:p>
         </w:tc>
         <w:tc>
@@ -27248,15 +26727,7 @@
               <w:cnfStyle w:val="000000100000" w:firstRow="0" w:lastRow="0" w:firstColumn="0" w:lastColumn="0" w:oddVBand="0" w:evenVBand="0" w:oddHBand="1" w:evenHBand="0" w:firstRowFirstColumn="0" w:firstRowLastColumn="0" w:lastRowFirstColumn="0" w:lastRowLastColumn="0"/>
             </w:pPr>
             <w:r>
-              <w:t xml:space="preserve">increment for the Hough accumulator angle. The number of angles </w:t>
-            </w:r>
-            <w:proofErr w:type="gramStart"/>
-            <w:r>
-              <w:t>are</w:t>
-            </w:r>
-            <w:proofErr w:type="gramEnd"/>
-            <w:r>
-              <w:t xml:space="preserve"> 180 / </w:t>
+              <w:t xml:space="preserve">increment for the Hough accumulator angle. The number of angles are 180 / </w:t>
             </w:r>
             <w:proofErr w:type="spellStart"/>
             <w:r>
@@ -27287,14 +26758,7 @@
                 <w:b w:val="0"/>
                 <w:bCs w:val="0"/>
               </w:rPr>
-              <w:t>rho</w:t>
-            </w:r>
-            <w:r>
-              <w:rPr>
-                <w:b w:val="0"/>
-                <w:bCs w:val="0"/>
-              </w:rPr>
-              <w:t>-</w:t>
+              <w:t>rho-</w:t>
             </w:r>
             <w:proofErr w:type="spellStart"/>
             <w:r>
@@ -27451,7 +26915,6 @@
                 <w:bCs w:val="0"/>
               </w:rPr>
             </w:pPr>
-            <w:proofErr w:type="gramStart"/>
             <w:r>
               <w:rPr>
                 <w:b w:val="0"/>
@@ -27459,7 +26922,6 @@
               </w:rPr>
               <w:t>max-row</w:t>
             </w:r>
-            <w:proofErr w:type="gramEnd"/>
           </w:p>
         </w:tc>
         <w:tc>
@@ -27554,7 +27016,6 @@
                 <w:bCs w:val="0"/>
               </w:rPr>
             </w:pPr>
-            <w:proofErr w:type="gramStart"/>
             <w:r>
               <w:rPr>
                 <w:b w:val="0"/>
@@ -27562,7 +27023,6 @@
               </w:rPr>
               <w:t>max-col</w:t>
             </w:r>
-            <w:proofErr w:type="gramEnd"/>
           </w:p>
         </w:tc>
         <w:tc>
@@ -27608,8 +27068,8 @@
         <w:tblLook w:val="04A0" w:firstRow="1" w:lastRow="0" w:firstColumn="1" w:lastColumn="0" w:noHBand="0" w:noVBand="1"/>
       </w:tblPr>
       <w:tblGrid>
-        <w:gridCol w:w="2018"/>
-        <w:gridCol w:w="7332"/>
+        <w:gridCol w:w="2369"/>
+        <w:gridCol w:w="4974"/>
       </w:tblGrid>
       <w:tr>
         <w:trPr>
@@ -27668,8 +27128,17 @@
                 <w:b w:val="0"/>
                 <w:bCs w:val="0"/>
               </w:rPr>
-              <w:t>rows</w:t>
-            </w:r>
+              <w:t xml:space="preserve">theta </w:t>
+            </w:r>
+            <w:proofErr w:type="spellStart"/>
+            <w:r>
+              <w:rPr>
+                <w:b w:val="0"/>
+                <w:bCs w:val="0"/>
+              </w:rPr>
+              <w:t>inc</w:t>
+            </w:r>
+            <w:proofErr w:type="spellEnd"/>
           </w:p>
         </w:tc>
         <w:tc>
@@ -27682,32 +27151,41 @@
               <w:cnfStyle w:val="000000100000" w:firstRow="0" w:lastRow="0" w:firstColumn="0" w:lastColumn="0" w:oddVBand="0" w:evenVBand="0" w:oddHBand="1" w:evenHBand="0" w:firstRowFirstColumn="0" w:firstRowLastColumn="0" w:lastRowFirstColumn="0" w:lastRowLastColumn="0"/>
             </w:pPr>
             <w:r>
-              <w:t>The number of image rows</w:t>
-            </w:r>
-          </w:p>
-        </w:tc>
-      </w:tr>
-      <w:tr>
-        <w:tc>
-          <w:tcPr>
-            <w:cnfStyle w:val="001000000000" w:firstRow="0" w:lastRow="0" w:firstColumn="1" w:lastColumn="0" w:oddVBand="0" w:evenVBand="0" w:oddHBand="0" w:evenHBand="0" w:firstRowFirstColumn="0" w:firstRowLastColumn="0" w:lastRowFirstColumn="0" w:lastRowLastColumn="0"/>
-            <w:tcW w:w="0" w:type="auto"/>
-          </w:tcPr>
-          <w:p>
-            <w:pPr>
-              <w:pStyle w:val="NoSpacing"/>
-              <w:rPr>
-                <w:b w:val="0"/>
-                <w:bCs w:val="0"/>
-              </w:rPr>
-            </w:pPr>
-            <w:r>
-              <w:rPr>
-                <w:b w:val="0"/>
-                <w:bCs w:val="0"/>
-              </w:rPr>
-              <w:t>cols</w:t>
-            </w:r>
+              <w:t>increment between sampled angles in degrees</w:t>
+            </w:r>
+          </w:p>
+        </w:tc>
+      </w:tr>
+      <w:tr>
+        <w:tc>
+          <w:tcPr>
+            <w:cnfStyle w:val="001000000000" w:firstRow="0" w:lastRow="0" w:firstColumn="1" w:lastColumn="0" w:oddVBand="0" w:evenVBand="0" w:oddHBand="0" w:evenHBand="0" w:firstRowFirstColumn="0" w:firstRowLastColumn="0" w:lastRowFirstColumn="0" w:lastRowLastColumn="0"/>
+            <w:tcW w:w="0" w:type="auto"/>
+          </w:tcPr>
+          <w:p>
+            <w:pPr>
+              <w:pStyle w:val="NoSpacing"/>
+              <w:rPr>
+                <w:b w:val="0"/>
+                <w:bCs w:val="0"/>
+              </w:rPr>
+            </w:pPr>
+            <w:r>
+              <w:rPr>
+                <w:b w:val="0"/>
+                <w:bCs w:val="0"/>
+              </w:rPr>
+              <w:t xml:space="preserve">rho </w:t>
+            </w:r>
+            <w:proofErr w:type="spellStart"/>
+            <w:r>
+              <w:rPr>
+                <w:b w:val="0"/>
+                <w:bCs w:val="0"/>
+              </w:rPr>
+              <w:t>inc</w:t>
+            </w:r>
+            <w:proofErr w:type="spellEnd"/>
           </w:p>
         </w:tc>
         <w:tc>
@@ -27719,8 +27197,13 @@
               <w:pStyle w:val="NoSpacing"/>
               <w:cnfStyle w:val="000000000000" w:firstRow="0" w:lastRow="0" w:firstColumn="0" w:lastColumn="0" w:oddVBand="0" w:evenVBand="0" w:oddHBand="0" w:evenHBand="0" w:firstRowFirstColumn="0" w:firstRowLastColumn="0" w:lastRowFirstColumn="0" w:lastRowLastColumn="0"/>
             </w:pPr>
-            <w:r>
-              <w:t>The number of image columns</w:t>
+            <w:proofErr w:type="spellStart"/>
+            <w:r>
+              <w:t>inrement</w:t>
+            </w:r>
+            <w:proofErr w:type="spellEnd"/>
+            <w:r>
+              <w:t xml:space="preserve"> between sampled polar line distances</w:t>
             </w:r>
           </w:p>
         </w:tc>
@@ -27742,13 +27225,15 @@
                 <w:bCs w:val="0"/>
               </w:rPr>
             </w:pPr>
-            <w:r>
-              <w:rPr>
-                <w:b w:val="0"/>
-                <w:bCs w:val="0"/>
-              </w:rPr>
-              <w:t>components</w:t>
-            </w:r>
+            <w:proofErr w:type="spellStart"/>
+            <w:r>
+              <w:rPr>
+                <w:b w:val="0"/>
+                <w:bCs w:val="0"/>
+              </w:rPr>
+              <w:t>nrhos</w:t>
+            </w:r>
+            <w:proofErr w:type="spellEnd"/>
           </w:p>
         </w:tc>
         <w:tc>
@@ -27761,32 +27246,34 @@
               <w:cnfStyle w:val="000000100000" w:firstRow="0" w:lastRow="0" w:firstColumn="0" w:lastColumn="0" w:oddVBand="0" w:evenVBand="0" w:oddHBand="1" w:evenHBand="0" w:firstRowFirstColumn="0" w:firstRowLastColumn="0" w:lastRowFirstColumn="0" w:lastRowLastColumn="0"/>
             </w:pPr>
             <w:r>
-              <w:t>The number of image components. Grayscale images have 1 component, color images have 3 components.</w:t>
-            </w:r>
-          </w:p>
-        </w:tc>
-      </w:tr>
-      <w:tr>
-        <w:tc>
-          <w:tcPr>
-            <w:cnfStyle w:val="001000000000" w:firstRow="0" w:lastRow="0" w:firstColumn="1" w:lastColumn="0" w:oddVBand="0" w:evenVBand="0" w:oddHBand="0" w:evenHBand="0" w:firstRowFirstColumn="0" w:firstRowLastColumn="0" w:lastRowFirstColumn="0" w:lastRowLastColumn="0"/>
-            <w:tcW w:w="0" w:type="auto"/>
-          </w:tcPr>
-          <w:p>
-            <w:pPr>
-              <w:pStyle w:val="NoSpacing"/>
-              <w:rPr>
-                <w:b w:val="0"/>
-                <w:bCs w:val="0"/>
-              </w:rPr>
-            </w:pPr>
-            <w:r>
-              <w:rPr>
-                <w:b w:val="0"/>
-                <w:bCs w:val="0"/>
-              </w:rPr>
-              <w:t>depth</w:t>
-            </w:r>
+              <w:t>number of rho values sampled</w:t>
+            </w:r>
+          </w:p>
+        </w:tc>
+      </w:tr>
+      <w:tr>
+        <w:tc>
+          <w:tcPr>
+            <w:cnfStyle w:val="001000000000" w:firstRow="0" w:lastRow="0" w:firstColumn="1" w:lastColumn="0" w:oddVBand="0" w:evenVBand="0" w:oddHBand="0" w:evenHBand="0" w:firstRowFirstColumn="0" w:firstRowLastColumn="0" w:lastRowFirstColumn="0" w:lastRowLastColumn="0"/>
+            <w:tcW w:w="0" w:type="auto"/>
+          </w:tcPr>
+          <w:p>
+            <w:pPr>
+              <w:pStyle w:val="NoSpacing"/>
+              <w:rPr>
+                <w:b w:val="0"/>
+                <w:bCs w:val="0"/>
+              </w:rPr>
+            </w:pPr>
+            <w:proofErr w:type="spellStart"/>
+            <w:r>
+              <w:rPr>
+                <w:b w:val="0"/>
+                <w:bCs w:val="0"/>
+              </w:rPr>
+              <w:t>nthetas</w:t>
+            </w:r>
+            <w:proofErr w:type="spellEnd"/>
           </w:p>
         </w:tc>
         <w:tc>
@@ -27799,35 +27286,13 @@
               <w:cnfStyle w:val="000000000000" w:firstRow="0" w:lastRow="0" w:firstColumn="0" w:lastColumn="0" w:oddVBand="0" w:evenVBand="0" w:oddHBand="0" w:evenHBand="0" w:firstRowFirstColumn="0" w:firstRowLastColumn="0" w:lastRowFirstColumn="0" w:lastRowLastColumn="0"/>
             </w:pPr>
             <w:r>
-              <w:t>Pixel value data type.</w:t>
-            </w:r>
-          </w:p>
-          <w:p>
-            <w:pPr>
-              <w:pStyle w:val="tablebullet"/>
-              <w:cnfStyle w:val="000000000000" w:firstRow="0" w:lastRow="0" w:firstColumn="0" w:lastColumn="0" w:oddVBand="0" w:evenVBand="0" w:oddHBand="0" w:evenHBand="0" w:firstRowFirstColumn="0" w:firstRowLastColumn="0" w:lastRowFirstColumn="0" w:lastRowLastColumn="0"/>
-            </w:pPr>
-            <w:r>
-              <w:t xml:space="preserve">CV_8U </w:t>
-            </w:r>
-          </w:p>
-          <w:p>
-            <w:pPr>
-              <w:pStyle w:val="tablebullet"/>
-              <w:cnfStyle w:val="000000000000" w:firstRow="0" w:lastRow="0" w:firstColumn="0" w:lastColumn="0" w:oddVBand="0" w:evenVBand="0" w:oddHBand="0" w:evenHBand="0" w:firstRowFirstColumn="0" w:firstRowLastColumn="0" w:lastRowFirstColumn="0" w:lastRowLastColumn="0"/>
-            </w:pPr>
-            <w:r>
-              <w:t>CV_32S</w:t>
-            </w:r>
-          </w:p>
-          <w:p>
-            <w:pPr>
-              <w:pStyle w:val="tablebullet"/>
-              <w:cnfStyle w:val="000000000000" w:firstRow="0" w:lastRow="0" w:firstColumn="0" w:lastColumn="0" w:oddVBand="0" w:evenVBand="0" w:oddHBand="0" w:evenHBand="0" w:firstRowFirstColumn="0" w:firstRowLastColumn="0" w:lastRowFirstColumn="0" w:lastRowLastColumn="0"/>
-            </w:pPr>
-            <w:r>
-              <w:t>CV_32F</w:t>
-            </w:r>
+              <w:t xml:space="preserve">number of angles sampled = 180 / </w:t>
+            </w:r>
+            <w:proofErr w:type="spellStart"/>
+            <w:r>
+              <w:t>theta_inc</w:t>
+            </w:r>
+            <w:proofErr w:type="spellEnd"/>
           </w:p>
         </w:tc>
       </w:tr>
@@ -27848,16 +27313,13 @@
                 <w:bCs w:val="0"/>
               </w:rPr>
             </w:pPr>
-            <w:proofErr w:type="spellStart"/>
-            <w:r>
-              <w:rPr>
-                <w:b w:val="0"/>
-                <w:bCs w:val="0"/>
-              </w:rPr>
-              <w:lastRenderedPageBreak/>
-              <w:t>theta_inc</w:t>
-            </w:r>
-            <w:proofErr w:type="spellEnd"/>
+            <w:r>
+              <w:rPr>
+                <w:b w:val="0"/>
+                <w:bCs w:val="0"/>
+              </w:rPr>
+              <w:t>bin min count</w:t>
+            </w:r>
           </w:p>
         </w:tc>
         <w:tc>
@@ -27870,26 +27332,32 @@
               <w:cnfStyle w:val="000000100000" w:firstRow="0" w:lastRow="0" w:firstColumn="0" w:lastColumn="0" w:oddVBand="0" w:evenVBand="0" w:oddHBand="1" w:evenHBand="0" w:firstRowFirstColumn="0" w:firstRowLastColumn="0" w:lastRowFirstColumn="0" w:lastRowLastColumn="0"/>
             </w:pPr>
             <w:r>
-              <w:t>increment between sampled angles in degrees</w:t>
-            </w:r>
-          </w:p>
-        </w:tc>
-      </w:tr>
-      <w:tr>
-        <w:tc>
-          <w:tcPr>
-            <w:cnfStyle w:val="001000000000" w:firstRow="0" w:lastRow="0" w:firstColumn="1" w:lastColumn="0" w:oddVBand="0" w:evenVBand="0" w:oddHBand="0" w:evenHBand="0" w:firstRowFirstColumn="0" w:firstRowLastColumn="0" w:lastRowFirstColumn="0" w:lastRowLastColumn="0"/>
-            <w:tcW w:w="0" w:type="auto"/>
-          </w:tcPr>
-          <w:p>
-            <w:pPr>
-              <w:pStyle w:val="NoSpacing"/>
-            </w:pPr>
-            <w:proofErr w:type="spellStart"/>
-            <w:r>
-              <w:t>rho_inc</w:t>
-            </w:r>
-            <w:proofErr w:type="spellEnd"/>
+              <w:t>lowest count for any histogram bin</w:t>
+            </w:r>
+          </w:p>
+        </w:tc>
+      </w:tr>
+      <w:tr>
+        <w:tc>
+          <w:tcPr>
+            <w:cnfStyle w:val="001000000000" w:firstRow="0" w:lastRow="0" w:firstColumn="1" w:lastColumn="0" w:oddVBand="0" w:evenVBand="0" w:oddHBand="0" w:evenHBand="0" w:firstRowFirstColumn="0" w:firstRowLastColumn="0" w:lastRowFirstColumn="0" w:lastRowLastColumn="0"/>
+            <w:tcW w:w="0" w:type="auto"/>
+          </w:tcPr>
+          <w:p>
+            <w:pPr>
+              <w:pStyle w:val="NoSpacing"/>
+              <w:rPr>
+                <w:b w:val="0"/>
+                <w:bCs w:val="0"/>
+              </w:rPr>
+            </w:pPr>
+            <w:r>
+              <w:rPr>
+                <w:b w:val="0"/>
+                <w:bCs w:val="0"/>
+              </w:rPr>
+              <w:t>bin max count</w:t>
+            </w:r>
           </w:p>
         </w:tc>
         <w:tc>
@@ -27901,13 +27369,8 @@
               <w:pStyle w:val="NoSpacing"/>
               <w:cnfStyle w:val="000000000000" w:firstRow="0" w:lastRow="0" w:firstColumn="0" w:lastColumn="0" w:oddVBand="0" w:evenVBand="0" w:oddHBand="0" w:evenHBand="0" w:firstRowFirstColumn="0" w:firstRowLastColumn="0" w:lastRowFirstColumn="0" w:lastRowLastColumn="0"/>
             </w:pPr>
-            <w:proofErr w:type="spellStart"/>
-            <w:r>
-              <w:t>inrement</w:t>
-            </w:r>
-            <w:proofErr w:type="spellEnd"/>
-            <w:r>
-              <w:t xml:space="preserve"> between sampled polar line distances</w:t>
+            <w:r>
+              <w:t>largest count for any histogram bin</w:t>
             </w:r>
           </w:p>
         </w:tc>
@@ -27929,269 +27392,85 @@
                 <w:bCs w:val="0"/>
               </w:rPr>
             </w:pPr>
+            <w:r>
+              <w:rPr>
+                <w:b w:val="0"/>
+                <w:bCs w:val="0"/>
+              </w:rPr>
+              <w:t>bin mean</w:t>
+            </w:r>
+          </w:p>
+        </w:tc>
+        <w:tc>
+          <w:tcPr>
+            <w:tcW w:w="0" w:type="auto"/>
+          </w:tcPr>
+          <w:p>
+            <w:pPr>
+              <w:pStyle w:val="NoSpacing"/>
+              <w:cnfStyle w:val="000000100000" w:firstRow="0" w:lastRow="0" w:firstColumn="0" w:lastColumn="0" w:oddVBand="0" w:evenVBand="0" w:oddHBand="1" w:evenHBand="0" w:firstRowFirstColumn="0" w:firstRowLastColumn="0" w:lastRowFirstColumn="0" w:lastRowLastColumn="0"/>
+            </w:pPr>
+            <w:r>
+              <w:t xml:space="preserve">mean for </w:t>
+            </w:r>
             <w:proofErr w:type="spellStart"/>
             <w:r>
-              <w:rPr>
-                <w:b w:val="0"/>
-                <w:bCs w:val="0"/>
-              </w:rPr>
-              <w:t>nthetas</w:t>
+              <w:t>hough</w:t>
             </w:r>
             <w:proofErr w:type="spellEnd"/>
-          </w:p>
-        </w:tc>
-        <w:tc>
-          <w:tcPr>
-            <w:tcW w:w="0" w:type="auto"/>
-          </w:tcPr>
-          <w:p>
-            <w:pPr>
-              <w:pStyle w:val="NoSpacing"/>
-              <w:cnfStyle w:val="000000100000" w:firstRow="0" w:lastRow="0" w:firstColumn="0" w:lastColumn="0" w:oddVBand="0" w:evenVBand="0" w:oddHBand="1" w:evenHBand="0" w:firstRowFirstColumn="0" w:firstRowLastColumn="0" w:lastRowFirstColumn="0" w:lastRowLastColumn="0"/>
-            </w:pPr>
-            <w:r>
-              <w:t xml:space="preserve">number of angles sampled = 180 / </w:t>
+            <w:r>
+              <w:t xml:space="preserve"> accumulator counts</w:t>
+            </w:r>
+          </w:p>
+        </w:tc>
+      </w:tr>
+      <w:tr>
+        <w:tc>
+          <w:tcPr>
+            <w:cnfStyle w:val="001000000000" w:firstRow="0" w:lastRow="0" w:firstColumn="1" w:lastColumn="0" w:oddVBand="0" w:evenVBand="0" w:oddHBand="0" w:evenHBand="0" w:firstRowFirstColumn="0" w:firstRowLastColumn="0" w:lastRowFirstColumn="0" w:lastRowLastColumn="0"/>
+            <w:tcW w:w="0" w:type="auto"/>
+          </w:tcPr>
+          <w:p>
+            <w:pPr>
+              <w:pStyle w:val="NoSpacing"/>
+              <w:rPr>
+                <w:b w:val="0"/>
+                <w:bCs w:val="0"/>
+              </w:rPr>
+            </w:pPr>
+            <w:r>
+              <w:rPr>
+                <w:b w:val="0"/>
+                <w:bCs w:val="0"/>
+              </w:rPr>
+              <w:lastRenderedPageBreak/>
+              <w:t>bin standard deviation</w:t>
+            </w:r>
+          </w:p>
+        </w:tc>
+        <w:tc>
+          <w:tcPr>
+            <w:tcW w:w="0" w:type="auto"/>
+          </w:tcPr>
+          <w:p>
+            <w:pPr>
+              <w:pStyle w:val="NoSpacing"/>
+              <w:cnfStyle w:val="000000000000" w:firstRow="0" w:lastRow="0" w:firstColumn="0" w:lastColumn="0" w:oddVBand="0" w:evenVBand="0" w:oddHBand="0" w:evenHBand="0" w:firstRowFirstColumn="0" w:firstRowLastColumn="0" w:lastRowFirstColumn="0" w:lastRowLastColumn="0"/>
+            </w:pPr>
+            <w:r>
+              <w:t xml:space="preserve">standard deviation for </w:t>
             </w:r>
             <w:proofErr w:type="spellStart"/>
             <w:r>
-              <w:t>theta_inc</w:t>
+              <w:t>hough</w:t>
             </w:r>
             <w:proofErr w:type="spellEnd"/>
-          </w:p>
-        </w:tc>
-      </w:tr>
-      <w:tr>
-        <w:tc>
-          <w:tcPr>
-            <w:cnfStyle w:val="001000000000" w:firstRow="0" w:lastRow="0" w:firstColumn="1" w:lastColumn="0" w:oddVBand="0" w:evenVBand="0" w:oddHBand="0" w:evenHBand="0" w:firstRowFirstColumn="0" w:firstRowLastColumn="0" w:lastRowFirstColumn="0" w:lastRowLastColumn="0"/>
-            <w:tcW w:w="0" w:type="auto"/>
-          </w:tcPr>
-          <w:p>
-            <w:pPr>
-              <w:pStyle w:val="NoSpacing"/>
-              <w:rPr>
-                <w:b w:val="0"/>
-                <w:bCs w:val="0"/>
-              </w:rPr>
-            </w:pPr>
-            <w:proofErr w:type="spellStart"/>
-            <w:r>
-              <w:rPr>
-                <w:b w:val="0"/>
-                <w:bCs w:val="0"/>
-              </w:rPr>
-              <w:t>nrhos</w:t>
-            </w:r>
-            <w:proofErr w:type="spellEnd"/>
-          </w:p>
-        </w:tc>
-        <w:tc>
-          <w:tcPr>
-            <w:tcW w:w="0" w:type="auto"/>
-          </w:tcPr>
-          <w:p>
-            <w:pPr>
-              <w:pStyle w:val="NoSpacing"/>
-              <w:cnfStyle w:val="000000000000" w:firstRow="0" w:lastRow="0" w:firstColumn="0" w:lastColumn="0" w:oddVBand="0" w:evenVBand="0" w:oddHBand="0" w:evenHBand="0" w:firstRowFirstColumn="0" w:firstRowLastColumn="0" w:lastRowFirstColumn="0" w:lastRowLastColumn="0"/>
-            </w:pPr>
-            <w:r>
-              <w:t>number of rho values sampled</w:t>
-            </w:r>
-          </w:p>
-        </w:tc>
-      </w:tr>
-      <w:tr>
-        <w:trPr>
-          <w:cnfStyle w:val="000000100000" w:firstRow="0" w:lastRow="0" w:firstColumn="0" w:lastColumn="0" w:oddVBand="0" w:evenVBand="0" w:oddHBand="1" w:evenHBand="0" w:firstRowFirstColumn="0" w:firstRowLastColumn="0" w:lastRowFirstColumn="0" w:lastRowLastColumn="0"/>
-        </w:trPr>
-        <w:tc>
-          <w:tcPr>
-            <w:cnfStyle w:val="001000000000" w:firstRow="0" w:lastRow="0" w:firstColumn="1" w:lastColumn="0" w:oddVBand="0" w:evenVBand="0" w:oddHBand="0" w:evenHBand="0" w:firstRowFirstColumn="0" w:firstRowLastColumn="0" w:lastRowFirstColumn="0" w:lastRowLastColumn="0"/>
-            <w:tcW w:w="0" w:type="auto"/>
-          </w:tcPr>
-          <w:p>
-            <w:pPr>
-              <w:pStyle w:val="NoSpacing"/>
-              <w:rPr>
-                <w:b w:val="0"/>
-                <w:bCs w:val="0"/>
-              </w:rPr>
-            </w:pPr>
-            <w:r>
-              <w:rPr>
-                <w:b w:val="0"/>
-                <w:bCs w:val="0"/>
-              </w:rPr>
-              <w:t xml:space="preserve">bin </w:t>
-            </w:r>
-            <w:proofErr w:type="spellStart"/>
-            <w:r>
-              <w:rPr>
-                <w:b w:val="0"/>
-                <w:bCs w:val="0"/>
-              </w:rPr>
-              <w:t>min_count</w:t>
-            </w:r>
-            <w:proofErr w:type="spellEnd"/>
-          </w:p>
-        </w:tc>
-        <w:tc>
-          <w:tcPr>
-            <w:tcW w:w="0" w:type="auto"/>
-          </w:tcPr>
-          <w:p>
-            <w:pPr>
-              <w:pStyle w:val="NoSpacing"/>
-              <w:cnfStyle w:val="000000100000" w:firstRow="0" w:lastRow="0" w:firstColumn="0" w:lastColumn="0" w:oddVBand="0" w:evenVBand="0" w:oddHBand="1" w:evenHBand="0" w:firstRowFirstColumn="0" w:firstRowLastColumn="0" w:lastRowFirstColumn="0" w:lastRowLastColumn="0"/>
-            </w:pPr>
-            <w:r>
-              <w:t>lowest count for any histogram bin</w:t>
-            </w:r>
-          </w:p>
-        </w:tc>
-      </w:tr>
-      <w:tr>
-        <w:tc>
-          <w:tcPr>
-            <w:cnfStyle w:val="001000000000" w:firstRow="0" w:lastRow="0" w:firstColumn="1" w:lastColumn="0" w:oddVBand="0" w:evenVBand="0" w:oddHBand="0" w:evenHBand="0" w:firstRowFirstColumn="0" w:firstRowLastColumn="0" w:lastRowFirstColumn="0" w:lastRowLastColumn="0"/>
-            <w:tcW w:w="0" w:type="auto"/>
-          </w:tcPr>
-          <w:p>
-            <w:pPr>
-              <w:pStyle w:val="NoSpacing"/>
-              <w:rPr>
-                <w:b w:val="0"/>
-                <w:bCs w:val="0"/>
-              </w:rPr>
-            </w:pPr>
-            <w:r>
-              <w:rPr>
-                <w:b w:val="0"/>
-                <w:bCs w:val="0"/>
-              </w:rPr>
-              <w:t xml:space="preserve">bin </w:t>
-            </w:r>
-            <w:proofErr w:type="spellStart"/>
-            <w:r>
-              <w:rPr>
-                <w:b w:val="0"/>
-                <w:bCs w:val="0"/>
-              </w:rPr>
-              <w:t>max_count</w:t>
-            </w:r>
-            <w:proofErr w:type="spellEnd"/>
-          </w:p>
-        </w:tc>
-        <w:tc>
-          <w:tcPr>
-            <w:tcW w:w="0" w:type="auto"/>
-          </w:tcPr>
-          <w:p>
-            <w:pPr>
-              <w:pStyle w:val="NoSpacing"/>
-              <w:cnfStyle w:val="000000000000" w:firstRow="0" w:lastRow="0" w:firstColumn="0" w:lastColumn="0" w:oddVBand="0" w:evenVBand="0" w:oddHBand="0" w:evenHBand="0" w:firstRowFirstColumn="0" w:firstRowLastColumn="0" w:lastRowFirstColumn="0" w:lastRowLastColumn="0"/>
-            </w:pPr>
-            <w:r>
-              <w:t>largest count for any histogram bin</w:t>
-            </w:r>
-          </w:p>
-        </w:tc>
-      </w:tr>
-      <w:tr>
-        <w:trPr>
-          <w:cnfStyle w:val="000000100000" w:firstRow="0" w:lastRow="0" w:firstColumn="0" w:lastColumn="0" w:oddVBand="0" w:evenVBand="0" w:oddHBand="1" w:evenHBand="0" w:firstRowFirstColumn="0" w:firstRowLastColumn="0" w:lastRowFirstColumn="0" w:lastRowLastColumn="0"/>
-        </w:trPr>
-        <w:tc>
-          <w:tcPr>
-            <w:cnfStyle w:val="001000000000" w:firstRow="0" w:lastRow="0" w:firstColumn="1" w:lastColumn="0" w:oddVBand="0" w:evenVBand="0" w:oddHBand="0" w:evenHBand="0" w:firstRowFirstColumn="0" w:firstRowLastColumn="0" w:lastRowFirstColumn="0" w:lastRowLastColumn="0"/>
-            <w:tcW w:w="0" w:type="auto"/>
-          </w:tcPr>
-          <w:p>
-            <w:pPr>
-              <w:pStyle w:val="NoSpacing"/>
-              <w:rPr>
-                <w:b w:val="0"/>
-                <w:bCs w:val="0"/>
-              </w:rPr>
-            </w:pPr>
-            <w:r>
-              <w:rPr>
-                <w:b w:val="0"/>
-                <w:bCs w:val="0"/>
-              </w:rPr>
-              <w:t>bin mean</w:t>
-            </w:r>
-          </w:p>
-        </w:tc>
-        <w:tc>
-          <w:tcPr>
-            <w:tcW w:w="0" w:type="auto"/>
-          </w:tcPr>
-          <w:p>
-            <w:pPr>
-              <w:pStyle w:val="NoSpacing"/>
-              <w:cnfStyle w:val="000000100000" w:firstRow="0" w:lastRow="0" w:firstColumn="0" w:lastColumn="0" w:oddVBand="0" w:evenVBand="0" w:oddHBand="1" w:evenHBand="0" w:firstRowFirstColumn="0" w:firstRowLastColumn="0" w:lastRowFirstColumn="0" w:lastRowLastColumn="0"/>
-            </w:pPr>
-            <w:r>
-              <w:t xml:space="preserve">mean for </w:t>
-            </w:r>
-            <w:proofErr w:type="spellStart"/>
-            <w:r>
-              <w:t>hough</w:t>
-            </w:r>
-            <w:proofErr w:type="spellEnd"/>
             <w:r>
               <w:t xml:space="preserve"> accumulator counts</w:t>
             </w:r>
           </w:p>
         </w:tc>
       </w:tr>
-      <w:tr>
-        <w:tc>
-          <w:tcPr>
-            <w:cnfStyle w:val="001000000000" w:firstRow="0" w:lastRow="0" w:firstColumn="1" w:lastColumn="0" w:oddVBand="0" w:evenVBand="0" w:oddHBand="0" w:evenHBand="0" w:firstRowFirstColumn="0" w:firstRowLastColumn="0" w:lastRowFirstColumn="0" w:lastRowLastColumn="0"/>
-            <w:tcW w:w="0" w:type="auto"/>
-          </w:tcPr>
-          <w:p>
-            <w:pPr>
-              <w:pStyle w:val="NoSpacing"/>
-              <w:rPr>
-                <w:b w:val="0"/>
-                <w:bCs w:val="0"/>
-              </w:rPr>
-            </w:pPr>
-            <w:r>
-              <w:rPr>
-                <w:b w:val="0"/>
-                <w:bCs w:val="0"/>
-              </w:rPr>
-              <w:t>bin standard deviation</w:t>
-            </w:r>
-          </w:p>
-        </w:tc>
-        <w:tc>
-          <w:tcPr>
-            <w:tcW w:w="0" w:type="auto"/>
-          </w:tcPr>
-          <w:p>
-            <w:pPr>
-              <w:pStyle w:val="NoSpacing"/>
-              <w:cnfStyle w:val="000000000000" w:firstRow="0" w:lastRow="0" w:firstColumn="0" w:lastColumn="0" w:oddVBand="0" w:evenVBand="0" w:oddHBand="0" w:evenHBand="0" w:firstRowFirstColumn="0" w:firstRowLastColumn="0" w:lastRowFirstColumn="0" w:lastRowLastColumn="0"/>
-            </w:pPr>
-            <w:r>
-              <w:t xml:space="preserve">standard deviation for </w:t>
-            </w:r>
-            <w:proofErr w:type="spellStart"/>
-            <w:r>
-              <w:t>hough</w:t>
-            </w:r>
-            <w:proofErr w:type="spellEnd"/>
-            <w:r>
-              <w:t xml:space="preserve"> accumulator counts</w:t>
-            </w:r>
-          </w:p>
-        </w:tc>
-      </w:tr>
     </w:tbl>
     <w:p>
       <w:pPr>
@@ -28208,13 +27487,8 @@
     </w:p>
     <w:p>
       <w:r>
-        <w:t xml:space="preserve">The Hough peak detect operator finds polar lines (rho, theta) in the Hough accumulator data where the counts exceed a </w:t>
-      </w:r>
-      <w:proofErr w:type="gramStart"/>
-      <w:r>
-        <w:t>threshold..</w:t>
-      </w:r>
-      <w:proofErr w:type="gramEnd"/>
+        <w:t>The Hough peak detect operator finds polar lines (rho, theta) in the Hough accumulator data where the counts exceed a threshold..</w:t>
+      </w:r>
     </w:p>
     <w:p>
       <w:r>
@@ -28833,8 +28107,8 @@
         <w:tblLook w:val="04A0" w:firstRow="1" w:lastRow="0" w:firstColumn="1" w:lastColumn="0" w:noHBand="0" w:noVBand="1"/>
       </w:tblPr>
       <w:tblGrid>
-        <w:gridCol w:w="2876"/>
-        <w:gridCol w:w="6474"/>
+        <w:gridCol w:w="3045"/>
+        <w:gridCol w:w="6305"/>
       </w:tblGrid>
       <w:tr>
         <w:trPr>
@@ -28923,62 +28197,36 @@
           <w:p>
             <w:pPr>
               <w:pStyle w:val="NoSpacing"/>
-              <w:rPr>
-                <w:b w:val="0"/>
-                <w:bCs w:val="0"/>
-              </w:rPr>
-            </w:pPr>
+            </w:pPr>
+            <w:r>
+              <w:rPr>
+                <w:b w:val="0"/>
+                <w:bCs w:val="0"/>
+              </w:rPr>
+              <w:t>count min</w:t>
+            </w:r>
+          </w:p>
+        </w:tc>
+        <w:tc>
+          <w:tcPr>
+            <w:tcW w:w="0" w:type="auto"/>
+          </w:tcPr>
+          <w:p>
+            <w:pPr>
+              <w:pStyle w:val="NoSpacing"/>
+              <w:cnfStyle w:val="000000000000" w:firstRow="0" w:lastRow="0" w:firstColumn="0" w:lastColumn="0" w:oddVBand="0" w:evenVBand="0" w:oddHBand="0" w:evenHBand="0" w:firstRowFirstColumn="0" w:firstRowLastColumn="0" w:lastRowFirstColumn="0" w:lastRowLastColumn="0"/>
+            </w:pPr>
+            <w:r>
+              <w:t xml:space="preserve">lowest </w:t>
+            </w:r>
             <w:proofErr w:type="spellStart"/>
             <w:r>
-              <w:rPr>
-                <w:b w:val="0"/>
-                <w:bCs w:val="0"/>
-              </w:rPr>
-              <w:t>nthetas</w:t>
+              <w:t>hough</w:t>
             </w:r>
             <w:proofErr w:type="spellEnd"/>
-          </w:p>
-        </w:tc>
-        <w:tc>
-          <w:tcPr>
-            <w:tcW w:w="0" w:type="auto"/>
-          </w:tcPr>
-          <w:p>
-            <w:pPr>
-              <w:pStyle w:val="NoSpacing"/>
-              <w:cnfStyle w:val="000000000000" w:firstRow="0" w:lastRow="0" w:firstColumn="0" w:lastColumn="0" w:oddVBand="0" w:evenVBand="0" w:oddHBand="0" w:evenHBand="0" w:firstRowFirstColumn="0" w:firstRowLastColumn="0" w:lastRowFirstColumn="0" w:lastRowLastColumn="0"/>
-            </w:pPr>
-            <w:r>
-              <w:t xml:space="preserve">The number of angles sampled = </w:t>
-            </w:r>
-            <m:oMath>
-              <m:f>
-                <m:fPr>
-                  <m:ctrlPr>
-                    <w:rPr>
-                      <w:rFonts w:ascii="Cambria Math" w:hAnsi="Cambria Math"/>
-                      <w:i/>
-                    </w:rPr>
-                  </m:ctrlPr>
-                </m:fPr>
-                <m:num>
-                  <m:r>
-                    <w:rPr>
-                      <w:rFonts w:ascii="Cambria Math" w:hAnsi="Cambria Math"/>
-                    </w:rPr>
-                    <m:t>180</m:t>
-                  </m:r>
-                </m:num>
-                <m:den>
-                  <m:r>
-                    <w:rPr>
-                      <w:rFonts w:ascii="Cambria Math" w:hAnsi="Cambria Math"/>
-                    </w:rPr>
-                    <m:t>theta_inc</m:t>
-                  </m:r>
-                </m:den>
-              </m:f>
-            </m:oMath>
+            <w:r>
+              <w:t xml:space="preserve"> accumulator count</w:t>
+            </w:r>
           </w:p>
         </w:tc>
       </w:tr>
@@ -28994,53 +28242,55 @@
           <w:p>
             <w:pPr>
               <w:pStyle w:val="NoSpacing"/>
-              <w:rPr>
-                <w:b w:val="0"/>
-                <w:bCs w:val="0"/>
-              </w:rPr>
-            </w:pPr>
+            </w:pPr>
+            <w:r>
+              <w:rPr>
+                <w:b w:val="0"/>
+                <w:bCs w:val="0"/>
+              </w:rPr>
+              <w:t>count max</w:t>
+            </w:r>
+          </w:p>
+        </w:tc>
+        <w:tc>
+          <w:tcPr>
+            <w:tcW w:w="0" w:type="auto"/>
+          </w:tcPr>
+          <w:p>
+            <w:pPr>
+              <w:pStyle w:val="NoSpacing"/>
+              <w:cnfStyle w:val="000000100000" w:firstRow="0" w:lastRow="0" w:firstColumn="0" w:lastColumn="0" w:oddVBand="0" w:evenVBand="0" w:oddHBand="1" w:evenHBand="0" w:firstRowFirstColumn="0" w:firstRowLastColumn="0" w:lastRowFirstColumn="0" w:lastRowLastColumn="0"/>
+            </w:pPr>
+            <w:r>
+              <w:t xml:space="preserve">largest </w:t>
+            </w:r>
             <w:proofErr w:type="spellStart"/>
             <w:r>
-              <w:rPr>
-                <w:b w:val="0"/>
-                <w:bCs w:val="0"/>
-              </w:rPr>
-              <w:t>nrhos</w:t>
+              <w:t>hough</w:t>
             </w:r>
             <w:proofErr w:type="spellEnd"/>
-          </w:p>
-        </w:tc>
-        <w:tc>
-          <w:tcPr>
-            <w:tcW w:w="0" w:type="auto"/>
-          </w:tcPr>
-          <w:p>
-            <w:pPr>
-              <w:pStyle w:val="NoSpacing"/>
-              <w:cnfStyle w:val="000000100000" w:firstRow="0" w:lastRow="0" w:firstColumn="0" w:lastColumn="0" w:oddVBand="0" w:evenVBand="0" w:oddHBand="1" w:evenHBand="0" w:firstRowFirstColumn="0" w:firstRowLastColumn="0" w:lastRowFirstColumn="0" w:lastRowLastColumn="0"/>
-            </w:pPr>
-            <w:r>
-              <w:t>The number of rho values sampled</w:t>
-            </w:r>
-          </w:p>
-        </w:tc>
-      </w:tr>
-      <w:tr>
-        <w:tc>
-          <w:tcPr>
-            <w:cnfStyle w:val="001000000000" w:firstRow="0" w:lastRow="0" w:firstColumn="1" w:lastColumn="0" w:oddVBand="0" w:evenVBand="0" w:oddHBand="0" w:evenHBand="0" w:firstRowFirstColumn="0" w:firstRowLastColumn="0" w:lastRowFirstColumn="0" w:lastRowLastColumn="0"/>
-            <w:tcW w:w="0" w:type="auto"/>
-          </w:tcPr>
-          <w:p>
-            <w:pPr>
-              <w:pStyle w:val="NoSpacing"/>
-            </w:pPr>
-            <w:r>
-              <w:rPr>
-                <w:b w:val="0"/>
-                <w:bCs w:val="0"/>
-              </w:rPr>
-              <w:t>count min</w:t>
+            <w:r>
+              <w:t xml:space="preserve"> accumulator count</w:t>
+            </w:r>
+          </w:p>
+        </w:tc>
+      </w:tr>
+      <w:tr>
+        <w:tc>
+          <w:tcPr>
+            <w:cnfStyle w:val="001000000000" w:firstRow="0" w:lastRow="0" w:firstColumn="1" w:lastColumn="0" w:oddVBand="0" w:evenVBand="0" w:oddHBand="0" w:evenHBand="0" w:firstRowFirstColumn="0" w:firstRowLastColumn="0" w:lastRowFirstColumn="0" w:lastRowLastColumn="0"/>
+            <w:tcW w:w="0" w:type="auto"/>
+          </w:tcPr>
+          <w:p>
+            <w:pPr>
+              <w:pStyle w:val="NoSpacing"/>
+            </w:pPr>
+            <w:r>
+              <w:rPr>
+                <w:b w:val="0"/>
+                <w:bCs w:val="0"/>
+              </w:rPr>
+              <w:t>count mean</w:t>
             </w:r>
           </w:p>
         </w:tc>
@@ -29053,16 +28303,16 @@
               <w:pStyle w:val="NoSpacing"/>
               <w:cnfStyle w:val="000000000000" w:firstRow="0" w:lastRow="0" w:firstColumn="0" w:lastColumn="0" w:oddVBand="0" w:evenVBand="0" w:oddHBand="0" w:evenHBand="0" w:firstRowFirstColumn="0" w:firstRowLastColumn="0" w:lastRowFirstColumn="0" w:lastRowLastColumn="0"/>
             </w:pPr>
-            <w:r>
-              <w:t xml:space="preserve">The lowest count for any </w:t>
-            </w:r>
             <w:proofErr w:type="spellStart"/>
             <w:r>
               <w:t>hough</w:t>
             </w:r>
             <w:proofErr w:type="spellEnd"/>
             <w:r>
-              <w:t xml:space="preserve"> accumulator counts</w:t>
+              <w:t xml:space="preserve"> accumulator count </w:t>
+            </w:r>
+            <w:r>
+              <w:t>mean</w:t>
             </w:r>
           </w:p>
         </w:tc>
@@ -29085,7 +28335,7 @@
                 <w:b w:val="0"/>
                 <w:bCs w:val="0"/>
               </w:rPr>
-              <w:t>count max</w:t>
+              <w:t>count standard deviation</w:t>
             </w:r>
           </w:p>
         </w:tc>
@@ -29098,36 +28348,40 @@
               <w:pStyle w:val="NoSpacing"/>
               <w:cnfStyle w:val="000000100000" w:firstRow="0" w:lastRow="0" w:firstColumn="0" w:lastColumn="0" w:oddVBand="0" w:evenVBand="0" w:oddHBand="1" w:evenHBand="0" w:firstRowFirstColumn="0" w:firstRowLastColumn="0" w:lastRowFirstColumn="0" w:lastRowLastColumn="0"/>
             </w:pPr>
-            <w:r>
-              <w:t xml:space="preserve">The largest count for any </w:t>
-            </w:r>
             <w:proofErr w:type="spellStart"/>
             <w:r>
               <w:t>hough</w:t>
             </w:r>
             <w:proofErr w:type="spellEnd"/>
             <w:r>
-              <w:t xml:space="preserve"> accumulator counts</w:t>
-            </w:r>
-          </w:p>
-        </w:tc>
-      </w:tr>
-      <w:tr>
-        <w:tc>
-          <w:tcPr>
-            <w:cnfStyle w:val="001000000000" w:firstRow="0" w:lastRow="0" w:firstColumn="1" w:lastColumn="0" w:oddVBand="0" w:evenVBand="0" w:oddHBand="0" w:evenHBand="0" w:firstRowFirstColumn="0" w:firstRowLastColumn="0" w:lastRowFirstColumn="0" w:lastRowLastColumn="0"/>
-            <w:tcW w:w="0" w:type="auto"/>
-          </w:tcPr>
-          <w:p>
-            <w:pPr>
-              <w:pStyle w:val="NoSpacing"/>
-            </w:pPr>
-            <w:r>
-              <w:rPr>
-                <w:b w:val="0"/>
-                <w:bCs w:val="0"/>
-              </w:rPr>
-              <w:t>count mean</w:t>
+              <w:t xml:space="preserve"> accumulator count </w:t>
+            </w:r>
+            <w:r>
+              <w:t>standard deviation</w:t>
+            </w:r>
+          </w:p>
+        </w:tc>
+      </w:tr>
+      <w:tr>
+        <w:tc>
+          <w:tcPr>
+            <w:cnfStyle w:val="001000000000" w:firstRow="0" w:lastRow="0" w:firstColumn="1" w:lastColumn="0" w:oddVBand="0" w:evenVBand="0" w:oddHBand="0" w:evenHBand="0" w:firstRowFirstColumn="0" w:firstRowLastColumn="0" w:lastRowFirstColumn="0" w:lastRowLastColumn="0"/>
+            <w:tcW w:w="0" w:type="auto"/>
+          </w:tcPr>
+          <w:p>
+            <w:pPr>
+              <w:pStyle w:val="NoSpacing"/>
+              <w:rPr>
+                <w:b w:val="0"/>
+                <w:bCs w:val="0"/>
+              </w:rPr>
+            </w:pPr>
+            <w:r>
+              <w:rPr>
+                <w:b w:val="0"/>
+                <w:bCs w:val="0"/>
+              </w:rPr>
+              <w:t>difference min</w:t>
             </w:r>
           </w:p>
         </w:tc>
@@ -29141,7 +28395,7 @@
               <w:cnfStyle w:val="000000000000" w:firstRow="0" w:lastRow="0" w:firstColumn="0" w:lastColumn="0" w:oddVBand="0" w:evenVBand="0" w:oddHBand="0" w:evenHBand="0" w:firstRowFirstColumn="0" w:firstRowLastColumn="0" w:lastRowFirstColumn="0" w:lastRowLastColumn="0"/>
             </w:pPr>
             <w:r>
-              <w:t xml:space="preserve">The mean for the </w:t>
+              <w:t xml:space="preserve">lowest </w:t>
             </w:r>
             <w:proofErr w:type="spellStart"/>
             <w:r>
@@ -29149,7 +28403,7 @@
             </w:r>
             <w:proofErr w:type="spellEnd"/>
             <w:r>
-              <w:t xml:space="preserve"> accumulator counts</w:t>
+              <w:t xml:space="preserve"> accumulator peak difference</w:t>
             </w:r>
           </w:p>
         </w:tc>
@@ -29166,13 +28420,17 @@
           <w:p>
             <w:pPr>
               <w:pStyle w:val="NoSpacing"/>
-            </w:pPr>
-            <w:r>
-              <w:rPr>
-                <w:b w:val="0"/>
-                <w:bCs w:val="0"/>
-              </w:rPr>
-              <w:t>count standard deviation</w:t>
+              <w:rPr>
+                <w:b w:val="0"/>
+                <w:bCs w:val="0"/>
+              </w:rPr>
+            </w:pPr>
+            <w:r>
+              <w:rPr>
+                <w:b w:val="0"/>
+                <w:bCs w:val="0"/>
+              </w:rPr>
+              <w:t>difference max</w:t>
             </w:r>
           </w:p>
         </w:tc>
@@ -29186,7 +28444,7 @@
               <w:cnfStyle w:val="000000100000" w:firstRow="0" w:lastRow="0" w:firstColumn="0" w:lastColumn="0" w:oddVBand="0" w:evenVBand="0" w:oddHBand="1" w:evenHBand="0" w:firstRowFirstColumn="0" w:firstRowLastColumn="0" w:lastRowFirstColumn="0" w:lastRowLastColumn="0"/>
             </w:pPr>
             <w:r>
-              <w:t xml:space="preserve">The standard deviation for the </w:t>
+              <w:t xml:space="preserve">largest </w:t>
             </w:r>
             <w:proofErr w:type="spellStart"/>
             <w:r>
@@ -29194,31 +28452,31 @@
             </w:r>
             <w:proofErr w:type="spellEnd"/>
             <w:r>
-              <w:t xml:space="preserve"> accumulator counts</w:t>
-            </w:r>
-          </w:p>
-        </w:tc>
-      </w:tr>
-      <w:tr>
-        <w:tc>
-          <w:tcPr>
-            <w:cnfStyle w:val="001000000000" w:firstRow="0" w:lastRow="0" w:firstColumn="1" w:lastColumn="0" w:oddVBand="0" w:evenVBand="0" w:oddHBand="0" w:evenHBand="0" w:firstRowFirstColumn="0" w:firstRowLastColumn="0" w:lastRowFirstColumn="0" w:lastRowLastColumn="0"/>
-            <w:tcW w:w="0" w:type="auto"/>
-          </w:tcPr>
-          <w:p>
-            <w:pPr>
-              <w:pStyle w:val="NoSpacing"/>
-              <w:rPr>
-                <w:b w:val="0"/>
-                <w:bCs w:val="0"/>
-              </w:rPr>
-            </w:pPr>
-            <w:r>
-              <w:rPr>
-                <w:b w:val="0"/>
-                <w:bCs w:val="0"/>
-              </w:rPr>
-              <w:t>difference min</w:t>
+              <w:t xml:space="preserve"> accumulator peak difference</w:t>
+            </w:r>
+          </w:p>
+        </w:tc>
+      </w:tr>
+      <w:tr>
+        <w:tc>
+          <w:tcPr>
+            <w:cnfStyle w:val="001000000000" w:firstRow="0" w:lastRow="0" w:firstColumn="1" w:lastColumn="0" w:oddVBand="0" w:evenVBand="0" w:oddHBand="0" w:evenHBand="0" w:firstRowFirstColumn="0" w:firstRowLastColumn="0" w:lastRowFirstColumn="0" w:lastRowLastColumn="0"/>
+            <w:tcW w:w="0" w:type="auto"/>
+          </w:tcPr>
+          <w:p>
+            <w:pPr>
+              <w:pStyle w:val="NoSpacing"/>
+              <w:rPr>
+                <w:b w:val="0"/>
+                <w:bCs w:val="0"/>
+              </w:rPr>
+            </w:pPr>
+            <w:r>
+              <w:rPr>
+                <w:b w:val="0"/>
+                <w:bCs w:val="0"/>
+              </w:rPr>
+              <w:t>difference mean</w:t>
             </w:r>
           </w:p>
         </w:tc>
@@ -29231,16 +28489,19 @@
               <w:pStyle w:val="NoSpacing"/>
               <w:cnfStyle w:val="000000000000" w:firstRow="0" w:lastRow="0" w:firstColumn="0" w:lastColumn="0" w:oddVBand="0" w:evenVBand="0" w:oddHBand="0" w:evenHBand="0" w:firstRowFirstColumn="0" w:firstRowLastColumn="0" w:lastRowFirstColumn="0" w:lastRowLastColumn="0"/>
             </w:pPr>
-            <w:r>
-              <w:t xml:space="preserve">The lowest difference for any </w:t>
-            </w:r>
             <w:proofErr w:type="spellStart"/>
             <w:r>
               <w:t>hough</w:t>
             </w:r>
             <w:proofErr w:type="spellEnd"/>
             <w:r>
-              <w:t xml:space="preserve"> accumulator differences</w:t>
+              <w:t xml:space="preserve"> accumulator </w:t>
+            </w:r>
+            <w:r>
+              <w:t xml:space="preserve">peak </w:t>
+            </w:r>
+            <w:r>
+              <w:t>difference mean</w:t>
             </w:r>
           </w:p>
         </w:tc>
@@ -29267,7 +28528,7 @@
                 <w:b w:val="0"/>
                 <w:bCs w:val="0"/>
               </w:rPr>
-              <w:t>difference max</w:t>
+              <w:t>difference standard deviation</w:t>
             </w:r>
           </w:p>
         </w:tc>
@@ -29280,40 +28541,46 @@
               <w:pStyle w:val="NoSpacing"/>
               <w:cnfStyle w:val="000000100000" w:firstRow="0" w:lastRow="0" w:firstColumn="0" w:lastColumn="0" w:oddVBand="0" w:evenVBand="0" w:oddHBand="1" w:evenHBand="0" w:firstRowFirstColumn="0" w:firstRowLastColumn="0" w:lastRowFirstColumn="0" w:lastRowLastColumn="0"/>
             </w:pPr>
-            <w:r>
-              <w:t xml:space="preserve">The largest difference for any </w:t>
-            </w:r>
             <w:proofErr w:type="spellStart"/>
             <w:r>
               <w:t>hough</w:t>
             </w:r>
             <w:proofErr w:type="spellEnd"/>
             <w:r>
-              <w:t xml:space="preserve"> accumulator differences</w:t>
-            </w:r>
-          </w:p>
-        </w:tc>
-      </w:tr>
-      <w:tr>
-        <w:tc>
-          <w:tcPr>
-            <w:cnfStyle w:val="001000000000" w:firstRow="0" w:lastRow="0" w:firstColumn="1" w:lastColumn="0" w:oddVBand="0" w:evenVBand="0" w:oddHBand="0" w:evenHBand="0" w:firstRowFirstColumn="0" w:firstRowLastColumn="0" w:lastRowFirstColumn="0" w:lastRowLastColumn="0"/>
-            <w:tcW w:w="0" w:type="auto"/>
-          </w:tcPr>
-          <w:p>
-            <w:pPr>
-              <w:pStyle w:val="NoSpacing"/>
-              <w:rPr>
-                <w:b w:val="0"/>
-                <w:bCs w:val="0"/>
-              </w:rPr>
-            </w:pPr>
-            <w:r>
-              <w:rPr>
-                <w:b w:val="0"/>
-                <w:bCs w:val="0"/>
-              </w:rPr>
-              <w:t>difference mean</w:t>
+              <w:t xml:space="preserve"> accumulator </w:t>
+            </w:r>
+            <w:r>
+              <w:t xml:space="preserve">peak </w:t>
+            </w:r>
+            <w:r>
+              <w:t xml:space="preserve">difference </w:t>
+            </w:r>
+            <w:r>
+              <w:t>standard deviation</w:t>
+            </w:r>
+          </w:p>
+        </w:tc>
+      </w:tr>
+      <w:tr>
+        <w:tc>
+          <w:tcPr>
+            <w:cnfStyle w:val="001000000000" w:firstRow="0" w:lastRow="0" w:firstColumn="1" w:lastColumn="0" w:oddVBand="0" w:evenVBand="0" w:oddHBand="0" w:evenHBand="0" w:firstRowFirstColumn="0" w:firstRowLastColumn="0" w:lastRowFirstColumn="0" w:lastRowLastColumn="0"/>
+            <w:tcW w:w="0" w:type="auto"/>
+          </w:tcPr>
+          <w:p>
+            <w:pPr>
+              <w:pStyle w:val="NoSpacing"/>
+              <w:rPr>
+                <w:b w:val="0"/>
+                <w:bCs w:val="0"/>
+              </w:rPr>
+            </w:pPr>
+            <w:r>
+              <w:rPr>
+                <w:b w:val="0"/>
+                <w:bCs w:val="0"/>
+              </w:rPr>
+              <w:t>percentage min</w:t>
             </w:r>
           </w:p>
         </w:tc>
@@ -29327,7 +28594,7 @@
               <w:cnfStyle w:val="000000000000" w:firstRow="0" w:lastRow="0" w:firstColumn="0" w:lastColumn="0" w:oddVBand="0" w:evenVBand="0" w:oddHBand="0" w:evenHBand="0" w:firstRowFirstColumn="0" w:firstRowLastColumn="0" w:lastRowFirstColumn="0" w:lastRowLastColumn="0"/>
             </w:pPr>
             <w:r>
-              <w:t xml:space="preserve">The mean for the </w:t>
+              <w:t xml:space="preserve">lowest </w:t>
             </w:r>
             <w:proofErr w:type="spellStart"/>
             <w:r>
@@ -29335,7 +28602,13 @@
             </w:r>
             <w:proofErr w:type="spellEnd"/>
             <w:r>
-              <w:t xml:space="preserve"> accumulator differences</w:t>
+              <w:t xml:space="preserve"> accumulator peak difference</w:t>
+            </w:r>
+            <w:r>
+              <w:t xml:space="preserve"> </w:t>
+            </w:r>
+            <w:r>
+              <w:t>percentage</w:t>
             </w:r>
           </w:p>
         </w:tc>
@@ -29362,7 +28635,7 @@
                 <w:b w:val="0"/>
                 <w:bCs w:val="0"/>
               </w:rPr>
-              <w:t>difference standard deviation</w:t>
+              <w:t>percentage max</w:t>
             </w:r>
           </w:p>
         </w:tc>
@@ -29376,7 +28649,7 @@
               <w:cnfStyle w:val="000000100000" w:firstRow="0" w:lastRow="0" w:firstColumn="0" w:lastColumn="0" w:oddVBand="0" w:evenVBand="0" w:oddHBand="1" w:evenHBand="0" w:firstRowFirstColumn="0" w:firstRowLastColumn="0" w:lastRowFirstColumn="0" w:lastRowLastColumn="0"/>
             </w:pPr>
             <w:r>
-              <w:t xml:space="preserve">The standard deviation for the </w:t>
+              <w:t xml:space="preserve">largest </w:t>
             </w:r>
             <w:proofErr w:type="spellStart"/>
             <w:r>
@@ -29384,32 +28657,37 @@
             </w:r>
             <w:proofErr w:type="spellEnd"/>
             <w:r>
-              <w:t xml:space="preserve"> accumulator differences</w:t>
-            </w:r>
-          </w:p>
-        </w:tc>
-      </w:tr>
-      <w:tr>
-        <w:tc>
-          <w:tcPr>
-            <w:cnfStyle w:val="001000000000" w:firstRow="0" w:lastRow="0" w:firstColumn="1" w:lastColumn="0" w:oddVBand="0" w:evenVBand="0" w:oddHBand="0" w:evenHBand="0" w:firstRowFirstColumn="0" w:firstRowLastColumn="0" w:lastRowFirstColumn="0" w:lastRowLastColumn="0"/>
-            <w:tcW w:w="0" w:type="auto"/>
-          </w:tcPr>
-          <w:p>
-            <w:pPr>
-              <w:pStyle w:val="NoSpacing"/>
-              <w:rPr>
-                <w:b w:val="0"/>
-                <w:bCs w:val="0"/>
-              </w:rPr>
-            </w:pPr>
-            <w:r>
-              <w:rPr>
-                <w:b w:val="0"/>
-                <w:bCs w:val="0"/>
-              </w:rPr>
-              <w:lastRenderedPageBreak/>
-              <w:t>percentage min</w:t>
+              <w:t xml:space="preserve"> accumulator peak difference</w:t>
+            </w:r>
+            <w:r>
+              <w:t xml:space="preserve"> </w:t>
+            </w:r>
+            <w:r>
+              <w:t>percentage</w:t>
+            </w:r>
+          </w:p>
+        </w:tc>
+      </w:tr>
+      <w:tr>
+        <w:tc>
+          <w:tcPr>
+            <w:cnfStyle w:val="001000000000" w:firstRow="0" w:lastRow="0" w:firstColumn="1" w:lastColumn="0" w:oddVBand="0" w:evenVBand="0" w:oddHBand="0" w:evenHBand="0" w:firstRowFirstColumn="0" w:firstRowLastColumn="0" w:lastRowFirstColumn="0" w:lastRowLastColumn="0"/>
+            <w:tcW w:w="0" w:type="auto"/>
+          </w:tcPr>
+          <w:p>
+            <w:pPr>
+              <w:pStyle w:val="NoSpacing"/>
+              <w:rPr>
+                <w:b w:val="0"/>
+                <w:bCs w:val="0"/>
+              </w:rPr>
+            </w:pPr>
+            <w:r>
+              <w:rPr>
+                <w:b w:val="0"/>
+                <w:bCs w:val="0"/>
+              </w:rPr>
+              <w:t>percentage mean</w:t>
             </w:r>
           </w:p>
         </w:tc>
@@ -29422,16 +28700,13 @@
               <w:pStyle w:val="NoSpacing"/>
               <w:cnfStyle w:val="000000000000" w:firstRow="0" w:lastRow="0" w:firstColumn="0" w:lastColumn="0" w:oddVBand="0" w:evenVBand="0" w:oddHBand="0" w:evenHBand="0" w:firstRowFirstColumn="0" w:firstRowLastColumn="0" w:lastRowFirstColumn="0" w:lastRowLastColumn="0"/>
             </w:pPr>
-            <w:r>
-              <w:t xml:space="preserve">The lowest percentage for any </w:t>
-            </w:r>
             <w:proofErr w:type="spellStart"/>
             <w:r>
               <w:t>hough</w:t>
             </w:r>
             <w:proofErr w:type="spellEnd"/>
             <w:r>
-              <w:t xml:space="preserve"> accumulator difference percentages</w:t>
+              <w:t xml:space="preserve"> accumulator peak difference percentage mean</w:t>
             </w:r>
           </w:p>
         </w:tc>
@@ -29458,7 +28733,7 @@
                 <w:b w:val="0"/>
                 <w:bCs w:val="0"/>
               </w:rPr>
-              <w:t>percentage max</w:t>
+              <w:t>percentage standard deviation</w:t>
             </w:r>
           </w:p>
         </w:tc>
@@ -29471,111 +28746,13 @@
               <w:pStyle w:val="NoSpacing"/>
               <w:cnfStyle w:val="000000100000" w:firstRow="0" w:lastRow="0" w:firstColumn="0" w:lastColumn="0" w:oddVBand="0" w:evenVBand="0" w:oddHBand="1" w:evenHBand="0" w:firstRowFirstColumn="0" w:firstRowLastColumn="0" w:lastRowFirstColumn="0" w:lastRowLastColumn="0"/>
             </w:pPr>
-            <w:r>
-              <w:t xml:space="preserve">The largest percentage for any </w:t>
-            </w:r>
             <w:proofErr w:type="spellStart"/>
             <w:r>
               <w:t>hough</w:t>
             </w:r>
             <w:proofErr w:type="spellEnd"/>
             <w:r>
-              <w:t xml:space="preserve"> accumulator difference percentages</w:t>
-            </w:r>
-          </w:p>
-        </w:tc>
-      </w:tr>
-      <w:tr>
-        <w:tc>
-          <w:tcPr>
-            <w:cnfStyle w:val="001000000000" w:firstRow="0" w:lastRow="0" w:firstColumn="1" w:lastColumn="0" w:oddVBand="0" w:evenVBand="0" w:oddHBand="0" w:evenHBand="0" w:firstRowFirstColumn="0" w:firstRowLastColumn="0" w:lastRowFirstColumn="0" w:lastRowLastColumn="0"/>
-            <w:tcW w:w="0" w:type="auto"/>
-          </w:tcPr>
-          <w:p>
-            <w:pPr>
-              <w:pStyle w:val="NoSpacing"/>
-              <w:rPr>
-                <w:b w:val="0"/>
-                <w:bCs w:val="0"/>
-              </w:rPr>
-            </w:pPr>
-            <w:r>
-              <w:rPr>
-                <w:b w:val="0"/>
-                <w:bCs w:val="0"/>
-              </w:rPr>
-              <w:t>percentage mean</w:t>
-            </w:r>
-          </w:p>
-        </w:tc>
-        <w:tc>
-          <w:tcPr>
-            <w:tcW w:w="0" w:type="auto"/>
-          </w:tcPr>
-          <w:p>
-            <w:pPr>
-              <w:pStyle w:val="NoSpacing"/>
-              <w:cnfStyle w:val="000000000000" w:firstRow="0" w:lastRow="0" w:firstColumn="0" w:lastColumn="0" w:oddVBand="0" w:evenVBand="0" w:oddHBand="0" w:evenHBand="0" w:firstRowFirstColumn="0" w:firstRowLastColumn="0" w:lastRowFirstColumn="0" w:lastRowLastColumn="0"/>
-            </w:pPr>
-            <w:r>
-              <w:t xml:space="preserve">The mean for the </w:t>
-            </w:r>
-            <w:proofErr w:type="spellStart"/>
-            <w:r>
-              <w:t>hough</w:t>
-            </w:r>
-            <w:proofErr w:type="spellEnd"/>
-            <w:r>
-              <w:t xml:space="preserve"> accumulator difference percentages</w:t>
-            </w:r>
-          </w:p>
-        </w:tc>
-      </w:tr>
-      <w:tr>
-        <w:trPr>
-          <w:cnfStyle w:val="000000100000" w:firstRow="0" w:lastRow="0" w:firstColumn="0" w:lastColumn="0" w:oddVBand="0" w:evenVBand="0" w:oddHBand="1" w:evenHBand="0" w:firstRowFirstColumn="0" w:firstRowLastColumn="0" w:lastRowFirstColumn="0" w:lastRowLastColumn="0"/>
-        </w:trPr>
-        <w:tc>
-          <w:tcPr>
-            <w:cnfStyle w:val="001000000000" w:firstRow="0" w:lastRow="0" w:firstColumn="1" w:lastColumn="0" w:oddVBand="0" w:evenVBand="0" w:oddHBand="0" w:evenHBand="0" w:firstRowFirstColumn="0" w:firstRowLastColumn="0" w:lastRowFirstColumn="0" w:lastRowLastColumn="0"/>
-            <w:tcW w:w="0" w:type="auto"/>
-          </w:tcPr>
-          <w:p>
-            <w:pPr>
-              <w:pStyle w:val="NoSpacing"/>
-              <w:rPr>
-                <w:b w:val="0"/>
-                <w:bCs w:val="0"/>
-              </w:rPr>
-            </w:pPr>
-            <w:r>
-              <w:rPr>
-                <w:b w:val="0"/>
-                <w:bCs w:val="0"/>
-              </w:rPr>
-              <w:t>percentage standard deviation</w:t>
-            </w:r>
-          </w:p>
-        </w:tc>
-        <w:tc>
-          <w:tcPr>
-            <w:tcW w:w="0" w:type="auto"/>
-          </w:tcPr>
-          <w:p>
-            <w:pPr>
-              <w:pStyle w:val="NoSpacing"/>
-              <w:cnfStyle w:val="000000100000" w:firstRow="0" w:lastRow="0" w:firstColumn="0" w:lastColumn="0" w:oddVBand="0" w:evenVBand="0" w:oddHBand="1" w:evenHBand="0" w:firstRowFirstColumn="0" w:firstRowLastColumn="0" w:lastRowFirstColumn="0" w:lastRowLastColumn="0"/>
-            </w:pPr>
-            <w:r>
-              <w:t xml:space="preserve">The standard deviation for the </w:t>
-            </w:r>
-            <w:proofErr w:type="spellStart"/>
-            <w:r>
-              <w:t>hough</w:t>
-            </w:r>
-            <w:proofErr w:type="spellEnd"/>
-            <w:r>
-              <w:t xml:space="preserve"> accumulator difference percentages</w:t>
+              <w:t xml:space="preserve"> accumulator peak difference percentage standard deviation</w:t>
             </w:r>
           </w:p>
         </w:tc>
@@ -29591,25 +28768,12 @@
     </w:p>
     <w:p>
       <w:r>
-        <w:t xml:space="preserve">The transform image combine operator does a linear recombination of two images. The formula for the output values </w:t>
-      </w:r>
-      <w:proofErr w:type="gramStart"/>
-      <w:r>
-        <w:t>are</w:t>
-      </w:r>
-      <w:proofErr w:type="gramEnd"/>
-      <w:r>
-        <w:t>:</w:t>
-      </w:r>
-    </w:p>
-    <w:p>
-      <w:proofErr w:type="gramStart"/>
-      <w:r>
-        <w:t>output(</w:t>
-      </w:r>
-      <w:proofErr w:type="gramEnd"/>
-      <w:r>
-        <w:t>row, col) = scale</w:t>
+        <w:t>The transform image combine operator does a linear recombination of two images. The formula for the output values are:</w:t>
+      </w:r>
+    </w:p>
+    <w:p>
+      <w:r>
+        <w:t>output(row, col) = scale</w:t>
       </w:r>
       <w:r>
         <w:rPr>
@@ -29650,6 +28814,7 @@
     </w:p>
     <w:p>
       <w:r>
+        <w:lastRenderedPageBreak/>
         <w:t>The operator takes the following data descriptors. Input images must be the same (rows, cols) size.</w:t>
       </w:r>
     </w:p>
@@ -30056,7 +29221,6 @@
                 <w:bCs w:val="0"/>
               </w:rPr>
             </w:pPr>
-            <w:proofErr w:type="gramStart"/>
             <w:r>
               <w:rPr>
                 <w:b w:val="0"/>
@@ -30064,7 +29228,6 @@
               </w:rPr>
               <w:t>scale-1</w:t>
             </w:r>
-            <w:proofErr w:type="gramEnd"/>
           </w:p>
         </w:tc>
         <w:tc>
@@ -30109,7 +29272,6 @@
                 <w:bCs w:val="0"/>
               </w:rPr>
             </w:pPr>
-            <w:proofErr w:type="gramStart"/>
             <w:r>
               <w:rPr>
                 <w:b w:val="0"/>
@@ -30117,7 +29279,6 @@
               </w:rPr>
               <w:t>scale-2</w:t>
             </w:r>
-            <w:proofErr w:type="gramEnd"/>
           </w:p>
         </w:tc>
         <w:tc>
@@ -30268,7 +29429,6 @@
                 <w:bCs w:val="0"/>
               </w:rPr>
             </w:pPr>
-            <w:proofErr w:type="gramStart"/>
             <w:r>
               <w:rPr>
                 <w:b w:val="0"/>
@@ -30276,7 +29436,6 @@
               </w:rPr>
               <w:t>max-row</w:t>
             </w:r>
-            <w:proofErr w:type="gramEnd"/>
           </w:p>
         </w:tc>
         <w:tc>
@@ -30371,7 +29530,6 @@
                 <w:bCs w:val="0"/>
               </w:rPr>
             </w:pPr>
-            <w:proofErr w:type="gramStart"/>
             <w:r>
               <w:rPr>
                 <w:b w:val="0"/>
@@ -30379,7 +29537,6 @@
               </w:rPr>
               <w:t>max-col</w:t>
             </w:r>
-            <w:proofErr w:type="gramEnd"/>
           </w:p>
         </w:tc>
         <w:tc>
@@ -30695,7 +29852,6 @@
         <w:pStyle w:val="Heading2"/>
       </w:pPr>
       <w:r>
-        <w:lastRenderedPageBreak/>
         <w:t>transform-image-copy Operator</w:t>
       </w:r>
     </w:p>
@@ -31027,6 +30183,7 @@
         <w:pStyle w:val="Normalafterlist"/>
       </w:pPr>
       <w:r>
+        <w:lastRenderedPageBreak/>
         <w:t xml:space="preserve">There are several variations depending whether the </w:t>
       </w:r>
       <w:proofErr w:type="spellStart"/>
@@ -31930,7 +31087,6 @@
         <w:pStyle w:val="Heading2"/>
       </w:pPr>
       <w:r>
-        <w:lastRenderedPageBreak/>
         <w:t>transform-image-create Operator</w:t>
       </w:r>
     </w:p>
@@ -31960,15 +31116,7 @@
         </w:numPr>
       </w:pPr>
       <w:r>
-        <w:t xml:space="preserve">If a text input file is specified, each line consists of space or tab delimited numeric intensities. The number of rows is the number of lines in the file. The number of columns is the number of fields on each line. The number of fields must be the same on each line. If the output format is JPEG, field values outside the range of </w:t>
-      </w:r>
-      <w:proofErr w:type="gramStart"/>
-      <w:r>
-        <w:t>0..</w:t>
-      </w:r>
-      <w:proofErr w:type="gramEnd"/>
-      <w:r>
-        <w:t xml:space="preserve">255 will be truncated. </w:t>
+        <w:t xml:space="preserve">If a text input file is specified, each line consists of space or tab delimited numeric intensities. The number of rows is the number of lines in the file. The number of columns is the number of fields on each line. The number of fields must be the same on each line. If the output format is JPEG, field values outside the range of 0..255 will be truncated. </w:t>
       </w:r>
     </w:p>
     <w:tbl>
@@ -31997,6 +31145,7 @@
           </w:tcPr>
           <w:p>
             <w:r>
+              <w:lastRenderedPageBreak/>
               <w:t>Descriptor type</w:t>
             </w:r>
           </w:p>
@@ -32542,12 +31691,10 @@
               <w:t>A point to add to the image as ‘</w:t>
             </w:r>
             <w:proofErr w:type="spellStart"/>
-            <w:proofErr w:type="gramStart"/>
             <w:r>
               <w:t>row,col</w:t>
             </w:r>
             <w:proofErr w:type="spellEnd"/>
-            <w:proofErr w:type="gramEnd"/>
             <w:r>
               <w:t>’</w:t>
             </w:r>
@@ -32603,12 +31750,10 @@
               <w:t>A line segment ‘(</w:t>
             </w:r>
             <w:proofErr w:type="spellStart"/>
-            <w:proofErr w:type="gramStart"/>
             <w:r>
               <w:t>row,col</w:t>
             </w:r>
             <w:proofErr w:type="spellEnd"/>
-            <w:proofErr w:type="gramEnd"/>
             <w:r>
               <w:t>):(</w:t>
             </w:r>
@@ -32690,12 +31835,10 @@
               <w:t>A rectangle ‘(</w:t>
             </w:r>
             <w:proofErr w:type="spellStart"/>
-            <w:proofErr w:type="gramStart"/>
             <w:r>
               <w:t>row,col</w:t>
             </w:r>
             <w:proofErr w:type="spellEnd"/>
-            <w:proofErr w:type="gramEnd"/>
             <w:r>
               <w:t>):(</w:t>
             </w:r>
@@ -32772,15 +31915,7 @@
               <w:cnfStyle w:val="000000000000" w:firstRow="0" w:lastRow="0" w:firstColumn="0" w:lastColumn="0" w:oddVBand="0" w:evenVBand="0" w:oddHBand="0" w:evenHBand="0" w:firstRowFirstColumn="0" w:firstRowLastColumn="0" w:lastRowFirstColumn="0" w:lastRowLastColumn="0"/>
             </w:pPr>
             <w:r>
-              <w:t xml:space="preserve">Similar to the ‘rectangle’ </w:t>
-            </w:r>
-            <w:proofErr w:type="gramStart"/>
-            <w:r>
-              <w:t>parameter, but</w:t>
-            </w:r>
-            <w:proofErr w:type="gramEnd"/>
-            <w:r>
-              <w:t xml:space="preserve"> creates a filled rectangle.</w:t>
+              <w:t>Similar to the ‘rectangle’ parameter, but creates a filled rectangle.</w:t>
             </w:r>
           </w:p>
         </w:tc>
@@ -32850,7 +31985,6 @@
                 <w:bCs w:val="0"/>
               </w:rPr>
             </w:pPr>
-            <w:proofErr w:type="gramStart"/>
             <w:r>
               <w:rPr>
                 <w:b w:val="0"/>
@@ -32858,7 +31992,6 @@
               </w:rPr>
               <w:t>max-row</w:t>
             </w:r>
-            <w:proofErr w:type="gramEnd"/>
           </w:p>
         </w:tc>
         <w:tc>
@@ -32953,7 +32086,6 @@
                 <w:bCs w:val="0"/>
               </w:rPr>
             </w:pPr>
-            <w:proofErr w:type="gramStart"/>
             <w:r>
               <w:rPr>
                 <w:b w:val="0"/>
@@ -32961,7 +32093,6 @@
               </w:rPr>
               <w:t>max-col</w:t>
             </w:r>
-            <w:proofErr w:type="gramEnd"/>
           </w:p>
         </w:tc>
         <w:tc>
@@ -33008,7 +32139,6 @@
         <w:t>“point”: “(</w:t>
       </w:r>
       <w:proofErr w:type="spellStart"/>
-      <w:proofErr w:type="gramStart"/>
       <w:r>
         <w:rPr>
           <w:i/>
@@ -33027,7 +32157,6 @@
         <w:t>col</w:t>
       </w:r>
       <w:proofErr w:type="spellEnd"/>
-      <w:proofErr w:type="gramEnd"/>
       <w:r>
         <w:t>)|(</w:t>
       </w:r>
@@ -33059,11 +32188,9 @@
         <w:pStyle w:val="Code"/>
       </w:pPr>
       <w:r>
-        <w:lastRenderedPageBreak/>
         <w:t>“line”: “(</w:t>
       </w:r>
       <w:proofErr w:type="spellStart"/>
-      <w:proofErr w:type="gramStart"/>
       <w:r>
         <w:rPr>
           <w:i/>
@@ -33082,7 +32209,6 @@
         <w:t>col</w:t>
       </w:r>
       <w:proofErr w:type="spellEnd"/>
-      <w:proofErr w:type="gramEnd"/>
       <w:r>
         <w:t>):(</w:t>
       </w:r>
@@ -33161,7 +32287,6 @@
         <w:t>“rectangle”: “(</w:t>
       </w:r>
       <w:proofErr w:type="spellStart"/>
-      <w:proofErr w:type="gramStart"/>
       <w:r>
         <w:rPr>
           <w:i/>
@@ -33180,7 +32305,6 @@
         <w:t>col</w:t>
       </w:r>
       <w:proofErr w:type="spellEnd"/>
-      <w:proofErr w:type="gramEnd"/>
       <w:r>
         <w:t>):(</w:t>
       </w:r>
@@ -33538,6 +32662,7 @@
       </w:pPr>
       <w:bookmarkStart w:id="8" w:name="_Ref112930833"/>
       <w:r>
+        <w:lastRenderedPageBreak/>
         <w:t>transform-intensity-map Operator</w:t>
       </w:r>
       <w:bookmarkEnd w:id="8"/>
@@ -33732,15 +32857,7 @@
       </w:r>
       <w:proofErr w:type="spellEnd"/>
       <w:r>
-        <w:t xml:space="preserve"> is the output pixel value for input pixel values &gt;= threshold. Values for JPEG output images will be CV_8U and truncated to </w:t>
-      </w:r>
-      <w:proofErr w:type="gramStart"/>
-      <w:r>
-        <w:t>0..</w:t>
-      </w:r>
-      <w:proofErr w:type="gramEnd"/>
-      <w:r>
-        <w:t>255.</w:t>
+        <w:t xml:space="preserve"> is the output pixel value for input pixel values &gt;= threshold. Values for JPEG output images will be CV_8U and truncated to 0..255.</w:t>
       </w:r>
     </w:p>
     <w:p>
@@ -34382,16 +33499,13 @@
                 <w:bCs w:val="0"/>
               </w:rPr>
             </w:pPr>
-            <w:proofErr w:type="gramStart"/>
-            <w:r>
-              <w:rPr>
-                <w:b w:val="0"/>
-                <w:bCs w:val="0"/>
-              </w:rPr>
-              <w:lastRenderedPageBreak/>
+            <w:r>
+              <w:rPr>
+                <w:b w:val="0"/>
+                <w:bCs w:val="0"/>
+              </w:rPr>
               <w:t>max-row</w:t>
             </w:r>
-            <w:proofErr w:type="gramEnd"/>
           </w:p>
         </w:tc>
         <w:tc>
@@ -34486,7 +33600,6 @@
                 <w:bCs w:val="0"/>
               </w:rPr>
             </w:pPr>
-            <w:proofErr w:type="gramStart"/>
             <w:r>
               <w:rPr>
                 <w:b w:val="0"/>
@@ -34494,7 +33607,6 @@
               </w:rPr>
               <w:t>max-col</w:t>
             </w:r>
-            <w:proofErr w:type="gramEnd"/>
           </w:p>
         </w:tc>
         <w:tc>
@@ -34741,6 +33853,7 @@
                 <w:b w:val="0"/>
                 <w:bCs w:val="0"/>
               </w:rPr>
+              <w:lastRenderedPageBreak/>
               <w:t>depth</w:t>
             </w:r>
           </w:p>
@@ -35129,21 +34242,12 @@
         <w:pStyle w:val="Heading2"/>
       </w:pPr>
       <w:r>
-        <w:lastRenderedPageBreak/>
         <w:t>CV-workbench programs</w:t>
       </w:r>
     </w:p>
     <w:p>
       <w:r>
-        <w:t xml:space="preserve">There are </w:t>
-      </w:r>
-      <w:proofErr w:type="gramStart"/>
-      <w:r>
-        <w:t>a number of</w:t>
-      </w:r>
-      <w:proofErr w:type="gramEnd"/>
-      <w:r>
-        <w:t xml:space="preserve"> CV-workbench programs included in the </w:t>
+        <w:t xml:space="preserve">There are a number of CV-workbench programs included in the </w:t>
       </w:r>
       <w:r>
         <w:rPr>
@@ -35256,14 +34360,7 @@
       </w:pPr>
       <w:r>
         <w:br/>
-      </w:r>
-      <w:proofErr w:type="gramStart"/>
-      <w:r>
-        <w:t>$ .</w:t>
-      </w:r>
-      <w:proofErr w:type="gramEnd"/>
-      <w:r>
-        <w:t xml:space="preserve">/cv-workbench </w:t>
+        <w:t xml:space="preserve">$ ./cv-workbench </w:t>
       </w:r>
       <w:r>
         <w:rPr>
@@ -35290,6 +34387,7 @@
         <w:pStyle w:val="Normalafterlist"/>
       </w:pPr>
       <w:r>
+        <w:lastRenderedPageBreak/>
         <w:t>The script file format is described above, and the log file is written to the same directory as the script file.</w:t>
       </w:r>
     </w:p>
@@ -35310,13 +34408,8 @@
       <w:pPr>
         <w:pStyle w:val="Code"/>
       </w:pPr>
-      <w:proofErr w:type="gramStart"/>
-      <w:r>
-        <w:t>$./</w:t>
-      </w:r>
-      <w:proofErr w:type="gramEnd"/>
-      <w:r>
-        <w:t xml:space="preserve">image-copy </w:t>
+      <w:r>
+        <w:t xml:space="preserve">$./image-copy </w:t>
       </w:r>
       <w:proofErr w:type="spellStart"/>
       <w:r>
@@ -35449,7 +34542,6 @@
                 <w:bCs w:val="0"/>
               </w:rPr>
             </w:pPr>
-            <w:proofErr w:type="gramStart"/>
             <w:r>
               <w:rPr>
                 <w:b w:val="0"/>
@@ -35457,7 +34549,6 @@
               </w:rPr>
               <w:t>max-row</w:t>
             </w:r>
-            <w:proofErr w:type="gramEnd"/>
           </w:p>
         </w:tc>
         <w:tc>
@@ -35526,7 +34617,6 @@
                 <w:bCs w:val="0"/>
               </w:rPr>
             </w:pPr>
-            <w:proofErr w:type="gramStart"/>
             <w:r>
               <w:rPr>
                 <w:b w:val="0"/>
@@ -35534,7 +34624,6 @@
               </w:rPr>
               <w:t>max-col</w:t>
             </w:r>
-            <w:proofErr w:type="gramEnd"/>
           </w:p>
         </w:tc>
         <w:tc>
@@ -35569,13 +34658,8 @@
       <w:pPr>
         <w:pStyle w:val="Code"/>
       </w:pPr>
-      <w:proofErr w:type="gramStart"/>
-      <w:r>
-        <w:t>$ .</w:t>
-      </w:r>
-      <w:proofErr w:type="gramEnd"/>
-      <w:r>
-        <w:t xml:space="preserve">/image-dump </w:t>
+      <w:r>
+        <w:t xml:space="preserve">$ ./image-dump </w:t>
       </w:r>
       <w:r>
         <w:rPr>
@@ -35675,13 +34759,8 @@
           <w:iCs/>
         </w:rPr>
       </w:pPr>
-      <w:proofErr w:type="gramStart"/>
-      <w:r>
-        <w:t>$ .</w:t>
-      </w:r>
-      <w:proofErr w:type="gramEnd"/>
-      <w:r>
-        <w:t xml:space="preserve">/image-info </w:t>
+      <w:r>
+        <w:t xml:space="preserve">$ ./image-info </w:t>
       </w:r>
       <w:r>
         <w:rPr>
@@ -35727,28 +34806,15 @@
         <w:t>in-filename</w:t>
       </w:r>
       <w:r>
-        <w:t xml:space="preserve"> has a “.jpg” or “.bin” extension to indicate whether it is a JPEG image file or a binary internal format image file. It writes statistics of the image </w:t>
-      </w:r>
-      <w:proofErr w:type="gramStart"/>
-      <w:r>
-        <w:t>similar to</w:t>
-      </w:r>
-      <w:proofErr w:type="gramEnd"/>
-      <w:r>
-        <w:t xml:space="preserve"> this:</w:t>
+        <w:t xml:space="preserve"> has a “.jpg” or “.bin” extension to indicate whether it is a JPEG image file or a binary internal format image file. It writes statistics of the image similar to this:</w:t>
       </w:r>
     </w:p>
     <w:p>
       <w:pPr>
         <w:pStyle w:val="Code"/>
       </w:pPr>
-      <w:proofErr w:type="gramStart"/>
-      <w:r>
-        <w:t>$ .</w:t>
-      </w:r>
-      <w:proofErr w:type="gramEnd"/>
-      <w:r>
-        <w:t>/image-info test/reference/du_map_gray.jpg</w:t>
+      <w:r>
+        <w:t>$ ./image-info test/reference/du_map_gray.jpg</w:t>
       </w:r>
     </w:p>
     <w:p>
@@ -35796,16 +34862,260 @@
         <w:pStyle w:val="Code"/>
       </w:pPr>
       <w:r>
+        <w:t xml:space="preserve">    </w:t>
+      </w:r>
+      <w:proofErr w:type="spellStart"/>
+      <w:r>
+        <w:t>row_stride</w:t>
+      </w:r>
+      <w:proofErr w:type="spellEnd"/>
+      <w:r>
+        <w:t xml:space="preserve">          685</w:t>
+      </w:r>
+    </w:p>
+    <w:p>
+      <w:pPr>
+        <w:pStyle w:val="Code"/>
+      </w:pPr>
+      <w:r>
+        <w:t xml:space="preserve">    </w:t>
+      </w:r>
+      <w:proofErr w:type="spellStart"/>
+      <w:r>
+        <w:t>npixels</w:t>
+      </w:r>
+      <w:proofErr w:type="spellEnd"/>
+      <w:r>
+        <w:t xml:space="preserve">             380860</w:t>
+      </w:r>
+    </w:p>
+    <w:p>
+      <w:pPr>
+        <w:pStyle w:val="Code"/>
+      </w:pPr>
+      <w:r>
+        <w:t>histogram:</w:t>
+      </w:r>
+    </w:p>
+    <w:p>
+      <w:pPr>
+        <w:pStyle w:val="Code"/>
+      </w:pPr>
+      <w:r>
+        <w:t xml:space="preserve">    </w:t>
+      </w:r>
+      <w:proofErr w:type="spellStart"/>
+      <w:r>
+        <w:t>nbins</w:t>
+      </w:r>
+      <w:proofErr w:type="spellEnd"/>
+      <w:r>
+        <w:t xml:space="preserve">               100</w:t>
+      </w:r>
+    </w:p>
+    <w:p>
+      <w:pPr>
+        <w:pStyle w:val="Code"/>
+      </w:pPr>
+      <w:r>
+        <w:t xml:space="preserve">    </w:t>
+      </w:r>
+      <w:proofErr w:type="spellStart"/>
+      <w:r>
+        <w:t>lower_value</w:t>
+      </w:r>
+      <w:proofErr w:type="spellEnd"/>
+      <w:r>
+        <w:t xml:space="preserve">         31</w:t>
+      </w:r>
+    </w:p>
+    <w:p>
+      <w:pPr>
+        <w:pStyle w:val="Code"/>
+      </w:pPr>
+      <w:r>
+        <w:t xml:space="preserve">    </w:t>
+      </w:r>
+      <w:proofErr w:type="spellStart"/>
+      <w:r>
+        <w:t>upper_value</w:t>
+      </w:r>
+      <w:proofErr w:type="spellEnd"/>
+      <w:r>
+        <w:t xml:space="preserve">         255</w:t>
+      </w:r>
+    </w:p>
+    <w:p>
+      <w:pPr>
+        <w:pStyle w:val="Code"/>
+      </w:pPr>
+      <w:r>
+        <w:t xml:space="preserve">    bounds:</w:t>
+      </w:r>
+    </w:p>
+    <w:p>
+      <w:pPr>
+        <w:pStyle w:val="Code"/>
+      </w:pPr>
+      <w:r>
+        <w:t xml:space="preserve">        </w:t>
+      </w:r>
+      <w:proofErr w:type="spellStart"/>
+      <w:r>
+        <w:t>min_value</w:t>
+      </w:r>
+      <w:proofErr w:type="spellEnd"/>
+      <w:r>
+        <w:t xml:space="preserve">           0</w:t>
+      </w:r>
+    </w:p>
+    <w:p>
+      <w:pPr>
+        <w:pStyle w:val="Code"/>
+      </w:pPr>
+      <w:r>
+        <w:t xml:space="preserve">        </w:t>
+      </w:r>
+      <w:proofErr w:type="spellStart"/>
+      <w:r>
+        <w:t>max_value</w:t>
+      </w:r>
+      <w:proofErr w:type="spellEnd"/>
+      <w:r>
+        <w:t xml:space="preserve">           24757</w:t>
+      </w:r>
+    </w:p>
+    <w:p>
+      <w:pPr>
+        <w:pStyle w:val="Code"/>
+      </w:pPr>
+      <w:r>
+        <w:t xml:space="preserve">    stats:</w:t>
+      </w:r>
+    </w:p>
+    <w:p>
+      <w:pPr>
+        <w:pStyle w:val="Code"/>
+      </w:pPr>
+      <w:r>
+        <w:t xml:space="preserve">        count               380860</w:t>
+      </w:r>
+    </w:p>
+    <w:p>
+      <w:pPr>
+        <w:pStyle w:val="Code"/>
+      </w:pPr>
+      <w:r>
+        <w:t xml:space="preserve">        mean                148.429</w:t>
+      </w:r>
+    </w:p>
+    <w:p>
+      <w:pPr>
+        <w:pStyle w:val="Code"/>
+      </w:pPr>
+      <w:r>
+        <w:t xml:space="preserve">        variance            1126.51</w:t>
+      </w:r>
+    </w:p>
+    <w:p>
+      <w:pPr>
+        <w:pStyle w:val="Code"/>
+      </w:pPr>
+      <w:r>
+        <w:t xml:space="preserve">        sample variance     1126.51</w:t>
+      </w:r>
+    </w:p>
+    <w:p>
+      <w:pPr>
+        <w:pStyle w:val="Code"/>
+      </w:pPr>
+      <w:r>
+        <w:t xml:space="preserve">        standard deviation  33.5635</w:t>
+      </w:r>
+    </w:p>
+    <w:p>
+      <w:pPr>
+        <w:pStyle w:val="Code"/>
+      </w:pPr>
+      <w:r>
+        <w:t xml:space="preserve">        min value           31</w:t>
+      </w:r>
+    </w:p>
+    <w:p>
+      <w:pPr>
+        <w:pStyle w:val="Code"/>
+      </w:pPr>
+      <w:r>
+        <w:t xml:space="preserve">        max value           255</w:t>
+      </w:r>
+    </w:p>
+    <w:p>
+      <w:pPr>
+        <w:pStyle w:val="Heading3"/>
+      </w:pPr>
+      <w:r>
+        <w:t>image-map</w:t>
+      </w:r>
+    </w:p>
+    <w:p>
+      <w:r>
+        <w:t>This is a program that performs the same function as the transform-intensity-map operator. It is run with:</w:t>
+      </w:r>
+    </w:p>
+    <w:p>
+      <w:pPr>
+        <w:pStyle w:val="Code"/>
+      </w:pPr>
+      <w:r>
         <w:lastRenderedPageBreak/>
-        <w:t xml:space="preserve">    </w:t>
+        <w:t xml:space="preserve">$ ./image-map </w:t>
       </w:r>
       <w:proofErr w:type="spellStart"/>
       <w:r>
-        <w:t>row_stride</w:t>
+        <w:t>in_filename</w:t>
       </w:r>
       <w:proofErr w:type="spellEnd"/>
       <w:r>
-        <w:t xml:space="preserve">          685</w:t>
+        <w:t xml:space="preserve"> out-filename lower-in upper-in lower-out upper-out</w:t>
+      </w:r>
+    </w:p>
+    <w:p>
+      <w:pPr>
+        <w:pStyle w:val="Normalafterlist"/>
+      </w:pPr>
+      <w:r>
+        <w:t xml:space="preserve">See Section </w:t>
+      </w:r>
+      <w:r>
+        <w:fldChar w:fldCharType="begin"/>
+      </w:r>
+      <w:r>
+        <w:instrText xml:space="preserve"> REF _Ref112930833 \r \h </w:instrText>
+      </w:r>
+      <w:r>
+        <w:fldChar w:fldCharType="separate"/>
+      </w:r>
+      <w:r>
+        <w:t>8.19</w:t>
+      </w:r>
+      <w:r>
+        <w:fldChar w:fldCharType="end"/>
+      </w:r>
+      <w:r>
+        <w:t xml:space="preserve"> on the transform-intensity-map operator for a description of the parameters.</w:t>
+      </w:r>
+    </w:p>
+    <w:p>
+      <w:pPr>
+        <w:pStyle w:val="Heading3"/>
+      </w:pPr>
+      <w:r>
+        <w:t>image-morph</w:t>
+      </w:r>
+    </w:p>
+    <w:p>
+      <w:r>
+        <w:t>This is a program that tests the filter-image-morphology operator. It is runs all morphology operators on the input image with:</w:t>
       </w:r>
     </w:p>
     <w:p>
@@ -35813,15 +35123,54 @@
         <w:pStyle w:val="Code"/>
       </w:pPr>
       <w:r>
-        <w:t xml:space="preserve">    </w:t>
+        <w:t xml:space="preserve">$ ./image-morph </w:t>
       </w:r>
       <w:proofErr w:type="spellStart"/>
       <w:r>
-        <w:t>npixels</w:t>
+        <w:t>in_filename</w:t>
       </w:r>
       <w:proofErr w:type="spellEnd"/>
       <w:r>
-        <w:t xml:space="preserve">             380860</w:t>
+        <w:t xml:space="preserve"> rows cols thickness</w:t>
+      </w:r>
+    </w:p>
+    <w:p>
+      <w:pPr>
+        <w:pStyle w:val="Normalafterlist"/>
+      </w:pPr>
+      <w:r>
+        <w:t xml:space="preserve">See Section </w:t>
+      </w:r>
+      <w:r>
+        <w:fldChar w:fldCharType="begin"/>
+      </w:r>
+      <w:r>
+        <w:instrText xml:space="preserve"> REF _Ref112930947 \r \h </w:instrText>
+      </w:r>
+      <w:r>
+        <w:fldChar w:fldCharType="separate"/>
+      </w:r>
+      <w:r>
+        <w:t>8.6</w:t>
+      </w:r>
+      <w:r>
+        <w:fldChar w:fldCharType="end"/>
+      </w:r>
+      <w:r>
+        <w:t xml:space="preserve"> for a description of the filter-image-morphology operator.</w:t>
+      </w:r>
+    </w:p>
+    <w:p>
+      <w:pPr>
+        <w:pStyle w:val="Heading3"/>
+      </w:pPr>
+      <w:r>
+        <w:t>image-read</w:t>
+      </w:r>
+    </w:p>
+    <w:p>
+      <w:r>
+        <w:t>This is a program that reads a tab-delimited text image file and writes it out as an internal binary format file. It is run with:</w:t>
       </w:r>
     </w:p>
     <w:p>
@@ -35829,318 +35178,7 @@
         <w:pStyle w:val="Code"/>
       </w:pPr>
       <w:r>
-        <w:t>histogram:</w:t>
-      </w:r>
-    </w:p>
-    <w:p>
-      <w:pPr>
-        <w:pStyle w:val="Code"/>
-      </w:pPr>
-      <w:r>
-        <w:t xml:space="preserve">    </w:t>
-      </w:r>
-      <w:proofErr w:type="spellStart"/>
-      <w:r>
-        <w:t>nbins</w:t>
-      </w:r>
-      <w:proofErr w:type="spellEnd"/>
-      <w:r>
-        <w:t xml:space="preserve">               100</w:t>
-      </w:r>
-    </w:p>
-    <w:p>
-      <w:pPr>
-        <w:pStyle w:val="Code"/>
-      </w:pPr>
-      <w:r>
-        <w:t xml:space="preserve">    </w:t>
-      </w:r>
-      <w:proofErr w:type="spellStart"/>
-      <w:r>
-        <w:t>lower_value</w:t>
-      </w:r>
-      <w:proofErr w:type="spellEnd"/>
-      <w:r>
-        <w:t xml:space="preserve">         31</w:t>
-      </w:r>
-    </w:p>
-    <w:p>
-      <w:pPr>
-        <w:pStyle w:val="Code"/>
-      </w:pPr>
-      <w:r>
-        <w:t xml:space="preserve">    </w:t>
-      </w:r>
-      <w:proofErr w:type="spellStart"/>
-      <w:r>
-        <w:t>upper_value</w:t>
-      </w:r>
-      <w:proofErr w:type="spellEnd"/>
-      <w:r>
-        <w:t xml:space="preserve">         255</w:t>
-      </w:r>
-    </w:p>
-    <w:p>
-      <w:pPr>
-        <w:pStyle w:val="Code"/>
-      </w:pPr>
-      <w:r>
-        <w:t xml:space="preserve">    bounds:</w:t>
-      </w:r>
-    </w:p>
-    <w:p>
-      <w:pPr>
-        <w:pStyle w:val="Code"/>
-      </w:pPr>
-      <w:r>
-        <w:t xml:space="preserve">        </w:t>
-      </w:r>
-      <w:proofErr w:type="spellStart"/>
-      <w:r>
-        <w:t>min_value</w:t>
-      </w:r>
-      <w:proofErr w:type="spellEnd"/>
-      <w:r>
-        <w:t xml:space="preserve">           0</w:t>
-      </w:r>
-    </w:p>
-    <w:p>
-      <w:pPr>
-        <w:pStyle w:val="Code"/>
-      </w:pPr>
-      <w:r>
-        <w:t xml:space="preserve">        </w:t>
-      </w:r>
-      <w:proofErr w:type="spellStart"/>
-      <w:r>
-        <w:t>max_value</w:t>
-      </w:r>
-      <w:proofErr w:type="spellEnd"/>
-      <w:r>
-        <w:t xml:space="preserve">           24757</w:t>
-      </w:r>
-    </w:p>
-    <w:p>
-      <w:pPr>
-        <w:pStyle w:val="Code"/>
-      </w:pPr>
-      <w:r>
-        <w:t xml:space="preserve">    stats:</w:t>
-      </w:r>
-    </w:p>
-    <w:p>
-      <w:pPr>
-        <w:pStyle w:val="Code"/>
-      </w:pPr>
-      <w:r>
-        <w:t xml:space="preserve">        count               380860</w:t>
-      </w:r>
-    </w:p>
-    <w:p>
-      <w:pPr>
-        <w:pStyle w:val="Code"/>
-      </w:pPr>
-      <w:r>
-        <w:t xml:space="preserve">        mean                148.429</w:t>
-      </w:r>
-    </w:p>
-    <w:p>
-      <w:pPr>
-        <w:pStyle w:val="Code"/>
-      </w:pPr>
-      <w:r>
-        <w:t xml:space="preserve">        variance            1126.51</w:t>
-      </w:r>
-    </w:p>
-    <w:p>
-      <w:pPr>
-        <w:pStyle w:val="Code"/>
-      </w:pPr>
-      <w:r>
-        <w:t xml:space="preserve">        sample variance     1126.51</w:t>
-      </w:r>
-    </w:p>
-    <w:p>
-      <w:pPr>
-        <w:pStyle w:val="Code"/>
-      </w:pPr>
-      <w:r>
-        <w:t xml:space="preserve">        standard </w:t>
-      </w:r>
-      <w:proofErr w:type="gramStart"/>
-      <w:r>
-        <w:t>deviation  33.5635</w:t>
-      </w:r>
-      <w:proofErr w:type="gramEnd"/>
-    </w:p>
-    <w:p>
-      <w:pPr>
-        <w:pStyle w:val="Code"/>
-      </w:pPr>
-      <w:r>
-        <w:t xml:space="preserve">        min value           31</w:t>
-      </w:r>
-    </w:p>
-    <w:p>
-      <w:pPr>
-        <w:pStyle w:val="Code"/>
-      </w:pPr>
-      <w:r>
-        <w:t xml:space="preserve">        max value           255</w:t>
-      </w:r>
-    </w:p>
-    <w:p>
-      <w:pPr>
-        <w:pStyle w:val="Heading3"/>
-      </w:pPr>
-      <w:r>
-        <w:t>image-map</w:t>
-      </w:r>
-    </w:p>
-    <w:p>
-      <w:r>
-        <w:t>This is a program that performs the same function as the transform-intensity-map operator. It is run with:</w:t>
-      </w:r>
-    </w:p>
-    <w:p>
-      <w:pPr>
-        <w:pStyle w:val="Code"/>
-      </w:pPr>
-      <w:proofErr w:type="gramStart"/>
-      <w:r>
-        <w:t>$ .</w:t>
-      </w:r>
-      <w:proofErr w:type="gramEnd"/>
-      <w:r>
-        <w:t xml:space="preserve">/image-map </w:t>
-      </w:r>
-      <w:proofErr w:type="spellStart"/>
-      <w:r>
-        <w:t>in_filename</w:t>
-      </w:r>
-      <w:proofErr w:type="spellEnd"/>
-      <w:r>
-        <w:t xml:space="preserve"> out-filename lower-in upper-in lower-out upper-out</w:t>
-      </w:r>
-    </w:p>
-    <w:p>
-      <w:pPr>
-        <w:pStyle w:val="Normalafterlist"/>
-      </w:pPr>
-      <w:r>
-        <w:t xml:space="preserve">See Section </w:t>
-      </w:r>
-      <w:r>
-        <w:fldChar w:fldCharType="begin"/>
-      </w:r>
-      <w:r>
-        <w:instrText xml:space="preserve"> REF _Ref112930833 \r \h </w:instrText>
-      </w:r>
-      <w:r>
-        <w:fldChar w:fldCharType="separate"/>
-      </w:r>
-      <w:r>
-        <w:t>8.19</w:t>
-      </w:r>
-      <w:r>
-        <w:fldChar w:fldCharType="end"/>
-      </w:r>
-      <w:r>
-        <w:t xml:space="preserve"> on the transform-intensity-map operator for a description of the parameters.</w:t>
-      </w:r>
-    </w:p>
-    <w:p>
-      <w:pPr>
-        <w:pStyle w:val="Heading3"/>
-      </w:pPr>
-      <w:r>
-        <w:t>image-morph</w:t>
-      </w:r>
-    </w:p>
-    <w:p>
-      <w:r>
-        <w:t xml:space="preserve">This is a program that tests the filter-image-morphology operator. It is </w:t>
-      </w:r>
-      <w:proofErr w:type="gramStart"/>
-      <w:r>
-        <w:t>runs</w:t>
-      </w:r>
-      <w:proofErr w:type="gramEnd"/>
-      <w:r>
-        <w:t xml:space="preserve"> all morphology operators on the input image with:</w:t>
-      </w:r>
-    </w:p>
-    <w:p>
-      <w:pPr>
-        <w:pStyle w:val="Code"/>
-      </w:pPr>
-      <w:proofErr w:type="gramStart"/>
-      <w:r>
-        <w:t>$ .</w:t>
-      </w:r>
-      <w:proofErr w:type="gramEnd"/>
-      <w:r>
-        <w:t xml:space="preserve">/image-morph </w:t>
-      </w:r>
-      <w:proofErr w:type="spellStart"/>
-      <w:r>
-        <w:t>in_filename</w:t>
-      </w:r>
-      <w:proofErr w:type="spellEnd"/>
-      <w:r>
-        <w:t xml:space="preserve"> rows cols thickness</w:t>
-      </w:r>
-    </w:p>
-    <w:p>
-      <w:pPr>
-        <w:pStyle w:val="Normalafterlist"/>
-      </w:pPr>
-      <w:r>
-        <w:t xml:space="preserve">See Section </w:t>
-      </w:r>
-      <w:r>
-        <w:fldChar w:fldCharType="begin"/>
-      </w:r>
-      <w:r>
-        <w:instrText xml:space="preserve"> REF _Ref112930947 \r \h </w:instrText>
-      </w:r>
-      <w:r>
-        <w:fldChar w:fldCharType="separate"/>
-      </w:r>
-      <w:r>
-        <w:t>8.6</w:t>
-      </w:r>
-      <w:r>
-        <w:fldChar w:fldCharType="end"/>
-      </w:r>
-      <w:r>
-        <w:t xml:space="preserve"> for a description of the filter-image-morphology operator.</w:t>
-      </w:r>
-    </w:p>
-    <w:p>
-      <w:pPr>
-        <w:pStyle w:val="Heading3"/>
-      </w:pPr>
-      <w:r>
-        <w:t>image-read</w:t>
-      </w:r>
-    </w:p>
-    <w:p>
-      <w:r>
-        <w:t>This is a program that reads a tab-delimited text image file and writes it out as an internal binary format file. It is run with:</w:t>
-      </w:r>
-    </w:p>
-    <w:p>
-      <w:pPr>
-        <w:pStyle w:val="Code"/>
-      </w:pPr>
-      <w:proofErr w:type="gramStart"/>
-      <w:r>
-        <w:t>$ .</w:t>
-      </w:r>
-      <w:proofErr w:type="gramEnd"/>
-      <w:r>
-        <w:t xml:space="preserve">/image-read </w:t>
+        <w:t xml:space="preserve">$ ./image-read </w:t>
       </w:r>
       <w:r>
         <w:rPr>
@@ -36210,13 +35248,8 @@
       <w:pPr>
         <w:pStyle w:val="Code"/>
       </w:pPr>
-      <w:proofErr w:type="gramStart"/>
-      <w:r>
-        <w:t>./</w:t>
-      </w:r>
-      <w:proofErr w:type="gramEnd"/>
-      <w:r>
-        <w:t xml:space="preserve">image-trig </w:t>
+      <w:r>
+        <w:t xml:space="preserve">./image-trig </w:t>
       </w:r>
     </w:p>
     <w:p>
@@ -36240,14 +35273,7 @@
       </w:pPr>
       <w:r>
         <w:br/>
-      </w:r>
-      <w:proofErr w:type="gramStart"/>
-      <w:r>
-        <w:t>$ .</w:t>
-      </w:r>
-      <w:proofErr w:type="gramEnd"/>
-      <w:r>
-        <w:t>/</w:t>
+        <w:t>$ ./</w:t>
       </w:r>
       <w:proofErr w:type="spellStart"/>
       <w:r>
@@ -36255,8 +35281,21 @@
       </w:r>
       <w:proofErr w:type="spellEnd"/>
       <w:r>
-        <w:t xml:space="preserve"> in-filename.jpg &gt;out-filename.jpg</w:t>
-      </w:r>
+        <w:t xml:space="preserve"> in-</w:t>
+      </w:r>
+      <w:proofErr w:type="spellStart"/>
+      <w:r>
+        <w:t>filename.jpg</w:t>
+      </w:r>
+      <w:proofErr w:type="spellEnd"/>
+      <w:r>
+        <w:t xml:space="preserve"> &gt;out-</w:t>
+      </w:r>
+      <w:proofErr w:type="spellStart"/>
+      <w:r>
+        <w:t>filename.jpg</w:t>
+      </w:r>
+      <w:proofErr w:type="spellEnd"/>
     </w:p>
     <w:p>
       <w:pPr>
@@ -36272,7 +35311,6 @@
         <w:pStyle w:val="Heading3"/>
       </w:pPr>
       <w:r>
-        <w:lastRenderedPageBreak/>
         <w:t>Installing CV Workbench from source</w:t>
       </w:r>
     </w:p>
@@ -36353,7 +35391,7 @@
       <w:rPr>
         <w:noProof/>
       </w:rPr>
-      <w:t>9/22/2022 8:59 AM</w:t>
+      <w:t>9/23/2022 2:17 PM</w:t>
     </w:r>
     <w:r>
       <w:fldChar w:fldCharType="end"/>
@@ -36413,7 +35451,7 @@
       <w:rPr>
         <w:noProof/>
       </w:rPr>
-      <w:t>9/22/2022 8:59 AM</w:t>
+      <w:t>9/23/2022 2:17 PM</w:t>
     </w:r>
     <w:r>
       <w:fldChar w:fldCharType="end"/>

</xml_diff>